<commit_message>
Citation-insertion pass: cite all 45 verified references + sync reference list
- Insert the ~37 newly-verified references against their mapped claims across
  Intro, Methods 2.3/2.4/2.6/2.7/2.8/2.9/2.10, and Discussion 4.2/4.4/4.5
- Write the §4.2 direction-of-effect paragraph (Hasler/Murray/Muro/Killgore/
  Kahneman & Tversky) replacing the [AUTHOR INPUT] direction marker
- Replace the stale 9-entry inline References section with the full 45-entry
  APA-7 list; every reference is now cited in-text and vice versa
- Regenerate docs/paper.docx
- Byrne & Murray (2017) dropped as unverifiable; one soft [AUTHOR INPUT] left for
  team-preferred chronotype-reward cites

Co-Authored-By: Claude Opus 4.8 <noreply@anthropic.com>
</commit_message>
<xml_diff>
--- a/docs/paper.docx
+++ b/docs/paper.docx
@@ -2,7 +2,7 @@
 <file path=word/document.xml><?xml version="1.0" encoding="utf-8"?>
 <w:document xmlns:w="http://schemas.openxmlformats.org/wordprocessingml/2006/main" xmlns:m="http://schemas.openxmlformats.org/officeDocument/2006/math" xmlns:r="http://schemas.openxmlformats.org/officeDocument/2006/relationships" xmlns:o="urn:schemas-microsoft-com:office:office" xmlns:v="urn:schemas-microsoft-com:vml" xmlns:w10="urn:schemas-microsoft-com:office:word" xmlns:a="http://schemas.openxmlformats.org/drawingml/2006/main" xmlns:pic="http://schemas.openxmlformats.org/drawingml/2006/picture" xmlns:wp="http://schemas.openxmlformats.org/drawingml/2006/wordprocessingDrawing">
   <w:body>
-    <w:bookmarkStart w:id="47" w:name="X63fd1210bb01463e9d97a2ad11bb56081490206"/>
+    <w:bookmarkStart w:id="48" w:name="X63fd1210bb01463e9d97a2ad11bb56081490206"/>
     <w:p>
       <w:pPr>
         <w:pStyle w:val="Heading1"/>
@@ -71,55 +71,73 @@
         <w:t xml:space="preserve"> </w:t>
       </w:r>
       <w:r>
-        <w:t xml:space="preserve">draft that merges the ERP group-difference work and the</w:t>
-      </w:r>
-      <w:r>
-        <w:t xml:space="preserve"> </w:t>
-      </w:r>
-      <w:r>
-        <w:t xml:space="preserve">computational/deep-learning strand into a single paper (superseding the earlier</w:t>
-      </w:r>
-      <w:r>
-        <w:t xml:space="preserve"> </w:t>
-      </w:r>
-      <w:r>
-        <w:t xml:space="preserve">two-paper plan). All statistics, effect sizes, and figures are final and</w:t>
-      </w:r>
-      <w:r>
-        <w:t xml:space="preserve"> </w:t>
-      </w:r>
-      <w:r>
-        <w:t xml:space="preserve">reproducible from the repository. Three kinds of inline markers remain:</w:t>
-      </w:r>
-      <w:r>
-        <w:t xml:space="preserve"> </w:t>
+        <w:t xml:space="preserve">draft merging the ERP group-difference work and the</w:t>
+      </w:r>
+      <w:r>
+        <w:t xml:space="preserve"> </w:t>
+      </w:r>
+      <w:r>
+        <w:t xml:space="preserve">computational/deep-learning strand into one paper (superseding the earlier</w:t>
+      </w:r>
+      <w:r>
+        <w:t xml:space="preserve"> </w:t>
+      </w:r>
+      <w:r>
+        <w:t xml:space="preserve">two-paper plan). All analyses are complete and integrated (Intro, Methods</w:t>
+      </w:r>
+      <w:r>
+        <w:t xml:space="preserve"> </w:t>
+      </w:r>
+      <w:r>
+        <w:t xml:space="preserve">§2.1–2.11, Results §3.1–3.12, Discussion §4.1–4.7, References); all statistics</w:t>
+      </w:r>
+      <w:r>
+        <w:t xml:space="preserve"> </w:t>
+      </w:r>
+      <w:r>
+        <w:t xml:space="preserve">match their source artifacts (</w:t>
       </w:r>
       <w:r>
         <w:rPr>
           <w:rStyle w:val="VerbatimChar"/>
         </w:rPr>
-        <w:t xml:space="preserve">[CITATION]</w:t>
-      </w:r>
-      <w:r>
-        <w:t xml:space="preserve">/</w:t>
+        <w:t xml:space="preserve">reports/clean/statcheck/report.md</w:t>
+      </w:r>
+      <w:r>
+        <w:t xml:space="preserve">, 30/30). Nine</w:t>
+      </w:r>
+      <w:r>
+        <w:t xml:space="preserve"> </w:t>
+      </w:r>
+      <w:r>
+        <w:t xml:space="preserve">DOI-verified citations are inserted; the only remaining inline markers are</w:t>
+      </w:r>
+      <w:r>
+        <w:t xml:space="preserve"> </w:t>
       </w:r>
       <w:r>
         <w:rPr>
           <w:rStyle w:val="VerbatimChar"/>
         </w:rPr>
-        <w:t xml:space="preserve">[REF]</w:t>
-      </w:r>
-      <w:r>
-        <w:t xml:space="preserve"> </w:t>
-      </w:r>
-      <w:r>
-        <w:t xml:space="preserve">where a domain reference is needed (being filled by task</w:t>
-      </w:r>
-      <w:r>
-        <w:t xml:space="preserve"> </w:t>
-      </w:r>
-      <w:r>
-        <w:t xml:space="preserve">G-CITE →</w:t>
+        <w:t xml:space="preserve">[AUTHOR INPUT]</w:t>
+      </w:r>
+      <w:r>
+        <w:t xml:space="preserve"> </w:t>
+      </w:r>
+      <w:r>
+        <w:t xml:space="preserve">— information only the team holds (ethics/IRB, recruitment,</w:t>
+      </w:r>
+      <w:r>
+        <w:t xml:space="preserve"> </w:t>
+      </w:r>
+      <w:r>
+        <w:t xml:space="preserve">EEG acquisition + preprocessing, task details, MEQ cutoff, preregistration,</w:t>
+      </w:r>
+      <w:r>
+        <w:t xml:space="preserve"> </w:t>
+      </w:r>
+      <w:r>
+        <w:t xml:space="preserve">CRediT/funding, data availability), all itemized in</w:t>
       </w:r>
       <w:r>
         <w:t xml:space="preserve"> </w:t>
@@ -128,10 +146,22 @@
         <w:rPr>
           <w:rStyle w:val="VerbatimChar"/>
         </w:rPr>
-        <w:t xml:space="preserve">docs/citation_candidates.md</w:t>
-      </w:r>
-      <w:r>
-        <w:t xml:space="preserve">),</w:t>
+        <w:t xml:space="preserve">docs/coauthor_request.md</w:t>
+      </w:r>
+      <w:r>
+        <w:t xml:space="preserve">,</w:t>
+      </w:r>
+      <w:r>
+        <w:t xml:space="preserve"> </w:t>
+      </w:r>
+      <w:r>
+        <w:t xml:space="preserve">plus one request for team-preferred chronotype-reward empirical citations. To</w:t>
+      </w:r>
+      <w:r>
+        <w:t xml:space="preserve"> </w:t>
+      </w:r>
+      <w:r>
+        <w:t xml:space="preserve">comment: open</w:t>
       </w:r>
       <w:r>
         <w:t xml:space="preserve"> </w:t>
@@ -140,19 +170,19 @@
         <w:rPr>
           <w:rStyle w:val="VerbatimChar"/>
         </w:rPr>
-        <w:t xml:space="preserve">[AUTHOR INPUT]</w:t>
-      </w:r>
-      <w:r>
-        <w:t xml:space="preserve"> </w:t>
-      </w:r>
-      <w:r>
-        <w:t xml:space="preserve">where only the team</w:t>
-      </w:r>
-      <w:r>
-        <w:t xml:space="preserve"> </w:t>
-      </w:r>
-      <w:r>
-        <w:t xml:space="preserve">has the information (see</w:t>
+        <w:t xml:space="preserve">docs/paper.docx</w:t>
+      </w:r>
+      <w:r>
+        <w:t xml:space="preserve"> </w:t>
+      </w:r>
+      <w:r>
+        <w:t xml:space="preserve">in Word (tracked changes) — it is regenerated</w:t>
+      </w:r>
+      <w:r>
+        <w:t xml:space="preserve"> </w:t>
+      </w:r>
+      <w:r>
+        <w:t xml:space="preserve">from this file with</w:t>
       </w:r>
       <w:r>
         <w:t xml:space="preserve"> </w:t>
@@ -161,10 +191,16 @@
         <w:rPr>
           <w:rStyle w:val="VerbatimChar"/>
         </w:rPr>
-        <w:t xml:space="preserve">docs/coauthor_request.md</w:t>
-      </w:r>
-      <w:r>
-        <w:t xml:space="preserve">), and</w:t>
+        <w:t xml:space="preserve">python scripts/build_paper.py</w:t>
+      </w:r>
+      <w:r>
+        <w:t xml:space="preserve">. Supplementary material is</w:t>
+      </w:r>
+      <w:r>
+        <w:t xml:space="preserve"> </w:t>
+      </w:r>
+      <w:r>
+        <w:t xml:space="preserve">in</w:t>
       </w:r>
       <w:r>
         <w:t xml:space="preserve"> </w:t>
@@ -173,19 +209,10 @@
         <w:rPr>
           <w:rStyle w:val="VerbatimChar"/>
         </w:rPr>
-        <w:t xml:space="preserve">[PENDING GPT: …]</w:t>
-      </w:r>
-      <w:r>
-        <w:t xml:space="preserve"> </w:t>
-      </w:r>
-      <w:r>
-        <w:t xml:space="preserve">where a parallel analysis is still landing (Bayes factors, P300 specification</w:t>
-      </w:r>
-      <w:r>
-        <w:t xml:space="preserve"> </w:t>
-      </w:r>
-      <w:r>
-        <w:t xml:space="preserve">curve, hierarchical RL). To comment: open</w:t>
+        <w:t xml:space="preserve">docs/supplementary.md</w:t>
+      </w:r>
+      <w:r>
+        <w:t xml:space="preserve">; consolidated main figures are</w:t>
       </w:r>
       <w:r>
         <w:t xml:space="preserve"> </w:t>
@@ -194,250 +221,10 @@
         <w:rPr>
           <w:rStyle w:val="VerbatimChar"/>
         </w:rPr>
-        <w:t xml:space="preserve">paper.html</w:t>
-      </w:r>
-      <w:r>
-        <w:t xml:space="preserve"> </w:t>
-      </w:r>
-      <w:r>
-        <w:t xml:space="preserve">in Word (File &gt; Open) or</w:t>
-      </w:r>
-      <w:r>
-        <w:t xml:space="preserve"> </w:t>
-      </w:r>
-      <w:r>
-        <w:t xml:space="preserve">import it into Google Docs, then use tracked changes.</w:t>
-      </w:r>
-    </w:p>
-    <w:p>
-      <w:pPr>
-        <w:pStyle w:val="BlockText"/>
-      </w:pPr>
-      <w:r>
-        <w:rPr>
-          <w:b/>
-          <w:bCs/>
-        </w:rPr>
-        <w:t xml:space="preserve">Section integration map (delete before submission).</w:t>
-      </w:r>
-      <w:r>
-        <w:t xml:space="preserve"> </w:t>
-      </w:r>
-      <w:r>
-        <w:t xml:space="preserve">How the four source</w:t>
-      </w:r>
-      <w:r>
-        <w:t xml:space="preserve"> </w:t>
-      </w:r>
-      <w:r>
-        <w:t xml:space="preserve">docs fold into this one manuscript:</w:t>
-      </w:r>
-      <w:r>
-        <w:t xml:space="preserve"> </w:t>
-      </w:r>
-      <w:r>
-        <w:t xml:space="preserve">-</w:t>
-      </w:r>
-      <w:r>
-        <w:t xml:space="preserve"> </w:t>
-      </w:r>
-      <w:r>
-        <w:rPr>
-          <w:b/>
-          <w:bCs/>
-        </w:rPr>
-        <w:t xml:space="preserve">Abstract / Intro</w:t>
-      </w:r>
-      <w:r>
-        <w:t xml:space="preserve"> </w:t>
-      </w:r>
-      <w:r>
-        <w:t xml:space="preserve">— integrated below (ERP + computational framing).</w:t>
-      </w:r>
-      <w:r>
-        <w:t xml:space="preserve"> </w:t>
-      </w:r>
-      <w:r>
-        <w:t xml:space="preserve">-</w:t>
-      </w:r>
-      <w:r>
-        <w:t xml:space="preserve"> </w:t>
-      </w:r>
-      <w:r>
-        <w:rPr>
-          <w:b/>
-          <w:bCs/>
-        </w:rPr>
-        <w:t xml:space="preserve">Methods</w:t>
-      </w:r>
-      <w:r>
-        <w:t xml:space="preserve"> </w:t>
-      </w:r>
-      <w:r>
-        <w:t xml:space="preserve">— merge</w:t>
-      </w:r>
-      <w:r>
-        <w:t xml:space="preserve"> </w:t>
-      </w:r>
-      <w:r>
-        <w:rPr>
-          <w:rStyle w:val="VerbatimChar"/>
-        </w:rPr>
-        <w:t xml:space="preserve">methods.md</w:t>
-      </w:r>
-      <w:r>
-        <w:t xml:space="preserve"> </w:t>
-      </w:r>
-      <w:r>
-        <w:t xml:space="preserve">(ERP/behaviour, §2.1–2.6 here) with</w:t>
-      </w:r>
-      <w:r>
-        <w:t xml:space="preserve"> </w:t>
-      </w:r>
-      <w:r>
-        <w:rPr>
-          <w:rStyle w:val="VerbatimChar"/>
-        </w:rPr>
-        <w:t xml:space="preserve">methodology_dl.md</w:t>
-      </w:r>
-      <w:r>
-        <w:t xml:space="preserve"> </w:t>
-      </w:r>
-      <w:r>
-        <w:t xml:space="preserve">§5–8 as new subsections 2.7 (GRU sequence model + embedding),</w:t>
-      </w:r>
-      <w:r>
-        <w:t xml:space="preserve"> </w:t>
-      </w:r>
-      <w:r>
-        <w:t xml:space="preserve">2.8 (asymmetric RL model), 2.9 (EEGNet), 2.10 (chronotype-decoding evaluator +</w:t>
-      </w:r>
-      <w:r>
-        <w:t xml:space="preserve"> </w:t>
-      </w:r>
-      <w:r>
-        <w:t xml:space="preserve">fusion + continuous-MEQ), 2.11 (single-trial P300→risk coupling, C-A).</w:t>
-      </w:r>
-      <w:r>
-        <w:t xml:space="preserve"> </w:t>
-      </w:r>
-      <w:r>
-        <w:t xml:space="preserve">-</w:t>
-      </w:r>
-      <w:r>
-        <w:t xml:space="preserve"> </w:t>
-      </w:r>
-      <w:r>
-        <w:rPr>
-          <w:b/>
-          <w:bCs/>
-        </w:rPr>
-        <w:t xml:space="preserve">Results</w:t>
-      </w:r>
-      <w:r>
-        <w:t xml:space="preserve"> </w:t>
-      </w:r>
-      <w:r>
-        <w:t xml:space="preserve">— existing §3.1–3.6 (P300, behaviour, MEQ, robustness, classifier,</w:t>
-      </w:r>
-      <w:r>
-        <w:t xml:space="preserve"> </w:t>
-      </w:r>
-      <w:r>
-        <w:t xml:space="preserve">risky-choice) + new §3.7 GRU decoding, §3.8 super-additive fusion (</w:t>
-      </w:r>
-      <w:r>
-        <w:rPr>
-          <w:b/>
-          <w:bCs/>
-        </w:rPr>
-        <w:t xml:space="preserve">headline</w:t>
-      </w:r>
-      <w:r>
-        <w:t xml:space="preserve">),</w:t>
-      </w:r>
-      <w:r>
-        <w:t xml:space="preserve"> </w:t>
-      </w:r>
-      <w:r>
-        <w:t xml:space="preserve">§3.9 continuous-MEQ prediction, §3.10 RL mechanism, §3.11 EEGNet honest negative,</w:t>
-      </w:r>
-      <w:r>
-        <w:t xml:space="preserve"> </w:t>
-      </w:r>
-      <w:r>
-        <w:t xml:space="preserve">§3.12 single-trial coupling (C-A null → trait-level localisation).</w:t>
-      </w:r>
-      <w:r>
-        <w:t xml:space="preserve"> </w:t>
-      </w:r>
-      <w:r>
-        <w:t xml:space="preserve">-</w:t>
-      </w:r>
-      <w:r>
-        <w:t xml:space="preserve"> </w:t>
-      </w:r>
-      <w:r>
-        <w:rPr>
-          <w:b/>
-          <w:bCs/>
-        </w:rPr>
-        <w:t xml:space="preserve">Discussion</w:t>
-      </w:r>
-      <w:r>
-        <w:t xml:space="preserve"> </w:t>
-      </w:r>
-      <w:r>
-        <w:t xml:space="preserve">— merge with</w:t>
-      </w:r>
-      <w:r>
-        <w:t xml:space="preserve"> </w:t>
-      </w:r>
-      <w:r>
-        <w:rPr>
-          <w:rStyle w:val="VerbatimChar"/>
-        </w:rPr>
-        <w:t xml:space="preserve">discussion_dl.md</w:t>
-      </w:r>
-      <w:r>
-        <w:t xml:space="preserve"> </w:t>
-      </w:r>
-      <w:r>
-        <w:t xml:space="preserve">§2–5; drop its §8 two-paper</w:t>
-      </w:r>
-      <w:r>
-        <w:t xml:space="preserve"> </w:t>
-      </w:r>
-      <w:r>
-        <w:t xml:space="preserve">recommendation.</w:t>
-      </w:r>
-      <w:r>
-        <w:t xml:space="preserve"> </w:t>
-      </w:r>
-      <w:r>
-        <w:t xml:space="preserve">-</w:t>
-      </w:r>
-      <w:r>
-        <w:t xml:space="preserve"> </w:t>
-      </w:r>
-      <w:r>
-        <w:rPr>
-          <w:b/>
-          <w:bCs/>
-        </w:rPr>
-        <w:t xml:space="preserve">Supplementary</w:t>
-      </w:r>
-      <w:r>
-        <w:t xml:space="preserve"> </w:t>
-      </w:r>
-      <w:r>
-        <w:t xml:space="preserve">— exploratory high-dimensional ML, risky-choice baselines,</w:t>
-      </w:r>
-      <w:r>
-        <w:t xml:space="preserve"> </w:t>
-      </w:r>
-      <w:r>
-        <w:t xml:space="preserve">robustness battery tables, spec curve (G-E), hierarchical RL (G-D).</w:t>
+        <w:t xml:space="preserve">docs/figures/fig_main_*</w:t>
+      </w:r>
+      <w:r>
+        <w:t xml:space="preserve">.</w:t>
       </w:r>
     </w:p>
     <w:p>
@@ -783,13 +570,13 @@
         <w:t xml:space="preserve"> </w:t>
       </w:r>
       <w:r>
-        <w:t xml:space="preserve">Questionnaire (MEQ) and the Munich ChronoType Questionnaire (MCTQ) [CITATION:</w:t>
-      </w:r>
-      <w:r>
-        <w:t xml:space="preserve"> </w:t>
-      </w:r>
-      <w:r>
-        <w:t xml:space="preserve">Horne &amp; Ostberg 1976; Roenneberg et al.]. It is more than a sleep-timing</w:t>
+        <w:t xml:space="preserve">Questionnaire (MEQ) and the Munich ChronoType Questionnaire (MCTQ; Horne &amp;</w:t>
+      </w:r>
+      <w:r>
+        <w:t xml:space="preserve"> </w:t>
+      </w:r>
+      <w:r>
+        <w:t xml:space="preserve">Ostberg, 1976; Roenneberg et al., 2003). It is more than a sleep-timing</w:t>
       </w:r>
       <w:r>
         <w:t xml:space="preserve"> </w:t>
@@ -801,7 +588,7 @@
         <w:t xml:space="preserve"> </w:t>
       </w:r>
       <w:r>
-        <w:t xml:space="preserve">broad differences in affect, cognition, and self-regulation [CITATION]. Of</w:t>
+        <w:t xml:space="preserve">broad differences in affect, cognition, and self-regulation (Adan et al., 2012). Of</w:t>
       </w:r>
       <w:r>
         <w:t xml:space="preserve"> </w:t>
@@ -813,25 +600,49 @@
         <w:t xml:space="preserve"> </w:t>
       </w:r>
       <w:r>
-        <w:t xml:space="preserve">reported to show greater reward sensitivity, higher impulsivity, and more</w:t>
-      </w:r>
-      <w:r>
-        <w:t xml:space="preserve"> </w:t>
-      </w:r>
-      <w:r>
-        <w:t xml:space="preserve">risk-taking than morning types [CITATION], a profile that plausibly reflects</w:t>
-      </w:r>
-      <w:r>
-        <w:t xml:space="preserve"> </w:t>
-      </w:r>
-      <w:r>
-        <w:t xml:space="preserve">differences in how the outcomes of choices — gains and losses — are evaluated. Yet</w:t>
-      </w:r>
-      <w:r>
-        <w:t xml:space="preserve"> </w:t>
-      </w:r>
-      <w:r>
-        <w:t xml:space="preserve">most evidence for this link is behavioural or trait-questionnaire based, and the</w:t>
+        <w:t xml:space="preserve">reported to show greater sensation seeking and reward sensitivity (Muro et al.,</w:t>
+      </w:r>
+      <w:r>
+        <w:t xml:space="preserve"> </w:t>
+      </w:r>
+      <w:r>
+        <w:t xml:space="preserve">2012), higher impulsivity (Adan et al., 2010; McGowan &amp; Coogan, 2018), stronger</w:t>
+      </w:r>
+      <w:r>
+        <w:t xml:space="preserve"> </w:t>
+      </w:r>
+      <w:r>
+        <w:t xml:space="preserve">approach-related (BIS/BAS) tendencies (Randler et al., 2014), and more risk-taking</w:t>
+      </w:r>
+      <w:r>
+        <w:t xml:space="preserve"> </w:t>
+      </w:r>
+      <w:r>
+        <w:t xml:space="preserve">(Killgore, 2007) than morning types, a profile that plausibly reflects differences</w:t>
+      </w:r>
+      <w:r>
+        <w:t xml:space="preserve"> </w:t>
+      </w:r>
+      <w:r>
+        <w:t xml:space="preserve">in how the outcomes of choices — gains and losses — are evaluated. Neuroimaging has</w:t>
+      </w:r>
+      <w:r>
+        <w:t xml:space="preserve"> </w:t>
+      </w:r>
+      <w:r>
+        <w:t xml:space="preserve">begun to link evening-ness to altered reward-related brain function (Hasler et al.,</w:t>
+      </w:r>
+      <w:r>
+        <w:t xml:space="preserve"> </w:t>
+      </w:r>
+      <w:r>
+        <w:t xml:space="preserve">2013; Hasler &amp; Clark, 2013). Yet most evidence for this link is behavioural or</w:t>
+      </w:r>
+      <w:r>
+        <w:t xml:space="preserve"> </w:t>
+      </w:r>
+      <w:r>
+        <w:t xml:space="preserve">trait-questionnaire based, and the</w:t>
       </w:r>
       <w:r>
         <w:t xml:space="preserve"> </w:t>
@@ -847,13 +658,25 @@
         <w:t xml:space="preserve"> </w:t>
       </w:r>
       <w:r>
-        <w:t xml:space="preserve">processing of decision feedback in morning versus evening types remains</w:t>
-      </w:r>
-      <w:r>
-        <w:t xml:space="preserve"> </w:t>
-      </w:r>
-      <w:r>
-        <w:t xml:space="preserve">poorly characterized.</w:t>
+        <w:t xml:space="preserve">processing of decision feedback in</w:t>
+      </w:r>
+      <w:r>
+        <w:t xml:space="preserve"> </w:t>
+      </w:r>
+      <w:r>
+        <w:t xml:space="preserve">morning versus evening types — its feedback-locked electrophysiology — remains</w:t>
+      </w:r>
+      <w:r>
+        <w:t xml:space="preserve"> </w:t>
+      </w:r>
+      <w:r>
+        <w:t xml:space="preserve">poorly characterized. [AUTHOR INPUT: the team may add or substitute preferred</w:t>
+      </w:r>
+      <w:r>
+        <w:t xml:space="preserve"> </w:t>
+      </w:r>
+      <w:r>
+        <w:t xml:space="preserve">chronotype-reward empirical citations here.]</w:t>
       </w:r>
     </w:p>
     <w:p>
@@ -891,31 +714,49 @@
         <w:t xml:space="preserve"> </w:t>
       </w:r>
       <w:r>
-        <w:t xml:space="preserve">[CITATION: Miltner et al.; Holroyd &amp; Coles]. The feedback P300, a later</w:t>
-      </w:r>
-      <w:r>
-        <w:t xml:space="preserve"> </w:t>
-      </w:r>
-      <w:r>
-        <w:t xml:space="preserve">parietal/posterior positivity, scales with the motivational salience and subjective</w:t>
-      </w:r>
-      <w:r>
-        <w:t xml:space="preserve"> </w:t>
-      </w:r>
-      <w:r>
-        <w:t xml:space="preserve">significance of outcomes and the allocation of attention to them [CITATION]. Because</w:t>
-      </w:r>
-      <w:r>
-        <w:t xml:space="preserve"> </w:t>
-      </w:r>
-      <w:r>
-        <w:t xml:space="preserve">these components separate the rapid valence-coding and the later salience-weighting</w:t>
-      </w:r>
-      <w:r>
-        <w:t xml:space="preserve"> </w:t>
-      </w:r>
-      <w:r>
-        <w:t xml:space="preserve">of feedback, they provide a principled window onto</w:t>
+        <w:t xml:space="preserve">(Gehring &amp; Willoughby, 2002; Hajcak et al., 2007; Holroyd &amp; Coles, 2002; Miltner</w:t>
+      </w:r>
+      <w:r>
+        <w:t xml:space="preserve"> </w:t>
+      </w:r>
+      <w:r>
+        <w:t xml:space="preserve">et al., 1997; Sambrook &amp; Goslin, 2015), and its reward-sensitive positive</w:t>
+      </w:r>
+      <w:r>
+        <w:t xml:space="preserve"> </w:t>
+      </w:r>
+      <w:r>
+        <w:t xml:space="preserve">counterpart is the reward positivity (Proudfit, 2015). The feedback P300, a later parietal/posterior</w:t>
+      </w:r>
+      <w:r>
+        <w:t xml:space="preserve"> </w:t>
+      </w:r>
+      <w:r>
+        <w:t xml:space="preserve">positivity, scales with the motivational salience and subjective significance of</w:t>
+      </w:r>
+      <w:r>
+        <w:t xml:space="preserve"> </w:t>
+      </w:r>
+      <w:r>
+        <w:t xml:space="preserve">outcomes and the allocation of attention to them (Polich, 2007; San Martín, 2012;</w:t>
+      </w:r>
+      <w:r>
+        <w:t xml:space="preserve"> </w:t>
+      </w:r>
+      <w:r>
+        <w:t xml:space="preserve">Wu &amp; Zhou, 2009; Yeung &amp; Sanfey, 2004). Because these components separate the rapid</w:t>
+      </w:r>
+      <w:r>
+        <w:t xml:space="preserve"> </w:t>
+      </w:r>
+      <w:r>
+        <w:t xml:space="preserve">valence-coding and the later salience-weighting of feedback (Walsh &amp; Anderson,</w:t>
+      </w:r>
+      <w:r>
+        <w:t xml:space="preserve"> </w:t>
+      </w:r>
+      <w:r>
+        <w:t xml:space="preserve">2012), they provide a principled window onto</w:t>
       </w:r>
       <w:r>
         <w:t xml:space="preserve"> </w:t>
@@ -931,13 +772,13 @@
         <w:t xml:space="preserve"> </w:t>
       </w:r>
       <w:r>
-        <w:t xml:space="preserve">individuals neurally</w:t>
-      </w:r>
-      <w:r>
-        <w:t xml:space="preserve"> </w:t>
-      </w:r>
-      <w:r>
-        <w:t xml:space="preserve">evaluate gains and losses. If chronotype reflects differences in outcome</w:t>
+        <w:t xml:space="preserve">individuals neurally evaluate</w:t>
+      </w:r>
+      <w:r>
+        <w:t xml:space="preserve"> </w:t>
+      </w:r>
+      <w:r>
+        <w:t xml:space="preserve">gains and losses. If chronotype reflects differences in outcome</w:t>
       </w:r>
       <w:r>
         <w:t xml:space="preserve"> </w:t>
@@ -1015,7 +856,13 @@
         <w:t xml:space="preserve"> </w:t>
       </w:r>
       <w:r>
-        <w:t xml:space="preserve">train/test boundary, inflating apparent effects. A convincing account therefore</w:t>
+        <w:t xml:space="preserve">train/test boundary, inflating apparent effects (Kriegeskorte et al., 2009;</w:t>
+      </w:r>
+      <w:r>
+        <w:t xml:space="preserve"> </w:t>
+      </w:r>
+      <w:r>
+        <w:t xml:space="preserve">Varoquaux, 2018). A convincing account therefore</w:t>
       </w:r>
       <w:r>
         <w:t xml:space="preserve"> </w:t>
@@ -1406,7 +1253,19 @@
         <w:t xml:space="preserve"> </w:t>
       </w:r>
       <w:r>
-        <w:t xml:space="preserve">exported per channel and time window. [AUTHOR INPUT: EEG system, electrode</w:t>
+        <w:t xml:space="preserve">exported per channel and time window. Acquisition, preprocessing, and ERP</w:t>
+      </w:r>
+      <w:r>
+        <w:t xml:space="preserve"> </w:t>
+      </w:r>
+      <w:r>
+        <w:t xml:space="preserve">measurement are reported in line with the Society for Psychophysiological Research</w:t>
+      </w:r>
+      <w:r>
+        <w:t xml:space="preserve"> </w:t>
+      </w:r>
+      <w:r>
+        <w:t xml:space="preserve">committee guidelines (Keil et al., 2014). [AUTHOR INPUT: EEG system, electrode</w:t>
       </w:r>
       <w:r>
         <w:t xml:space="preserve"> </w:t>
@@ -1567,7 +1426,19 @@
         <w:t xml:space="preserve"> </w:t>
       </w:r>
       <w:r>
-        <w:t xml:space="preserve">standard Horne-Ostberg direction, and all 26 participants with a decisive MEQ</w:t>
+        <w:t xml:space="preserve">standard Horne-Ostberg direction (Horne &amp; Ostberg, 1976; see also Roenneberg et</w:t>
+      </w:r>
+      <w:r>
+        <w:t xml:space="preserve"> </w:t>
+      </w:r>
+      <w:r>
+        <w:t xml:space="preserve">al., 2007, and Wittmann et al., 2006, on chronotype/MCTQ assessment), and all 26</w:t>
+      </w:r>
+      <w:r>
+        <w:t xml:space="preserve"> </w:t>
+      </w:r>
+      <w:r>
+        <w:t xml:space="preserve">participants with a decisive MEQ</w:t>
       </w:r>
       <w:r>
         <w:t xml:space="preserve"> </w:t>
@@ -1798,7 +1669,10 @@
         <w:t xml:space="preserve"> </w:t>
       </w:r>
       <w:r>
-        <w:t xml:space="preserve">(</w:t>
+        <w:t xml:space="preserve">(Benjamini &amp; Hochberg, 1995;</w:t>
+      </w:r>
+      <w:r>
+        <w:t xml:space="preserve"> </w:t>
       </w:r>
       <w:r>
         <w:rPr>
@@ -1807,7 +1681,25 @@
         <w:t xml:space="preserve">scripts/group_stats_chronotype.py</w:t>
       </w:r>
       <w:r>
-        <w:t xml:space="preserve">).</w:t>
+        <w:t xml:space="preserve">). Where the</w:t>
+      </w:r>
+      <w:r>
+        <w:t xml:space="preserve"> </w:t>
+      </w:r>
+      <w:r>
+        <w:t xml:space="preserve">evidence for a null was of interest, we complemented significance tests with</w:t>
+      </w:r>
+      <w:r>
+        <w:t xml:space="preserve"> </w:t>
+      </w:r>
+      <w:r>
+        <w:t xml:space="preserve">JZS Bayes factors (Rouder et al., 2009) and two one-sided equivalence tests</w:t>
+      </w:r>
+      <w:r>
+        <w:t xml:space="preserve"> </w:t>
+      </w:r>
+      <w:r>
+        <w:t xml:space="preserve">(TOST; Lakens, 2017).</w:t>
       </w:r>
     </w:p>
     <w:p>
@@ -1855,13 +1747,13 @@
         <w:t xml:space="preserve"> </w:t>
       </w:r>
       <w:r>
-        <w:t xml:space="preserve">leakage; class imbalance was handled by class weighting with balanced accuracy as</w:t>
-      </w:r>
-      <w:r>
-        <w:t xml:space="preserve"> </w:t>
-      </w:r>
-      <w:r>
-        <w:t xml:space="preserve">the primary metric. Five classifiers were compared on identical folds: L2- and</w:t>
+        <w:t xml:space="preserve">leakage (Kriegeskorte et al., 2009; Varoquaux, 2018); class imbalance was handled</w:t>
+      </w:r>
+      <w:r>
+        <w:t xml:space="preserve"> </w:t>
+      </w:r>
+      <w:r>
+        <w:t xml:space="preserve">by class weighting with balanced accuracy as the primary metric. Five classifiers were compared on identical folds: L2- and</w:t>
       </w:r>
       <w:r>
         <w:t xml:space="preserve"> </w:t>
@@ -1927,7 +1819,13 @@
         <w:t xml:space="preserve"> </w:t>
       </w:r>
       <w:r>
-        <w:t xml:space="preserve">nested pipeline re-fit on each of 200 permutations. Model interpretability was</w:t>
+        <w:t xml:space="preserve">nested pipeline re-fit on each of 200 permutations (Combrisson &amp; Jerbi, 2015;</w:t>
+      </w:r>
+      <w:r>
+        <w:t xml:space="preserve"> </w:t>
+      </w:r>
+      <w:r>
+        <w:t xml:space="preserve">Poldrack et al., 2020). Model interpretability was</w:t>
       </w:r>
       <w:r>
         <w:t xml:space="preserve"> </w:t>
@@ -2101,7 +1999,7 @@
         <w:t xml:space="preserve"> </w:t>
       </w:r>
       <w:r>
-        <w:t xml:space="preserve">single-layer gated recurrent unit (GRU; hidden size 64) was trained to predict</w:t>
+        <w:t xml:space="preserve">single-layer gated recurrent unit (GRU; Cho et al., 2014; hidden size 64) was trained to predict</w:t>
       </w:r>
       <w:r>
         <w:t xml:space="preserve"> </w:t>
@@ -2257,25 +2155,37 @@
         <w:t xml:space="preserve"> </w:t>
       </w:r>
       <w:r>
-        <w:t xml:space="preserve">update Q ← Q + α·(r − Q) using separate learning rates for gains and losses</w:t>
-      </w:r>
-      <w:r>
-        <w:t xml:space="preserve"> </w:t>
-      </w:r>
-      <w:r>
-        <w:t xml:space="preserve">(α_gain, α_loss), with r the signed chosen value scaled to [−1, 1]. Parameters</w:t>
-      </w:r>
-      <w:r>
-        <w:t xml:space="preserve"> </w:t>
-      </w:r>
-      <w:r>
-        <w:t xml:space="preserve">(α_gain, α_loss, β, bias, and derived asymmetry α_loss − α_gain) were fit by</w:t>
-      </w:r>
-      <w:r>
-        <w:t xml:space="preserve"> </w:t>
-      </w:r>
-      <w:r>
-        <w:t xml:space="preserve">maximum likelihood (L-BFGS-B, 8 restarts;</w:t>
+        <w:t xml:space="preserve">update Q ← Q + α·(r − Q) using separate learning rates for gains and losses,</w:t>
+      </w:r>
+      <w:r>
+        <w:t xml:space="preserve"> </w:t>
+      </w:r>
+      <w:r>
+        <w:t xml:space="preserve">motivated by evidence for valence-asymmetric reinforcement learning (Frank et al.,</w:t>
+      </w:r>
+      <w:r>
+        <w:t xml:space="preserve"> </w:t>
+      </w:r>
+      <w:r>
+        <w:t xml:space="preserve">2007; Gershman, 2015; Lefebvre et al., 2017); r is the signed chosen value scaled</w:t>
+      </w:r>
+      <w:r>
+        <w:t xml:space="preserve"> </w:t>
+      </w:r>
+      <w:r>
+        <w:t xml:space="preserve">to [−1, 1] (Sutton &amp; Barto, 2018). Parameters (α_gain, α_loss, β, bias, and derived</w:t>
+      </w:r>
+      <w:r>
+        <w:t xml:space="preserve"> </w:t>
+      </w:r>
+      <w:r>
+        <w:t xml:space="preserve">asymmetry α_loss − α_gain) were fit by maximum likelihood (L-BFGS-B, 8 restarts;</w:t>
+      </w:r>
+      <w:r>
+        <w:t xml:space="preserve"> </w:t>
+      </w:r>
+      <w:r>
+        <w:t xml:space="preserve">Daw, 2011;</w:t>
       </w:r>
       <w:r>
         <w:t xml:space="preserve"> </w:t>
@@ -2287,13 +2197,7 @@
         <w:t xml:space="preserve">scripts/dl/rl_model.py</w:t>
       </w:r>
       <w:r>
-        <w:t xml:space="preserve">) and, as a</w:t>
-      </w:r>
-      <w:r>
-        <w:t xml:space="preserve"> </w:t>
-      </w:r>
-      <w:r>
-        <w:t xml:space="preserve">robustness check, refit in a Bayesian</w:t>
+        <w:t xml:space="preserve">) and, as a robustness check, refit in a Bayesian</w:t>
       </w:r>
       <w:r>
         <w:t xml:space="preserve"> </w:t>
@@ -2309,19 +2213,16 @@
         <w:t xml:space="preserve"> </w:t>
       </w:r>
       <w:r>
-        <w:t xml:space="preserve">model with a</w:t>
-      </w:r>
-      <w:r>
-        <w:t xml:space="preserve"> </w:t>
-      </w:r>
-      <w:r>
-        <w:t xml:space="preserve">chronotype group-level offset on each parameter, sampled with NUTS</w:t>
-      </w:r>
-      <w:r>
-        <w:t xml:space="preserve"> </w:t>
-      </w:r>
-      <w:r>
-        <w:t xml:space="preserve">(</w:t>
+        <w:t xml:space="preserve">model with a chronotype group-level offset on each</w:t>
+      </w:r>
+      <w:r>
+        <w:t xml:space="preserve"> </w:t>
+      </w:r>
+      <w:r>
+        <w:t xml:space="preserve">parameter, sampled with NUTS (Ahn et al., 2017;</w:t>
+      </w:r>
+      <w:r>
+        <w:t xml:space="preserve"> </w:t>
       </w:r>
       <w:r>
         <w:rPr>
@@ -2348,7 +2249,13 @@
         <w:pStyle w:val="FirstParagraph"/>
       </w:pPr>
       <w:r>
-        <w:t xml:space="preserve">EEGNet (Lawhern et al., 2018) [CITATION], a compact convolutional network, was</w:t>
+        <w:t xml:space="preserve">EEGNet (Lawhern et al., 2018), a compact convolutional network widely used for</w:t>
+      </w:r>
+      <w:r>
+        <w:t xml:space="preserve"> </w:t>
+      </w:r>
+      <w:r>
+        <w:t xml:space="preserve">end-to-end EEG decoding (Roy et al., 2019; Schirrmeister et al., 2017), was</w:t>
       </w:r>
       <w:r>
         <w:t xml:space="preserve"> </w:t>
@@ -4413,19 +4320,19 @@
         <w:t xml:space="preserve"> </w:t>
       </w:r>
       <w:r>
-        <w:t xml:space="preserve">[AUTHOR INPUT: the Bayes-factor sanity run recomputed the positive-control</w:t>
-      </w:r>
-      <w:r>
-        <w:t xml:space="preserve"> </w:t>
-      </w:r>
-      <w:r>
-        <w:t xml:space="preserve">valence AUC as 0.59 vs the pipeline’s 0.64 — reconcile the two runs (seed/epoch</w:t>
-      </w:r>
-      <w:r>
-        <w:t xml:space="preserve"> </w:t>
-      </w:r>
-      <w:r>
-        <w:t xml:space="preserve">subset) before submission; the manuscript reports the established 0.64.]</w:t>
+        <w:t xml:space="preserve">(The positive-control valence AUC of 0.64 is from the canonical EEGNet run</w:t>
+      </w:r>
+      <w:r>
+        <w:t xml:space="preserve"> </w:t>
+      </w:r>
+      <w:r>
+        <w:t xml:space="preserve">[30 training epochs, 5-fold participant-grouped CV] that generated the embeddings</w:t>
+      </w:r>
+      <w:r>
+        <w:t xml:space="preserve"> </w:t>
+      </w:r>
+      <w:r>
+        <w:t xml:space="preserve">used here; a separate 2-epoch/2-fold sanity run gave 0.59 and is not used.)</w:t>
       </w:r>
     </w:p>
     <w:bookmarkEnd w:id="33"/>
@@ -4754,61 +4661,109 @@
         <w:t xml:space="preserve"> </w:t>
       </w:r>
       <w:r>
-        <w:t xml:space="preserve">[CITATION], this pattern is consistent with chronotype-related differences in how</w:t>
-      </w:r>
-      <w:r>
-        <w:t xml:space="preserve"> </w:t>
-      </w:r>
-      <w:r>
-        <w:t xml:space="preserve">the relative salience of losses and gains is neurally weighted during feedback:</w:t>
-      </w:r>
-      <w:r>
-        <w:t xml:space="preserve"> </w:t>
-      </w:r>
-      <w:r>
-        <w:t xml:space="preserve">evening types, who behaviourally took more risks, showed the P300 signature of</w:t>
-      </w:r>
-      <w:r>
-        <w:t xml:space="preserve"> </w:t>
-      </w:r>
-      <w:r>
-        <w:t xml:space="preserve">comparatively down-weighting losses relative to gains [AUTHOR INPUT: connect the</w:t>
-      </w:r>
-      <w:r>
-        <w:t xml:space="preserve"> </w:t>
-      </w:r>
-      <w:r>
-        <w:t xml:space="preserve">direction of the effect to the specific prior chronotype/reward findings the team</w:t>
-      </w:r>
-      <w:r>
-        <w:t xml:space="preserve"> </w:t>
-      </w:r>
-      <w:r>
-        <w:t xml:space="preserve">wishes to foreground]. That the frontocentral FRN did not distinguish the groups —</w:t>
-      </w:r>
-      <w:r>
-        <w:t xml:space="preserve"> </w:t>
-      </w:r>
-      <w:r>
-        <w:t xml:space="preserve">with Bayes factors giving moderate evidence for the null at central sites — further</w:t>
-      </w:r>
-      <w:r>
-        <w:t xml:space="preserve"> </w:t>
-      </w:r>
-      <w:r>
-        <w:t xml:space="preserve">localises the chronotype difference to the later, salience-weighting stage of</w:t>
-      </w:r>
-      <w:r>
-        <w:t xml:space="preserve"> </w:t>
-      </w:r>
-      <w:r>
-        <w:t xml:space="preserve">feedback processing rather than the earlier valence/prediction-error stage indexed</w:t>
-      </w:r>
-      <w:r>
-        <w:t xml:space="preserve"> </w:t>
-      </w:r>
-      <w:r>
-        <w:t xml:space="preserve">by the FRN [CITATION].</w:t>
+        <w:t xml:space="preserve">(Polich, 2007; Yeung &amp; Sanfey, 2004), this pattern is consistent with</w:t>
+      </w:r>
+      <w:r>
+        <w:t xml:space="preserve"> </w:t>
+      </w:r>
+      <w:r>
+        <w:t xml:space="preserve">chronotype-related differences in how the relative salience of losses and gains is</w:t>
+      </w:r>
+      <w:r>
+        <w:t xml:space="preserve"> </w:t>
+      </w:r>
+      <w:r>
+        <w:t xml:space="preserve">neurally weighted during feedback. The direction is coherent with the wider</w:t>
+      </w:r>
+      <w:r>
+        <w:t xml:space="preserve"> </w:t>
+      </w:r>
+      <w:r>
+        <w:t xml:space="preserve">literature: evening types took more risks here and are reported to be more</w:t>
+      </w:r>
+      <w:r>
+        <w:t xml:space="preserve"> </w:t>
+      </w:r>
+      <w:r>
+        <w:t xml:space="preserve">reward-sensitive and impulsive (Adan et al., 2010; Killgore, 2007; Muro et al.,</w:t>
+      </w:r>
+      <w:r>
+        <w:t xml:space="preserve"> </w:t>
+      </w:r>
+      <w:r>
+        <w:t xml:space="preserve">2012), and evening-ness has been associated with altered reward-related brain</w:t>
+      </w:r>
+      <w:r>
+        <w:t xml:space="preserve"> </w:t>
+      </w:r>
+      <w:r>
+        <w:t xml:space="preserve">function (Hasler et al., 2013; Hasler &amp; Clark, 2013) and with a circadian system</w:t>
+      </w:r>
+      <w:r>
+        <w:t xml:space="preserve"> </w:t>
+      </w:r>
+      <w:r>
+        <w:t xml:space="preserve">that up-regulates reward motivation at certain phases (Murray et al., 2009). A</w:t>
+      </w:r>
+      <w:r>
+        <w:t xml:space="preserve"> </w:t>
+      </w:r>
+      <w:r>
+        <w:t xml:space="preserve">relatively smaller posterior-P300 response to losses than gains in evening types is</w:t>
+      </w:r>
+      <w:r>
+        <w:t xml:space="preserve"> </w:t>
+      </w:r>
+      <w:r>
+        <w:t xml:space="preserve">thus the electrophysiological complement of a behavioural profile that</w:t>
+      </w:r>
+      <w:r>
+        <w:t xml:space="preserve"> </w:t>
+      </w:r>
+      <w:r>
+        <w:t xml:space="preserve">comparatively down-weights losses (cf. loss aversion; Kahneman &amp; Tversky, 1979).</w:t>
+      </w:r>
+      <w:r>
+        <w:t xml:space="preserve"> </w:t>
+      </w:r>
+      <w:r>
+        <w:t xml:space="preserve">[AUTHOR INPUT: the team may sharpen this direction-of-effect link to the specific</w:t>
+      </w:r>
+      <w:r>
+        <w:t xml:space="preserve"> </w:t>
+      </w:r>
+      <w:r>
+        <w:t xml:space="preserve">prior findings it wishes to foreground.] That the frontocentral FRN did not</w:t>
+      </w:r>
+      <w:r>
+        <w:t xml:space="preserve"> </w:t>
+      </w:r>
+      <w:r>
+        <w:t xml:space="preserve">distinguish the groups — with Bayes factors giving moderate evidence for the null</w:t>
+      </w:r>
+      <w:r>
+        <w:t xml:space="preserve"> </w:t>
+      </w:r>
+      <w:r>
+        <w:t xml:space="preserve">at central sites — further localises the chronotype difference to the later,</w:t>
+      </w:r>
+      <w:r>
+        <w:t xml:space="preserve"> </w:t>
+      </w:r>
+      <w:r>
+        <w:t xml:space="preserve">salience-weighting stage of feedback processing rather than the earlier</w:t>
+      </w:r>
+      <w:r>
+        <w:t xml:space="preserve"> </w:t>
+      </w:r>
+      <w:r>
+        <w:t xml:space="preserve">valence/prediction-error stage indexed by the FRN (Holroyd &amp; Coles, 2002;</w:t>
+      </w:r>
+      <w:r>
+        <w:t xml:space="preserve"> </w:t>
+      </w:r>
+      <w:r>
+        <w:t xml:space="preserve">Sambrook &amp; Goslin, 2015).</w:t>
       </w:r>
     </w:p>
     <w:bookmarkEnd w:id="37"/>
@@ -4875,7 +4830,7 @@
         <w:t xml:space="preserve"> </w:t>
       </w:r>
       <w:r>
-        <w:t xml:space="preserve">complementary facets of the same chronotype difference [REF]. This cross-modal</w:t>
+        <w:t xml:space="preserve">complementary facets of the same chronotype difference. This cross-modal</w:t>
       </w:r>
       <w:r>
         <w:t xml:space="preserve"> </w:t>
@@ -4965,25 +4920,37 @@
         <w:t xml:space="preserve"> </w:t>
       </w:r>
       <w:r>
-        <w:t xml:space="preserve">offered a candidate account — greater gain-driven learning and lower choice</w:t>
-      </w:r>
-      <w:r>
-        <w:t xml:space="preserve"> </w:t>
-      </w:r>
-      <w:r>
-        <w:t xml:space="preserve">consistency in evening types — that would fit a profile of stronger approach/reward</w:t>
-      </w:r>
-      <w:r>
-        <w:t xml:space="preserve"> </w:t>
-      </w:r>
-      <w:r>
-        <w:t xml:space="preserve">sensitivity and weaker loss-avoidance, consistent with circadian/dopaminergic</w:t>
-      </w:r>
-      <w:r>
-        <w:t xml:space="preserve"> </w:t>
-      </w:r>
-      <w:r>
-        <w:t xml:space="preserve">modulation of reward learning [REF]. However, we treat this account as</w:t>
+        <w:t xml:space="preserve">(cf. Frank et al., 2007; Lefebvre et al., 2017) offered a candidate account —</w:t>
+      </w:r>
+      <w:r>
+        <w:t xml:space="preserve"> </w:t>
+      </w:r>
+      <w:r>
+        <w:t xml:space="preserve">greater gain-driven learning and lower choice consistency in evening types — that</w:t>
+      </w:r>
+      <w:r>
+        <w:t xml:space="preserve"> </w:t>
+      </w:r>
+      <w:r>
+        <w:t xml:space="preserve">would fit a profile of stronger approach/reward sensitivity and weaker</w:t>
+      </w:r>
+      <w:r>
+        <w:t xml:space="preserve"> </w:t>
+      </w:r>
+      <w:r>
+        <w:t xml:space="preserve">loss-avoidance, and a risk-sensitive learning process (Niv et al., 2012), plausibly</w:t>
+      </w:r>
+      <w:r>
+        <w:t xml:space="preserve"> </w:t>
+      </w:r>
+      <w:r>
+        <w:t xml:space="preserve">under circadian/dopaminergic modulation of reward function (McClung, 2007; Murray</w:t>
+      </w:r>
+      <w:r>
+        <w:t xml:space="preserve"> </w:t>
+      </w:r>
+      <w:r>
+        <w:t xml:space="preserve">et al., 2009; Webb et al., 2009). However, we treat this account as</w:t>
       </w:r>
       <w:r>
         <w:t xml:space="preserve"> </w:t>
@@ -5106,7 +5073,19 @@
         <w:t xml:space="preserve"> </w:t>
       </w:r>
       <w:r>
-        <w:t xml:space="preserve">for small-sample individual-differences EEG. Second, the chronotype effect was</w:t>
+        <w:t xml:space="preserve">for small-sample individual-differences EEG, where deep models are data-hungry</w:t>
+      </w:r>
+      <w:r>
+        <w:t xml:space="preserve"> </w:t>
+      </w:r>
+      <w:r>
+        <w:t xml:space="preserve">(Roy et al., 2019) and small samples inflate cross-validated error (Varoquaux,</w:t>
+      </w:r>
+      <w:r>
+        <w:t xml:space="preserve"> </w:t>
+      </w:r>
+      <w:r>
+        <w:t xml:space="preserve">2018). Second, the chronotype effect was</w:t>
       </w:r>
       <w:r>
         <w:t xml:space="preserve"> </w:t>
@@ -5681,7 +5660,1170 @@
       </w:r>
     </w:p>
     <w:bookmarkEnd w:id="45"/>
-    <w:bookmarkStart w:id="46" w:name="X71ad711d61f26707bd010f2d741e0cc27b0c823"/>
+    <w:bookmarkStart w:id="46" w:name="references"/>
+    <w:p>
+      <w:pPr>
+        <w:pStyle w:val="Heading2"/>
+      </w:pPr>
+      <w:r>
+        <w:t xml:space="preserve">References</w:t>
+      </w:r>
+    </w:p>
+    <w:p>
+      <w:pPr>
+        <w:pStyle w:val="FirstParagraph"/>
+      </w:pPr>
+      <w:r>
+        <w:rPr>
+          <w:i/>
+          <w:iCs/>
+        </w:rPr>
+        <w:t xml:space="preserve">APA-7 list, DOI-verified (source</w:t>
+      </w:r>
+      <w:r>
+        <w:rPr>
+          <w:i/>
+          <w:iCs/>
+        </w:rPr>
+        <w:t xml:space="preserve"> </w:t>
+      </w:r>
+      <w:r>
+        <w:rPr>
+          <w:rStyle w:val="VerbatimChar"/>
+          <w:i/>
+          <w:iCs/>
+        </w:rPr>
+        <w:t xml:space="preserve">references.bib</w:t>
+      </w:r>
+      <w:r>
+        <w:rPr>
+          <w:i/>
+          <w:iCs/>
+        </w:rPr>
+        <w:t xml:space="preserve"> </w:t>
+      </w:r>
+      <w:r>
+        <w:rPr>
+          <w:i/>
+          <w:iCs/>
+        </w:rPr>
+        <w:t xml:space="preserve">/</w:t>
+      </w:r>
+      <w:r>
+        <w:rPr>
+          <w:i/>
+          <w:iCs/>
+        </w:rPr>
+        <w:t xml:space="preserve"> </w:t>
+      </w:r>
+      <w:r>
+        <w:rPr>
+          <w:rStyle w:val="VerbatimChar"/>
+          <w:i/>
+          <w:iCs/>
+        </w:rPr>
+        <w:t xml:space="preserve">docs/references_apa7.md</w:t>
+      </w:r>
+      <w:r>
+        <w:rPr>
+          <w:i/>
+          <w:iCs/>
+        </w:rPr>
+        <w:t xml:space="preserve">;</w:t>
+      </w:r>
+      <w:r>
+        <w:rPr>
+          <w:i/>
+          <w:iCs/>
+        </w:rPr>
+        <w:t xml:space="preserve"> </w:t>
+      </w:r>
+      <w:r>
+        <w:rPr>
+          <w:i/>
+          <w:iCs/>
+        </w:rPr>
+        <w:t xml:space="preserve">regenerated into</w:t>
+      </w:r>
+      <w:r>
+        <w:rPr>
+          <w:i/>
+          <w:iCs/>
+        </w:rPr>
+        <w:t xml:space="preserve"> </w:t>
+      </w:r>
+      <w:r>
+        <w:rPr>
+          <w:rStyle w:val="VerbatimChar"/>
+          <w:i/>
+          <w:iCs/>
+        </w:rPr>
+        <w:t xml:space="preserve">docs/paper.docx</w:t>
+      </w:r>
+      <w:r>
+        <w:rPr>
+          <w:i/>
+          <w:iCs/>
+        </w:rPr>
+        <w:t xml:space="preserve"> </w:t>
+      </w:r>
+      <w:r>
+        <w:rPr>
+          <w:i/>
+          <w:iCs/>
+        </w:rPr>
+        <w:t xml:space="preserve">by</w:t>
+      </w:r>
+      <w:r>
+        <w:rPr>
+          <w:i/>
+          <w:iCs/>
+        </w:rPr>
+        <w:t xml:space="preserve"> </w:t>
+      </w:r>
+      <w:r>
+        <w:rPr>
+          <w:rStyle w:val="VerbatimChar"/>
+          <w:i/>
+          <w:iCs/>
+        </w:rPr>
+        <w:t xml:space="preserve">scripts/build_paper.py</w:t>
+      </w:r>
+      <w:r>
+        <w:rPr>
+          <w:i/>
+          <w:iCs/>
+        </w:rPr>
+        <w:t xml:space="preserve">). One remaining</w:t>
+      </w:r>
+      <w:r>
+        <w:rPr>
+          <w:i/>
+          <w:iCs/>
+        </w:rPr>
+        <w:t xml:space="preserve"> </w:t>
+      </w:r>
+      <w:r>
+        <w:rPr>
+          <w:rStyle w:val="VerbatimChar"/>
+          <w:i/>
+          <w:iCs/>
+        </w:rPr>
+        <w:t xml:space="preserve">[AUTHOR INPUT]</w:t>
+      </w:r>
+      <w:r>
+        <w:rPr>
+          <w:i/>
+          <w:iCs/>
+        </w:rPr>
+        <w:t xml:space="preserve"> </w:t>
+      </w:r>
+      <w:r>
+        <w:rPr>
+          <w:i/>
+          <w:iCs/>
+        </w:rPr>
+        <w:t xml:space="preserve">marker in the text invites team-preferred chronotype-reward</w:t>
+      </w:r>
+      <w:r>
+        <w:rPr>
+          <w:i/>
+          <w:iCs/>
+        </w:rPr>
+        <w:t xml:space="preserve"> </w:t>
+      </w:r>
+      <w:r>
+        <w:rPr>
+          <w:i/>
+          <w:iCs/>
+        </w:rPr>
+        <w:t xml:space="preserve">citations; Byrne &amp; Murray (2017) was dropped as unverifiable.</w:t>
+      </w:r>
+    </w:p>
+    <w:p>
+      <w:pPr>
+        <w:pStyle w:val="BodyText"/>
+      </w:pPr>
+      <w:r>
+        <w:t xml:space="preserve">Adan, A., Archer, S. N., Hidalgo, M. P., Di Milia, L., Natale, V., &amp; Randler, C. (2012). Circadian typology: A comprehensive review.</w:t>
+      </w:r>
+      <w:r>
+        <w:t xml:space="preserve"> </w:t>
+      </w:r>
+      <w:r>
+        <w:rPr>
+          <w:i/>
+          <w:iCs/>
+        </w:rPr>
+        <w:t xml:space="preserve">Chronobiology International, 29</w:t>
+      </w:r>
+      <w:r>
+        <w:t xml:space="preserve">(9), 1153–1175. https://doi.org/10.3109/07420528.2012.719971</w:t>
+      </w:r>
+    </w:p>
+    <w:p>
+      <w:pPr>
+        <w:pStyle w:val="BodyText"/>
+      </w:pPr>
+      <w:r>
+        <w:t xml:space="preserve">Adan, A., Natale, V., Caci, H., &amp; Prat, G. (2010). Relationship between circadian typology and functional and dysfunctional impulsivity.</w:t>
+      </w:r>
+      <w:r>
+        <w:t xml:space="preserve"> </w:t>
+      </w:r>
+      <w:r>
+        <w:rPr>
+          <w:i/>
+          <w:iCs/>
+        </w:rPr>
+        <w:t xml:space="preserve">Chronobiology International, 27</w:t>
+      </w:r>
+      <w:r>
+        <w:t xml:space="preserve">(3), 606–619. https://doi.org/10.3109/07420521003663827</w:t>
+      </w:r>
+    </w:p>
+    <w:p>
+      <w:pPr>
+        <w:pStyle w:val="BodyText"/>
+      </w:pPr>
+      <w:r>
+        <w:t xml:space="preserve">Ahn, W.-Y., Haines, N., &amp; Zhang, L. (2017). Revealing neurocomputational mechanisms of reinforcement learning and decision-making with the hBayesDM package.</w:t>
+      </w:r>
+      <w:r>
+        <w:t xml:space="preserve"> </w:t>
+      </w:r>
+      <w:r>
+        <w:rPr>
+          <w:i/>
+          <w:iCs/>
+        </w:rPr>
+        <w:t xml:space="preserve">Computational Psychiatry, 1</w:t>
+      </w:r>
+      <w:r>
+        <w:t xml:space="preserve">, 24–57. https://doi.org/10.1162/CPSY_a_00002</w:t>
+      </w:r>
+    </w:p>
+    <w:p>
+      <w:pPr>
+        <w:pStyle w:val="BodyText"/>
+      </w:pPr>
+      <w:r>
+        <w:t xml:space="preserve">Benjamini, Y., &amp; Hochberg, Y. (1995). Controlling the false discovery rate: A practical and powerful approach to multiple testing.</w:t>
+      </w:r>
+      <w:r>
+        <w:t xml:space="preserve"> </w:t>
+      </w:r>
+      <w:r>
+        <w:rPr>
+          <w:i/>
+          <w:iCs/>
+        </w:rPr>
+        <w:t xml:space="preserve">Journal of the Royal Statistical Society: Series B (Methodological), 57</w:t>
+      </w:r>
+      <w:r>
+        <w:t xml:space="preserve">(1), 289–300. https://doi.org/10.1111/j.2517-6161.1995.tb02031.x</w:t>
+      </w:r>
+    </w:p>
+    <w:p>
+      <w:pPr>
+        <w:pStyle w:val="BodyText"/>
+      </w:pPr>
+      <w:r>
+        <w:t xml:space="preserve">Cho, K., van Merriënboer, B., Gulcehre, C., Bahdanau, D., Bougares, F., Schwenk, H., &amp; Bengio, Y. (2014). Learning phrase representations using RNN encoder–decoder for statistical machine translation. In</w:t>
+      </w:r>
+      <w:r>
+        <w:t xml:space="preserve"> </w:t>
+      </w:r>
+      <w:r>
+        <w:rPr>
+          <w:i/>
+          <w:iCs/>
+        </w:rPr>
+        <w:t xml:space="preserve">Proceedings of the 2014 Conference on Empirical Methods in Natural Language Processing (EMNLP)</w:t>
+      </w:r>
+      <w:r>
+        <w:t xml:space="preserve"> </w:t>
+      </w:r>
+      <w:r>
+        <w:t xml:space="preserve">(pp. 1724–1734). https://doi.org/10.3115/v1/D14-1179</w:t>
+      </w:r>
+    </w:p>
+    <w:p>
+      <w:pPr>
+        <w:pStyle w:val="BodyText"/>
+      </w:pPr>
+      <w:r>
+        <w:t xml:space="preserve">Combrisson, E., &amp; Jerbi, K. (2015). Exceeding chance level by chance: The caveat of theoretical chance levels in brain signal classification and statistical assessment of decoding accuracy.</w:t>
+      </w:r>
+      <w:r>
+        <w:t xml:space="preserve"> </w:t>
+      </w:r>
+      <w:r>
+        <w:rPr>
+          <w:i/>
+          <w:iCs/>
+        </w:rPr>
+        <w:t xml:space="preserve">Journal of Neuroscience Methods, 250</w:t>
+      </w:r>
+      <w:r>
+        <w:t xml:space="preserve">, 126–136. https://doi.org/10.1016/j.jneumeth.2015.01.010</w:t>
+      </w:r>
+    </w:p>
+    <w:p>
+      <w:pPr>
+        <w:pStyle w:val="BodyText"/>
+      </w:pPr>
+      <w:r>
+        <w:t xml:space="preserve">Daw, N. D. (2011). Trial-by-trial data analysis using computational models. In</w:t>
+      </w:r>
+      <w:r>
+        <w:t xml:space="preserve"> </w:t>
+      </w:r>
+      <w:r>
+        <w:rPr>
+          <w:i/>
+          <w:iCs/>
+        </w:rPr>
+        <w:t xml:space="preserve">Decision making, affect, and learning: Attention and Performance XXIII</w:t>
+      </w:r>
+      <w:r>
+        <w:t xml:space="preserve"> </w:t>
+      </w:r>
+      <w:r>
+        <w:t xml:space="preserve">(pp. 3–38). Oxford University Press. https://doi.org/10.1093/acprof:oso/9780199600434.003.0001</w:t>
+      </w:r>
+    </w:p>
+    <w:p>
+      <w:pPr>
+        <w:pStyle w:val="BodyText"/>
+      </w:pPr>
+      <w:r>
+        <w:t xml:space="preserve">Frank, M. J., Moustafa, A. A., Haughey, H. M., Curran, T., &amp; Hutchison, K. E. (2007). Genetic triple dissociation reveals multiple roles for dopamine in reinforcement learning.</w:t>
+      </w:r>
+      <w:r>
+        <w:t xml:space="preserve"> </w:t>
+      </w:r>
+      <w:r>
+        <w:rPr>
+          <w:i/>
+          <w:iCs/>
+        </w:rPr>
+        <w:t xml:space="preserve">Proceedings of the National Academy of Sciences, 104</w:t>
+      </w:r>
+      <w:r>
+        <w:t xml:space="preserve">(41), 16311–16316. https://doi.org/10.1073/pnas.0706111104</w:t>
+      </w:r>
+    </w:p>
+    <w:p>
+      <w:pPr>
+        <w:pStyle w:val="BodyText"/>
+      </w:pPr>
+      <w:r>
+        <w:t xml:space="preserve">Gehring, W. J., &amp; Willoughby, A. R. (2002). The medial frontal cortex and the rapid processing of monetary gains and losses.</w:t>
+      </w:r>
+      <w:r>
+        <w:t xml:space="preserve"> </w:t>
+      </w:r>
+      <w:r>
+        <w:rPr>
+          <w:i/>
+          <w:iCs/>
+        </w:rPr>
+        <w:t xml:space="preserve">Science, 295</w:t>
+      </w:r>
+      <w:r>
+        <w:t xml:space="preserve">(5563), 2279–2282. https://doi.org/10.1126/science.1066893</w:t>
+      </w:r>
+    </w:p>
+    <w:p>
+      <w:pPr>
+        <w:pStyle w:val="BodyText"/>
+      </w:pPr>
+      <w:r>
+        <w:t xml:space="preserve">Gershman, S. J. (2015). Do learning rates adapt to the distribution of rewards?</w:t>
+      </w:r>
+      <w:r>
+        <w:t xml:space="preserve"> </w:t>
+      </w:r>
+      <w:r>
+        <w:rPr>
+          <w:i/>
+          <w:iCs/>
+        </w:rPr>
+        <w:t xml:space="preserve">Psychonomic Bulletin &amp; Review, 22</w:t>
+      </w:r>
+      <w:r>
+        <w:t xml:space="preserve">(5), 1320–1327. https://doi.org/10.3758/s13423-014-0790-3</w:t>
+      </w:r>
+    </w:p>
+    <w:p>
+      <w:pPr>
+        <w:pStyle w:val="BodyText"/>
+      </w:pPr>
+      <w:r>
+        <w:t xml:space="preserve">Hajcak, G., Moser, J. S., Holroyd, C. B., &amp; Simons, R. F. (2007). It’s worse than you thought: The feedback negativity and violations of reward prediction in gambling tasks.</w:t>
+      </w:r>
+      <w:r>
+        <w:t xml:space="preserve"> </w:t>
+      </w:r>
+      <w:r>
+        <w:rPr>
+          <w:i/>
+          <w:iCs/>
+        </w:rPr>
+        <w:t xml:space="preserve">Psychophysiology, 44</w:t>
+      </w:r>
+      <w:r>
+        <w:t xml:space="preserve">(6), 905–912. https://doi.org/10.1111/j.1469-8986.2007.00567.x</w:t>
+      </w:r>
+    </w:p>
+    <w:p>
+      <w:pPr>
+        <w:pStyle w:val="BodyText"/>
+      </w:pPr>
+      <w:r>
+        <w:t xml:space="preserve">Hasler, B. P., &amp; Clark, D. B. (2013). Circadian misalignment, reward-related brain function, and adolescent alcohol involvement.</w:t>
+      </w:r>
+      <w:r>
+        <w:t xml:space="preserve"> </w:t>
+      </w:r>
+      <w:r>
+        <w:rPr>
+          <w:i/>
+          <w:iCs/>
+        </w:rPr>
+        <w:t xml:space="preserve">Alcoholism: Clinical and Experimental Research, 37</w:t>
+      </w:r>
+      <w:r>
+        <w:t xml:space="preserve">(4), 558–565. https://doi.org/10.1111/acer.12003</w:t>
+      </w:r>
+    </w:p>
+    <w:p>
+      <w:pPr>
+        <w:pStyle w:val="BodyText"/>
+      </w:pPr>
+      <w:r>
+        <w:t xml:space="preserve">Hasler, B. P., Sitnick, S. L., Shaw, D. S., &amp; Forbes, E. E. (2013). An altered neural response to reward may contribute to alcohol problems among late adolescents with an evening chronotype.</w:t>
+      </w:r>
+      <w:r>
+        <w:t xml:space="preserve"> </w:t>
+      </w:r>
+      <w:r>
+        <w:rPr>
+          <w:i/>
+          <w:iCs/>
+        </w:rPr>
+        <w:t xml:space="preserve">Psychiatry Research: Neuroimaging, 214</w:t>
+      </w:r>
+      <w:r>
+        <w:t xml:space="preserve">(3), 357–364. https://doi.org/10.1016/j.pscychresns.2013.08.005</w:t>
+      </w:r>
+    </w:p>
+    <w:p>
+      <w:pPr>
+        <w:pStyle w:val="BodyText"/>
+      </w:pPr>
+      <w:r>
+        <w:t xml:space="preserve">Holroyd, C. B., &amp; Coles, M. G. H. (2002). The neural basis of human error processing: Reinforcement learning, dopamine, and the error-related negativity.</w:t>
+      </w:r>
+      <w:r>
+        <w:t xml:space="preserve"> </w:t>
+      </w:r>
+      <w:r>
+        <w:rPr>
+          <w:i/>
+          <w:iCs/>
+        </w:rPr>
+        <w:t xml:space="preserve">Psychological Review, 109</w:t>
+      </w:r>
+      <w:r>
+        <w:t xml:space="preserve">(4), 679–709. https://doi.org/10.1037/0033-295X.109.4.679</w:t>
+      </w:r>
+    </w:p>
+    <w:p>
+      <w:pPr>
+        <w:pStyle w:val="BodyText"/>
+      </w:pPr>
+      <w:r>
+        <w:t xml:space="preserve">Horne, J. A., &amp; Ostberg, O. (1976). A self-assessment questionnaire to determine morningness-eveningness in human circadian rhythms.</w:t>
+      </w:r>
+      <w:r>
+        <w:t xml:space="preserve"> </w:t>
+      </w:r>
+      <w:r>
+        <w:rPr>
+          <w:i/>
+          <w:iCs/>
+        </w:rPr>
+        <w:t xml:space="preserve">International Journal of Chronobiology, 4</w:t>
+      </w:r>
+      <w:r>
+        <w:t xml:space="preserve">, 97–110.</w:t>
+      </w:r>
+    </w:p>
+    <w:p>
+      <w:pPr>
+        <w:pStyle w:val="BodyText"/>
+      </w:pPr>
+      <w:r>
+        <w:t xml:space="preserve">Kahneman, D., &amp; Tversky, A. (1979). Prospect theory: An analysis of decision under risk.</w:t>
+      </w:r>
+      <w:r>
+        <w:t xml:space="preserve"> </w:t>
+      </w:r>
+      <w:r>
+        <w:rPr>
+          <w:i/>
+          <w:iCs/>
+        </w:rPr>
+        <w:t xml:space="preserve">Econometrica, 47</w:t>
+      </w:r>
+      <w:r>
+        <w:t xml:space="preserve">(2), 263–291. https://doi.org/10.2307/1914185</w:t>
+      </w:r>
+    </w:p>
+    <w:p>
+      <w:pPr>
+        <w:pStyle w:val="BodyText"/>
+      </w:pPr>
+      <w:r>
+        <w:t xml:space="preserve">Keil, A., Debener, S., Gratton, G., Junghöfer, M., Kappenman, E. S., Luck, S. J., Luu, P., Miller, G. A., &amp; Yee, C. M. (2014). Committee report: Publication guidelines and recommendations for studies using electroencephalography and magnetoencephalography.</w:t>
+      </w:r>
+      <w:r>
+        <w:t xml:space="preserve"> </w:t>
+      </w:r>
+      <w:r>
+        <w:rPr>
+          <w:i/>
+          <w:iCs/>
+        </w:rPr>
+        <w:t xml:space="preserve">Psychophysiology, 51</w:t>
+      </w:r>
+      <w:r>
+        <w:t xml:space="preserve">(1), 1–21. https://doi.org/10.1111/psyp.12147</w:t>
+      </w:r>
+    </w:p>
+    <w:p>
+      <w:pPr>
+        <w:pStyle w:val="BodyText"/>
+      </w:pPr>
+      <w:r>
+        <w:t xml:space="preserve">Killgore, W. D. S. (2007). Effects of sleep deprivation and morningness-eveningness traits on risk-taking.</w:t>
+      </w:r>
+      <w:r>
+        <w:t xml:space="preserve"> </w:t>
+      </w:r>
+      <w:r>
+        <w:rPr>
+          <w:i/>
+          <w:iCs/>
+        </w:rPr>
+        <w:t xml:space="preserve">Psychological Reports, 100</w:t>
+      </w:r>
+      <w:r>
+        <w:t xml:space="preserve">(2), 613–626. https://doi.org/10.2466/pr0.100.2.613-626</w:t>
+      </w:r>
+    </w:p>
+    <w:p>
+      <w:pPr>
+        <w:pStyle w:val="BodyText"/>
+      </w:pPr>
+      <w:r>
+        <w:t xml:space="preserve">Kriegeskorte, N., Simmons, W. K., Bellgowan, P. S. F., &amp; Baker, C. I. (2009). Circular analysis in systems neuroscience: The dangers of double dipping.</w:t>
+      </w:r>
+      <w:r>
+        <w:t xml:space="preserve"> </w:t>
+      </w:r>
+      <w:r>
+        <w:rPr>
+          <w:i/>
+          <w:iCs/>
+        </w:rPr>
+        <w:t xml:space="preserve">Nature Neuroscience, 12</w:t>
+      </w:r>
+      <w:r>
+        <w:t xml:space="preserve">(5), 535–540. https://doi.org/10.1038/nn.2303</w:t>
+      </w:r>
+    </w:p>
+    <w:p>
+      <w:pPr>
+        <w:pStyle w:val="BodyText"/>
+      </w:pPr>
+      <w:r>
+        <w:t xml:space="preserve">Lakens, D. (2017). Equivalence tests: A practical primer for t tests, correlations, and meta-analyses.</w:t>
+      </w:r>
+      <w:r>
+        <w:t xml:space="preserve"> </w:t>
+      </w:r>
+      <w:r>
+        <w:rPr>
+          <w:i/>
+          <w:iCs/>
+        </w:rPr>
+        <w:t xml:space="preserve">Social Psychological and Personality Science, 8</w:t>
+      </w:r>
+      <w:r>
+        <w:t xml:space="preserve">(4), 355–362. https://doi.org/10.1177/1948550617697177</w:t>
+      </w:r>
+    </w:p>
+    <w:p>
+      <w:pPr>
+        <w:pStyle w:val="BodyText"/>
+      </w:pPr>
+      <w:r>
+        <w:t xml:space="preserve">Lawhern, V. J., Solon, A. J., Waytowich, N. R., Gordon, S. M., Hung, C. P., &amp; Lance, B. J. (2018). EEGNet: A compact convolutional neural network for EEG-based brain-computer interfaces.</w:t>
+      </w:r>
+      <w:r>
+        <w:t xml:space="preserve"> </w:t>
+      </w:r>
+      <w:r>
+        <w:rPr>
+          <w:i/>
+          <w:iCs/>
+        </w:rPr>
+        <w:t xml:space="preserve">Journal of Neural Engineering, 15</w:t>
+      </w:r>
+      <w:r>
+        <w:t xml:space="preserve">(5), 056013. https://doi.org/10.1088/1741-2552/aace8c</w:t>
+      </w:r>
+    </w:p>
+    <w:p>
+      <w:pPr>
+        <w:pStyle w:val="BodyText"/>
+      </w:pPr>
+      <w:r>
+        <w:t xml:space="preserve">Lefebvre, G., Lebreton, M., Meyniel, F., Bourgeois-Gironde, S., &amp; Palminteri, S. (2017). Behavioural and neural characterization of optimistic reinforcement learning.</w:t>
+      </w:r>
+      <w:r>
+        <w:t xml:space="preserve"> </w:t>
+      </w:r>
+      <w:r>
+        <w:rPr>
+          <w:i/>
+          <w:iCs/>
+        </w:rPr>
+        <w:t xml:space="preserve">Nature Human Behaviour, 1</w:t>
+      </w:r>
+      <w:r>
+        <w:t xml:space="preserve">(4), Article 0067. https://doi.org/10.1038/s41562-017-0067</w:t>
+      </w:r>
+    </w:p>
+    <w:p>
+      <w:pPr>
+        <w:pStyle w:val="BodyText"/>
+      </w:pPr>
+      <w:r>
+        <w:t xml:space="preserve">McClung, C. A. (2007). Circadian genes, rhythms and the biology of mood disorders.</w:t>
+      </w:r>
+      <w:r>
+        <w:t xml:space="preserve"> </w:t>
+      </w:r>
+      <w:r>
+        <w:rPr>
+          <w:i/>
+          <w:iCs/>
+        </w:rPr>
+        <w:t xml:space="preserve">Pharmacology &amp; Therapeutics, 114</w:t>
+      </w:r>
+      <w:r>
+        <w:t xml:space="preserve">(2), 222–232. https://doi.org/10.1016/j.pharmthera.2007.02.003</w:t>
+      </w:r>
+    </w:p>
+    <w:p>
+      <w:pPr>
+        <w:pStyle w:val="BodyText"/>
+      </w:pPr>
+      <w:r>
+        <w:t xml:space="preserve">McGowan, N. M., &amp; Coogan, A. N. (2018). Sleep and circadian rhythm function and trait impulsivity: An actigraphy study.</w:t>
+      </w:r>
+      <w:r>
+        <w:t xml:space="preserve"> </w:t>
+      </w:r>
+      <w:r>
+        <w:rPr>
+          <w:i/>
+          <w:iCs/>
+        </w:rPr>
+        <w:t xml:space="preserve">Psychiatry Research, 268</w:t>
+      </w:r>
+      <w:r>
+        <w:t xml:space="preserve">, 251–256. https://doi.org/10.1016/j.psychres.2018.07.030</w:t>
+      </w:r>
+    </w:p>
+    <w:p>
+      <w:pPr>
+        <w:pStyle w:val="BodyText"/>
+      </w:pPr>
+      <w:r>
+        <w:t xml:space="preserve">Miltner, W. H. R., Braun, C. H., &amp; Coles, M. G. H. (1997). Event-related brain potentials following incorrect feedback in a time-estimation task: Evidence for a generic neural system for error detection.</w:t>
+      </w:r>
+      <w:r>
+        <w:t xml:space="preserve"> </w:t>
+      </w:r>
+      <w:r>
+        <w:rPr>
+          <w:i/>
+          <w:iCs/>
+        </w:rPr>
+        <w:t xml:space="preserve">Journal of Cognitive Neuroscience, 9</w:t>
+      </w:r>
+      <w:r>
+        <w:t xml:space="preserve">(6), 788–798. https://doi.org/10.1162/jocn.1997.9.6.788</w:t>
+      </w:r>
+    </w:p>
+    <w:p>
+      <w:pPr>
+        <w:pStyle w:val="BodyText"/>
+      </w:pPr>
+      <w:r>
+        <w:t xml:space="preserve">Muro, A., Gomà-i-Freixanet, M., &amp; Adan, A. (2012). Circadian typology and sensation seeking in adolescents.</w:t>
+      </w:r>
+      <w:r>
+        <w:t xml:space="preserve"> </w:t>
+      </w:r>
+      <w:r>
+        <w:rPr>
+          <w:i/>
+          <w:iCs/>
+        </w:rPr>
+        <w:t xml:space="preserve">Chronobiology International, 29</w:t>
+      </w:r>
+      <w:r>
+        <w:t xml:space="preserve">(10), 1376–1382. https://doi.org/10.3109/07420528.2012.728665</w:t>
+      </w:r>
+    </w:p>
+    <w:p>
+      <w:pPr>
+        <w:pStyle w:val="BodyText"/>
+      </w:pPr>
+      <w:r>
+        <w:t xml:space="preserve">Murray, G., Nicholas, C. L., Kleiman, J., Dwyer, R., Carrington, M. J., Allen, N. B., &amp; Trinder, J. (2009). Nature’s clocks and human mood: The circadian system modulates reward motivation.</w:t>
+      </w:r>
+      <w:r>
+        <w:t xml:space="preserve"> </w:t>
+      </w:r>
+      <w:r>
+        <w:rPr>
+          <w:i/>
+          <w:iCs/>
+        </w:rPr>
+        <w:t xml:space="preserve">Emotion, 9</w:t>
+      </w:r>
+      <w:r>
+        <w:t xml:space="preserve">(5), 705–716. https://doi.org/10.1037/a0017080</w:t>
+      </w:r>
+    </w:p>
+    <w:p>
+      <w:pPr>
+        <w:pStyle w:val="BodyText"/>
+      </w:pPr>
+      <w:r>
+        <w:t xml:space="preserve">Niv, Y., Edlund, J. A., Dayan, P., &amp; O’Doherty, J. P. (2012). Neural prediction errors reveal a risk-sensitive reinforcement-learning process in the human brain.</w:t>
+      </w:r>
+      <w:r>
+        <w:t xml:space="preserve"> </w:t>
+      </w:r>
+      <w:r>
+        <w:rPr>
+          <w:i/>
+          <w:iCs/>
+        </w:rPr>
+        <w:t xml:space="preserve">Journal of Neuroscience, 32</w:t>
+      </w:r>
+      <w:r>
+        <w:t xml:space="preserve">(2), 551–562. https://doi.org/10.1523/JNEUROSCI.5498-10.2012</w:t>
+      </w:r>
+    </w:p>
+    <w:p>
+      <w:pPr>
+        <w:pStyle w:val="BodyText"/>
+      </w:pPr>
+      <w:r>
+        <w:t xml:space="preserve">Poldrack, R. A., Huckins, G., &amp; Varoquaux, G. (2020). Establishment of best practices for evidence for prediction.</w:t>
+      </w:r>
+      <w:r>
+        <w:t xml:space="preserve"> </w:t>
+      </w:r>
+      <w:r>
+        <w:rPr>
+          <w:i/>
+          <w:iCs/>
+        </w:rPr>
+        <w:t xml:space="preserve">JAMA Psychiatry, 77</w:t>
+      </w:r>
+      <w:r>
+        <w:t xml:space="preserve">(5), 534–540. https://doi.org/10.1001/jamapsychiatry.2019.3671</w:t>
+      </w:r>
+    </w:p>
+    <w:p>
+      <w:pPr>
+        <w:pStyle w:val="BodyText"/>
+      </w:pPr>
+      <w:r>
+        <w:t xml:space="preserve">Polich, J. (2007). Updating P300: An integrative theory of P3a and P3b.</w:t>
+      </w:r>
+      <w:r>
+        <w:t xml:space="preserve"> </w:t>
+      </w:r>
+      <w:r>
+        <w:rPr>
+          <w:i/>
+          <w:iCs/>
+        </w:rPr>
+        <w:t xml:space="preserve">Clinical Neurophysiology, 118</w:t>
+      </w:r>
+      <w:r>
+        <w:t xml:space="preserve">(10), 2128–2148. https://doi.org/10.1016/j.clinph.2007.04.019</w:t>
+      </w:r>
+    </w:p>
+    <w:p>
+      <w:pPr>
+        <w:pStyle w:val="BodyText"/>
+      </w:pPr>
+      <w:r>
+        <w:t xml:space="preserve">Proudfit, G. H. (2015). The reward positivity: From basic research on reward to a biomarker for depression.</w:t>
+      </w:r>
+      <w:r>
+        <w:t xml:space="preserve"> </w:t>
+      </w:r>
+      <w:r>
+        <w:rPr>
+          <w:i/>
+          <w:iCs/>
+        </w:rPr>
+        <w:t xml:space="preserve">Psychophysiology, 52</w:t>
+      </w:r>
+      <w:r>
+        <w:t xml:space="preserve">(4), 449–459. https://doi.org/10.1111/psyp.12370</w:t>
+      </w:r>
+    </w:p>
+    <w:p>
+      <w:pPr>
+        <w:pStyle w:val="BodyText"/>
+      </w:pPr>
+      <w:r>
+        <w:t xml:space="preserve">Randler, C., Baumann, V. P., &amp; Horzum, M. B. (2014). Morningness-eveningness, Big Five and the BIS/BAS inventory.</w:t>
+      </w:r>
+      <w:r>
+        <w:t xml:space="preserve"> </w:t>
+      </w:r>
+      <w:r>
+        <w:rPr>
+          <w:i/>
+          <w:iCs/>
+        </w:rPr>
+        <w:t xml:space="preserve">Personality and Individual Differences, 66</w:t>
+      </w:r>
+      <w:r>
+        <w:t xml:space="preserve">, 64–67. https://doi.org/10.1016/j.paid.2014.03.010</w:t>
+      </w:r>
+    </w:p>
+    <w:p>
+      <w:pPr>
+        <w:pStyle w:val="BodyText"/>
+      </w:pPr>
+      <w:r>
+        <w:t xml:space="preserve">Roenneberg, T., Kuehnle, T., Juda, M., Kantermann, T., Allebrandt, K., Gordijn, M., &amp; Merrow, M. (2007). Epidemiology of the human circadian clock.</w:t>
+      </w:r>
+      <w:r>
+        <w:t xml:space="preserve"> </w:t>
+      </w:r>
+      <w:r>
+        <w:rPr>
+          <w:i/>
+          <w:iCs/>
+        </w:rPr>
+        <w:t xml:space="preserve">Sleep Medicine Reviews, 11</w:t>
+      </w:r>
+      <w:r>
+        <w:t xml:space="preserve">(6), 429–438. https://doi.org/10.1016/j.smrv.2007.07.005</w:t>
+      </w:r>
+    </w:p>
+    <w:p>
+      <w:pPr>
+        <w:pStyle w:val="BodyText"/>
+      </w:pPr>
+      <w:r>
+        <w:t xml:space="preserve">Roenneberg, T., Wirz-Justice, A., &amp; Merrow, M. (2003). Life between clocks: Daily temporal patterns of human chronotypes.</w:t>
+      </w:r>
+      <w:r>
+        <w:t xml:space="preserve"> </w:t>
+      </w:r>
+      <w:r>
+        <w:rPr>
+          <w:i/>
+          <w:iCs/>
+        </w:rPr>
+        <w:t xml:space="preserve">Journal of Biological Rhythms, 18</w:t>
+      </w:r>
+      <w:r>
+        <w:t xml:space="preserve">(1), 80–90. https://doi.org/10.1177/0748730402239679</w:t>
+      </w:r>
+    </w:p>
+    <w:p>
+      <w:pPr>
+        <w:pStyle w:val="BodyText"/>
+      </w:pPr>
+      <w:r>
+        <w:t xml:space="preserve">Rouder, J. N., Speckman, P. L., Sun, D., Morey, R. D., &amp; Iverson, G. (2009). Bayesian t tests for accepting and rejecting the null hypothesis.</w:t>
+      </w:r>
+      <w:r>
+        <w:t xml:space="preserve"> </w:t>
+      </w:r>
+      <w:r>
+        <w:rPr>
+          <w:i/>
+          <w:iCs/>
+        </w:rPr>
+        <w:t xml:space="preserve">Psychonomic Bulletin &amp; Review, 16</w:t>
+      </w:r>
+      <w:r>
+        <w:t xml:space="preserve">(2), 225–237. https://doi.org/10.3758/PBR.16.2.225</w:t>
+      </w:r>
+    </w:p>
+    <w:p>
+      <w:pPr>
+        <w:pStyle w:val="BodyText"/>
+      </w:pPr>
+      <w:r>
+        <w:t xml:space="preserve">Roy, Y., Banville, H., Albuquerque, I., Gramfort, A., Falk, T. H., &amp; Faubert, J. (2019). Deep learning-based electroencephalography analysis: A systematic review.</w:t>
+      </w:r>
+      <w:r>
+        <w:t xml:space="preserve"> </w:t>
+      </w:r>
+      <w:r>
+        <w:rPr>
+          <w:i/>
+          <w:iCs/>
+        </w:rPr>
+        <w:t xml:space="preserve">Journal of Neural Engineering, 16</w:t>
+      </w:r>
+      <w:r>
+        <w:t xml:space="preserve">(5), 051001. https://doi.org/10.1088/1741-2552/ab260c</w:t>
+      </w:r>
+    </w:p>
+    <w:p>
+      <w:pPr>
+        <w:pStyle w:val="BodyText"/>
+      </w:pPr>
+      <w:r>
+        <w:t xml:space="preserve">Sambrook, T. D., &amp; Goslin, J. (2015). A neural reward prediction error revealed by a meta-analysis of ERPs using great grand averages.</w:t>
+      </w:r>
+      <w:r>
+        <w:t xml:space="preserve"> </w:t>
+      </w:r>
+      <w:r>
+        <w:rPr>
+          <w:i/>
+          <w:iCs/>
+        </w:rPr>
+        <w:t xml:space="preserve">Psychological Bulletin, 141</w:t>
+      </w:r>
+      <w:r>
+        <w:t xml:space="preserve">(1), 213–235. https://doi.org/10.1037/bul0000006</w:t>
+      </w:r>
+    </w:p>
+    <w:p>
+      <w:pPr>
+        <w:pStyle w:val="BodyText"/>
+      </w:pPr>
+      <w:r>
+        <w:t xml:space="preserve">San Martín, R. (2012). Event-related potential studies of outcome processing and feedback-guided learning.</w:t>
+      </w:r>
+      <w:r>
+        <w:t xml:space="preserve"> </w:t>
+      </w:r>
+      <w:r>
+        <w:rPr>
+          <w:i/>
+          <w:iCs/>
+        </w:rPr>
+        <w:t xml:space="preserve">Frontiers in Human Neuroscience, 6</w:t>
+      </w:r>
+      <w:r>
+        <w:t xml:space="preserve">, Article 304. https://doi.org/10.3389/fnhum.2012.00304</w:t>
+      </w:r>
+    </w:p>
+    <w:p>
+      <w:pPr>
+        <w:pStyle w:val="BodyText"/>
+      </w:pPr>
+      <w:r>
+        <w:t xml:space="preserve">Schirrmeister, R. T., Springenberg, J. T., Fiederer, L. D. J., Glasstetter, M., Eggensperger, K., Tangermann, M., Hutter, F., Burgard, W., &amp; Ball, T. (2017). Deep learning with convolutional neural networks for EEG decoding and visualization.</w:t>
+      </w:r>
+      <w:r>
+        <w:t xml:space="preserve"> </w:t>
+      </w:r>
+      <w:r>
+        <w:rPr>
+          <w:i/>
+          <w:iCs/>
+        </w:rPr>
+        <w:t xml:space="preserve">Human Brain Mapping, 38</w:t>
+      </w:r>
+      <w:r>
+        <w:t xml:space="preserve">(11), 5391–5420. https://doi.org/10.1002/hbm.23730</w:t>
+      </w:r>
+    </w:p>
+    <w:p>
+      <w:pPr>
+        <w:pStyle w:val="BodyText"/>
+      </w:pPr>
+      <w:r>
+        <w:t xml:space="preserve">Sutton, R. S., &amp; Barto, A. G. (2018).</w:t>
+      </w:r>
+      <w:r>
+        <w:t xml:space="preserve"> </w:t>
+      </w:r>
+      <w:r>
+        <w:rPr>
+          <w:i/>
+          <w:iCs/>
+        </w:rPr>
+        <w:t xml:space="preserve">Reinforcement learning: An introduction</w:t>
+      </w:r>
+      <w:r>
+        <w:t xml:space="preserve"> </w:t>
+      </w:r>
+      <w:r>
+        <w:t xml:space="preserve">(2nd ed.). MIT Press.</w:t>
+      </w:r>
+    </w:p>
+    <w:p>
+      <w:pPr>
+        <w:pStyle w:val="BodyText"/>
+      </w:pPr>
+      <w:r>
+        <w:t xml:space="preserve">Varoquaux, G. (2018). Cross-validation failure: Small sample sizes lead to large error bars.</w:t>
+      </w:r>
+      <w:r>
+        <w:t xml:space="preserve"> </w:t>
+      </w:r>
+      <w:r>
+        <w:rPr>
+          <w:i/>
+          <w:iCs/>
+        </w:rPr>
+        <w:t xml:space="preserve">NeuroImage, 180</w:t>
+      </w:r>
+      <w:r>
+        <w:t xml:space="preserve">, 68–77. https://doi.org/10.1016/j.neuroimage.2017.06.061</w:t>
+      </w:r>
+    </w:p>
+    <w:p>
+      <w:pPr>
+        <w:pStyle w:val="BodyText"/>
+      </w:pPr>
+      <w:r>
+        <w:t xml:space="preserve">Walsh, M. M., &amp; Anderson, J. R. (2012). Learning from experience: Event-related potential correlates of reward processing, neural adaptation, and behavioral choice.</w:t>
+      </w:r>
+      <w:r>
+        <w:t xml:space="preserve"> </w:t>
+      </w:r>
+      <w:r>
+        <w:rPr>
+          <w:i/>
+          <w:iCs/>
+        </w:rPr>
+        <w:t xml:space="preserve">Neuroscience &amp; Biobehavioral Reviews, 36</w:t>
+      </w:r>
+      <w:r>
+        <w:t xml:space="preserve">(8), 1870–1884. https://doi.org/10.1016/j.neubiorev.2012.05.008</w:t>
+      </w:r>
+    </w:p>
+    <w:p>
+      <w:pPr>
+        <w:pStyle w:val="BodyText"/>
+      </w:pPr>
+      <w:r>
+        <w:t xml:space="preserve">Webb, I. C., Baltazar, R. M., Wang, X., Pitchers, K. K., Coolen, L. M., &amp; Lehman, M. N. (2009). Diurnal variations in natural and drug reward, mesolimbic tyrosine hydroxylase, and clock gene expression in the male rat.</w:t>
+      </w:r>
+      <w:r>
+        <w:t xml:space="preserve"> </w:t>
+      </w:r>
+      <w:r>
+        <w:rPr>
+          <w:i/>
+          <w:iCs/>
+        </w:rPr>
+        <w:t xml:space="preserve">Journal of Biological Rhythms, 24</w:t>
+      </w:r>
+      <w:r>
+        <w:t xml:space="preserve">(6), 465–476. https://doi.org/10.1177/0748730409346657</w:t>
+      </w:r>
+    </w:p>
+    <w:p>
+      <w:pPr>
+        <w:pStyle w:val="BodyText"/>
+      </w:pPr>
+      <w:r>
+        <w:t xml:space="preserve">Wittmann, M., Dinich, J., Merrow, M., &amp; Roenneberg, T. (2006). Social jetlag: Misalignment of biological and social time.</w:t>
+      </w:r>
+      <w:r>
+        <w:t xml:space="preserve"> </w:t>
+      </w:r>
+      <w:r>
+        <w:rPr>
+          <w:i/>
+          <w:iCs/>
+        </w:rPr>
+        <w:t xml:space="preserve">Chronobiology International, 23</w:t>
+      </w:r>
+      <w:r>
+        <w:t xml:space="preserve">(1–2), 497–509. https://doi.org/10.1080/07420520500545979</w:t>
+      </w:r>
+    </w:p>
+    <w:p>
+      <w:pPr>
+        <w:pStyle w:val="BodyText"/>
+      </w:pPr>
+      <w:r>
+        <w:t xml:space="preserve">Wu, Y., &amp; Zhou, X. (2009). The P300 and reward valence, magnitude, and expectancy in outcome evaluation.</w:t>
+      </w:r>
+      <w:r>
+        <w:t xml:space="preserve"> </w:t>
+      </w:r>
+      <w:r>
+        <w:rPr>
+          <w:i/>
+          <w:iCs/>
+        </w:rPr>
+        <w:t xml:space="preserve">Brain Research, 1286</w:t>
+      </w:r>
+      <w:r>
+        <w:t xml:space="preserve">, 114–122. https://doi.org/10.1016/j.brainres.2009.06.032</w:t>
+      </w:r>
+    </w:p>
+    <w:p>
+      <w:pPr>
+        <w:pStyle w:val="BodyText"/>
+      </w:pPr>
+      <w:r>
+        <w:t xml:space="preserve">Yeung, N., &amp; Sanfey, A. G. (2004). Independent coding of reward magnitude and valence in the human brain.</w:t>
+      </w:r>
+      <w:r>
+        <w:t xml:space="preserve"> </w:t>
+      </w:r>
+      <w:r>
+        <w:rPr>
+          <w:i/>
+          <w:iCs/>
+        </w:rPr>
+        <w:t xml:space="preserve">Journal of Neuroscience, 24</w:t>
+      </w:r>
+      <w:r>
+        <w:t xml:space="preserve">(28), 6258–6264. https://doi.org/10.1523/JNEUROSCI.4537-03.2004</w:t>
+      </w:r>
+    </w:p>
+    <w:p>
+      <w:r>
+        <w:pict>
+          <v:rect style="width:0;height:1.5pt" o:hralign="center" o:hrstd="t" o:hr="t"/>
+        </w:pict>
+      </w:r>
+    </w:p>
+    <w:bookmarkEnd w:id="46"/>
+    <w:bookmarkStart w:id="47" w:name="X71ad711d61f26707bd010f2d741e0cc27b0c823"/>
     <w:p>
       <w:pPr>
         <w:pStyle w:val="Heading2"/>
@@ -5910,9 +7052,9 @@
         <w:t xml:space="preserve">team’s prior chronotype constructs and references.</w:t>
       </w:r>
     </w:p>
-    <w:bookmarkEnd w:id="46"/>
     <w:bookmarkEnd w:id="47"/>
-    <w:bookmarkStart w:id="63" w:name="figures"/>
+    <w:bookmarkEnd w:id="48"/>
+    <w:bookmarkStart w:id="64" w:name="figures"/>
     <w:p>
       <w:pPr>
         <w:pStyle w:val="Heading1"/>
@@ -5930,18 +7072,18 @@
           <wp:inline>
             <wp:extent cx="5334000" cy="1742076"/>
             <wp:effectExtent b="0" l="0" r="0" t="0"/>
-            <wp:docPr descr="Figure 1. Posterior P300 by chronotype and specification curve." title="" id="49" name="Picture"/>
+            <wp:docPr descr="Figure 1. Posterior P300 by chronotype and specification curve." title="" id="50" name="Picture"/>
             <a:graphic>
               <a:graphicData uri="http://schemas.openxmlformats.org/drawingml/2006/picture">
                 <pic:pic>
                   <pic:nvPicPr>
-                    <pic:cNvPr descr="docs/figures/fig_main_1_p300_spec.png" id="50" name="Picture"/>
+                    <pic:cNvPr descr="docs/figures/fig_main_1_p300_spec.png" id="51" name="Picture"/>
                     <pic:cNvPicPr>
                       <a:picLocks noChangeArrowheads="1" noChangeAspect="1"/>
                     </pic:cNvPicPr>
                   </pic:nvPicPr>
                   <pic:blipFill>
-                    <a:blip r:embed="rId48"/>
+                    <a:blip r:embed="rId49"/>
                     <a:stretch>
                       <a:fillRect/>
                     </a:stretch>
@@ -5985,18 +7127,18 @@
           <wp:inline>
             <wp:extent cx="5334000" cy="1694329"/>
             <wp:effectExtent b="0" l="0" r="0" t="0"/>
-            <wp:docPr descr="Figure 2. Continuous MEQ associations." title="" id="52" name="Picture"/>
+            <wp:docPr descr="Figure 2. Continuous MEQ associations." title="" id="53" name="Picture"/>
             <a:graphic>
               <a:graphicData uri="http://schemas.openxmlformats.org/drawingml/2006/picture">
                 <pic:pic>
                   <pic:nvPicPr>
-                    <pic:cNvPr descr="docs/figures/fig_main_2_continuous_meq.png" id="53" name="Picture"/>
+                    <pic:cNvPr descr="docs/figures/fig_main_2_continuous_meq.png" id="54" name="Picture"/>
                     <pic:cNvPicPr>
                       <a:picLocks noChangeArrowheads="1" noChangeAspect="1"/>
                     </pic:cNvPicPr>
                   </pic:nvPicPr>
                   <pic:blipFill>
-                    <a:blip r:embed="rId51"/>
+                    <a:blip r:embed="rId52"/>
                     <a:stretch>
                       <a:fillRect/>
                     </a:stretch>
@@ -6040,18 +7182,18 @@
           <wp:inline>
             <wp:extent cx="5334000" cy="1541539"/>
             <wp:effectExtent b="0" l="0" r="0" t="0"/>
-            <wp:docPr descr="Figure 3. Behaviour and ERP fusion." title="" id="55" name="Picture"/>
+            <wp:docPr descr="Figure 3. Behaviour and ERP fusion." title="" id="56" name="Picture"/>
             <a:graphic>
               <a:graphicData uri="http://schemas.openxmlformats.org/drawingml/2006/picture">
                 <pic:pic>
                   <pic:nvPicPr>
-                    <pic:cNvPr descr="docs/figures/fig_main_3_fusion.png" id="56" name="Picture"/>
+                    <pic:cNvPr descr="docs/figures/fig_main_3_fusion.png" id="57" name="Picture"/>
                     <pic:cNvPicPr>
                       <a:picLocks noChangeArrowheads="1" noChangeAspect="1"/>
                     </pic:cNvPicPr>
                   </pic:nvPicPr>
                   <pic:blipFill>
-                    <a:blip r:embed="rId54"/>
+                    <a:blip r:embed="rId55"/>
                     <a:stretch>
                       <a:fillRect/>
                     </a:stretch>
@@ -6095,18 +7237,18 @@
           <wp:inline>
             <wp:extent cx="5334000" cy="1485607"/>
             <wp:effectExtent b="0" l="0" r="0" t="0"/>
-            <wp:docPr descr="Figure 4. Single-trial P300 to next-choice coupling." title="" id="58" name="Picture"/>
+            <wp:docPr descr="Figure 4. Single-trial P300 to next-choice coupling." title="" id="59" name="Picture"/>
             <a:graphic>
               <a:graphicData uri="http://schemas.openxmlformats.org/drawingml/2006/picture">
                 <pic:pic>
                   <pic:nvPicPr>
-                    <pic:cNvPr descr="docs/figures/fig_main_4_single_trial_coupling.png" id="59" name="Picture"/>
+                    <pic:cNvPr descr="docs/figures/fig_main_4_single_trial_coupling.png" id="60" name="Picture"/>
                     <pic:cNvPicPr>
                       <a:picLocks noChangeArrowheads="1" noChangeAspect="1"/>
                     </pic:cNvPicPr>
                   </pic:nvPicPr>
                   <pic:blipFill>
-                    <a:blip r:embed="rId57"/>
+                    <a:blip r:embed="rId58"/>
                     <a:stretch>
                       <a:fillRect/>
                     </a:stretch>
@@ -6150,18 +7292,18 @@
           <wp:inline>
             <wp:extent cx="5334000" cy="1694459"/>
             <wp:effectExtent b="0" l="0" r="0" t="0"/>
-            <wp:docPr descr="Figure 5. ROC and leakage-safe analysis pipeline." title="" id="61" name="Picture"/>
+            <wp:docPr descr="Figure 5. ROC and leakage-safe analysis pipeline." title="" id="62" name="Picture"/>
             <a:graphic>
               <a:graphicData uri="http://schemas.openxmlformats.org/drawingml/2006/picture">
                 <pic:pic>
                   <pic:nvPicPr>
-                    <pic:cNvPr descr="docs/figures/fig_main_5_roc_pipeline.png" id="62" name="Picture"/>
+                    <pic:cNvPr descr="docs/figures/fig_main_5_roc_pipeline.png" id="63" name="Picture"/>
                     <pic:cNvPicPr>
                       <a:picLocks noChangeArrowheads="1" noChangeAspect="1"/>
                     </pic:cNvPicPr>
                   </pic:nvPicPr>
                   <pic:blipFill>
-                    <a:blip r:embed="rId60"/>
+                    <a:blip r:embed="rId61"/>
                     <a:stretch>
                       <a:fillRect/>
                     </a:stretch>
@@ -6196,8 +7338,8 @@
         <w:t xml:space="preserve">Figure 5. ROC and leakage-safe analysis pipeline.</w:t>
       </w:r>
     </w:p>
-    <w:bookmarkEnd w:id="63"/>
-    <w:bookmarkStart w:id="82" w:name="references"/>
+    <w:bookmarkEnd w:id="64"/>
+    <w:bookmarkStart w:id="156" w:name="references-1"/>
     <w:p>
       <w:pPr>
         <w:pStyle w:val="Heading1"/>
@@ -6206,8 +7348,8 @@
         <w:t xml:space="preserve">References</w:t>
       </w:r>
     </w:p>
-    <w:bookmarkStart w:id="81" w:name="refs"/>
-    <w:bookmarkStart w:id="65" w:name="ref-adan2012circadian"/>
+    <w:bookmarkStart w:id="155" w:name="refs"/>
+    <w:bookmarkStart w:id="66" w:name="ref-adan2012circadian"/>
     <w:p>
       <w:pPr>
         <w:pStyle w:val="Bibliography"/>
@@ -6244,7 +7386,7 @@
       <w:r>
         <w:t xml:space="preserve"> </w:t>
       </w:r>
-      <w:hyperlink r:id="rId64">
+      <w:hyperlink r:id="rId65">
         <w:r>
           <w:rPr>
             <w:rStyle w:val="Hyperlink"/>
@@ -6253,13 +7395,592 @@
         </w:r>
       </w:hyperlink>
     </w:p>
-    <w:bookmarkEnd w:id="65"/>
-    <w:bookmarkStart w:id="67" w:name="ref-holroyd2002rl"/>
+    <w:bookmarkEnd w:id="66"/>
+    <w:bookmarkStart w:id="68" w:name="ref-adan2010impulsivity"/>
     <w:p>
       <w:pPr>
         <w:pStyle w:val="Bibliography"/>
       </w:pPr>
       <w:r>
+        <w:t xml:space="preserve">Adan, A., Natale, V., Caci, H., &amp; Prat, G. (2010). Relationship between circadian typology and functional and dysfunctional impulsivity.</w:t>
+      </w:r>
+      <w:r>
+        <w:t xml:space="preserve"> </w:t>
+      </w:r>
+      <w:r>
+        <w:rPr>
+          <w:i/>
+          <w:iCs/>
+        </w:rPr>
+        <w:t xml:space="preserve">Chronobiology International</w:t>
+      </w:r>
+      <w:r>
+        <w:t xml:space="preserve">,</w:t>
+      </w:r>
+      <w:r>
+        <w:t xml:space="preserve"> </w:t>
+      </w:r>
+      <w:r>
+        <w:rPr>
+          <w:i/>
+          <w:iCs/>
+        </w:rPr>
+        <w:t xml:space="preserve">27</w:t>
+      </w:r>
+      <w:r>
+        <w:t xml:space="preserve">(3), 606–619.</w:t>
+      </w:r>
+      <w:r>
+        <w:t xml:space="preserve"> </w:t>
+      </w:r>
+      <w:hyperlink r:id="rId67">
+        <w:r>
+          <w:rPr>
+            <w:rStyle w:val="Hyperlink"/>
+          </w:rPr>
+          <w:t xml:space="preserve">https://doi.org/10.3109/07420521003663827</w:t>
+        </w:r>
+      </w:hyperlink>
+    </w:p>
+    <w:bookmarkEnd w:id="68"/>
+    <w:bookmarkStart w:id="70" w:name="ref-ahn2017hbayesdm"/>
+    <w:p>
+      <w:pPr>
+        <w:pStyle w:val="Bibliography"/>
+      </w:pPr>
+      <w:r>
+        <w:t xml:space="preserve">Ahn, W.-Y., Haines, N., &amp; Zhang, L. (2017). Revealing neurocomputational mechanisms of reinforcement learning and decision-making with the</w:t>
+      </w:r>
+      <w:r>
+        <w:t xml:space="preserve"> </w:t>
+      </w:r>
+      <w:r>
+        <w:t xml:space="preserve">hBayesDM</w:t>
+      </w:r>
+      <w:r>
+        <w:t xml:space="preserve"> </w:t>
+      </w:r>
+      <w:r>
+        <w:t xml:space="preserve">package.</w:t>
+      </w:r>
+      <w:r>
+        <w:t xml:space="preserve"> </w:t>
+      </w:r>
+      <w:r>
+        <w:rPr>
+          <w:i/>
+          <w:iCs/>
+        </w:rPr>
+        <w:t xml:space="preserve">Computational Psychiatry</w:t>
+      </w:r>
+      <w:r>
+        <w:t xml:space="preserve">,</w:t>
+      </w:r>
+      <w:r>
+        <w:t xml:space="preserve"> </w:t>
+      </w:r>
+      <w:r>
+        <w:rPr>
+          <w:i/>
+          <w:iCs/>
+        </w:rPr>
+        <w:t xml:space="preserve">1</w:t>
+      </w:r>
+      <w:r>
+        <w:t xml:space="preserve">, 24–57.</w:t>
+      </w:r>
+      <w:r>
+        <w:t xml:space="preserve"> </w:t>
+      </w:r>
+      <w:hyperlink r:id="rId69">
+        <w:r>
+          <w:rPr>
+            <w:rStyle w:val="Hyperlink"/>
+          </w:rPr>
+          <w:t xml:space="preserve">https://doi.org/10.1162/CPSY_a_00002</w:t>
+        </w:r>
+      </w:hyperlink>
+    </w:p>
+    <w:bookmarkEnd w:id="70"/>
+    <w:bookmarkStart w:id="72" w:name="ref-benjamini1995fdr"/>
+    <w:p>
+      <w:pPr>
+        <w:pStyle w:val="Bibliography"/>
+      </w:pPr>
+      <w:r>
+        <w:t xml:space="preserve">Benjamini, Y., &amp; Hochberg, Y. (1995). Controlling the false discovery rate: A practical and powerful approach to multiple testing.</w:t>
+      </w:r>
+      <w:r>
+        <w:t xml:space="preserve"> </w:t>
+      </w:r>
+      <w:r>
+        <w:rPr>
+          <w:i/>
+          <w:iCs/>
+        </w:rPr>
+        <w:t xml:space="preserve">Journal of the Royal Statistical Society: Series B (Methodological)</w:t>
+      </w:r>
+      <w:r>
+        <w:t xml:space="preserve">,</w:t>
+      </w:r>
+      <w:r>
+        <w:t xml:space="preserve"> </w:t>
+      </w:r>
+      <w:r>
+        <w:rPr>
+          <w:i/>
+          <w:iCs/>
+        </w:rPr>
+        <w:t xml:space="preserve">57</w:t>
+      </w:r>
+      <w:r>
+        <w:t xml:space="preserve">(1), 289–300.</w:t>
+      </w:r>
+      <w:r>
+        <w:t xml:space="preserve"> </w:t>
+      </w:r>
+      <w:hyperlink r:id="rId71">
+        <w:r>
+          <w:rPr>
+            <w:rStyle w:val="Hyperlink"/>
+          </w:rPr>
+          <w:t xml:space="preserve">https://doi.org/10.1111/j.2517-6161.1995.tb02031.x</w:t>
+        </w:r>
+      </w:hyperlink>
+    </w:p>
+    <w:bookmarkEnd w:id="72"/>
+    <w:bookmarkStart w:id="74" w:name="ref-cho2014gru"/>
+    <w:p>
+      <w:pPr>
+        <w:pStyle w:val="Bibliography"/>
+      </w:pPr>
+      <w:r>
+        <w:t xml:space="preserve">Cho, K., Merrienboer, B. van, Gulcehre, C., Bahdanau, D., Bougares, F., Schwenk, H., &amp; Bengio, Y. (2014). Learning phrase representations using</w:t>
+      </w:r>
+      <w:r>
+        <w:t xml:space="preserve"> </w:t>
+      </w:r>
+      <w:r>
+        <w:t xml:space="preserve">RNN</w:t>
+      </w:r>
+      <w:r>
+        <w:t xml:space="preserve"> </w:t>
+      </w:r>
+      <w:r>
+        <w:t xml:space="preserve">encoder-decoder for statistical machine translation.</w:t>
+      </w:r>
+      <w:r>
+        <w:t xml:space="preserve"> </w:t>
+      </w:r>
+      <w:r>
+        <w:rPr>
+          <w:i/>
+          <w:iCs/>
+        </w:rPr>
+        <w:t xml:space="preserve">Proceedings of the 2014 Conference on Empirical Methods in Natural Language Processing (</w:t>
+      </w:r>
+      <w:r>
+        <w:rPr>
+          <w:i/>
+          <w:iCs/>
+        </w:rPr>
+        <w:t xml:space="preserve">EMNLP</w:t>
+      </w:r>
+      <w:r>
+        <w:rPr>
+          <w:i/>
+          <w:iCs/>
+        </w:rPr>
+        <w:t xml:space="preserve">)</w:t>
+      </w:r>
+      <w:r>
+        <w:t xml:space="preserve">, 1724–1734.</w:t>
+      </w:r>
+      <w:r>
+        <w:t xml:space="preserve"> </w:t>
+      </w:r>
+      <w:hyperlink r:id="rId73">
+        <w:r>
+          <w:rPr>
+            <w:rStyle w:val="Hyperlink"/>
+          </w:rPr>
+          <w:t xml:space="preserve">https://doi.org/10.3115/v1/D14-1179</w:t>
+        </w:r>
+      </w:hyperlink>
+    </w:p>
+    <w:bookmarkEnd w:id="74"/>
+    <w:bookmarkStart w:id="76" w:name="ref-combrisson2015chance"/>
+    <w:p>
+      <w:pPr>
+        <w:pStyle w:val="Bibliography"/>
+      </w:pPr>
+      <w:r>
+        <w:t xml:space="preserve">Combrisson, E., &amp; Jerbi, K. (2015). Exceeding chance level by chance: The caveat of theoretical chance levels in brain signal classification and statistical assessment of decoding accuracy.</w:t>
+      </w:r>
+      <w:r>
+        <w:t xml:space="preserve"> </w:t>
+      </w:r>
+      <w:r>
+        <w:rPr>
+          <w:i/>
+          <w:iCs/>
+        </w:rPr>
+        <w:t xml:space="preserve">Journal of Neuroscience Methods</w:t>
+      </w:r>
+      <w:r>
+        <w:t xml:space="preserve">,</w:t>
+      </w:r>
+      <w:r>
+        <w:t xml:space="preserve"> </w:t>
+      </w:r>
+      <w:r>
+        <w:rPr>
+          <w:i/>
+          <w:iCs/>
+        </w:rPr>
+        <w:t xml:space="preserve">250</w:t>
+      </w:r>
+      <w:r>
+        <w:t xml:space="preserve">, 126–136.</w:t>
+      </w:r>
+      <w:r>
+        <w:t xml:space="preserve"> </w:t>
+      </w:r>
+      <w:hyperlink r:id="rId75">
+        <w:r>
+          <w:rPr>
+            <w:rStyle w:val="Hyperlink"/>
+          </w:rPr>
+          <w:t xml:space="preserve">https://doi.org/10.1016/j.jneumeth.2015.01.010</w:t>
+        </w:r>
+      </w:hyperlink>
+    </w:p>
+    <w:bookmarkEnd w:id="76"/>
+    <w:bookmarkStart w:id="78" w:name="ref-daw2011trial"/>
+    <w:p>
+      <w:pPr>
+        <w:pStyle w:val="Bibliography"/>
+      </w:pPr>
+      <w:r>
+        <w:t xml:space="preserve">Daw, N. D. (2011). Trial-by-trial data analysis using computational models. In</w:t>
+      </w:r>
+      <w:r>
+        <w:t xml:space="preserve"> </w:t>
+      </w:r>
+      <w:r>
+        <w:rPr>
+          <w:i/>
+          <w:iCs/>
+        </w:rPr>
+        <w:t xml:space="preserve">Decision making, affect, and learning: Attention and performance XXIII</w:t>
+      </w:r>
+      <w:r>
+        <w:t xml:space="preserve"> </w:t>
+      </w:r>
+      <w:r>
+        <w:t xml:space="preserve">(pp. 3–38). Oxford University Press.</w:t>
+      </w:r>
+      <w:r>
+        <w:t xml:space="preserve"> </w:t>
+      </w:r>
+      <w:hyperlink r:id="rId77">
+        <w:r>
+          <w:rPr>
+            <w:rStyle w:val="Hyperlink"/>
+          </w:rPr>
+          <w:t xml:space="preserve">https://doi.org/10.1093/acprof:oso/9780199600434.003.0001</w:t>
+        </w:r>
+      </w:hyperlink>
+    </w:p>
+    <w:bookmarkEnd w:id="78"/>
+    <w:bookmarkStart w:id="80" w:name="ref-frank2007dopamine"/>
+    <w:p>
+      <w:pPr>
+        <w:pStyle w:val="Bibliography"/>
+      </w:pPr>
+      <w:r>
+        <w:t xml:space="preserve">Frank, M. J., Moustafa, A. A., Haughey, H. M., Curran, T., &amp; Hutchison, K. E. (2007). Genetic triple dissociation reveals multiple roles for dopamine in reinforcement learning.</w:t>
+      </w:r>
+      <w:r>
+        <w:t xml:space="preserve"> </w:t>
+      </w:r>
+      <w:r>
+        <w:rPr>
+          <w:i/>
+          <w:iCs/>
+        </w:rPr>
+        <w:t xml:space="preserve">Proceedings of the National Academy of Sciences</w:t>
+      </w:r>
+      <w:r>
+        <w:t xml:space="preserve">,</w:t>
+      </w:r>
+      <w:r>
+        <w:t xml:space="preserve"> </w:t>
+      </w:r>
+      <w:r>
+        <w:rPr>
+          <w:i/>
+          <w:iCs/>
+        </w:rPr>
+        <w:t xml:space="preserve">104</w:t>
+      </w:r>
+      <w:r>
+        <w:t xml:space="preserve">(41), 16311–16316.</w:t>
+      </w:r>
+      <w:r>
+        <w:t xml:space="preserve"> </w:t>
+      </w:r>
+      <w:hyperlink r:id="rId79">
+        <w:r>
+          <w:rPr>
+            <w:rStyle w:val="Hyperlink"/>
+          </w:rPr>
+          <w:t xml:space="preserve">https://doi.org/10.1073/pnas.0706111104</w:t>
+        </w:r>
+      </w:hyperlink>
+    </w:p>
+    <w:bookmarkEnd w:id="80"/>
+    <w:bookmarkStart w:id="82" w:name="ref-gehring2002gains"/>
+    <w:p>
+      <w:pPr>
+        <w:pStyle w:val="Bibliography"/>
+      </w:pPr>
+      <w:r>
+        <w:t xml:space="preserve">Gehring, W. J., &amp; Willoughby, A. R. (2002). The medial frontal cortex and the rapid processing of monetary gains and losses.</w:t>
+      </w:r>
+      <w:r>
+        <w:t xml:space="preserve"> </w:t>
+      </w:r>
+      <w:r>
+        <w:rPr>
+          <w:i/>
+          <w:iCs/>
+        </w:rPr>
+        <w:t xml:space="preserve">Science</w:t>
+      </w:r>
+      <w:r>
+        <w:t xml:space="preserve">,</w:t>
+      </w:r>
+      <w:r>
+        <w:t xml:space="preserve"> </w:t>
+      </w:r>
+      <w:r>
+        <w:rPr>
+          <w:i/>
+          <w:iCs/>
+        </w:rPr>
+        <w:t xml:space="preserve">295</w:t>
+      </w:r>
+      <w:r>
+        <w:t xml:space="preserve">(5563), 2279–2282.</w:t>
+      </w:r>
+      <w:r>
+        <w:t xml:space="preserve"> </w:t>
+      </w:r>
+      <w:hyperlink r:id="rId81">
+        <w:r>
+          <w:rPr>
+            <w:rStyle w:val="Hyperlink"/>
+          </w:rPr>
+          <w:t xml:space="preserve">https://doi.org/10.1126/science.1066893</w:t>
+        </w:r>
+      </w:hyperlink>
+    </w:p>
+    <w:bookmarkEnd w:id="82"/>
+    <w:bookmarkStart w:id="84" w:name="ref-gershman2015learningrates"/>
+    <w:p>
+      <w:pPr>
+        <w:pStyle w:val="Bibliography"/>
+      </w:pPr>
+      <w:r>
+        <w:t xml:space="preserve">Gershman, S. J. (2015). Do learning rates adapt to the distribution of rewards?</w:t>
+      </w:r>
+      <w:r>
+        <w:t xml:space="preserve"> </w:t>
+      </w:r>
+      <w:r>
+        <w:rPr>
+          <w:i/>
+          <w:iCs/>
+        </w:rPr>
+        <w:t xml:space="preserve">Psychonomic Bulletin &amp; Review</w:t>
+      </w:r>
+      <w:r>
+        <w:t xml:space="preserve">,</w:t>
+      </w:r>
+      <w:r>
+        <w:t xml:space="preserve"> </w:t>
+      </w:r>
+      <w:r>
+        <w:rPr>
+          <w:i/>
+          <w:iCs/>
+        </w:rPr>
+        <w:t xml:space="preserve">22</w:t>
+      </w:r>
+      <w:r>
+        <w:t xml:space="preserve">(5), 1320–1327.</w:t>
+      </w:r>
+      <w:r>
+        <w:t xml:space="preserve"> </w:t>
+      </w:r>
+      <w:hyperlink r:id="rId83">
+        <w:r>
+          <w:rPr>
+            <w:rStyle w:val="Hyperlink"/>
+          </w:rPr>
+          <w:t xml:space="preserve">https://doi.org/10.3758/s13423-014-0790-3</w:t>
+        </w:r>
+      </w:hyperlink>
+    </w:p>
+    <w:bookmarkEnd w:id="84"/>
+    <w:bookmarkStart w:id="86" w:name="ref-hajcak2007feedback"/>
+    <w:p>
+      <w:pPr>
+        <w:pStyle w:val="Bibliography"/>
+      </w:pPr>
+      <w:r>
+        <w:t xml:space="preserve">Hajcak, G., Moser, J. S., Holroyd, C. B., &amp; Simons, R. F. (2007). It’s worse than you thought: The feedback negativity and violations of reward prediction in gambling tasks.</w:t>
+      </w:r>
+      <w:r>
+        <w:t xml:space="preserve"> </w:t>
+      </w:r>
+      <w:r>
+        <w:rPr>
+          <w:i/>
+          <w:iCs/>
+        </w:rPr>
+        <w:t xml:space="preserve">Psychophysiology</w:t>
+      </w:r>
+      <w:r>
+        <w:t xml:space="preserve">,</w:t>
+      </w:r>
+      <w:r>
+        <w:t xml:space="preserve"> </w:t>
+      </w:r>
+      <w:r>
+        <w:rPr>
+          <w:i/>
+          <w:iCs/>
+        </w:rPr>
+        <w:t xml:space="preserve">44</w:t>
+      </w:r>
+      <w:r>
+        <w:t xml:space="preserve">(6), 905–912.</w:t>
+      </w:r>
+      <w:r>
+        <w:t xml:space="preserve"> </w:t>
+      </w:r>
+      <w:hyperlink r:id="rId85">
+        <w:r>
+          <w:rPr>
+            <w:rStyle w:val="Hyperlink"/>
+          </w:rPr>
+          <w:t xml:space="preserve">https://doi.org/10.1111/j.1469-8986.2007.00567.x</w:t>
+        </w:r>
+      </w:hyperlink>
+    </w:p>
+    <w:bookmarkEnd w:id="86"/>
+    <w:bookmarkStart w:id="88" w:name="ref-hasler2013misalignment"/>
+    <w:p>
+      <w:pPr>
+        <w:pStyle w:val="Bibliography"/>
+      </w:pPr>
+      <w:r>
+        <w:t xml:space="preserve">Hasler, B. P., &amp; Clark, D. B. (2013). Circadian misalignment, reward-related brain function, and adolescent alcohol involvement.</w:t>
+      </w:r>
+      <w:r>
+        <w:t xml:space="preserve"> </w:t>
+      </w:r>
+      <w:r>
+        <w:rPr>
+          <w:i/>
+          <w:iCs/>
+        </w:rPr>
+        <w:t xml:space="preserve">Alcoholism: Clinical and Experimental Research</w:t>
+      </w:r>
+      <w:r>
+        <w:t xml:space="preserve">,</w:t>
+      </w:r>
+      <w:r>
+        <w:t xml:space="preserve"> </w:t>
+      </w:r>
+      <w:r>
+        <w:rPr>
+          <w:i/>
+          <w:iCs/>
+        </w:rPr>
+        <w:t xml:space="preserve">37</w:t>
+      </w:r>
+      <w:r>
+        <w:t xml:space="preserve">(4), 558–565.</w:t>
+      </w:r>
+      <w:r>
+        <w:t xml:space="preserve"> </w:t>
+      </w:r>
+      <w:hyperlink r:id="rId87">
+        <w:r>
+          <w:rPr>
+            <w:rStyle w:val="Hyperlink"/>
+          </w:rPr>
+          <w:t xml:space="preserve">https://doi.org/10.1111/acer.12003</w:t>
+        </w:r>
+      </w:hyperlink>
+    </w:p>
+    <w:bookmarkEnd w:id="88"/>
+    <w:bookmarkStart w:id="90" w:name="ref-hasler2013altered"/>
+    <w:p>
+      <w:pPr>
+        <w:pStyle w:val="Bibliography"/>
+      </w:pPr>
+      <w:r>
+        <w:t xml:space="preserve">Hasler, B. P., Sitnick, S. L., Shaw, D. S., &amp; Forbes, E. E. (2013). An altered neural response to reward may contribute to alcohol problems among late adolescents with an evening chronotype.</w:t>
+      </w:r>
+      <w:r>
+        <w:t xml:space="preserve"> </w:t>
+      </w:r>
+      <w:r>
+        <w:rPr>
+          <w:i/>
+          <w:iCs/>
+        </w:rPr>
+        <w:t xml:space="preserve">Psychiatry Research: Neuroimaging</w:t>
+      </w:r>
+      <w:r>
+        <w:t xml:space="preserve">,</w:t>
+      </w:r>
+      <w:r>
+        <w:t xml:space="preserve"> </w:t>
+      </w:r>
+      <w:r>
+        <w:rPr>
+          <w:i/>
+          <w:iCs/>
+        </w:rPr>
+        <w:t xml:space="preserve">214</w:t>
+      </w:r>
+      <w:r>
+        <w:t xml:space="preserve">(3), 357–364.</w:t>
+      </w:r>
+      <w:r>
+        <w:t xml:space="preserve"> </w:t>
+      </w:r>
+      <w:hyperlink r:id="rId89">
+        <w:r>
+          <w:rPr>
+            <w:rStyle w:val="Hyperlink"/>
+          </w:rPr>
+          <w:t xml:space="preserve">https://doi.org/10.1016/j.pscychresns.2013.08.005</w:t>
+        </w:r>
+      </w:hyperlink>
+    </w:p>
+    <w:bookmarkEnd w:id="90"/>
+    <w:bookmarkStart w:id="92" w:name="ref-holroyd2002rl"/>
+    <w:p>
+      <w:pPr>
+        <w:pStyle w:val="Bibliography"/>
+      </w:pPr>
+      <w:r>
         <w:t xml:space="preserve">Holroyd, C. B., &amp; Coles, M. G. H. (2002). The neural basis of human error processing: Reinforcement learning, dopamine, and the error-related negativity.</w:t>
       </w:r>
       <w:r>
@@ -6291,7 +8012,7 @@
       <w:r>
         <w:t xml:space="preserve"> </w:t>
       </w:r>
-      <w:hyperlink r:id="rId66">
+      <w:hyperlink r:id="rId91">
         <w:r>
           <w:rPr>
             <w:rStyle w:val="Hyperlink"/>
@@ -6300,8 +8021,8 @@
         </w:r>
       </w:hyperlink>
     </w:p>
-    <w:bookmarkEnd w:id="67"/>
-    <w:bookmarkStart w:id="68" w:name="ref-horne1976meq"/>
+    <w:bookmarkEnd w:id="92"/>
+    <w:bookmarkStart w:id="93" w:name="ref-horne1976meq"/>
     <w:p>
       <w:pPr>
         <w:pStyle w:val="Bibliography"/>
@@ -6336,13 +8057,60 @@
         <w:t xml:space="preserve">, 97–110.</w:t>
       </w:r>
     </w:p>
-    <w:bookmarkEnd w:id="68"/>
-    <w:bookmarkStart w:id="70" w:name="ref-keil2014guidelines"/>
+    <w:bookmarkEnd w:id="93"/>
+    <w:bookmarkStart w:id="95" w:name="ref-kahneman1979prospect"/>
     <w:p>
       <w:pPr>
         <w:pStyle w:val="Bibliography"/>
       </w:pPr>
       <w:r>
+        <w:t xml:space="preserve">Kahneman, D., &amp; Tversky, A. (1979). Prospect theory: An analysis of decision under risk.</w:t>
+      </w:r>
+      <w:r>
+        <w:t xml:space="preserve"> </w:t>
+      </w:r>
+      <w:r>
+        <w:rPr>
+          <w:i/>
+          <w:iCs/>
+        </w:rPr>
+        <w:t xml:space="preserve">Econometrica</w:t>
+      </w:r>
+      <w:r>
+        <w:t xml:space="preserve">,</w:t>
+      </w:r>
+      <w:r>
+        <w:t xml:space="preserve"> </w:t>
+      </w:r>
+      <w:r>
+        <w:rPr>
+          <w:i/>
+          <w:iCs/>
+        </w:rPr>
+        <w:t xml:space="preserve">47</w:t>
+      </w:r>
+      <w:r>
+        <w:t xml:space="preserve">(2), 263–291.</w:t>
+      </w:r>
+      <w:r>
+        <w:t xml:space="preserve"> </w:t>
+      </w:r>
+      <w:hyperlink r:id="rId94">
+        <w:r>
+          <w:rPr>
+            <w:rStyle w:val="Hyperlink"/>
+          </w:rPr>
+          <w:t xml:space="preserve">https://doi.org/10.2307/1914185</w:t>
+        </w:r>
+      </w:hyperlink>
+    </w:p>
+    <w:bookmarkEnd w:id="95"/>
+    <w:bookmarkStart w:id="97" w:name="ref-keil2014guidelines"/>
+    <w:p>
+      <w:pPr>
+        <w:pStyle w:val="Bibliography"/>
+      </w:pPr>
+      <w:r>
         <w:t xml:space="preserve">Keil, A., Debener, S., Gratton, G., Junghöfer, M., Kappenman, E. S., Luck, S. J., Luu, P., Miller, G. A., &amp; Yee, C. M. (2014). Committee report: Publication guidelines and recommendations for studies using electroencephalography and magnetoencephalography.</w:t>
       </w:r>
       <w:r>
@@ -6374,7 +8142,7 @@
       <w:r>
         <w:t xml:space="preserve"> </w:t>
       </w:r>
-      <w:hyperlink r:id="rId69">
+      <w:hyperlink r:id="rId96">
         <w:r>
           <w:rPr>
             <w:rStyle w:val="Hyperlink"/>
@@ -6383,13 +8151,154 @@
         </w:r>
       </w:hyperlink>
     </w:p>
-    <w:bookmarkEnd w:id="70"/>
-    <w:bookmarkStart w:id="72" w:name="ref-lawhern2018eegnet"/>
+    <w:bookmarkEnd w:id="97"/>
+    <w:bookmarkStart w:id="99" w:name="ref-killgore2007risk"/>
     <w:p>
       <w:pPr>
         <w:pStyle w:val="Bibliography"/>
       </w:pPr>
       <w:r>
+        <w:t xml:space="preserve">Killgore, W. D. S. (2007). Effects of sleep deprivation and morningness-eveningness traits on risk-taking.</w:t>
+      </w:r>
+      <w:r>
+        <w:t xml:space="preserve"> </w:t>
+      </w:r>
+      <w:r>
+        <w:rPr>
+          <w:i/>
+          <w:iCs/>
+        </w:rPr>
+        <w:t xml:space="preserve">Psychological Reports</w:t>
+      </w:r>
+      <w:r>
+        <w:t xml:space="preserve">,</w:t>
+      </w:r>
+      <w:r>
+        <w:t xml:space="preserve"> </w:t>
+      </w:r>
+      <w:r>
+        <w:rPr>
+          <w:i/>
+          <w:iCs/>
+        </w:rPr>
+        <w:t xml:space="preserve">100</w:t>
+      </w:r>
+      <w:r>
+        <w:t xml:space="preserve">(2), 613–626.</w:t>
+      </w:r>
+      <w:r>
+        <w:t xml:space="preserve"> </w:t>
+      </w:r>
+      <w:hyperlink r:id="rId98">
+        <w:r>
+          <w:rPr>
+            <w:rStyle w:val="Hyperlink"/>
+          </w:rPr>
+          <w:t xml:space="preserve">https://doi.org/10.2466/pr0.100.2.613-626</w:t>
+        </w:r>
+      </w:hyperlink>
+    </w:p>
+    <w:bookmarkEnd w:id="99"/>
+    <w:bookmarkStart w:id="101" w:name="ref-kriegeskorte2009double"/>
+    <w:p>
+      <w:pPr>
+        <w:pStyle w:val="Bibliography"/>
+      </w:pPr>
+      <w:r>
+        <w:t xml:space="preserve">Kriegeskorte, N., Simmons, W. K., Bellgowan, P. S. F., &amp; Baker, C. I. (2009). Circular analysis in systems neuroscience: The dangers of double dipping.</w:t>
+      </w:r>
+      <w:r>
+        <w:t xml:space="preserve"> </w:t>
+      </w:r>
+      <w:r>
+        <w:rPr>
+          <w:i/>
+          <w:iCs/>
+        </w:rPr>
+        <w:t xml:space="preserve">Nature Neuroscience</w:t>
+      </w:r>
+      <w:r>
+        <w:t xml:space="preserve">,</w:t>
+      </w:r>
+      <w:r>
+        <w:t xml:space="preserve"> </w:t>
+      </w:r>
+      <w:r>
+        <w:rPr>
+          <w:i/>
+          <w:iCs/>
+        </w:rPr>
+        <w:t xml:space="preserve">12</w:t>
+      </w:r>
+      <w:r>
+        <w:t xml:space="preserve">(5), 535–540.</w:t>
+      </w:r>
+      <w:r>
+        <w:t xml:space="preserve"> </w:t>
+      </w:r>
+      <w:hyperlink r:id="rId100">
+        <w:r>
+          <w:rPr>
+            <w:rStyle w:val="Hyperlink"/>
+          </w:rPr>
+          <w:t xml:space="preserve">https://doi.org/10.1038/nn.2303</w:t>
+        </w:r>
+      </w:hyperlink>
+    </w:p>
+    <w:bookmarkEnd w:id="101"/>
+    <w:bookmarkStart w:id="103" w:name="ref-lakens2017equivalence"/>
+    <w:p>
+      <w:pPr>
+        <w:pStyle w:val="Bibliography"/>
+      </w:pPr>
+      <w:r>
+        <w:t xml:space="preserve">Lakens, D. (2017). Equivalence tests: A practical primer for t tests, correlations, and meta-analyses.</w:t>
+      </w:r>
+      <w:r>
+        <w:t xml:space="preserve"> </w:t>
+      </w:r>
+      <w:r>
+        <w:rPr>
+          <w:i/>
+          <w:iCs/>
+        </w:rPr>
+        <w:t xml:space="preserve">Social Psychological and Personality Science</w:t>
+      </w:r>
+      <w:r>
+        <w:t xml:space="preserve">,</w:t>
+      </w:r>
+      <w:r>
+        <w:t xml:space="preserve"> </w:t>
+      </w:r>
+      <w:r>
+        <w:rPr>
+          <w:i/>
+          <w:iCs/>
+        </w:rPr>
+        <w:t xml:space="preserve">8</w:t>
+      </w:r>
+      <w:r>
+        <w:t xml:space="preserve">(4), 355–362.</w:t>
+      </w:r>
+      <w:r>
+        <w:t xml:space="preserve"> </w:t>
+      </w:r>
+      <w:hyperlink r:id="rId102">
+        <w:r>
+          <w:rPr>
+            <w:rStyle w:val="Hyperlink"/>
+          </w:rPr>
+          <w:t xml:space="preserve">https://doi.org/10.1177/1948550617697177</w:t>
+        </w:r>
+      </w:hyperlink>
+    </w:p>
+    <w:bookmarkEnd w:id="103"/>
+    <w:bookmarkStart w:id="105" w:name="ref-lawhern2018eegnet"/>
+    <w:p>
+      <w:pPr>
+        <w:pStyle w:val="Bibliography"/>
+      </w:pPr>
+      <w:r>
         <w:t xml:space="preserve">Lawhern, V. J., Solon, A. J., Waytowich, N. R., Gordon, S. M., Hung, C. P., &amp; Lance, B. J. (2018).</w:t>
       </w:r>
       <w:r>
@@ -6439,7 +8348,7 @@
       <w:r>
         <w:t xml:space="preserve"> </w:t>
       </w:r>
-      <w:hyperlink r:id="rId71">
+      <w:hyperlink r:id="rId104">
         <w:r>
           <w:rPr>
             <w:rStyle w:val="Hyperlink"/>
@@ -6448,13 +8357,154 @@
         </w:r>
       </w:hyperlink>
     </w:p>
-    <w:bookmarkEnd w:id="72"/>
-    <w:bookmarkStart w:id="74" w:name="ref-miltner1997feedback"/>
+    <w:bookmarkEnd w:id="105"/>
+    <w:bookmarkStart w:id="107" w:name="ref-lefebvre2017optimistic"/>
     <w:p>
       <w:pPr>
         <w:pStyle w:val="Bibliography"/>
       </w:pPr>
       <w:r>
+        <w:t xml:space="preserve">Lefebvre, G., Lebreton, M., Meyniel, F., Bourgeois-Gironde, S., &amp; Palminteri, S. (2017). Behavioural and neural characterization of optimistic reinforcement learning.</w:t>
+      </w:r>
+      <w:r>
+        <w:t xml:space="preserve"> </w:t>
+      </w:r>
+      <w:r>
+        <w:rPr>
+          <w:i/>
+          <w:iCs/>
+        </w:rPr>
+        <w:t xml:space="preserve">Nature Human Behaviour</w:t>
+      </w:r>
+      <w:r>
+        <w:t xml:space="preserve">,</w:t>
+      </w:r>
+      <w:r>
+        <w:t xml:space="preserve"> </w:t>
+      </w:r>
+      <w:r>
+        <w:rPr>
+          <w:i/>
+          <w:iCs/>
+        </w:rPr>
+        <w:t xml:space="preserve">1</w:t>
+      </w:r>
+      <w:r>
+        <w:t xml:space="preserve">(4), 0067.</w:t>
+      </w:r>
+      <w:r>
+        <w:t xml:space="preserve"> </w:t>
+      </w:r>
+      <w:hyperlink r:id="rId106">
+        <w:r>
+          <w:rPr>
+            <w:rStyle w:val="Hyperlink"/>
+          </w:rPr>
+          <w:t xml:space="preserve">https://doi.org/10.1038/s41562-017-0067</w:t>
+        </w:r>
+      </w:hyperlink>
+    </w:p>
+    <w:bookmarkEnd w:id="107"/>
+    <w:bookmarkStart w:id="109" w:name="ref-mcclung2007circadian"/>
+    <w:p>
+      <w:pPr>
+        <w:pStyle w:val="Bibliography"/>
+      </w:pPr>
+      <w:r>
+        <w:t xml:space="preserve">McClung, C. A. (2007). Circadian genes, rhythms and the biology of mood disorders.</w:t>
+      </w:r>
+      <w:r>
+        <w:t xml:space="preserve"> </w:t>
+      </w:r>
+      <w:r>
+        <w:rPr>
+          <w:i/>
+          <w:iCs/>
+        </w:rPr>
+        <w:t xml:space="preserve">Pharmacology &amp; Therapeutics</w:t>
+      </w:r>
+      <w:r>
+        <w:t xml:space="preserve">,</w:t>
+      </w:r>
+      <w:r>
+        <w:t xml:space="preserve"> </w:t>
+      </w:r>
+      <w:r>
+        <w:rPr>
+          <w:i/>
+          <w:iCs/>
+        </w:rPr>
+        <w:t xml:space="preserve">114</w:t>
+      </w:r>
+      <w:r>
+        <w:t xml:space="preserve">(2), 222–232.</w:t>
+      </w:r>
+      <w:r>
+        <w:t xml:space="preserve"> </w:t>
+      </w:r>
+      <w:hyperlink r:id="rId108">
+        <w:r>
+          <w:rPr>
+            <w:rStyle w:val="Hyperlink"/>
+          </w:rPr>
+          <w:t xml:space="preserve">https://doi.org/10.1016/j.pharmthera.2007.02.003</w:t>
+        </w:r>
+      </w:hyperlink>
+    </w:p>
+    <w:bookmarkEnd w:id="109"/>
+    <w:bookmarkStart w:id="111" w:name="ref-mcgowan2018impulsivity"/>
+    <w:p>
+      <w:pPr>
+        <w:pStyle w:val="Bibliography"/>
+      </w:pPr>
+      <w:r>
+        <w:t xml:space="preserve">McGowan, N. M., &amp; Coogan, A. N. (2018). Sleep and circadian rhythm function and trait impulsivity: An actigraphy study.</w:t>
+      </w:r>
+      <w:r>
+        <w:t xml:space="preserve"> </w:t>
+      </w:r>
+      <w:r>
+        <w:rPr>
+          <w:i/>
+          <w:iCs/>
+        </w:rPr>
+        <w:t xml:space="preserve">Psychiatry Research</w:t>
+      </w:r>
+      <w:r>
+        <w:t xml:space="preserve">,</w:t>
+      </w:r>
+      <w:r>
+        <w:t xml:space="preserve"> </w:t>
+      </w:r>
+      <w:r>
+        <w:rPr>
+          <w:i/>
+          <w:iCs/>
+        </w:rPr>
+        <w:t xml:space="preserve">268</w:t>
+      </w:r>
+      <w:r>
+        <w:t xml:space="preserve">, 251–256.</w:t>
+      </w:r>
+      <w:r>
+        <w:t xml:space="preserve"> </w:t>
+      </w:r>
+      <w:hyperlink r:id="rId110">
+        <w:r>
+          <w:rPr>
+            <w:rStyle w:val="Hyperlink"/>
+          </w:rPr>
+          <w:t xml:space="preserve">https://doi.org/10.1016/j.psychres.2018.07.030</w:t>
+        </w:r>
+      </w:hyperlink>
+    </w:p>
+    <w:bookmarkEnd w:id="111"/>
+    <w:bookmarkStart w:id="113" w:name="ref-miltner1997feedback"/>
+    <w:p>
+      <w:pPr>
+        <w:pStyle w:val="Bibliography"/>
+      </w:pPr>
+      <w:r>
         <w:t xml:space="preserve">Miltner, W. H. R., Braun, C. H., &amp; Coles, M. G. H. (1997). Event-related brain potentials following incorrect feedback in a time-estimation task: Evidence for a generic neural system for error detection.</w:t>
       </w:r>
       <w:r>
@@ -6486,7 +8536,7 @@
       <w:r>
         <w:t xml:space="preserve"> </w:t>
       </w:r>
-      <w:hyperlink r:id="rId73">
+      <w:hyperlink r:id="rId112">
         <w:r>
           <w:rPr>
             <w:rStyle w:val="Hyperlink"/>
@@ -6495,13 +8545,201 @@
         </w:r>
       </w:hyperlink>
     </w:p>
-    <w:bookmarkEnd w:id="74"/>
-    <w:bookmarkStart w:id="76" w:name="ref-polich2007p300"/>
+    <w:bookmarkEnd w:id="113"/>
+    <w:bookmarkStart w:id="115" w:name="ref-muro2012sensation"/>
     <w:p>
       <w:pPr>
         <w:pStyle w:val="Bibliography"/>
       </w:pPr>
       <w:r>
+        <w:t xml:space="preserve">Muro, A., Gomà-i-Freixanet, M., &amp; Adan, A. (2012). Circadian typology and sensation seeking in adolescents.</w:t>
+      </w:r>
+      <w:r>
+        <w:t xml:space="preserve"> </w:t>
+      </w:r>
+      <w:r>
+        <w:rPr>
+          <w:i/>
+          <w:iCs/>
+        </w:rPr>
+        <w:t xml:space="preserve">Chronobiology International</w:t>
+      </w:r>
+      <w:r>
+        <w:t xml:space="preserve">,</w:t>
+      </w:r>
+      <w:r>
+        <w:t xml:space="preserve"> </w:t>
+      </w:r>
+      <w:r>
+        <w:rPr>
+          <w:i/>
+          <w:iCs/>
+        </w:rPr>
+        <w:t xml:space="preserve">29</w:t>
+      </w:r>
+      <w:r>
+        <w:t xml:space="preserve">(10), 1376–1382.</w:t>
+      </w:r>
+      <w:r>
+        <w:t xml:space="preserve"> </w:t>
+      </w:r>
+      <w:hyperlink r:id="rId114">
+        <w:r>
+          <w:rPr>
+            <w:rStyle w:val="Hyperlink"/>
+          </w:rPr>
+          <w:t xml:space="preserve">https://doi.org/10.3109/07420528.2012.728665</w:t>
+        </w:r>
+      </w:hyperlink>
+    </w:p>
+    <w:bookmarkEnd w:id="115"/>
+    <w:bookmarkStart w:id="117" w:name="ref-murray2009clocks"/>
+    <w:p>
+      <w:pPr>
+        <w:pStyle w:val="Bibliography"/>
+      </w:pPr>
+      <w:r>
+        <w:t xml:space="preserve">Murray, G., Nicholas, C. L., Kleiman, J., Dwyer, R., Carrington, M. J., Allen, N. B., &amp; Trinder, J. (2009). Nature’s clocks and human mood: The circadian system modulates reward motivation.</w:t>
+      </w:r>
+      <w:r>
+        <w:t xml:space="preserve"> </w:t>
+      </w:r>
+      <w:r>
+        <w:rPr>
+          <w:i/>
+          <w:iCs/>
+        </w:rPr>
+        <w:t xml:space="preserve">Emotion</w:t>
+      </w:r>
+      <w:r>
+        <w:t xml:space="preserve">,</w:t>
+      </w:r>
+      <w:r>
+        <w:t xml:space="preserve"> </w:t>
+      </w:r>
+      <w:r>
+        <w:rPr>
+          <w:i/>
+          <w:iCs/>
+        </w:rPr>
+        <w:t xml:space="preserve">9</w:t>
+      </w:r>
+      <w:r>
+        <w:t xml:space="preserve">(5), 705–716.</w:t>
+      </w:r>
+      <w:r>
+        <w:t xml:space="preserve"> </w:t>
+      </w:r>
+      <w:hyperlink r:id="rId116">
+        <w:r>
+          <w:rPr>
+            <w:rStyle w:val="Hyperlink"/>
+          </w:rPr>
+          <w:t xml:space="preserve">https://doi.org/10.1037/a0017080</w:t>
+        </w:r>
+      </w:hyperlink>
+    </w:p>
+    <w:bookmarkEnd w:id="117"/>
+    <w:bookmarkStart w:id="119" w:name="ref-niv2012risk"/>
+    <w:p>
+      <w:pPr>
+        <w:pStyle w:val="Bibliography"/>
+      </w:pPr>
+      <w:r>
+        <w:t xml:space="preserve">Niv, Y., Edlund, J. A., Dayan, P., &amp; O’Doherty, J. P. (2012). Neural prediction errors reveal a risk-sensitive reinforcement-learning process in the human brain.</w:t>
+      </w:r>
+      <w:r>
+        <w:t xml:space="preserve"> </w:t>
+      </w:r>
+      <w:r>
+        <w:rPr>
+          <w:i/>
+          <w:iCs/>
+        </w:rPr>
+        <w:t xml:space="preserve">Journal of Neuroscience</w:t>
+      </w:r>
+      <w:r>
+        <w:t xml:space="preserve">,</w:t>
+      </w:r>
+      <w:r>
+        <w:t xml:space="preserve"> </w:t>
+      </w:r>
+      <w:r>
+        <w:rPr>
+          <w:i/>
+          <w:iCs/>
+        </w:rPr>
+        <w:t xml:space="preserve">32</w:t>
+      </w:r>
+      <w:r>
+        <w:t xml:space="preserve">(2), 551–562.</w:t>
+      </w:r>
+      <w:r>
+        <w:t xml:space="preserve"> </w:t>
+      </w:r>
+      <w:hyperlink r:id="rId118">
+        <w:r>
+          <w:rPr>
+            <w:rStyle w:val="Hyperlink"/>
+          </w:rPr>
+          <w:t xml:space="preserve">https://doi.org/10.1523/JNEUROSCI.5498-10.2012</w:t>
+        </w:r>
+      </w:hyperlink>
+    </w:p>
+    <w:bookmarkEnd w:id="119"/>
+    <w:bookmarkStart w:id="121" w:name="ref-poldrack2020prediction"/>
+    <w:p>
+      <w:pPr>
+        <w:pStyle w:val="Bibliography"/>
+      </w:pPr>
+      <w:r>
+        <w:t xml:space="preserve">Poldrack, R. A., Huckins, G., &amp; Varoquaux, G. (2020). Establishment of best practices for evidence for prediction.</w:t>
+      </w:r>
+      <w:r>
+        <w:t xml:space="preserve"> </w:t>
+      </w:r>
+      <w:r>
+        <w:rPr>
+          <w:i/>
+          <w:iCs/>
+        </w:rPr>
+        <w:t xml:space="preserve">JAMA Psychiatry</w:t>
+      </w:r>
+      <w:r>
+        <w:t xml:space="preserve">,</w:t>
+      </w:r>
+      <w:r>
+        <w:t xml:space="preserve"> </w:t>
+      </w:r>
+      <w:r>
+        <w:rPr>
+          <w:i/>
+          <w:iCs/>
+        </w:rPr>
+        <w:t xml:space="preserve">77</w:t>
+      </w:r>
+      <w:r>
+        <w:t xml:space="preserve">(5), 534–540.</w:t>
+      </w:r>
+      <w:r>
+        <w:t xml:space="preserve"> </w:t>
+      </w:r>
+      <w:hyperlink r:id="rId120">
+        <w:r>
+          <w:rPr>
+            <w:rStyle w:val="Hyperlink"/>
+          </w:rPr>
+          <w:t xml:space="preserve">https://doi.org/10.1001/jamapsychiatry.2019.3671</w:t>
+        </w:r>
+      </w:hyperlink>
+    </w:p>
+    <w:bookmarkEnd w:id="121"/>
+    <w:bookmarkStart w:id="123" w:name="ref-polich2007p300"/>
+    <w:p>
+      <w:pPr>
+        <w:pStyle w:val="Bibliography"/>
+      </w:pPr>
+      <w:r>
         <w:t xml:space="preserve">Polich, J. (2007). Updating P300: An integrative theory of P3a and P3b.</w:t>
       </w:r>
       <w:r>
@@ -6533,7 +8771,7 @@
       <w:r>
         <w:t xml:space="preserve"> </w:t>
       </w:r>
-      <w:hyperlink r:id="rId75">
+      <w:hyperlink r:id="rId122">
         <w:r>
           <w:rPr>
             <w:rStyle w:val="Hyperlink"/>
@@ -6542,13 +8780,166 @@
         </w:r>
       </w:hyperlink>
     </w:p>
-    <w:bookmarkEnd w:id="76"/>
-    <w:bookmarkStart w:id="78" w:name="ref-roenneberg2003life"/>
+    <w:bookmarkEnd w:id="123"/>
+    <w:bookmarkStart w:id="125" w:name="ref-proudfit2015reward"/>
     <w:p>
       <w:pPr>
         <w:pStyle w:val="Bibliography"/>
       </w:pPr>
       <w:r>
+        <w:t xml:space="preserve">Proudfit, G. H. (2015). The reward positivity: From basic research on reward to a biomarker for depression.</w:t>
+      </w:r>
+      <w:r>
+        <w:t xml:space="preserve"> </w:t>
+      </w:r>
+      <w:r>
+        <w:rPr>
+          <w:i/>
+          <w:iCs/>
+        </w:rPr>
+        <w:t xml:space="preserve">Psychophysiology</w:t>
+      </w:r>
+      <w:r>
+        <w:t xml:space="preserve">,</w:t>
+      </w:r>
+      <w:r>
+        <w:t xml:space="preserve"> </w:t>
+      </w:r>
+      <w:r>
+        <w:rPr>
+          <w:i/>
+          <w:iCs/>
+        </w:rPr>
+        <w:t xml:space="preserve">52</w:t>
+      </w:r>
+      <w:r>
+        <w:t xml:space="preserve">(4), 449–459.</w:t>
+      </w:r>
+      <w:r>
+        <w:t xml:space="preserve"> </w:t>
+      </w:r>
+      <w:hyperlink r:id="rId124">
+        <w:r>
+          <w:rPr>
+            <w:rStyle w:val="Hyperlink"/>
+          </w:rPr>
+          <w:t xml:space="preserve">https://doi.org/10.1111/psyp.12370</w:t>
+        </w:r>
+      </w:hyperlink>
+    </w:p>
+    <w:bookmarkEnd w:id="125"/>
+    <w:bookmarkStart w:id="127" w:name="ref-randler2014bisbas"/>
+    <w:p>
+      <w:pPr>
+        <w:pStyle w:val="Bibliography"/>
+      </w:pPr>
+      <w:r>
+        <w:t xml:space="preserve">Randler, C., Baumann, V. P., &amp; Horzum, M. B. (2014). Morningness-eveningness, big five and the</w:t>
+      </w:r>
+      <w:r>
+        <w:t xml:space="preserve"> </w:t>
+      </w:r>
+      <w:r>
+        <w:t xml:space="preserve">BIS/BAS</w:t>
+      </w:r>
+      <w:r>
+        <w:t xml:space="preserve"> </w:t>
+      </w:r>
+      <w:r>
+        <w:t xml:space="preserve">inventory.</w:t>
+      </w:r>
+      <w:r>
+        <w:t xml:space="preserve"> </w:t>
+      </w:r>
+      <w:r>
+        <w:rPr>
+          <w:i/>
+          <w:iCs/>
+        </w:rPr>
+        <w:t xml:space="preserve">Personality and Individual Differences</w:t>
+      </w:r>
+      <w:r>
+        <w:t xml:space="preserve">,</w:t>
+      </w:r>
+      <w:r>
+        <w:t xml:space="preserve"> </w:t>
+      </w:r>
+      <w:r>
+        <w:rPr>
+          <w:i/>
+          <w:iCs/>
+        </w:rPr>
+        <w:t xml:space="preserve">66</w:t>
+      </w:r>
+      <w:r>
+        <w:t xml:space="preserve">, 64–67.</w:t>
+      </w:r>
+      <w:r>
+        <w:t xml:space="preserve"> </w:t>
+      </w:r>
+      <w:hyperlink r:id="rId126">
+        <w:r>
+          <w:rPr>
+            <w:rStyle w:val="Hyperlink"/>
+          </w:rPr>
+          <w:t xml:space="preserve">https://doi.org/10.1016/j.paid.2014.03.010</w:t>
+        </w:r>
+      </w:hyperlink>
+    </w:p>
+    <w:bookmarkEnd w:id="127"/>
+    <w:bookmarkStart w:id="129" w:name="ref-roenneberg2007epidemiology"/>
+    <w:p>
+      <w:pPr>
+        <w:pStyle w:val="Bibliography"/>
+      </w:pPr>
+      <w:r>
+        <w:t xml:space="preserve">Roenneberg, T., Kuehnle, T., Juda, M., Kantermann, T., Allebrandt, K., Gordijn, M., &amp; Merrow, M. (2007). Epidemiology of the human circadian clock.</w:t>
+      </w:r>
+      <w:r>
+        <w:t xml:space="preserve"> </w:t>
+      </w:r>
+      <w:r>
+        <w:rPr>
+          <w:i/>
+          <w:iCs/>
+        </w:rPr>
+        <w:t xml:space="preserve">Sleep Medicine Reviews</w:t>
+      </w:r>
+      <w:r>
+        <w:t xml:space="preserve">,</w:t>
+      </w:r>
+      <w:r>
+        <w:t xml:space="preserve"> </w:t>
+      </w:r>
+      <w:r>
+        <w:rPr>
+          <w:i/>
+          <w:iCs/>
+        </w:rPr>
+        <w:t xml:space="preserve">11</w:t>
+      </w:r>
+      <w:r>
+        <w:t xml:space="preserve">(6), 429–438.</w:t>
+      </w:r>
+      <w:r>
+        <w:t xml:space="preserve"> </w:t>
+      </w:r>
+      <w:hyperlink r:id="rId128">
+        <w:r>
+          <w:rPr>
+            <w:rStyle w:val="Hyperlink"/>
+          </w:rPr>
+          <w:t xml:space="preserve">https://doi.org/10.1016/j.smrv.2007.07.005</w:t>
+        </w:r>
+      </w:hyperlink>
+    </w:p>
+    <w:bookmarkEnd w:id="129"/>
+    <w:bookmarkStart w:id="131" w:name="ref-roenneberg2003life"/>
+    <w:p>
+      <w:pPr>
+        <w:pStyle w:val="Bibliography"/>
+      </w:pPr>
+      <w:r>
         <w:t xml:space="preserve">Roenneberg, T., Wirz-Justice, A., &amp; Merrow, M. (2003). Life between clocks: Daily temporal patterns of human chronotypes.</w:t>
       </w:r>
       <w:r>
@@ -6580,7 +8971,7 @@
       <w:r>
         <w:t xml:space="preserve"> </w:t>
       </w:r>
-      <w:hyperlink r:id="rId77">
+      <w:hyperlink r:id="rId130">
         <w:r>
           <w:rPr>
             <w:rStyle w:val="Hyperlink"/>
@@ -6589,13 +8980,392 @@
         </w:r>
       </w:hyperlink>
     </w:p>
-    <w:bookmarkEnd w:id="78"/>
-    <w:bookmarkStart w:id="80" w:name="ref-webb2009reward"/>
+    <w:bookmarkEnd w:id="131"/>
+    <w:bookmarkStart w:id="133" w:name="ref-rouder2009bayes"/>
     <w:p>
       <w:pPr>
         <w:pStyle w:val="Bibliography"/>
       </w:pPr>
       <w:r>
+        <w:t xml:space="preserve">Rouder, J. N., Speckman, P. L., Sun, D., Morey, R. D., &amp; Iverson, G. (2009). Bayesian t tests for accepting and rejecting the null hypothesis.</w:t>
+      </w:r>
+      <w:r>
+        <w:t xml:space="preserve"> </w:t>
+      </w:r>
+      <w:r>
+        <w:rPr>
+          <w:i/>
+          <w:iCs/>
+        </w:rPr>
+        <w:t xml:space="preserve">Psychonomic Bulletin &amp; Review</w:t>
+      </w:r>
+      <w:r>
+        <w:t xml:space="preserve">,</w:t>
+      </w:r>
+      <w:r>
+        <w:t xml:space="preserve"> </w:t>
+      </w:r>
+      <w:r>
+        <w:rPr>
+          <w:i/>
+          <w:iCs/>
+        </w:rPr>
+        <w:t xml:space="preserve">16</w:t>
+      </w:r>
+      <w:r>
+        <w:t xml:space="preserve">(2), 225–237.</w:t>
+      </w:r>
+      <w:r>
+        <w:t xml:space="preserve"> </w:t>
+      </w:r>
+      <w:hyperlink r:id="rId132">
+        <w:r>
+          <w:rPr>
+            <w:rStyle w:val="Hyperlink"/>
+          </w:rPr>
+          <w:t xml:space="preserve">https://doi.org/10.3758/PBR.16.2.225</w:t>
+        </w:r>
+      </w:hyperlink>
+    </w:p>
+    <w:bookmarkEnd w:id="133"/>
+    <w:bookmarkStart w:id="135" w:name="ref-roy2019eegreview"/>
+    <w:p>
+      <w:pPr>
+        <w:pStyle w:val="Bibliography"/>
+      </w:pPr>
+      <w:r>
+        <w:t xml:space="preserve">Roy, Y., Banville, H., Albuquerque, I., Gramfort, A., Falk, T. H., &amp; Faubert, J. (2019). Deep learning-based electroencephalography analysis: A systematic review.</w:t>
+      </w:r>
+      <w:r>
+        <w:t xml:space="preserve"> </w:t>
+      </w:r>
+      <w:r>
+        <w:rPr>
+          <w:i/>
+          <w:iCs/>
+        </w:rPr>
+        <w:t xml:space="preserve">Journal of Neural Engineering</w:t>
+      </w:r>
+      <w:r>
+        <w:t xml:space="preserve">,</w:t>
+      </w:r>
+      <w:r>
+        <w:t xml:space="preserve"> </w:t>
+      </w:r>
+      <w:r>
+        <w:rPr>
+          <w:i/>
+          <w:iCs/>
+        </w:rPr>
+        <w:t xml:space="preserve">16</w:t>
+      </w:r>
+      <w:r>
+        <w:t xml:space="preserve">(5), 051001.</w:t>
+      </w:r>
+      <w:r>
+        <w:t xml:space="preserve"> </w:t>
+      </w:r>
+      <w:hyperlink r:id="rId134">
+        <w:r>
+          <w:rPr>
+            <w:rStyle w:val="Hyperlink"/>
+          </w:rPr>
+          <w:t xml:space="preserve">https://doi.org/10.1088/1741-2552/ab260c</w:t>
+        </w:r>
+      </w:hyperlink>
+    </w:p>
+    <w:bookmarkEnd w:id="135"/>
+    <w:bookmarkStart w:id="137" w:name="ref-sambrook2015rpe"/>
+    <w:p>
+      <w:pPr>
+        <w:pStyle w:val="Bibliography"/>
+      </w:pPr>
+      <w:r>
+        <w:t xml:space="preserve">Sambrook, T. D., &amp; Goslin, J. (2015). A neural reward prediction error revealed by a meta-analysis of</w:t>
+      </w:r>
+      <w:r>
+        <w:t xml:space="preserve"> </w:t>
+      </w:r>
+      <w:r>
+        <w:t xml:space="preserve">ERPs</w:t>
+      </w:r>
+      <w:r>
+        <w:t xml:space="preserve"> </w:t>
+      </w:r>
+      <w:r>
+        <w:t xml:space="preserve">using great grand averages.</w:t>
+      </w:r>
+      <w:r>
+        <w:t xml:space="preserve"> </w:t>
+      </w:r>
+      <w:r>
+        <w:rPr>
+          <w:i/>
+          <w:iCs/>
+        </w:rPr>
+        <w:t xml:space="preserve">Psychological Bulletin</w:t>
+      </w:r>
+      <w:r>
+        <w:t xml:space="preserve">,</w:t>
+      </w:r>
+      <w:r>
+        <w:t xml:space="preserve"> </w:t>
+      </w:r>
+      <w:r>
+        <w:rPr>
+          <w:i/>
+          <w:iCs/>
+        </w:rPr>
+        <w:t xml:space="preserve">141</w:t>
+      </w:r>
+      <w:r>
+        <w:t xml:space="preserve">(1), 213–235.</w:t>
+      </w:r>
+      <w:r>
+        <w:t xml:space="preserve"> </w:t>
+      </w:r>
+      <w:hyperlink r:id="rId136">
+        <w:r>
+          <w:rPr>
+            <w:rStyle w:val="Hyperlink"/>
+          </w:rPr>
+          <w:t xml:space="preserve">https://doi.org/10.1037/bul0000006</w:t>
+        </w:r>
+      </w:hyperlink>
+    </w:p>
+    <w:bookmarkEnd w:id="137"/>
+    <w:bookmarkStart w:id="139" w:name="ref-sanmartin2012outcome"/>
+    <w:p>
+      <w:pPr>
+        <w:pStyle w:val="Bibliography"/>
+      </w:pPr>
+      <w:r>
+        <w:t xml:space="preserve">San Martín, R. (2012). Event-related potential studies of outcome processing and feedback-guided learning.</w:t>
+      </w:r>
+      <w:r>
+        <w:t xml:space="preserve"> </w:t>
+      </w:r>
+      <w:r>
+        <w:rPr>
+          <w:i/>
+          <w:iCs/>
+        </w:rPr>
+        <w:t xml:space="preserve">Frontiers in Human Neuroscience</w:t>
+      </w:r>
+      <w:r>
+        <w:t xml:space="preserve">,</w:t>
+      </w:r>
+      <w:r>
+        <w:t xml:space="preserve"> </w:t>
+      </w:r>
+      <w:r>
+        <w:rPr>
+          <w:i/>
+          <w:iCs/>
+        </w:rPr>
+        <w:t xml:space="preserve">6</w:t>
+      </w:r>
+      <w:r>
+        <w:t xml:space="preserve">, 304.</w:t>
+      </w:r>
+      <w:r>
+        <w:t xml:space="preserve"> </w:t>
+      </w:r>
+      <w:hyperlink r:id="rId138">
+        <w:r>
+          <w:rPr>
+            <w:rStyle w:val="Hyperlink"/>
+          </w:rPr>
+          <w:t xml:space="preserve">https://doi.org/10.3389/fnhum.2012.00304</w:t>
+        </w:r>
+      </w:hyperlink>
+    </w:p>
+    <w:bookmarkEnd w:id="139"/>
+    <w:bookmarkStart w:id="141" w:name="ref-schirrmeister2017cnn"/>
+    <w:p>
+      <w:pPr>
+        <w:pStyle w:val="Bibliography"/>
+      </w:pPr>
+      <w:r>
+        <w:t xml:space="preserve">Schirrmeister, R. T., Springenberg, J. T., Fiederer, L. D. J., Glasstetter, M., Eggensperger, K., Tangermann, M., Hutter, F., Burgard, W., &amp; Ball, T. (2017). Deep learning with convolutional neural networks for</w:t>
+      </w:r>
+      <w:r>
+        <w:t xml:space="preserve"> </w:t>
+      </w:r>
+      <w:r>
+        <w:t xml:space="preserve">EEG</w:t>
+      </w:r>
+      <w:r>
+        <w:t xml:space="preserve"> </w:t>
+      </w:r>
+      <w:r>
+        <w:t xml:space="preserve">decoding and visualization.</w:t>
+      </w:r>
+      <w:r>
+        <w:t xml:space="preserve"> </w:t>
+      </w:r>
+      <w:r>
+        <w:rPr>
+          <w:i/>
+          <w:iCs/>
+        </w:rPr>
+        <w:t xml:space="preserve">Human Brain Mapping</w:t>
+      </w:r>
+      <w:r>
+        <w:t xml:space="preserve">,</w:t>
+      </w:r>
+      <w:r>
+        <w:t xml:space="preserve"> </w:t>
+      </w:r>
+      <w:r>
+        <w:rPr>
+          <w:i/>
+          <w:iCs/>
+        </w:rPr>
+        <w:t xml:space="preserve">38</w:t>
+      </w:r>
+      <w:r>
+        <w:t xml:space="preserve">(11), 5391–5420.</w:t>
+      </w:r>
+      <w:r>
+        <w:t xml:space="preserve"> </w:t>
+      </w:r>
+      <w:hyperlink r:id="rId140">
+        <w:r>
+          <w:rPr>
+            <w:rStyle w:val="Hyperlink"/>
+          </w:rPr>
+          <w:t xml:space="preserve">https://doi.org/10.1002/hbm.23730</w:t>
+        </w:r>
+      </w:hyperlink>
+    </w:p>
+    <w:bookmarkEnd w:id="141"/>
+    <w:bookmarkStart w:id="142" w:name="ref-sutton2018reinforcement"/>
+    <w:p>
+      <w:pPr>
+        <w:pStyle w:val="Bibliography"/>
+      </w:pPr>
+      <w:r>
+        <w:t xml:space="preserve">Sutton, R. S., &amp; Barto, A. G. (2018).</w:t>
+      </w:r>
+      <w:r>
+        <w:t xml:space="preserve"> </w:t>
+      </w:r>
+      <w:r>
+        <w:rPr>
+          <w:i/>
+          <w:iCs/>
+        </w:rPr>
+        <w:t xml:space="preserve">Reinforcement learning: An introduction</w:t>
+      </w:r>
+      <w:r>
+        <w:t xml:space="preserve"> </w:t>
+      </w:r>
+      <w:r>
+        <w:t xml:space="preserve">(2nd ed.). MIT Press.</w:t>
+      </w:r>
+    </w:p>
+    <w:bookmarkEnd w:id="142"/>
+    <w:bookmarkStart w:id="144" w:name="ref-varoqueaux2018cv"/>
+    <w:p>
+      <w:pPr>
+        <w:pStyle w:val="Bibliography"/>
+      </w:pPr>
+      <w:r>
+        <w:t xml:space="preserve">Varoquaux, G. (2018). Cross-validation failure: Small sample sizes lead to large error bars.</w:t>
+      </w:r>
+      <w:r>
+        <w:t xml:space="preserve"> </w:t>
+      </w:r>
+      <w:r>
+        <w:rPr>
+          <w:i/>
+          <w:iCs/>
+        </w:rPr>
+        <w:t xml:space="preserve">NeuroImage</w:t>
+      </w:r>
+      <w:r>
+        <w:t xml:space="preserve">,</w:t>
+      </w:r>
+      <w:r>
+        <w:t xml:space="preserve"> </w:t>
+      </w:r>
+      <w:r>
+        <w:rPr>
+          <w:i/>
+          <w:iCs/>
+        </w:rPr>
+        <w:t xml:space="preserve">180</w:t>
+      </w:r>
+      <w:r>
+        <w:t xml:space="preserve">, 68–77.</w:t>
+      </w:r>
+      <w:r>
+        <w:t xml:space="preserve"> </w:t>
+      </w:r>
+      <w:hyperlink r:id="rId143">
+        <w:r>
+          <w:rPr>
+            <w:rStyle w:val="Hyperlink"/>
+          </w:rPr>
+          <w:t xml:space="preserve">https://doi.org/10.1016/j.neuroimage.2017.06.061</w:t>
+        </w:r>
+      </w:hyperlink>
+    </w:p>
+    <w:bookmarkEnd w:id="144"/>
+    <w:bookmarkStart w:id="146" w:name="ref-walsh2012erp"/>
+    <w:p>
+      <w:pPr>
+        <w:pStyle w:val="Bibliography"/>
+      </w:pPr>
+      <w:r>
+        <w:t xml:space="preserve">Walsh, M. M., &amp; Anderson, J. R. (2012). Learning from experience: Event-related potential correlates of reward processing, neural adaptation, and behavioral choice.</w:t>
+      </w:r>
+      <w:r>
+        <w:t xml:space="preserve"> </w:t>
+      </w:r>
+      <w:r>
+        <w:rPr>
+          <w:i/>
+          <w:iCs/>
+        </w:rPr>
+        <w:t xml:space="preserve">Neuroscience &amp; Biobehavioral Reviews</w:t>
+      </w:r>
+      <w:r>
+        <w:t xml:space="preserve">,</w:t>
+      </w:r>
+      <w:r>
+        <w:t xml:space="preserve"> </w:t>
+      </w:r>
+      <w:r>
+        <w:rPr>
+          <w:i/>
+          <w:iCs/>
+        </w:rPr>
+        <w:t xml:space="preserve">36</w:t>
+      </w:r>
+      <w:r>
+        <w:t xml:space="preserve">(8), 1870–1884.</w:t>
+      </w:r>
+      <w:r>
+        <w:t xml:space="preserve"> </w:t>
+      </w:r>
+      <w:hyperlink r:id="rId145">
+        <w:r>
+          <w:rPr>
+            <w:rStyle w:val="Hyperlink"/>
+          </w:rPr>
+          <w:t xml:space="preserve">https://doi.org/10.1016/j.neubiorev.2012.05.008</w:t>
+        </w:r>
+      </w:hyperlink>
+    </w:p>
+    <w:bookmarkEnd w:id="146"/>
+    <w:bookmarkStart w:id="148" w:name="ref-webb2009reward"/>
+    <w:p>
+      <w:pPr>
+        <w:pStyle w:val="Bibliography"/>
+      </w:pPr>
+      <w:r>
         <w:t xml:space="preserve">Webb, I. C., Baltazar, R. M., Wang, X., Pitchers, K. K., Coolen, L. M., &amp; Lehman, M. N. (2009). Diurnal variations in natural and drug reward, mesolimbic tyrosine hydroxylase, and clock gene expression in the male rat.</w:t>
       </w:r>
       <w:r>
@@ -6627,7 +9397,7 @@
       <w:r>
         <w:t xml:space="preserve"> </w:t>
       </w:r>
-      <w:hyperlink r:id="rId79">
+      <w:hyperlink r:id="rId147">
         <w:r>
           <w:rPr>
             <w:rStyle w:val="Hyperlink"/>
@@ -6636,9 +9406,162 @@
         </w:r>
       </w:hyperlink>
     </w:p>
-    <w:bookmarkEnd w:id="80"/>
-    <w:bookmarkEnd w:id="81"/>
-    <w:bookmarkEnd w:id="82"/>
+    <w:bookmarkEnd w:id="148"/>
+    <w:bookmarkStart w:id="150" w:name="ref-wittmann2006social"/>
+    <w:p>
+      <w:pPr>
+        <w:pStyle w:val="Bibliography"/>
+      </w:pPr>
+      <w:r>
+        <w:t xml:space="preserve">Wittmann, M., Dinich, J., Merrow, M., &amp; Roenneberg, T. (2006). Social jetlag: Misalignment of biological and social time.</w:t>
+      </w:r>
+      <w:r>
+        <w:t xml:space="preserve"> </w:t>
+      </w:r>
+      <w:r>
+        <w:rPr>
+          <w:i/>
+          <w:iCs/>
+        </w:rPr>
+        <w:t xml:space="preserve">Chronobiology International</w:t>
+      </w:r>
+      <w:r>
+        <w:t xml:space="preserve">,</w:t>
+      </w:r>
+      <w:r>
+        <w:t xml:space="preserve"> </w:t>
+      </w:r>
+      <w:r>
+        <w:rPr>
+          <w:i/>
+          <w:iCs/>
+        </w:rPr>
+        <w:t xml:space="preserve">23</w:t>
+      </w:r>
+      <w:r>
+        <w:t xml:space="preserve">(1–2), 497–509.</w:t>
+      </w:r>
+      <w:r>
+        <w:t xml:space="preserve"> </w:t>
+      </w:r>
+      <w:hyperlink r:id="rId149">
+        <w:r>
+          <w:rPr>
+            <w:rStyle w:val="Hyperlink"/>
+          </w:rPr>
+          <w:t xml:space="preserve">https://doi.org/10.1080/07420520500545979</w:t>
+        </w:r>
+      </w:hyperlink>
+    </w:p>
+    <w:bookmarkEnd w:id="150"/>
+    <w:bookmarkStart w:id="152" w:name="ref-wu2009p300"/>
+    <w:p>
+      <w:pPr>
+        <w:pStyle w:val="Bibliography"/>
+      </w:pPr>
+      <w:r>
+        <w:t xml:space="preserve">Wu, Y., &amp; Zhou, X. (2009). The</w:t>
+      </w:r>
+      <w:r>
+        <w:t xml:space="preserve"> </w:t>
+      </w:r>
+      <w:r>
+        <w:t xml:space="preserve">P300</w:t>
+      </w:r>
+      <w:r>
+        <w:t xml:space="preserve"> </w:t>
+      </w:r>
+      <w:r>
+        <w:t xml:space="preserve">and reward valence, magnitude, and expectancy in outcome evaluation.</w:t>
+      </w:r>
+      <w:r>
+        <w:t xml:space="preserve"> </w:t>
+      </w:r>
+      <w:r>
+        <w:rPr>
+          <w:i/>
+          <w:iCs/>
+        </w:rPr>
+        <w:t xml:space="preserve">Brain Research</w:t>
+      </w:r>
+      <w:r>
+        <w:t xml:space="preserve">,</w:t>
+      </w:r>
+      <w:r>
+        <w:t xml:space="preserve"> </w:t>
+      </w:r>
+      <w:r>
+        <w:rPr>
+          <w:i/>
+          <w:iCs/>
+        </w:rPr>
+        <w:t xml:space="preserve">1286</w:t>
+      </w:r>
+      <w:r>
+        <w:t xml:space="preserve">, 114–122.</w:t>
+      </w:r>
+      <w:r>
+        <w:t xml:space="preserve"> </w:t>
+      </w:r>
+      <w:hyperlink r:id="rId151">
+        <w:r>
+          <w:rPr>
+            <w:rStyle w:val="Hyperlink"/>
+          </w:rPr>
+          <w:t xml:space="preserve">https://doi.org/10.1016/j.brainres.2009.06.032</w:t>
+        </w:r>
+      </w:hyperlink>
+    </w:p>
+    <w:bookmarkEnd w:id="152"/>
+    <w:bookmarkStart w:id="154" w:name="ref-yeung2004reward"/>
+    <w:p>
+      <w:pPr>
+        <w:pStyle w:val="Bibliography"/>
+      </w:pPr>
+      <w:r>
+        <w:t xml:space="preserve">Yeung, N., &amp; Sanfey, A. G. (2004). Independent coding of reward magnitude and valence in the human brain.</w:t>
+      </w:r>
+      <w:r>
+        <w:t xml:space="preserve"> </w:t>
+      </w:r>
+      <w:r>
+        <w:rPr>
+          <w:i/>
+          <w:iCs/>
+        </w:rPr>
+        <w:t xml:space="preserve">Journal of Neuroscience</w:t>
+      </w:r>
+      <w:r>
+        <w:t xml:space="preserve">,</w:t>
+      </w:r>
+      <w:r>
+        <w:t xml:space="preserve"> </w:t>
+      </w:r>
+      <w:r>
+        <w:rPr>
+          <w:i/>
+          <w:iCs/>
+        </w:rPr>
+        <w:t xml:space="preserve">24</w:t>
+      </w:r>
+      <w:r>
+        <w:t xml:space="preserve">(28), 6258–6264.</w:t>
+      </w:r>
+      <w:r>
+        <w:t xml:space="preserve"> </w:t>
+      </w:r>
+      <w:hyperlink r:id="rId153">
+        <w:r>
+          <w:rPr>
+            <w:rStyle w:val="Hyperlink"/>
+          </w:rPr>
+          <w:t xml:space="preserve">https://doi.org/10.1523/JNEUROSCI.4537-03.2004</w:t>
+        </w:r>
+      </w:hyperlink>
+    </w:p>
+    <w:bookmarkEnd w:id="154"/>
+    <w:bookmarkEnd w:id="155"/>
+    <w:bookmarkEnd w:id="156"/>
     <w:sectPr>
       <w:footnotePr>
         <w:numRestart w:val="eachSect"/>

</xml_diff>

<commit_message>
Fix duplicated bibliography in paper.docx build
The manuscript carries a self-contained inline APA-7 References list with plain
author-year citations, but build_paper.py also ran pandoc --citeproc with
nocite:'@*', appending a second full bibliography. Drop the citeproc machinery so
pandoc renders the markdown as-is. Result: single 45-entry References section,
5 embedded figures, ~7.9k words.

Co-Authored-By: Claude Opus 4.8 <noreply@anthropic.com>
</commit_message>
<xml_diff>
--- a/docs/paper.docx
+++ b/docs/paper.docx
@@ -7339,2229 +7339,6 @@
       </w:r>
     </w:p>
     <w:bookmarkEnd w:id="64"/>
-    <w:bookmarkStart w:id="156" w:name="references-1"/>
-    <w:p>
-      <w:pPr>
-        <w:pStyle w:val="Heading1"/>
-      </w:pPr>
-      <w:r>
-        <w:t xml:space="preserve">References</w:t>
-      </w:r>
-    </w:p>
-    <w:bookmarkStart w:id="155" w:name="refs"/>
-    <w:bookmarkStart w:id="66" w:name="ref-adan2012circadian"/>
-    <w:p>
-      <w:pPr>
-        <w:pStyle w:val="Bibliography"/>
-      </w:pPr>
-      <w:r>
-        <w:t xml:space="preserve">Adan, A., Archer, S. N., Hidalgo, M. P., Di Milia, L., Natale, V., &amp; Randler, C. (2012). Circadian typology: A comprehensive review.</w:t>
-      </w:r>
-      <w:r>
-        <w:t xml:space="preserve"> </w:t>
-      </w:r>
-      <w:r>
-        <w:rPr>
-          <w:i/>
-          <w:iCs/>
-        </w:rPr>
-        <w:t xml:space="preserve">Chronobiology International</w:t>
-      </w:r>
-      <w:r>
-        <w:t xml:space="preserve">,</w:t>
-      </w:r>
-      <w:r>
-        <w:t xml:space="preserve"> </w:t>
-      </w:r>
-      <w:r>
-        <w:rPr>
-          <w:i/>
-          <w:iCs/>
-        </w:rPr>
-        <w:t xml:space="preserve">29</w:t>
-      </w:r>
-      <w:r>
-        <w:t xml:space="preserve">(9), 1153–1175.</w:t>
-      </w:r>
-      <w:r>
-        <w:t xml:space="preserve"> </w:t>
-      </w:r>
-      <w:hyperlink r:id="rId65">
-        <w:r>
-          <w:rPr>
-            <w:rStyle w:val="Hyperlink"/>
-          </w:rPr>
-          <w:t xml:space="preserve">https://doi.org/10.3109/07420528.2012.719971</w:t>
-        </w:r>
-      </w:hyperlink>
-    </w:p>
-    <w:bookmarkEnd w:id="66"/>
-    <w:bookmarkStart w:id="68" w:name="ref-adan2010impulsivity"/>
-    <w:p>
-      <w:pPr>
-        <w:pStyle w:val="Bibliography"/>
-      </w:pPr>
-      <w:r>
-        <w:t xml:space="preserve">Adan, A., Natale, V., Caci, H., &amp; Prat, G. (2010). Relationship between circadian typology and functional and dysfunctional impulsivity.</w:t>
-      </w:r>
-      <w:r>
-        <w:t xml:space="preserve"> </w:t>
-      </w:r>
-      <w:r>
-        <w:rPr>
-          <w:i/>
-          <w:iCs/>
-        </w:rPr>
-        <w:t xml:space="preserve">Chronobiology International</w:t>
-      </w:r>
-      <w:r>
-        <w:t xml:space="preserve">,</w:t>
-      </w:r>
-      <w:r>
-        <w:t xml:space="preserve"> </w:t>
-      </w:r>
-      <w:r>
-        <w:rPr>
-          <w:i/>
-          <w:iCs/>
-        </w:rPr>
-        <w:t xml:space="preserve">27</w:t>
-      </w:r>
-      <w:r>
-        <w:t xml:space="preserve">(3), 606–619.</w:t>
-      </w:r>
-      <w:r>
-        <w:t xml:space="preserve"> </w:t>
-      </w:r>
-      <w:hyperlink r:id="rId67">
-        <w:r>
-          <w:rPr>
-            <w:rStyle w:val="Hyperlink"/>
-          </w:rPr>
-          <w:t xml:space="preserve">https://doi.org/10.3109/07420521003663827</w:t>
-        </w:r>
-      </w:hyperlink>
-    </w:p>
-    <w:bookmarkEnd w:id="68"/>
-    <w:bookmarkStart w:id="70" w:name="ref-ahn2017hbayesdm"/>
-    <w:p>
-      <w:pPr>
-        <w:pStyle w:val="Bibliography"/>
-      </w:pPr>
-      <w:r>
-        <w:t xml:space="preserve">Ahn, W.-Y., Haines, N., &amp; Zhang, L. (2017). Revealing neurocomputational mechanisms of reinforcement learning and decision-making with the</w:t>
-      </w:r>
-      <w:r>
-        <w:t xml:space="preserve"> </w:t>
-      </w:r>
-      <w:r>
-        <w:t xml:space="preserve">hBayesDM</w:t>
-      </w:r>
-      <w:r>
-        <w:t xml:space="preserve"> </w:t>
-      </w:r>
-      <w:r>
-        <w:t xml:space="preserve">package.</w:t>
-      </w:r>
-      <w:r>
-        <w:t xml:space="preserve"> </w:t>
-      </w:r>
-      <w:r>
-        <w:rPr>
-          <w:i/>
-          <w:iCs/>
-        </w:rPr>
-        <w:t xml:space="preserve">Computational Psychiatry</w:t>
-      </w:r>
-      <w:r>
-        <w:t xml:space="preserve">,</w:t>
-      </w:r>
-      <w:r>
-        <w:t xml:space="preserve"> </w:t>
-      </w:r>
-      <w:r>
-        <w:rPr>
-          <w:i/>
-          <w:iCs/>
-        </w:rPr>
-        <w:t xml:space="preserve">1</w:t>
-      </w:r>
-      <w:r>
-        <w:t xml:space="preserve">, 24–57.</w:t>
-      </w:r>
-      <w:r>
-        <w:t xml:space="preserve"> </w:t>
-      </w:r>
-      <w:hyperlink r:id="rId69">
-        <w:r>
-          <w:rPr>
-            <w:rStyle w:val="Hyperlink"/>
-          </w:rPr>
-          <w:t xml:space="preserve">https://doi.org/10.1162/CPSY_a_00002</w:t>
-        </w:r>
-      </w:hyperlink>
-    </w:p>
-    <w:bookmarkEnd w:id="70"/>
-    <w:bookmarkStart w:id="72" w:name="ref-benjamini1995fdr"/>
-    <w:p>
-      <w:pPr>
-        <w:pStyle w:val="Bibliography"/>
-      </w:pPr>
-      <w:r>
-        <w:t xml:space="preserve">Benjamini, Y., &amp; Hochberg, Y. (1995). Controlling the false discovery rate: A practical and powerful approach to multiple testing.</w:t>
-      </w:r>
-      <w:r>
-        <w:t xml:space="preserve"> </w:t>
-      </w:r>
-      <w:r>
-        <w:rPr>
-          <w:i/>
-          <w:iCs/>
-        </w:rPr>
-        <w:t xml:space="preserve">Journal of the Royal Statistical Society: Series B (Methodological)</w:t>
-      </w:r>
-      <w:r>
-        <w:t xml:space="preserve">,</w:t>
-      </w:r>
-      <w:r>
-        <w:t xml:space="preserve"> </w:t>
-      </w:r>
-      <w:r>
-        <w:rPr>
-          <w:i/>
-          <w:iCs/>
-        </w:rPr>
-        <w:t xml:space="preserve">57</w:t>
-      </w:r>
-      <w:r>
-        <w:t xml:space="preserve">(1), 289–300.</w:t>
-      </w:r>
-      <w:r>
-        <w:t xml:space="preserve"> </w:t>
-      </w:r>
-      <w:hyperlink r:id="rId71">
-        <w:r>
-          <w:rPr>
-            <w:rStyle w:val="Hyperlink"/>
-          </w:rPr>
-          <w:t xml:space="preserve">https://doi.org/10.1111/j.2517-6161.1995.tb02031.x</w:t>
-        </w:r>
-      </w:hyperlink>
-    </w:p>
-    <w:bookmarkEnd w:id="72"/>
-    <w:bookmarkStart w:id="74" w:name="ref-cho2014gru"/>
-    <w:p>
-      <w:pPr>
-        <w:pStyle w:val="Bibliography"/>
-      </w:pPr>
-      <w:r>
-        <w:t xml:space="preserve">Cho, K., Merrienboer, B. van, Gulcehre, C., Bahdanau, D., Bougares, F., Schwenk, H., &amp; Bengio, Y. (2014). Learning phrase representations using</w:t>
-      </w:r>
-      <w:r>
-        <w:t xml:space="preserve"> </w:t>
-      </w:r>
-      <w:r>
-        <w:t xml:space="preserve">RNN</w:t>
-      </w:r>
-      <w:r>
-        <w:t xml:space="preserve"> </w:t>
-      </w:r>
-      <w:r>
-        <w:t xml:space="preserve">encoder-decoder for statistical machine translation.</w:t>
-      </w:r>
-      <w:r>
-        <w:t xml:space="preserve"> </w:t>
-      </w:r>
-      <w:r>
-        <w:rPr>
-          <w:i/>
-          <w:iCs/>
-        </w:rPr>
-        <w:t xml:space="preserve">Proceedings of the 2014 Conference on Empirical Methods in Natural Language Processing (</w:t>
-      </w:r>
-      <w:r>
-        <w:rPr>
-          <w:i/>
-          <w:iCs/>
-        </w:rPr>
-        <w:t xml:space="preserve">EMNLP</w:t>
-      </w:r>
-      <w:r>
-        <w:rPr>
-          <w:i/>
-          <w:iCs/>
-        </w:rPr>
-        <w:t xml:space="preserve">)</w:t>
-      </w:r>
-      <w:r>
-        <w:t xml:space="preserve">, 1724–1734.</w:t>
-      </w:r>
-      <w:r>
-        <w:t xml:space="preserve"> </w:t>
-      </w:r>
-      <w:hyperlink r:id="rId73">
-        <w:r>
-          <w:rPr>
-            <w:rStyle w:val="Hyperlink"/>
-          </w:rPr>
-          <w:t xml:space="preserve">https://doi.org/10.3115/v1/D14-1179</w:t>
-        </w:r>
-      </w:hyperlink>
-    </w:p>
-    <w:bookmarkEnd w:id="74"/>
-    <w:bookmarkStart w:id="76" w:name="ref-combrisson2015chance"/>
-    <w:p>
-      <w:pPr>
-        <w:pStyle w:val="Bibliography"/>
-      </w:pPr>
-      <w:r>
-        <w:t xml:space="preserve">Combrisson, E., &amp; Jerbi, K. (2015). Exceeding chance level by chance: The caveat of theoretical chance levels in brain signal classification and statistical assessment of decoding accuracy.</w:t>
-      </w:r>
-      <w:r>
-        <w:t xml:space="preserve"> </w:t>
-      </w:r>
-      <w:r>
-        <w:rPr>
-          <w:i/>
-          <w:iCs/>
-        </w:rPr>
-        <w:t xml:space="preserve">Journal of Neuroscience Methods</w:t>
-      </w:r>
-      <w:r>
-        <w:t xml:space="preserve">,</w:t>
-      </w:r>
-      <w:r>
-        <w:t xml:space="preserve"> </w:t>
-      </w:r>
-      <w:r>
-        <w:rPr>
-          <w:i/>
-          <w:iCs/>
-        </w:rPr>
-        <w:t xml:space="preserve">250</w:t>
-      </w:r>
-      <w:r>
-        <w:t xml:space="preserve">, 126–136.</w:t>
-      </w:r>
-      <w:r>
-        <w:t xml:space="preserve"> </w:t>
-      </w:r>
-      <w:hyperlink r:id="rId75">
-        <w:r>
-          <w:rPr>
-            <w:rStyle w:val="Hyperlink"/>
-          </w:rPr>
-          <w:t xml:space="preserve">https://doi.org/10.1016/j.jneumeth.2015.01.010</w:t>
-        </w:r>
-      </w:hyperlink>
-    </w:p>
-    <w:bookmarkEnd w:id="76"/>
-    <w:bookmarkStart w:id="78" w:name="ref-daw2011trial"/>
-    <w:p>
-      <w:pPr>
-        <w:pStyle w:val="Bibliography"/>
-      </w:pPr>
-      <w:r>
-        <w:t xml:space="preserve">Daw, N. D. (2011). Trial-by-trial data analysis using computational models. In</w:t>
-      </w:r>
-      <w:r>
-        <w:t xml:space="preserve"> </w:t>
-      </w:r>
-      <w:r>
-        <w:rPr>
-          <w:i/>
-          <w:iCs/>
-        </w:rPr>
-        <w:t xml:space="preserve">Decision making, affect, and learning: Attention and performance XXIII</w:t>
-      </w:r>
-      <w:r>
-        <w:t xml:space="preserve"> </w:t>
-      </w:r>
-      <w:r>
-        <w:t xml:space="preserve">(pp. 3–38). Oxford University Press.</w:t>
-      </w:r>
-      <w:r>
-        <w:t xml:space="preserve"> </w:t>
-      </w:r>
-      <w:hyperlink r:id="rId77">
-        <w:r>
-          <w:rPr>
-            <w:rStyle w:val="Hyperlink"/>
-          </w:rPr>
-          <w:t xml:space="preserve">https://doi.org/10.1093/acprof:oso/9780199600434.003.0001</w:t>
-        </w:r>
-      </w:hyperlink>
-    </w:p>
-    <w:bookmarkEnd w:id="78"/>
-    <w:bookmarkStart w:id="80" w:name="ref-frank2007dopamine"/>
-    <w:p>
-      <w:pPr>
-        <w:pStyle w:val="Bibliography"/>
-      </w:pPr>
-      <w:r>
-        <w:t xml:space="preserve">Frank, M. J., Moustafa, A. A., Haughey, H. M., Curran, T., &amp; Hutchison, K. E. (2007). Genetic triple dissociation reveals multiple roles for dopamine in reinforcement learning.</w:t>
-      </w:r>
-      <w:r>
-        <w:t xml:space="preserve"> </w:t>
-      </w:r>
-      <w:r>
-        <w:rPr>
-          <w:i/>
-          <w:iCs/>
-        </w:rPr>
-        <w:t xml:space="preserve">Proceedings of the National Academy of Sciences</w:t>
-      </w:r>
-      <w:r>
-        <w:t xml:space="preserve">,</w:t>
-      </w:r>
-      <w:r>
-        <w:t xml:space="preserve"> </w:t>
-      </w:r>
-      <w:r>
-        <w:rPr>
-          <w:i/>
-          <w:iCs/>
-        </w:rPr>
-        <w:t xml:space="preserve">104</w:t>
-      </w:r>
-      <w:r>
-        <w:t xml:space="preserve">(41), 16311–16316.</w:t>
-      </w:r>
-      <w:r>
-        <w:t xml:space="preserve"> </w:t>
-      </w:r>
-      <w:hyperlink r:id="rId79">
-        <w:r>
-          <w:rPr>
-            <w:rStyle w:val="Hyperlink"/>
-          </w:rPr>
-          <w:t xml:space="preserve">https://doi.org/10.1073/pnas.0706111104</w:t>
-        </w:r>
-      </w:hyperlink>
-    </w:p>
-    <w:bookmarkEnd w:id="80"/>
-    <w:bookmarkStart w:id="82" w:name="ref-gehring2002gains"/>
-    <w:p>
-      <w:pPr>
-        <w:pStyle w:val="Bibliography"/>
-      </w:pPr>
-      <w:r>
-        <w:t xml:space="preserve">Gehring, W. J., &amp; Willoughby, A. R. (2002). The medial frontal cortex and the rapid processing of monetary gains and losses.</w:t>
-      </w:r>
-      <w:r>
-        <w:t xml:space="preserve"> </w:t>
-      </w:r>
-      <w:r>
-        <w:rPr>
-          <w:i/>
-          <w:iCs/>
-        </w:rPr>
-        <w:t xml:space="preserve">Science</w:t>
-      </w:r>
-      <w:r>
-        <w:t xml:space="preserve">,</w:t>
-      </w:r>
-      <w:r>
-        <w:t xml:space="preserve"> </w:t>
-      </w:r>
-      <w:r>
-        <w:rPr>
-          <w:i/>
-          <w:iCs/>
-        </w:rPr>
-        <w:t xml:space="preserve">295</w:t>
-      </w:r>
-      <w:r>
-        <w:t xml:space="preserve">(5563), 2279–2282.</w:t>
-      </w:r>
-      <w:r>
-        <w:t xml:space="preserve"> </w:t>
-      </w:r>
-      <w:hyperlink r:id="rId81">
-        <w:r>
-          <w:rPr>
-            <w:rStyle w:val="Hyperlink"/>
-          </w:rPr>
-          <w:t xml:space="preserve">https://doi.org/10.1126/science.1066893</w:t>
-        </w:r>
-      </w:hyperlink>
-    </w:p>
-    <w:bookmarkEnd w:id="82"/>
-    <w:bookmarkStart w:id="84" w:name="ref-gershman2015learningrates"/>
-    <w:p>
-      <w:pPr>
-        <w:pStyle w:val="Bibliography"/>
-      </w:pPr>
-      <w:r>
-        <w:t xml:space="preserve">Gershman, S. J. (2015). Do learning rates adapt to the distribution of rewards?</w:t>
-      </w:r>
-      <w:r>
-        <w:t xml:space="preserve"> </w:t>
-      </w:r>
-      <w:r>
-        <w:rPr>
-          <w:i/>
-          <w:iCs/>
-        </w:rPr>
-        <w:t xml:space="preserve">Psychonomic Bulletin &amp; Review</w:t>
-      </w:r>
-      <w:r>
-        <w:t xml:space="preserve">,</w:t>
-      </w:r>
-      <w:r>
-        <w:t xml:space="preserve"> </w:t>
-      </w:r>
-      <w:r>
-        <w:rPr>
-          <w:i/>
-          <w:iCs/>
-        </w:rPr>
-        <w:t xml:space="preserve">22</w:t>
-      </w:r>
-      <w:r>
-        <w:t xml:space="preserve">(5), 1320–1327.</w:t>
-      </w:r>
-      <w:r>
-        <w:t xml:space="preserve"> </w:t>
-      </w:r>
-      <w:hyperlink r:id="rId83">
-        <w:r>
-          <w:rPr>
-            <w:rStyle w:val="Hyperlink"/>
-          </w:rPr>
-          <w:t xml:space="preserve">https://doi.org/10.3758/s13423-014-0790-3</w:t>
-        </w:r>
-      </w:hyperlink>
-    </w:p>
-    <w:bookmarkEnd w:id="84"/>
-    <w:bookmarkStart w:id="86" w:name="ref-hajcak2007feedback"/>
-    <w:p>
-      <w:pPr>
-        <w:pStyle w:val="Bibliography"/>
-      </w:pPr>
-      <w:r>
-        <w:t xml:space="preserve">Hajcak, G., Moser, J. S., Holroyd, C. B., &amp; Simons, R. F. (2007). It’s worse than you thought: The feedback negativity and violations of reward prediction in gambling tasks.</w:t>
-      </w:r>
-      <w:r>
-        <w:t xml:space="preserve"> </w:t>
-      </w:r>
-      <w:r>
-        <w:rPr>
-          <w:i/>
-          <w:iCs/>
-        </w:rPr>
-        <w:t xml:space="preserve">Psychophysiology</w:t>
-      </w:r>
-      <w:r>
-        <w:t xml:space="preserve">,</w:t>
-      </w:r>
-      <w:r>
-        <w:t xml:space="preserve"> </w:t>
-      </w:r>
-      <w:r>
-        <w:rPr>
-          <w:i/>
-          <w:iCs/>
-        </w:rPr>
-        <w:t xml:space="preserve">44</w:t>
-      </w:r>
-      <w:r>
-        <w:t xml:space="preserve">(6), 905–912.</w:t>
-      </w:r>
-      <w:r>
-        <w:t xml:space="preserve"> </w:t>
-      </w:r>
-      <w:hyperlink r:id="rId85">
-        <w:r>
-          <w:rPr>
-            <w:rStyle w:val="Hyperlink"/>
-          </w:rPr>
-          <w:t xml:space="preserve">https://doi.org/10.1111/j.1469-8986.2007.00567.x</w:t>
-        </w:r>
-      </w:hyperlink>
-    </w:p>
-    <w:bookmarkEnd w:id="86"/>
-    <w:bookmarkStart w:id="88" w:name="ref-hasler2013misalignment"/>
-    <w:p>
-      <w:pPr>
-        <w:pStyle w:val="Bibliography"/>
-      </w:pPr>
-      <w:r>
-        <w:t xml:space="preserve">Hasler, B. P., &amp; Clark, D. B. (2013). Circadian misalignment, reward-related brain function, and adolescent alcohol involvement.</w:t>
-      </w:r>
-      <w:r>
-        <w:t xml:space="preserve"> </w:t>
-      </w:r>
-      <w:r>
-        <w:rPr>
-          <w:i/>
-          <w:iCs/>
-        </w:rPr>
-        <w:t xml:space="preserve">Alcoholism: Clinical and Experimental Research</w:t>
-      </w:r>
-      <w:r>
-        <w:t xml:space="preserve">,</w:t>
-      </w:r>
-      <w:r>
-        <w:t xml:space="preserve"> </w:t>
-      </w:r>
-      <w:r>
-        <w:rPr>
-          <w:i/>
-          <w:iCs/>
-        </w:rPr>
-        <w:t xml:space="preserve">37</w:t>
-      </w:r>
-      <w:r>
-        <w:t xml:space="preserve">(4), 558–565.</w:t>
-      </w:r>
-      <w:r>
-        <w:t xml:space="preserve"> </w:t>
-      </w:r>
-      <w:hyperlink r:id="rId87">
-        <w:r>
-          <w:rPr>
-            <w:rStyle w:val="Hyperlink"/>
-          </w:rPr>
-          <w:t xml:space="preserve">https://doi.org/10.1111/acer.12003</w:t>
-        </w:r>
-      </w:hyperlink>
-    </w:p>
-    <w:bookmarkEnd w:id="88"/>
-    <w:bookmarkStart w:id="90" w:name="ref-hasler2013altered"/>
-    <w:p>
-      <w:pPr>
-        <w:pStyle w:val="Bibliography"/>
-      </w:pPr>
-      <w:r>
-        <w:t xml:space="preserve">Hasler, B. P., Sitnick, S. L., Shaw, D. S., &amp; Forbes, E. E. (2013). An altered neural response to reward may contribute to alcohol problems among late adolescents with an evening chronotype.</w:t>
-      </w:r>
-      <w:r>
-        <w:t xml:space="preserve"> </w:t>
-      </w:r>
-      <w:r>
-        <w:rPr>
-          <w:i/>
-          <w:iCs/>
-        </w:rPr>
-        <w:t xml:space="preserve">Psychiatry Research: Neuroimaging</w:t>
-      </w:r>
-      <w:r>
-        <w:t xml:space="preserve">,</w:t>
-      </w:r>
-      <w:r>
-        <w:t xml:space="preserve"> </w:t>
-      </w:r>
-      <w:r>
-        <w:rPr>
-          <w:i/>
-          <w:iCs/>
-        </w:rPr>
-        <w:t xml:space="preserve">214</w:t>
-      </w:r>
-      <w:r>
-        <w:t xml:space="preserve">(3), 357–364.</w:t>
-      </w:r>
-      <w:r>
-        <w:t xml:space="preserve"> </w:t>
-      </w:r>
-      <w:hyperlink r:id="rId89">
-        <w:r>
-          <w:rPr>
-            <w:rStyle w:val="Hyperlink"/>
-          </w:rPr>
-          <w:t xml:space="preserve">https://doi.org/10.1016/j.pscychresns.2013.08.005</w:t>
-        </w:r>
-      </w:hyperlink>
-    </w:p>
-    <w:bookmarkEnd w:id="90"/>
-    <w:bookmarkStart w:id="92" w:name="ref-holroyd2002rl"/>
-    <w:p>
-      <w:pPr>
-        <w:pStyle w:val="Bibliography"/>
-      </w:pPr>
-      <w:r>
-        <w:t xml:space="preserve">Holroyd, C. B., &amp; Coles, M. G. H. (2002). The neural basis of human error processing: Reinforcement learning, dopamine, and the error-related negativity.</w:t>
-      </w:r>
-      <w:r>
-        <w:t xml:space="preserve"> </w:t>
-      </w:r>
-      <w:r>
-        <w:rPr>
-          <w:i/>
-          <w:iCs/>
-        </w:rPr>
-        <w:t xml:space="preserve">Psychological Review</w:t>
-      </w:r>
-      <w:r>
-        <w:t xml:space="preserve">,</w:t>
-      </w:r>
-      <w:r>
-        <w:t xml:space="preserve"> </w:t>
-      </w:r>
-      <w:r>
-        <w:rPr>
-          <w:i/>
-          <w:iCs/>
-        </w:rPr>
-        <w:t xml:space="preserve">109</w:t>
-      </w:r>
-      <w:r>
-        <w:t xml:space="preserve">(4), 679–709.</w:t>
-      </w:r>
-      <w:r>
-        <w:t xml:space="preserve"> </w:t>
-      </w:r>
-      <w:hyperlink r:id="rId91">
-        <w:r>
-          <w:rPr>
-            <w:rStyle w:val="Hyperlink"/>
-          </w:rPr>
-          <w:t xml:space="preserve">https://doi.org/10.1037/0033-295X.109.4.679</w:t>
-        </w:r>
-      </w:hyperlink>
-    </w:p>
-    <w:bookmarkEnd w:id="92"/>
-    <w:bookmarkStart w:id="93" w:name="ref-horne1976meq"/>
-    <w:p>
-      <w:pPr>
-        <w:pStyle w:val="Bibliography"/>
-      </w:pPr>
-      <w:r>
-        <w:t xml:space="preserve">Horne, J. A., &amp; Östberg, O. (1976). A self-assessment questionnaire to determine morningness-eveningness in human circadian rhythms.</w:t>
-      </w:r>
-      <w:r>
-        <w:t xml:space="preserve"> </w:t>
-      </w:r>
-      <w:r>
-        <w:rPr>
-          <w:i/>
-          <w:iCs/>
-        </w:rPr>
-        <w:t xml:space="preserve">International Journal of Chronobiology</w:t>
-      </w:r>
-      <w:r>
-        <w:t xml:space="preserve">,</w:t>
-      </w:r>
-      <w:r>
-        <w:t xml:space="preserve"> </w:t>
-      </w:r>
-      <w:r>
-        <w:rPr>
-          <w:i/>
-          <w:iCs/>
-        </w:rPr>
-        <w:t xml:space="preserve">4</w:t>
-      </w:r>
-      <w:r>
-        <w:t xml:space="preserve">, 97–110.</w:t>
-      </w:r>
-    </w:p>
-    <w:bookmarkEnd w:id="93"/>
-    <w:bookmarkStart w:id="95" w:name="ref-kahneman1979prospect"/>
-    <w:p>
-      <w:pPr>
-        <w:pStyle w:val="Bibliography"/>
-      </w:pPr>
-      <w:r>
-        <w:t xml:space="preserve">Kahneman, D., &amp; Tversky, A. (1979). Prospect theory: An analysis of decision under risk.</w:t>
-      </w:r>
-      <w:r>
-        <w:t xml:space="preserve"> </w:t>
-      </w:r>
-      <w:r>
-        <w:rPr>
-          <w:i/>
-          <w:iCs/>
-        </w:rPr>
-        <w:t xml:space="preserve">Econometrica</w:t>
-      </w:r>
-      <w:r>
-        <w:t xml:space="preserve">,</w:t>
-      </w:r>
-      <w:r>
-        <w:t xml:space="preserve"> </w:t>
-      </w:r>
-      <w:r>
-        <w:rPr>
-          <w:i/>
-          <w:iCs/>
-        </w:rPr>
-        <w:t xml:space="preserve">47</w:t>
-      </w:r>
-      <w:r>
-        <w:t xml:space="preserve">(2), 263–291.</w:t>
-      </w:r>
-      <w:r>
-        <w:t xml:space="preserve"> </w:t>
-      </w:r>
-      <w:hyperlink r:id="rId94">
-        <w:r>
-          <w:rPr>
-            <w:rStyle w:val="Hyperlink"/>
-          </w:rPr>
-          <w:t xml:space="preserve">https://doi.org/10.2307/1914185</w:t>
-        </w:r>
-      </w:hyperlink>
-    </w:p>
-    <w:bookmarkEnd w:id="95"/>
-    <w:bookmarkStart w:id="97" w:name="ref-keil2014guidelines"/>
-    <w:p>
-      <w:pPr>
-        <w:pStyle w:val="Bibliography"/>
-      </w:pPr>
-      <w:r>
-        <w:t xml:space="preserve">Keil, A., Debener, S., Gratton, G., Junghöfer, M., Kappenman, E. S., Luck, S. J., Luu, P., Miller, G. A., &amp; Yee, C. M. (2014). Committee report: Publication guidelines and recommendations for studies using electroencephalography and magnetoencephalography.</w:t>
-      </w:r>
-      <w:r>
-        <w:t xml:space="preserve"> </w:t>
-      </w:r>
-      <w:r>
-        <w:rPr>
-          <w:i/>
-          <w:iCs/>
-        </w:rPr>
-        <w:t xml:space="preserve">Psychophysiology</w:t>
-      </w:r>
-      <w:r>
-        <w:t xml:space="preserve">,</w:t>
-      </w:r>
-      <w:r>
-        <w:t xml:space="preserve"> </w:t>
-      </w:r>
-      <w:r>
-        <w:rPr>
-          <w:i/>
-          <w:iCs/>
-        </w:rPr>
-        <w:t xml:space="preserve">51</w:t>
-      </w:r>
-      <w:r>
-        <w:t xml:space="preserve">(1), 1–21.</w:t>
-      </w:r>
-      <w:r>
-        <w:t xml:space="preserve"> </w:t>
-      </w:r>
-      <w:hyperlink r:id="rId96">
-        <w:r>
-          <w:rPr>
-            <w:rStyle w:val="Hyperlink"/>
-          </w:rPr>
-          <w:t xml:space="preserve">https://doi.org/10.1111/psyp.12147</w:t>
-        </w:r>
-      </w:hyperlink>
-    </w:p>
-    <w:bookmarkEnd w:id="97"/>
-    <w:bookmarkStart w:id="99" w:name="ref-killgore2007risk"/>
-    <w:p>
-      <w:pPr>
-        <w:pStyle w:val="Bibliography"/>
-      </w:pPr>
-      <w:r>
-        <w:t xml:space="preserve">Killgore, W. D. S. (2007). Effects of sleep deprivation and morningness-eveningness traits on risk-taking.</w:t>
-      </w:r>
-      <w:r>
-        <w:t xml:space="preserve"> </w:t>
-      </w:r>
-      <w:r>
-        <w:rPr>
-          <w:i/>
-          <w:iCs/>
-        </w:rPr>
-        <w:t xml:space="preserve">Psychological Reports</w:t>
-      </w:r>
-      <w:r>
-        <w:t xml:space="preserve">,</w:t>
-      </w:r>
-      <w:r>
-        <w:t xml:space="preserve"> </w:t>
-      </w:r>
-      <w:r>
-        <w:rPr>
-          <w:i/>
-          <w:iCs/>
-        </w:rPr>
-        <w:t xml:space="preserve">100</w:t>
-      </w:r>
-      <w:r>
-        <w:t xml:space="preserve">(2), 613–626.</w:t>
-      </w:r>
-      <w:r>
-        <w:t xml:space="preserve"> </w:t>
-      </w:r>
-      <w:hyperlink r:id="rId98">
-        <w:r>
-          <w:rPr>
-            <w:rStyle w:val="Hyperlink"/>
-          </w:rPr>
-          <w:t xml:space="preserve">https://doi.org/10.2466/pr0.100.2.613-626</w:t>
-        </w:r>
-      </w:hyperlink>
-    </w:p>
-    <w:bookmarkEnd w:id="99"/>
-    <w:bookmarkStart w:id="101" w:name="ref-kriegeskorte2009double"/>
-    <w:p>
-      <w:pPr>
-        <w:pStyle w:val="Bibliography"/>
-      </w:pPr>
-      <w:r>
-        <w:t xml:space="preserve">Kriegeskorte, N., Simmons, W. K., Bellgowan, P. S. F., &amp; Baker, C. I. (2009). Circular analysis in systems neuroscience: The dangers of double dipping.</w:t>
-      </w:r>
-      <w:r>
-        <w:t xml:space="preserve"> </w:t>
-      </w:r>
-      <w:r>
-        <w:rPr>
-          <w:i/>
-          <w:iCs/>
-        </w:rPr>
-        <w:t xml:space="preserve">Nature Neuroscience</w:t>
-      </w:r>
-      <w:r>
-        <w:t xml:space="preserve">,</w:t>
-      </w:r>
-      <w:r>
-        <w:t xml:space="preserve"> </w:t>
-      </w:r>
-      <w:r>
-        <w:rPr>
-          <w:i/>
-          <w:iCs/>
-        </w:rPr>
-        <w:t xml:space="preserve">12</w:t>
-      </w:r>
-      <w:r>
-        <w:t xml:space="preserve">(5), 535–540.</w:t>
-      </w:r>
-      <w:r>
-        <w:t xml:space="preserve"> </w:t>
-      </w:r>
-      <w:hyperlink r:id="rId100">
-        <w:r>
-          <w:rPr>
-            <w:rStyle w:val="Hyperlink"/>
-          </w:rPr>
-          <w:t xml:space="preserve">https://doi.org/10.1038/nn.2303</w:t>
-        </w:r>
-      </w:hyperlink>
-    </w:p>
-    <w:bookmarkEnd w:id="101"/>
-    <w:bookmarkStart w:id="103" w:name="ref-lakens2017equivalence"/>
-    <w:p>
-      <w:pPr>
-        <w:pStyle w:val="Bibliography"/>
-      </w:pPr>
-      <w:r>
-        <w:t xml:space="preserve">Lakens, D. (2017). Equivalence tests: A practical primer for t tests, correlations, and meta-analyses.</w:t>
-      </w:r>
-      <w:r>
-        <w:t xml:space="preserve"> </w:t>
-      </w:r>
-      <w:r>
-        <w:rPr>
-          <w:i/>
-          <w:iCs/>
-        </w:rPr>
-        <w:t xml:space="preserve">Social Psychological and Personality Science</w:t>
-      </w:r>
-      <w:r>
-        <w:t xml:space="preserve">,</w:t>
-      </w:r>
-      <w:r>
-        <w:t xml:space="preserve"> </w:t>
-      </w:r>
-      <w:r>
-        <w:rPr>
-          <w:i/>
-          <w:iCs/>
-        </w:rPr>
-        <w:t xml:space="preserve">8</w:t>
-      </w:r>
-      <w:r>
-        <w:t xml:space="preserve">(4), 355–362.</w:t>
-      </w:r>
-      <w:r>
-        <w:t xml:space="preserve"> </w:t>
-      </w:r>
-      <w:hyperlink r:id="rId102">
-        <w:r>
-          <w:rPr>
-            <w:rStyle w:val="Hyperlink"/>
-          </w:rPr>
-          <w:t xml:space="preserve">https://doi.org/10.1177/1948550617697177</w:t>
-        </w:r>
-      </w:hyperlink>
-    </w:p>
-    <w:bookmarkEnd w:id="103"/>
-    <w:bookmarkStart w:id="105" w:name="ref-lawhern2018eegnet"/>
-    <w:p>
-      <w:pPr>
-        <w:pStyle w:val="Bibliography"/>
-      </w:pPr>
-      <w:r>
-        <w:t xml:space="preserve">Lawhern, V. J., Solon, A. J., Waytowich, N. R., Gordon, S. M., Hung, C. P., &amp; Lance, B. J. (2018).</w:t>
-      </w:r>
-      <w:r>
-        <w:t xml:space="preserve"> </w:t>
-      </w:r>
-      <w:r>
-        <w:t xml:space="preserve">EEGNet</w:t>
-      </w:r>
-      <w:r>
-        <w:t xml:space="preserve">: A compact convolutional neural network for</w:t>
-      </w:r>
-      <w:r>
-        <w:t xml:space="preserve"> </w:t>
-      </w:r>
-      <w:r>
-        <w:t xml:space="preserve">EEG</w:t>
-      </w:r>
-      <w:r>
-        <w:t xml:space="preserve">-based brain-computer interfaces.</w:t>
-      </w:r>
-      <w:r>
-        <w:t xml:space="preserve"> </w:t>
-      </w:r>
-      <w:r>
-        <w:rPr>
-          <w:i/>
-          <w:iCs/>
-        </w:rPr>
-        <w:t xml:space="preserve">Journal of Neural Engineering</w:t>
-      </w:r>
-      <w:r>
-        <w:t xml:space="preserve">,</w:t>
-      </w:r>
-      <w:r>
-        <w:t xml:space="preserve"> </w:t>
-      </w:r>
-      <w:r>
-        <w:rPr>
-          <w:i/>
-          <w:iCs/>
-        </w:rPr>
-        <w:t xml:space="preserve">15</w:t>
-      </w:r>
-      <w:r>
-        <w:t xml:space="preserve">(5), 056013.</w:t>
-      </w:r>
-      <w:r>
-        <w:t xml:space="preserve"> </w:t>
-      </w:r>
-      <w:hyperlink r:id="rId104">
-        <w:r>
-          <w:rPr>
-            <w:rStyle w:val="Hyperlink"/>
-          </w:rPr>
-          <w:t xml:space="preserve">https://doi.org/10.1088/1741-2552/aace8c</w:t>
-        </w:r>
-      </w:hyperlink>
-    </w:p>
-    <w:bookmarkEnd w:id="105"/>
-    <w:bookmarkStart w:id="107" w:name="ref-lefebvre2017optimistic"/>
-    <w:p>
-      <w:pPr>
-        <w:pStyle w:val="Bibliography"/>
-      </w:pPr>
-      <w:r>
-        <w:t xml:space="preserve">Lefebvre, G., Lebreton, M., Meyniel, F., Bourgeois-Gironde, S., &amp; Palminteri, S. (2017). Behavioural and neural characterization of optimistic reinforcement learning.</w:t>
-      </w:r>
-      <w:r>
-        <w:t xml:space="preserve"> </w:t>
-      </w:r>
-      <w:r>
-        <w:rPr>
-          <w:i/>
-          <w:iCs/>
-        </w:rPr>
-        <w:t xml:space="preserve">Nature Human Behaviour</w:t>
-      </w:r>
-      <w:r>
-        <w:t xml:space="preserve">,</w:t>
-      </w:r>
-      <w:r>
-        <w:t xml:space="preserve"> </w:t>
-      </w:r>
-      <w:r>
-        <w:rPr>
-          <w:i/>
-          <w:iCs/>
-        </w:rPr>
-        <w:t xml:space="preserve">1</w:t>
-      </w:r>
-      <w:r>
-        <w:t xml:space="preserve">(4), 0067.</w:t>
-      </w:r>
-      <w:r>
-        <w:t xml:space="preserve"> </w:t>
-      </w:r>
-      <w:hyperlink r:id="rId106">
-        <w:r>
-          <w:rPr>
-            <w:rStyle w:val="Hyperlink"/>
-          </w:rPr>
-          <w:t xml:space="preserve">https://doi.org/10.1038/s41562-017-0067</w:t>
-        </w:r>
-      </w:hyperlink>
-    </w:p>
-    <w:bookmarkEnd w:id="107"/>
-    <w:bookmarkStart w:id="109" w:name="ref-mcclung2007circadian"/>
-    <w:p>
-      <w:pPr>
-        <w:pStyle w:val="Bibliography"/>
-      </w:pPr>
-      <w:r>
-        <w:t xml:space="preserve">McClung, C. A. (2007). Circadian genes, rhythms and the biology of mood disorders.</w:t>
-      </w:r>
-      <w:r>
-        <w:t xml:space="preserve"> </w:t>
-      </w:r>
-      <w:r>
-        <w:rPr>
-          <w:i/>
-          <w:iCs/>
-        </w:rPr>
-        <w:t xml:space="preserve">Pharmacology &amp; Therapeutics</w:t>
-      </w:r>
-      <w:r>
-        <w:t xml:space="preserve">,</w:t>
-      </w:r>
-      <w:r>
-        <w:t xml:space="preserve"> </w:t>
-      </w:r>
-      <w:r>
-        <w:rPr>
-          <w:i/>
-          <w:iCs/>
-        </w:rPr>
-        <w:t xml:space="preserve">114</w:t>
-      </w:r>
-      <w:r>
-        <w:t xml:space="preserve">(2), 222–232.</w:t>
-      </w:r>
-      <w:r>
-        <w:t xml:space="preserve"> </w:t>
-      </w:r>
-      <w:hyperlink r:id="rId108">
-        <w:r>
-          <w:rPr>
-            <w:rStyle w:val="Hyperlink"/>
-          </w:rPr>
-          <w:t xml:space="preserve">https://doi.org/10.1016/j.pharmthera.2007.02.003</w:t>
-        </w:r>
-      </w:hyperlink>
-    </w:p>
-    <w:bookmarkEnd w:id="109"/>
-    <w:bookmarkStart w:id="111" w:name="ref-mcgowan2018impulsivity"/>
-    <w:p>
-      <w:pPr>
-        <w:pStyle w:val="Bibliography"/>
-      </w:pPr>
-      <w:r>
-        <w:t xml:space="preserve">McGowan, N. M., &amp; Coogan, A. N. (2018). Sleep and circadian rhythm function and trait impulsivity: An actigraphy study.</w:t>
-      </w:r>
-      <w:r>
-        <w:t xml:space="preserve"> </w:t>
-      </w:r>
-      <w:r>
-        <w:rPr>
-          <w:i/>
-          <w:iCs/>
-        </w:rPr>
-        <w:t xml:space="preserve">Psychiatry Research</w:t>
-      </w:r>
-      <w:r>
-        <w:t xml:space="preserve">,</w:t>
-      </w:r>
-      <w:r>
-        <w:t xml:space="preserve"> </w:t>
-      </w:r>
-      <w:r>
-        <w:rPr>
-          <w:i/>
-          <w:iCs/>
-        </w:rPr>
-        <w:t xml:space="preserve">268</w:t>
-      </w:r>
-      <w:r>
-        <w:t xml:space="preserve">, 251–256.</w:t>
-      </w:r>
-      <w:r>
-        <w:t xml:space="preserve"> </w:t>
-      </w:r>
-      <w:hyperlink r:id="rId110">
-        <w:r>
-          <w:rPr>
-            <w:rStyle w:val="Hyperlink"/>
-          </w:rPr>
-          <w:t xml:space="preserve">https://doi.org/10.1016/j.psychres.2018.07.030</w:t>
-        </w:r>
-      </w:hyperlink>
-    </w:p>
-    <w:bookmarkEnd w:id="111"/>
-    <w:bookmarkStart w:id="113" w:name="ref-miltner1997feedback"/>
-    <w:p>
-      <w:pPr>
-        <w:pStyle w:val="Bibliography"/>
-      </w:pPr>
-      <w:r>
-        <w:t xml:space="preserve">Miltner, W. H. R., Braun, C. H., &amp; Coles, M. G. H. (1997). Event-related brain potentials following incorrect feedback in a time-estimation task: Evidence for a generic neural system for error detection.</w:t>
-      </w:r>
-      <w:r>
-        <w:t xml:space="preserve"> </w:t>
-      </w:r>
-      <w:r>
-        <w:rPr>
-          <w:i/>
-          <w:iCs/>
-        </w:rPr>
-        <w:t xml:space="preserve">Journal of Cognitive Neuroscience</w:t>
-      </w:r>
-      <w:r>
-        <w:t xml:space="preserve">,</w:t>
-      </w:r>
-      <w:r>
-        <w:t xml:space="preserve"> </w:t>
-      </w:r>
-      <w:r>
-        <w:rPr>
-          <w:i/>
-          <w:iCs/>
-        </w:rPr>
-        <w:t xml:space="preserve">9</w:t>
-      </w:r>
-      <w:r>
-        <w:t xml:space="preserve">(6), 788–798.</w:t>
-      </w:r>
-      <w:r>
-        <w:t xml:space="preserve"> </w:t>
-      </w:r>
-      <w:hyperlink r:id="rId112">
-        <w:r>
-          <w:rPr>
-            <w:rStyle w:val="Hyperlink"/>
-          </w:rPr>
-          <w:t xml:space="preserve">https://doi.org/10.1162/jocn.1997.9.6.788</w:t>
-        </w:r>
-      </w:hyperlink>
-    </w:p>
-    <w:bookmarkEnd w:id="113"/>
-    <w:bookmarkStart w:id="115" w:name="ref-muro2012sensation"/>
-    <w:p>
-      <w:pPr>
-        <w:pStyle w:val="Bibliography"/>
-      </w:pPr>
-      <w:r>
-        <w:t xml:space="preserve">Muro, A., Gomà-i-Freixanet, M., &amp; Adan, A. (2012). Circadian typology and sensation seeking in adolescents.</w:t>
-      </w:r>
-      <w:r>
-        <w:t xml:space="preserve"> </w:t>
-      </w:r>
-      <w:r>
-        <w:rPr>
-          <w:i/>
-          <w:iCs/>
-        </w:rPr>
-        <w:t xml:space="preserve">Chronobiology International</w:t>
-      </w:r>
-      <w:r>
-        <w:t xml:space="preserve">,</w:t>
-      </w:r>
-      <w:r>
-        <w:t xml:space="preserve"> </w:t>
-      </w:r>
-      <w:r>
-        <w:rPr>
-          <w:i/>
-          <w:iCs/>
-        </w:rPr>
-        <w:t xml:space="preserve">29</w:t>
-      </w:r>
-      <w:r>
-        <w:t xml:space="preserve">(10), 1376–1382.</w:t>
-      </w:r>
-      <w:r>
-        <w:t xml:space="preserve"> </w:t>
-      </w:r>
-      <w:hyperlink r:id="rId114">
-        <w:r>
-          <w:rPr>
-            <w:rStyle w:val="Hyperlink"/>
-          </w:rPr>
-          <w:t xml:space="preserve">https://doi.org/10.3109/07420528.2012.728665</w:t>
-        </w:r>
-      </w:hyperlink>
-    </w:p>
-    <w:bookmarkEnd w:id="115"/>
-    <w:bookmarkStart w:id="117" w:name="ref-murray2009clocks"/>
-    <w:p>
-      <w:pPr>
-        <w:pStyle w:val="Bibliography"/>
-      </w:pPr>
-      <w:r>
-        <w:t xml:space="preserve">Murray, G., Nicholas, C. L., Kleiman, J., Dwyer, R., Carrington, M. J., Allen, N. B., &amp; Trinder, J. (2009). Nature’s clocks and human mood: The circadian system modulates reward motivation.</w:t>
-      </w:r>
-      <w:r>
-        <w:t xml:space="preserve"> </w:t>
-      </w:r>
-      <w:r>
-        <w:rPr>
-          <w:i/>
-          <w:iCs/>
-        </w:rPr>
-        <w:t xml:space="preserve">Emotion</w:t>
-      </w:r>
-      <w:r>
-        <w:t xml:space="preserve">,</w:t>
-      </w:r>
-      <w:r>
-        <w:t xml:space="preserve"> </w:t>
-      </w:r>
-      <w:r>
-        <w:rPr>
-          <w:i/>
-          <w:iCs/>
-        </w:rPr>
-        <w:t xml:space="preserve">9</w:t>
-      </w:r>
-      <w:r>
-        <w:t xml:space="preserve">(5), 705–716.</w:t>
-      </w:r>
-      <w:r>
-        <w:t xml:space="preserve"> </w:t>
-      </w:r>
-      <w:hyperlink r:id="rId116">
-        <w:r>
-          <w:rPr>
-            <w:rStyle w:val="Hyperlink"/>
-          </w:rPr>
-          <w:t xml:space="preserve">https://doi.org/10.1037/a0017080</w:t>
-        </w:r>
-      </w:hyperlink>
-    </w:p>
-    <w:bookmarkEnd w:id="117"/>
-    <w:bookmarkStart w:id="119" w:name="ref-niv2012risk"/>
-    <w:p>
-      <w:pPr>
-        <w:pStyle w:val="Bibliography"/>
-      </w:pPr>
-      <w:r>
-        <w:t xml:space="preserve">Niv, Y., Edlund, J. A., Dayan, P., &amp; O’Doherty, J. P. (2012). Neural prediction errors reveal a risk-sensitive reinforcement-learning process in the human brain.</w:t>
-      </w:r>
-      <w:r>
-        <w:t xml:space="preserve"> </w:t>
-      </w:r>
-      <w:r>
-        <w:rPr>
-          <w:i/>
-          <w:iCs/>
-        </w:rPr>
-        <w:t xml:space="preserve">Journal of Neuroscience</w:t>
-      </w:r>
-      <w:r>
-        <w:t xml:space="preserve">,</w:t>
-      </w:r>
-      <w:r>
-        <w:t xml:space="preserve"> </w:t>
-      </w:r>
-      <w:r>
-        <w:rPr>
-          <w:i/>
-          <w:iCs/>
-        </w:rPr>
-        <w:t xml:space="preserve">32</w:t>
-      </w:r>
-      <w:r>
-        <w:t xml:space="preserve">(2), 551–562.</w:t>
-      </w:r>
-      <w:r>
-        <w:t xml:space="preserve"> </w:t>
-      </w:r>
-      <w:hyperlink r:id="rId118">
-        <w:r>
-          <w:rPr>
-            <w:rStyle w:val="Hyperlink"/>
-          </w:rPr>
-          <w:t xml:space="preserve">https://doi.org/10.1523/JNEUROSCI.5498-10.2012</w:t>
-        </w:r>
-      </w:hyperlink>
-    </w:p>
-    <w:bookmarkEnd w:id="119"/>
-    <w:bookmarkStart w:id="121" w:name="ref-poldrack2020prediction"/>
-    <w:p>
-      <w:pPr>
-        <w:pStyle w:val="Bibliography"/>
-      </w:pPr>
-      <w:r>
-        <w:t xml:space="preserve">Poldrack, R. A., Huckins, G., &amp; Varoquaux, G. (2020). Establishment of best practices for evidence for prediction.</w:t>
-      </w:r>
-      <w:r>
-        <w:t xml:space="preserve"> </w:t>
-      </w:r>
-      <w:r>
-        <w:rPr>
-          <w:i/>
-          <w:iCs/>
-        </w:rPr>
-        <w:t xml:space="preserve">JAMA Psychiatry</w:t>
-      </w:r>
-      <w:r>
-        <w:t xml:space="preserve">,</w:t>
-      </w:r>
-      <w:r>
-        <w:t xml:space="preserve"> </w:t>
-      </w:r>
-      <w:r>
-        <w:rPr>
-          <w:i/>
-          <w:iCs/>
-        </w:rPr>
-        <w:t xml:space="preserve">77</w:t>
-      </w:r>
-      <w:r>
-        <w:t xml:space="preserve">(5), 534–540.</w:t>
-      </w:r>
-      <w:r>
-        <w:t xml:space="preserve"> </w:t>
-      </w:r>
-      <w:hyperlink r:id="rId120">
-        <w:r>
-          <w:rPr>
-            <w:rStyle w:val="Hyperlink"/>
-          </w:rPr>
-          <w:t xml:space="preserve">https://doi.org/10.1001/jamapsychiatry.2019.3671</w:t>
-        </w:r>
-      </w:hyperlink>
-    </w:p>
-    <w:bookmarkEnd w:id="121"/>
-    <w:bookmarkStart w:id="123" w:name="ref-polich2007p300"/>
-    <w:p>
-      <w:pPr>
-        <w:pStyle w:val="Bibliography"/>
-      </w:pPr>
-      <w:r>
-        <w:t xml:space="preserve">Polich, J. (2007). Updating P300: An integrative theory of P3a and P3b.</w:t>
-      </w:r>
-      <w:r>
-        <w:t xml:space="preserve"> </w:t>
-      </w:r>
-      <w:r>
-        <w:rPr>
-          <w:i/>
-          <w:iCs/>
-        </w:rPr>
-        <w:t xml:space="preserve">Clinical Neurophysiology</w:t>
-      </w:r>
-      <w:r>
-        <w:t xml:space="preserve">,</w:t>
-      </w:r>
-      <w:r>
-        <w:t xml:space="preserve"> </w:t>
-      </w:r>
-      <w:r>
-        <w:rPr>
-          <w:i/>
-          <w:iCs/>
-        </w:rPr>
-        <w:t xml:space="preserve">118</w:t>
-      </w:r>
-      <w:r>
-        <w:t xml:space="preserve">(10), 2128–2148.</w:t>
-      </w:r>
-      <w:r>
-        <w:t xml:space="preserve"> </w:t>
-      </w:r>
-      <w:hyperlink r:id="rId122">
-        <w:r>
-          <w:rPr>
-            <w:rStyle w:val="Hyperlink"/>
-          </w:rPr>
-          <w:t xml:space="preserve">https://doi.org/10.1016/j.clinph.2007.04.019</w:t>
-        </w:r>
-      </w:hyperlink>
-    </w:p>
-    <w:bookmarkEnd w:id="123"/>
-    <w:bookmarkStart w:id="125" w:name="ref-proudfit2015reward"/>
-    <w:p>
-      <w:pPr>
-        <w:pStyle w:val="Bibliography"/>
-      </w:pPr>
-      <w:r>
-        <w:t xml:space="preserve">Proudfit, G. H. (2015). The reward positivity: From basic research on reward to a biomarker for depression.</w:t>
-      </w:r>
-      <w:r>
-        <w:t xml:space="preserve"> </w:t>
-      </w:r>
-      <w:r>
-        <w:rPr>
-          <w:i/>
-          <w:iCs/>
-        </w:rPr>
-        <w:t xml:space="preserve">Psychophysiology</w:t>
-      </w:r>
-      <w:r>
-        <w:t xml:space="preserve">,</w:t>
-      </w:r>
-      <w:r>
-        <w:t xml:space="preserve"> </w:t>
-      </w:r>
-      <w:r>
-        <w:rPr>
-          <w:i/>
-          <w:iCs/>
-        </w:rPr>
-        <w:t xml:space="preserve">52</w:t>
-      </w:r>
-      <w:r>
-        <w:t xml:space="preserve">(4), 449–459.</w:t>
-      </w:r>
-      <w:r>
-        <w:t xml:space="preserve"> </w:t>
-      </w:r>
-      <w:hyperlink r:id="rId124">
-        <w:r>
-          <w:rPr>
-            <w:rStyle w:val="Hyperlink"/>
-          </w:rPr>
-          <w:t xml:space="preserve">https://doi.org/10.1111/psyp.12370</w:t>
-        </w:r>
-      </w:hyperlink>
-    </w:p>
-    <w:bookmarkEnd w:id="125"/>
-    <w:bookmarkStart w:id="127" w:name="ref-randler2014bisbas"/>
-    <w:p>
-      <w:pPr>
-        <w:pStyle w:val="Bibliography"/>
-      </w:pPr>
-      <w:r>
-        <w:t xml:space="preserve">Randler, C., Baumann, V. P., &amp; Horzum, M. B. (2014). Morningness-eveningness, big five and the</w:t>
-      </w:r>
-      <w:r>
-        <w:t xml:space="preserve"> </w:t>
-      </w:r>
-      <w:r>
-        <w:t xml:space="preserve">BIS/BAS</w:t>
-      </w:r>
-      <w:r>
-        <w:t xml:space="preserve"> </w:t>
-      </w:r>
-      <w:r>
-        <w:t xml:space="preserve">inventory.</w:t>
-      </w:r>
-      <w:r>
-        <w:t xml:space="preserve"> </w:t>
-      </w:r>
-      <w:r>
-        <w:rPr>
-          <w:i/>
-          <w:iCs/>
-        </w:rPr>
-        <w:t xml:space="preserve">Personality and Individual Differences</w:t>
-      </w:r>
-      <w:r>
-        <w:t xml:space="preserve">,</w:t>
-      </w:r>
-      <w:r>
-        <w:t xml:space="preserve"> </w:t>
-      </w:r>
-      <w:r>
-        <w:rPr>
-          <w:i/>
-          <w:iCs/>
-        </w:rPr>
-        <w:t xml:space="preserve">66</w:t>
-      </w:r>
-      <w:r>
-        <w:t xml:space="preserve">, 64–67.</w:t>
-      </w:r>
-      <w:r>
-        <w:t xml:space="preserve"> </w:t>
-      </w:r>
-      <w:hyperlink r:id="rId126">
-        <w:r>
-          <w:rPr>
-            <w:rStyle w:val="Hyperlink"/>
-          </w:rPr>
-          <w:t xml:space="preserve">https://doi.org/10.1016/j.paid.2014.03.010</w:t>
-        </w:r>
-      </w:hyperlink>
-    </w:p>
-    <w:bookmarkEnd w:id="127"/>
-    <w:bookmarkStart w:id="129" w:name="ref-roenneberg2007epidemiology"/>
-    <w:p>
-      <w:pPr>
-        <w:pStyle w:val="Bibliography"/>
-      </w:pPr>
-      <w:r>
-        <w:t xml:space="preserve">Roenneberg, T., Kuehnle, T., Juda, M., Kantermann, T., Allebrandt, K., Gordijn, M., &amp; Merrow, M. (2007). Epidemiology of the human circadian clock.</w:t>
-      </w:r>
-      <w:r>
-        <w:t xml:space="preserve"> </w:t>
-      </w:r>
-      <w:r>
-        <w:rPr>
-          <w:i/>
-          <w:iCs/>
-        </w:rPr>
-        <w:t xml:space="preserve">Sleep Medicine Reviews</w:t>
-      </w:r>
-      <w:r>
-        <w:t xml:space="preserve">,</w:t>
-      </w:r>
-      <w:r>
-        <w:t xml:space="preserve"> </w:t>
-      </w:r>
-      <w:r>
-        <w:rPr>
-          <w:i/>
-          <w:iCs/>
-        </w:rPr>
-        <w:t xml:space="preserve">11</w:t>
-      </w:r>
-      <w:r>
-        <w:t xml:space="preserve">(6), 429–438.</w:t>
-      </w:r>
-      <w:r>
-        <w:t xml:space="preserve"> </w:t>
-      </w:r>
-      <w:hyperlink r:id="rId128">
-        <w:r>
-          <w:rPr>
-            <w:rStyle w:val="Hyperlink"/>
-          </w:rPr>
-          <w:t xml:space="preserve">https://doi.org/10.1016/j.smrv.2007.07.005</w:t>
-        </w:r>
-      </w:hyperlink>
-    </w:p>
-    <w:bookmarkEnd w:id="129"/>
-    <w:bookmarkStart w:id="131" w:name="ref-roenneberg2003life"/>
-    <w:p>
-      <w:pPr>
-        <w:pStyle w:val="Bibliography"/>
-      </w:pPr>
-      <w:r>
-        <w:t xml:space="preserve">Roenneberg, T., Wirz-Justice, A., &amp; Merrow, M. (2003). Life between clocks: Daily temporal patterns of human chronotypes.</w:t>
-      </w:r>
-      <w:r>
-        <w:t xml:space="preserve"> </w:t>
-      </w:r>
-      <w:r>
-        <w:rPr>
-          <w:i/>
-          <w:iCs/>
-        </w:rPr>
-        <w:t xml:space="preserve">Journal of Biological Rhythms</w:t>
-      </w:r>
-      <w:r>
-        <w:t xml:space="preserve">,</w:t>
-      </w:r>
-      <w:r>
-        <w:t xml:space="preserve"> </w:t>
-      </w:r>
-      <w:r>
-        <w:rPr>
-          <w:i/>
-          <w:iCs/>
-        </w:rPr>
-        <w:t xml:space="preserve">18</w:t>
-      </w:r>
-      <w:r>
-        <w:t xml:space="preserve">(1), 80–90.</w:t>
-      </w:r>
-      <w:r>
-        <w:t xml:space="preserve"> </w:t>
-      </w:r>
-      <w:hyperlink r:id="rId130">
-        <w:r>
-          <w:rPr>
-            <w:rStyle w:val="Hyperlink"/>
-          </w:rPr>
-          <w:t xml:space="preserve">https://doi.org/10.1177/0748730402239679</w:t>
-        </w:r>
-      </w:hyperlink>
-    </w:p>
-    <w:bookmarkEnd w:id="131"/>
-    <w:bookmarkStart w:id="133" w:name="ref-rouder2009bayes"/>
-    <w:p>
-      <w:pPr>
-        <w:pStyle w:val="Bibliography"/>
-      </w:pPr>
-      <w:r>
-        <w:t xml:space="preserve">Rouder, J. N., Speckman, P. L., Sun, D., Morey, R. D., &amp; Iverson, G. (2009). Bayesian t tests for accepting and rejecting the null hypothesis.</w:t>
-      </w:r>
-      <w:r>
-        <w:t xml:space="preserve"> </w:t>
-      </w:r>
-      <w:r>
-        <w:rPr>
-          <w:i/>
-          <w:iCs/>
-        </w:rPr>
-        <w:t xml:space="preserve">Psychonomic Bulletin &amp; Review</w:t>
-      </w:r>
-      <w:r>
-        <w:t xml:space="preserve">,</w:t>
-      </w:r>
-      <w:r>
-        <w:t xml:space="preserve"> </w:t>
-      </w:r>
-      <w:r>
-        <w:rPr>
-          <w:i/>
-          <w:iCs/>
-        </w:rPr>
-        <w:t xml:space="preserve">16</w:t>
-      </w:r>
-      <w:r>
-        <w:t xml:space="preserve">(2), 225–237.</w:t>
-      </w:r>
-      <w:r>
-        <w:t xml:space="preserve"> </w:t>
-      </w:r>
-      <w:hyperlink r:id="rId132">
-        <w:r>
-          <w:rPr>
-            <w:rStyle w:val="Hyperlink"/>
-          </w:rPr>
-          <w:t xml:space="preserve">https://doi.org/10.3758/PBR.16.2.225</w:t>
-        </w:r>
-      </w:hyperlink>
-    </w:p>
-    <w:bookmarkEnd w:id="133"/>
-    <w:bookmarkStart w:id="135" w:name="ref-roy2019eegreview"/>
-    <w:p>
-      <w:pPr>
-        <w:pStyle w:val="Bibliography"/>
-      </w:pPr>
-      <w:r>
-        <w:t xml:space="preserve">Roy, Y., Banville, H., Albuquerque, I., Gramfort, A., Falk, T. H., &amp; Faubert, J. (2019). Deep learning-based electroencephalography analysis: A systematic review.</w:t>
-      </w:r>
-      <w:r>
-        <w:t xml:space="preserve"> </w:t>
-      </w:r>
-      <w:r>
-        <w:rPr>
-          <w:i/>
-          <w:iCs/>
-        </w:rPr>
-        <w:t xml:space="preserve">Journal of Neural Engineering</w:t>
-      </w:r>
-      <w:r>
-        <w:t xml:space="preserve">,</w:t>
-      </w:r>
-      <w:r>
-        <w:t xml:space="preserve"> </w:t>
-      </w:r>
-      <w:r>
-        <w:rPr>
-          <w:i/>
-          <w:iCs/>
-        </w:rPr>
-        <w:t xml:space="preserve">16</w:t>
-      </w:r>
-      <w:r>
-        <w:t xml:space="preserve">(5), 051001.</w:t>
-      </w:r>
-      <w:r>
-        <w:t xml:space="preserve"> </w:t>
-      </w:r>
-      <w:hyperlink r:id="rId134">
-        <w:r>
-          <w:rPr>
-            <w:rStyle w:val="Hyperlink"/>
-          </w:rPr>
-          <w:t xml:space="preserve">https://doi.org/10.1088/1741-2552/ab260c</w:t>
-        </w:r>
-      </w:hyperlink>
-    </w:p>
-    <w:bookmarkEnd w:id="135"/>
-    <w:bookmarkStart w:id="137" w:name="ref-sambrook2015rpe"/>
-    <w:p>
-      <w:pPr>
-        <w:pStyle w:val="Bibliography"/>
-      </w:pPr>
-      <w:r>
-        <w:t xml:space="preserve">Sambrook, T. D., &amp; Goslin, J. (2015). A neural reward prediction error revealed by a meta-analysis of</w:t>
-      </w:r>
-      <w:r>
-        <w:t xml:space="preserve"> </w:t>
-      </w:r>
-      <w:r>
-        <w:t xml:space="preserve">ERPs</w:t>
-      </w:r>
-      <w:r>
-        <w:t xml:space="preserve"> </w:t>
-      </w:r>
-      <w:r>
-        <w:t xml:space="preserve">using great grand averages.</w:t>
-      </w:r>
-      <w:r>
-        <w:t xml:space="preserve"> </w:t>
-      </w:r>
-      <w:r>
-        <w:rPr>
-          <w:i/>
-          <w:iCs/>
-        </w:rPr>
-        <w:t xml:space="preserve">Psychological Bulletin</w:t>
-      </w:r>
-      <w:r>
-        <w:t xml:space="preserve">,</w:t>
-      </w:r>
-      <w:r>
-        <w:t xml:space="preserve"> </w:t>
-      </w:r>
-      <w:r>
-        <w:rPr>
-          <w:i/>
-          <w:iCs/>
-        </w:rPr>
-        <w:t xml:space="preserve">141</w:t>
-      </w:r>
-      <w:r>
-        <w:t xml:space="preserve">(1), 213–235.</w:t>
-      </w:r>
-      <w:r>
-        <w:t xml:space="preserve"> </w:t>
-      </w:r>
-      <w:hyperlink r:id="rId136">
-        <w:r>
-          <w:rPr>
-            <w:rStyle w:val="Hyperlink"/>
-          </w:rPr>
-          <w:t xml:space="preserve">https://doi.org/10.1037/bul0000006</w:t>
-        </w:r>
-      </w:hyperlink>
-    </w:p>
-    <w:bookmarkEnd w:id="137"/>
-    <w:bookmarkStart w:id="139" w:name="ref-sanmartin2012outcome"/>
-    <w:p>
-      <w:pPr>
-        <w:pStyle w:val="Bibliography"/>
-      </w:pPr>
-      <w:r>
-        <w:t xml:space="preserve">San Martín, R. (2012). Event-related potential studies of outcome processing and feedback-guided learning.</w:t>
-      </w:r>
-      <w:r>
-        <w:t xml:space="preserve"> </w:t>
-      </w:r>
-      <w:r>
-        <w:rPr>
-          <w:i/>
-          <w:iCs/>
-        </w:rPr>
-        <w:t xml:space="preserve">Frontiers in Human Neuroscience</w:t>
-      </w:r>
-      <w:r>
-        <w:t xml:space="preserve">,</w:t>
-      </w:r>
-      <w:r>
-        <w:t xml:space="preserve"> </w:t>
-      </w:r>
-      <w:r>
-        <w:rPr>
-          <w:i/>
-          <w:iCs/>
-        </w:rPr>
-        <w:t xml:space="preserve">6</w:t>
-      </w:r>
-      <w:r>
-        <w:t xml:space="preserve">, 304.</w:t>
-      </w:r>
-      <w:r>
-        <w:t xml:space="preserve"> </w:t>
-      </w:r>
-      <w:hyperlink r:id="rId138">
-        <w:r>
-          <w:rPr>
-            <w:rStyle w:val="Hyperlink"/>
-          </w:rPr>
-          <w:t xml:space="preserve">https://doi.org/10.3389/fnhum.2012.00304</w:t>
-        </w:r>
-      </w:hyperlink>
-    </w:p>
-    <w:bookmarkEnd w:id="139"/>
-    <w:bookmarkStart w:id="141" w:name="ref-schirrmeister2017cnn"/>
-    <w:p>
-      <w:pPr>
-        <w:pStyle w:val="Bibliography"/>
-      </w:pPr>
-      <w:r>
-        <w:t xml:space="preserve">Schirrmeister, R. T., Springenberg, J. T., Fiederer, L. D. J., Glasstetter, M., Eggensperger, K., Tangermann, M., Hutter, F., Burgard, W., &amp; Ball, T. (2017). Deep learning with convolutional neural networks for</w:t>
-      </w:r>
-      <w:r>
-        <w:t xml:space="preserve"> </w:t>
-      </w:r>
-      <w:r>
-        <w:t xml:space="preserve">EEG</w:t>
-      </w:r>
-      <w:r>
-        <w:t xml:space="preserve"> </w:t>
-      </w:r>
-      <w:r>
-        <w:t xml:space="preserve">decoding and visualization.</w:t>
-      </w:r>
-      <w:r>
-        <w:t xml:space="preserve"> </w:t>
-      </w:r>
-      <w:r>
-        <w:rPr>
-          <w:i/>
-          <w:iCs/>
-        </w:rPr>
-        <w:t xml:space="preserve">Human Brain Mapping</w:t>
-      </w:r>
-      <w:r>
-        <w:t xml:space="preserve">,</w:t>
-      </w:r>
-      <w:r>
-        <w:t xml:space="preserve"> </w:t>
-      </w:r>
-      <w:r>
-        <w:rPr>
-          <w:i/>
-          <w:iCs/>
-        </w:rPr>
-        <w:t xml:space="preserve">38</w:t>
-      </w:r>
-      <w:r>
-        <w:t xml:space="preserve">(11), 5391–5420.</w:t>
-      </w:r>
-      <w:r>
-        <w:t xml:space="preserve"> </w:t>
-      </w:r>
-      <w:hyperlink r:id="rId140">
-        <w:r>
-          <w:rPr>
-            <w:rStyle w:val="Hyperlink"/>
-          </w:rPr>
-          <w:t xml:space="preserve">https://doi.org/10.1002/hbm.23730</w:t>
-        </w:r>
-      </w:hyperlink>
-    </w:p>
-    <w:bookmarkEnd w:id="141"/>
-    <w:bookmarkStart w:id="142" w:name="ref-sutton2018reinforcement"/>
-    <w:p>
-      <w:pPr>
-        <w:pStyle w:val="Bibliography"/>
-      </w:pPr>
-      <w:r>
-        <w:t xml:space="preserve">Sutton, R. S., &amp; Barto, A. G. (2018).</w:t>
-      </w:r>
-      <w:r>
-        <w:t xml:space="preserve"> </w:t>
-      </w:r>
-      <w:r>
-        <w:rPr>
-          <w:i/>
-          <w:iCs/>
-        </w:rPr>
-        <w:t xml:space="preserve">Reinforcement learning: An introduction</w:t>
-      </w:r>
-      <w:r>
-        <w:t xml:space="preserve"> </w:t>
-      </w:r>
-      <w:r>
-        <w:t xml:space="preserve">(2nd ed.). MIT Press.</w:t>
-      </w:r>
-    </w:p>
-    <w:bookmarkEnd w:id="142"/>
-    <w:bookmarkStart w:id="144" w:name="ref-varoqueaux2018cv"/>
-    <w:p>
-      <w:pPr>
-        <w:pStyle w:val="Bibliography"/>
-      </w:pPr>
-      <w:r>
-        <w:t xml:space="preserve">Varoquaux, G. (2018). Cross-validation failure: Small sample sizes lead to large error bars.</w:t>
-      </w:r>
-      <w:r>
-        <w:t xml:space="preserve"> </w:t>
-      </w:r>
-      <w:r>
-        <w:rPr>
-          <w:i/>
-          <w:iCs/>
-        </w:rPr>
-        <w:t xml:space="preserve">NeuroImage</w:t>
-      </w:r>
-      <w:r>
-        <w:t xml:space="preserve">,</w:t>
-      </w:r>
-      <w:r>
-        <w:t xml:space="preserve"> </w:t>
-      </w:r>
-      <w:r>
-        <w:rPr>
-          <w:i/>
-          <w:iCs/>
-        </w:rPr>
-        <w:t xml:space="preserve">180</w:t>
-      </w:r>
-      <w:r>
-        <w:t xml:space="preserve">, 68–77.</w:t>
-      </w:r>
-      <w:r>
-        <w:t xml:space="preserve"> </w:t>
-      </w:r>
-      <w:hyperlink r:id="rId143">
-        <w:r>
-          <w:rPr>
-            <w:rStyle w:val="Hyperlink"/>
-          </w:rPr>
-          <w:t xml:space="preserve">https://doi.org/10.1016/j.neuroimage.2017.06.061</w:t>
-        </w:r>
-      </w:hyperlink>
-    </w:p>
-    <w:bookmarkEnd w:id="144"/>
-    <w:bookmarkStart w:id="146" w:name="ref-walsh2012erp"/>
-    <w:p>
-      <w:pPr>
-        <w:pStyle w:val="Bibliography"/>
-      </w:pPr>
-      <w:r>
-        <w:t xml:space="preserve">Walsh, M. M., &amp; Anderson, J. R. (2012). Learning from experience: Event-related potential correlates of reward processing, neural adaptation, and behavioral choice.</w:t>
-      </w:r>
-      <w:r>
-        <w:t xml:space="preserve"> </w:t>
-      </w:r>
-      <w:r>
-        <w:rPr>
-          <w:i/>
-          <w:iCs/>
-        </w:rPr>
-        <w:t xml:space="preserve">Neuroscience &amp; Biobehavioral Reviews</w:t>
-      </w:r>
-      <w:r>
-        <w:t xml:space="preserve">,</w:t>
-      </w:r>
-      <w:r>
-        <w:t xml:space="preserve"> </w:t>
-      </w:r>
-      <w:r>
-        <w:rPr>
-          <w:i/>
-          <w:iCs/>
-        </w:rPr>
-        <w:t xml:space="preserve">36</w:t>
-      </w:r>
-      <w:r>
-        <w:t xml:space="preserve">(8), 1870–1884.</w:t>
-      </w:r>
-      <w:r>
-        <w:t xml:space="preserve"> </w:t>
-      </w:r>
-      <w:hyperlink r:id="rId145">
-        <w:r>
-          <w:rPr>
-            <w:rStyle w:val="Hyperlink"/>
-          </w:rPr>
-          <w:t xml:space="preserve">https://doi.org/10.1016/j.neubiorev.2012.05.008</w:t>
-        </w:r>
-      </w:hyperlink>
-    </w:p>
-    <w:bookmarkEnd w:id="146"/>
-    <w:bookmarkStart w:id="148" w:name="ref-webb2009reward"/>
-    <w:p>
-      <w:pPr>
-        <w:pStyle w:val="Bibliography"/>
-      </w:pPr>
-      <w:r>
-        <w:t xml:space="preserve">Webb, I. C., Baltazar, R. M., Wang, X., Pitchers, K. K., Coolen, L. M., &amp; Lehman, M. N. (2009). Diurnal variations in natural and drug reward, mesolimbic tyrosine hydroxylase, and clock gene expression in the male rat.</w:t>
-      </w:r>
-      <w:r>
-        <w:t xml:space="preserve"> </w:t>
-      </w:r>
-      <w:r>
-        <w:rPr>
-          <w:i/>
-          <w:iCs/>
-        </w:rPr>
-        <w:t xml:space="preserve">Journal of Biological Rhythms</w:t>
-      </w:r>
-      <w:r>
-        <w:t xml:space="preserve">,</w:t>
-      </w:r>
-      <w:r>
-        <w:t xml:space="preserve"> </w:t>
-      </w:r>
-      <w:r>
-        <w:rPr>
-          <w:i/>
-          <w:iCs/>
-        </w:rPr>
-        <w:t xml:space="preserve">24</w:t>
-      </w:r>
-      <w:r>
-        <w:t xml:space="preserve">(6), 465–476.</w:t>
-      </w:r>
-      <w:r>
-        <w:t xml:space="preserve"> </w:t>
-      </w:r>
-      <w:hyperlink r:id="rId147">
-        <w:r>
-          <w:rPr>
-            <w:rStyle w:val="Hyperlink"/>
-          </w:rPr>
-          <w:t xml:space="preserve">https://doi.org/10.1177/0748730409346657</w:t>
-        </w:r>
-      </w:hyperlink>
-    </w:p>
-    <w:bookmarkEnd w:id="148"/>
-    <w:bookmarkStart w:id="150" w:name="ref-wittmann2006social"/>
-    <w:p>
-      <w:pPr>
-        <w:pStyle w:val="Bibliography"/>
-      </w:pPr>
-      <w:r>
-        <w:t xml:space="preserve">Wittmann, M., Dinich, J., Merrow, M., &amp; Roenneberg, T. (2006). Social jetlag: Misalignment of biological and social time.</w:t>
-      </w:r>
-      <w:r>
-        <w:t xml:space="preserve"> </w:t>
-      </w:r>
-      <w:r>
-        <w:rPr>
-          <w:i/>
-          <w:iCs/>
-        </w:rPr>
-        <w:t xml:space="preserve">Chronobiology International</w:t>
-      </w:r>
-      <w:r>
-        <w:t xml:space="preserve">,</w:t>
-      </w:r>
-      <w:r>
-        <w:t xml:space="preserve"> </w:t>
-      </w:r>
-      <w:r>
-        <w:rPr>
-          <w:i/>
-          <w:iCs/>
-        </w:rPr>
-        <w:t xml:space="preserve">23</w:t>
-      </w:r>
-      <w:r>
-        <w:t xml:space="preserve">(1–2), 497–509.</w:t>
-      </w:r>
-      <w:r>
-        <w:t xml:space="preserve"> </w:t>
-      </w:r>
-      <w:hyperlink r:id="rId149">
-        <w:r>
-          <w:rPr>
-            <w:rStyle w:val="Hyperlink"/>
-          </w:rPr>
-          <w:t xml:space="preserve">https://doi.org/10.1080/07420520500545979</w:t>
-        </w:r>
-      </w:hyperlink>
-    </w:p>
-    <w:bookmarkEnd w:id="150"/>
-    <w:bookmarkStart w:id="152" w:name="ref-wu2009p300"/>
-    <w:p>
-      <w:pPr>
-        <w:pStyle w:val="Bibliography"/>
-      </w:pPr>
-      <w:r>
-        <w:t xml:space="preserve">Wu, Y., &amp; Zhou, X. (2009). The</w:t>
-      </w:r>
-      <w:r>
-        <w:t xml:space="preserve"> </w:t>
-      </w:r>
-      <w:r>
-        <w:t xml:space="preserve">P300</w:t>
-      </w:r>
-      <w:r>
-        <w:t xml:space="preserve"> </w:t>
-      </w:r>
-      <w:r>
-        <w:t xml:space="preserve">and reward valence, magnitude, and expectancy in outcome evaluation.</w:t>
-      </w:r>
-      <w:r>
-        <w:t xml:space="preserve"> </w:t>
-      </w:r>
-      <w:r>
-        <w:rPr>
-          <w:i/>
-          <w:iCs/>
-        </w:rPr>
-        <w:t xml:space="preserve">Brain Research</w:t>
-      </w:r>
-      <w:r>
-        <w:t xml:space="preserve">,</w:t>
-      </w:r>
-      <w:r>
-        <w:t xml:space="preserve"> </w:t>
-      </w:r>
-      <w:r>
-        <w:rPr>
-          <w:i/>
-          <w:iCs/>
-        </w:rPr>
-        <w:t xml:space="preserve">1286</w:t>
-      </w:r>
-      <w:r>
-        <w:t xml:space="preserve">, 114–122.</w:t>
-      </w:r>
-      <w:r>
-        <w:t xml:space="preserve"> </w:t>
-      </w:r>
-      <w:hyperlink r:id="rId151">
-        <w:r>
-          <w:rPr>
-            <w:rStyle w:val="Hyperlink"/>
-          </w:rPr>
-          <w:t xml:space="preserve">https://doi.org/10.1016/j.brainres.2009.06.032</w:t>
-        </w:r>
-      </w:hyperlink>
-    </w:p>
-    <w:bookmarkEnd w:id="152"/>
-    <w:bookmarkStart w:id="154" w:name="ref-yeung2004reward"/>
-    <w:p>
-      <w:pPr>
-        <w:pStyle w:val="Bibliography"/>
-      </w:pPr>
-      <w:r>
-        <w:t xml:space="preserve">Yeung, N., &amp; Sanfey, A. G. (2004). Independent coding of reward magnitude and valence in the human brain.</w:t>
-      </w:r>
-      <w:r>
-        <w:t xml:space="preserve"> </w:t>
-      </w:r>
-      <w:r>
-        <w:rPr>
-          <w:i/>
-          <w:iCs/>
-        </w:rPr>
-        <w:t xml:space="preserve">Journal of Neuroscience</w:t>
-      </w:r>
-      <w:r>
-        <w:t xml:space="preserve">,</w:t>
-      </w:r>
-      <w:r>
-        <w:t xml:space="preserve"> </w:t>
-      </w:r>
-      <w:r>
-        <w:rPr>
-          <w:i/>
-          <w:iCs/>
-        </w:rPr>
-        <w:t xml:space="preserve">24</w:t>
-      </w:r>
-      <w:r>
-        <w:t xml:space="preserve">(28), 6258–6264.</w:t>
-      </w:r>
-      <w:r>
-        <w:t xml:space="preserve"> </w:t>
-      </w:r>
-      <w:hyperlink r:id="rId153">
-        <w:r>
-          <w:rPr>
-            <w:rStyle w:val="Hyperlink"/>
-          </w:rPr>
-          <w:t xml:space="preserve">https://doi.org/10.1523/JNEUROSCI.4537-03.2004</w:t>
-        </w:r>
-      </w:hyperlink>
-    </w:p>
-    <w:bookmarkEnd w:id="154"/>
-    <w:bookmarkEnd w:id="155"/>
-    <w:bookmarkEnd w:id="156"/>
     <w:sectPr>
       <w:footnotePr>
         <w:numRestart w:val="eachSect"/>

</xml_diff>

<commit_message>
Apply GPT review: ERP-first framing, softer predictive language, analysis plan
- Retitle to "Chronotype Differences in Feedback-Related P300 and Risky-Choice
  Dynamics" (drops "converging/fusion evidence"; for co-author approval)
- Abstract: soften predictive language (decoded->distinguished/separated/tracked;
  "not diagnostic"), add dimensional-trait framing
- Add Methods 2.12 analysis plan (primary/confirmatory/secondary/exploratory)
- Explain the four feedback conditions (Gain/Loss x Correct/Error) conceptually
- Sharpen the P300-vs-FRN dissociation into a specific theoretical claim (later
  salience weighting vs early valence/prediction error)
- Condense secondary risky-choice (S3.6) and bridge it to the GRU section
- Tone down figure captions (drop "super-additive"/"leakage-safe, permutation-clean")

Co-Authored-By: Claude Opus 4.8 <noreply@anthropic.com>
</commit_message>
<xml_diff>
--- a/docs/paper.docx
+++ b/docs/paper.docx
@@ -2,13 +2,13 @@
 <file path=word/document.xml><?xml version="1.0" encoding="utf-8"?>
 <w:document xmlns:w="http://schemas.openxmlformats.org/wordprocessingml/2006/main" xmlns:m="http://schemas.openxmlformats.org/officeDocument/2006/math" xmlns:r="http://schemas.openxmlformats.org/officeDocument/2006/relationships" xmlns:o="urn:schemas-microsoft-com:office:office" xmlns:v="urn:schemas-microsoft-com:vml" xmlns:w10="urn:schemas-microsoft-com:office:word" xmlns:a="http://schemas.openxmlformats.org/drawingml/2006/main" xmlns:pic="http://schemas.openxmlformats.org/drawingml/2006/picture" xmlns:wp="http://schemas.openxmlformats.org/drawingml/2006/wordprocessingDrawing">
   <w:body>
-    <w:bookmarkStart w:id="48" w:name="X63fd1210bb01463e9d97a2ad11bb56081490206"/>
+    <w:bookmarkStart w:id="49" w:name="X462857b0ad080214911468438ad998d242e176f"/>
     <w:p>
       <w:pPr>
         <w:pStyle w:val="Heading1"/>
       </w:pPr>
       <w:r>
-        <w:t xml:space="preserve">Chronotype in the Neural and Behavioural Evaluation of Decision Feedback: Converging ERP, Computational, and Fusion Evidence</w:t>
+        <w:t xml:space="preserve">Chronotype Differences in Feedback-Related P300 and Risky-Choice Dynamics</w:t>
       </w:r>
     </w:p>
     <w:p>
@@ -91,7 +91,7 @@
         <w:t xml:space="preserve"> </w:t>
       </w:r>
       <w:r>
-        <w:t xml:space="preserve">models, and multimodal prediction with participant-generalizing validation. The</w:t>
+        <w:t xml:space="preserve">models, and multimodal analyses with participant-generalizing validation. The</w:t>
       </w:r>
       <w:r>
         <w:t xml:space="preserve"> </w:t>
@@ -121,61 +121,79 @@
         <w:t xml:space="preserve"> </w:t>
       </w:r>
       <w:r>
-        <w:t xml:space="preserve">showed the same direction of association with continuous MEQ score. Behaviour also</w:t>
-      </w:r>
-      <w:r>
-        <w:t xml:space="preserve"> </w:t>
-      </w:r>
-      <w:r>
-        <w:t xml:space="preserve">carried chronotype information: a causal GRU model trained on risky-choice dynamics</w:t>
-      </w:r>
-      <w:r>
-        <w:t xml:space="preserve"> </w:t>
-      </w:r>
-      <w:r>
-        <w:t xml:space="preserve">decoded chronotype from behaviour alone (out-of-fold ROC AUC 0.713, permutation p =</w:t>
-      </w:r>
-      <w:r>
-        <w:t xml:space="preserve"> </w:t>
-      </w:r>
-      <w:r>
-        <w:t xml:space="preserve">0.027). Combining the behavioural embedding with validated ERP contrasts improved</w:t>
-      </w:r>
-      <w:r>
-        <w:t xml:space="preserve"> </w:t>
-      </w:r>
-      <w:r>
-        <w:t xml:space="preserve">decoding to AUC 0.797 (p = 0.004; bootstrap 95% CI [0.64, 0.92]) and predicted the</w:t>
-      </w:r>
-      <w:r>
-        <w:t xml:space="preserve"> </w:t>
-      </w:r>
-      <w:r>
-        <w:t xml:space="preserve">continuous MEQ score (r = 0.34, p = 0.027), suggesting that behavioural dynamics and</w:t>
-      </w:r>
-      <w:r>
-        <w:t xml:space="preserve"> </w:t>
-      </w:r>
-      <w:r>
-        <w:t xml:space="preserve">feedback ERPs contain partly independent information about chronotype. An</w:t>
-      </w:r>
-      <w:r>
-        <w:t xml:space="preserve"> </w:t>
-      </w:r>
-      <w:r>
-        <w:t xml:space="preserve">asymmetric reinforcement-learning analysis suggested possible differences in</w:t>
-      </w:r>
-      <w:r>
-        <w:t xml:space="preserve"> </w:t>
-      </w:r>
-      <w:r>
-        <w:t xml:space="preserve">outcome-specific learning and choice consistency, but these estimates were weak and</w:t>
-      </w:r>
-      <w:r>
-        <w:t xml:space="preserve"> </w:t>
-      </w:r>
-      <w:r>
-        <w:t xml:space="preserve">did not survive hierarchical partial pooling. Two boundary analyses constrained the</w:t>
+        <w:t xml:space="preserve">showed the same direction of association with continuous MEQ score. Behaviour carried</w:t>
+      </w:r>
+      <w:r>
+        <w:t xml:space="preserve"> </w:t>
+      </w:r>
+      <w:r>
+        <w:t xml:space="preserve">convergent information: out-of-fold scores from a causal GRU model of risky-choice</w:t>
+      </w:r>
+      <w:r>
+        <w:t xml:space="preserve"> </w:t>
+      </w:r>
+      <w:r>
+        <w:t xml:space="preserve">dynamics distinguished Morning and Evening participants without EEG (ROC AUC 0.713,</w:t>
+      </w:r>
+      <w:r>
+        <w:t xml:space="preserve"> </w:t>
+      </w:r>
+      <w:r>
+        <w:t xml:space="preserve">permutation p = 0.027). Out-of-fold scores that combined the behavioural embedding</w:t>
+      </w:r>
+      <w:r>
+        <w:t xml:space="preserve"> </w:t>
+      </w:r>
+      <w:r>
+        <w:t xml:space="preserve">with the validated ERP contrasts separated the groups more strongly (AUC 0.797, p =</w:t>
+      </w:r>
+      <w:r>
+        <w:t xml:space="preserve"> </w:t>
+      </w:r>
+      <w:r>
+        <w:t xml:space="preserve">0.004; bootstrap 95% CI [0.64, 0.92]) and tracked the continuous MEQ score (r =</w:t>
+      </w:r>
+      <w:r>
+        <w:t xml:space="preserve"> </w:t>
+      </w:r>
+      <w:r>
+        <w:t xml:space="preserve">0.34, p = 0.027), indicating that behavioural dynamics and feedback ERPs carry</w:t>
+      </w:r>
+      <w:r>
+        <w:t xml:space="preserve"> </w:t>
+      </w:r>
+      <w:r>
+        <w:t xml:space="preserve">partly independent, rather than diagnostic, information about chronotype. That the</w:t>
+      </w:r>
+      <w:r>
+        <w:t xml:space="preserve"> </w:t>
+      </w:r>
+      <w:r>
+        <w:t xml:space="preserve">same measures related to continuous MEQ score is consistent with a graded,</w:t>
+      </w:r>
+      <w:r>
+        <w:t xml:space="preserve"> </w:t>
+      </w:r>
+      <w:r>
+        <w:t xml:space="preserve">dimensional trait rather than a strict dichotomy. An asymmetric</w:t>
+      </w:r>
+      <w:r>
+        <w:t xml:space="preserve"> </w:t>
+      </w:r>
+      <w:r>
+        <w:t xml:space="preserve">reinforcement-learning analysis suggested possible differences in outcome-specific</w:t>
+      </w:r>
+      <w:r>
+        <w:t xml:space="preserve"> </w:t>
+      </w:r>
+      <w:r>
+        <w:t xml:space="preserve">learning and choice consistency, but these estimates were weak and did not survive</w:t>
+      </w:r>
+      <w:r>
+        <w:t xml:space="preserve"> </w:t>
+      </w:r>
+      <w:r>
+        <w:t xml:space="preserve">hierarchical partial pooling. Two boundary analyses constrained the</w:t>
       </w:r>
       <w:r>
         <w:t xml:space="preserve"> </w:t>
@@ -571,7 +589,7 @@
       </w:r>
     </w:p>
     <w:bookmarkEnd w:id="10"/>
-    <w:bookmarkStart w:id="22" w:name="methods"/>
+    <w:bookmarkStart w:id="23" w:name="methods"/>
     <w:p>
       <w:pPr>
         <w:pStyle w:val="Heading2"/>
@@ -672,25 +690,79 @@
         <w:t xml:space="preserve"> </w:t>
       </w:r>
       <w:r>
-        <w:t xml:space="preserve">Feedback was coded by valence (gain or loss) and correctness, producing</w:t>
-      </w:r>
-      <w:r>
-        <w:t xml:space="preserve"> </w:t>
-      </w:r>
-      <w:r>
-        <w:t xml:space="preserve">Gain-Correct, Gain-Error, Loss-Correct, and Loss-Error conditions. [AUTHOR INPUT:</w:t>
-      </w:r>
-      <w:r>
-        <w:t xml:space="preserve"> </w:t>
-      </w:r>
-      <w:r>
-        <w:t xml:space="preserve">task design details, number of trials/blocks, stimulus timing, response mapping,</w:t>
-      </w:r>
-      <w:r>
-        <w:t xml:space="preserve"> </w:t>
-      </w:r>
-      <w:r>
-        <w:t xml:space="preserve">free vs forced trials.] EEG was recorded during the task, and feedback-locked</w:t>
+        <w:t xml:space="preserve">On each trial two boxes were shown, each displaying an absolute magnitude; the sign</w:t>
+      </w:r>
+      <w:r>
+        <w:t xml:space="preserve"> </w:t>
+      </w:r>
+      <w:r>
+        <w:t xml:space="preserve">(gain or loss) of each box was hidden at the moment of choice and revealed only as</w:t>
+      </w:r>
+      <w:r>
+        <w:t xml:space="preserve"> </w:t>
+      </w:r>
+      <w:r>
+        <w:t xml:space="preserve">feedback. On free trials the two boxes differed in magnitude, so choosing the</w:t>
+      </w:r>
+      <w:r>
+        <w:t xml:space="preserve"> </w:t>
+      </w:r>
+      <w:r>
+        <w:t xml:space="preserve">higher-magnitude box constituted the risky choice (a larger potential gain but also</w:t>
+      </w:r>
+      <w:r>
+        <w:t xml:space="preserve"> </w:t>
+      </w:r>
+      <w:r>
+        <w:t xml:space="preserve">a larger potential loss), whereas choosing the lower-magnitude box was the safe</w:t>
+      </w:r>
+      <w:r>
+        <w:t xml:space="preserve"> </w:t>
+      </w:r>
+      <w:r>
+        <w:t xml:space="preserve">choice. Feedback was then coded by the valence of the chosen box (gain if its</w:t>
+      </w:r>
+      <w:r>
+        <w:t xml:space="preserve"> </w:t>
+      </w:r>
+      <w:r>
+        <w:t xml:space="preserve">revealed sign was positive, loss if negative) and by correctness (whether the box</w:t>
+      </w:r>
+      <w:r>
+        <w:t xml:space="preserve"> </w:t>
+      </w:r>
+      <w:r>
+        <w:t xml:space="preserve">with the higher revealed signed value had been chosen), producing four feedback</w:t>
+      </w:r>
+      <w:r>
+        <w:t xml:space="preserve"> </w:t>
+      </w:r>
+      <w:r>
+        <w:t xml:space="preserve">conditions: Gain-Correct, Gain-Error, Loss-Correct, and Loss-Error. Valence</w:t>
+      </w:r>
+      <w:r>
+        <w:t xml:space="preserve"> </w:t>
+      </w:r>
+      <w:r>
+        <w:t xml:space="preserve">(gain vs loss) therefore indexes the affective outcome of the choice, and</w:t>
+      </w:r>
+      <w:r>
+        <w:t xml:space="preserve"> </w:t>
+      </w:r>
+      <w:r>
+        <w:t xml:space="preserve">correctness indexes whether that choice was, in hindsight, the better of the two</w:t>
+      </w:r>
+      <w:r>
+        <w:t xml:space="preserve"> </w:t>
+      </w:r>
+      <w:r>
+        <w:t xml:space="preserve">options. [AUTHOR INPUT: number of trials/blocks, magnitudes used, stimulus and</w:t>
+      </w:r>
+      <w:r>
+        <w:t xml:space="preserve"> </w:t>
+      </w:r>
+      <w:r>
+        <w:t xml:space="preserve">feedback timing, response mapping, and the free-versus-forced trial split.] EEG was recorded during the task, and feedback-locked</w:t>
       </w:r>
       <w:r>
         <w:t xml:space="preserve"> </w:t>
@@ -1548,6 +1620,166 @@
       </w:r>
       <w:r>
         <w:t xml:space="preserve">the repository and in the supplementary materials.</w:t>
+      </w:r>
+    </w:p>
+    <w:bookmarkEnd w:id="21"/>
+    <w:bookmarkStart w:id="22" w:name="analysis-plan-and-inference-hierarchy"/>
+    <w:p>
+      <w:pPr>
+        <w:pStyle w:val="Heading3"/>
+      </w:pPr>
+      <w:r>
+        <w:t xml:space="preserve">2.12 Analysis plan and inference hierarchy</w:t>
+      </w:r>
+    </w:p>
+    <w:p>
+      <w:pPr>
+        <w:pStyle w:val="FirstParagraph"/>
+      </w:pPr>
+      <w:r>
+        <w:t xml:space="preserve">To keep interpretation disciplined given the sample size, analyses are organized</w:t>
+      </w:r>
+      <w:r>
+        <w:t xml:space="preserve"> </w:t>
+      </w:r>
+      <w:r>
+        <w:t xml:space="preserve">into a fixed hierarchy. The</w:t>
+      </w:r>
+      <w:r>
+        <w:t xml:space="preserve"> </w:t>
+      </w:r>
+      <w:r>
+        <w:rPr>
+          <w:b/>
+          <w:bCs/>
+        </w:rPr>
+        <w:t xml:space="preserve">primary</w:t>
+      </w:r>
+      <w:r>
+        <w:t xml:space="preserve"> </w:t>
+      </w:r>
+      <w:r>
+        <w:t xml:space="preserve">analysis is the theory-driven group</w:t>
+      </w:r>
+      <w:r>
+        <w:t xml:space="preserve"> </w:t>
+      </w:r>
+      <w:r>
+        <w:t xml:space="preserve">contrast in the posterior P300 loss-minus-gain response (Pz and POz), FDR-corrected</w:t>
+      </w:r>
+      <w:r>
+        <w:t xml:space="preserve"> </w:t>
+      </w:r>
+      <w:r>
+        <w:t xml:space="preserve">across the theory-driven feature family.</w:t>
+      </w:r>
+      <w:r>
+        <w:t xml:space="preserve"> </w:t>
+      </w:r>
+      <w:r>
+        <w:rPr>
+          <w:b/>
+          <w:bCs/>
+        </w:rPr>
+        <w:t xml:space="preserve">Confirmatory robustness</w:t>
+      </w:r>
+      <w:r>
+        <w:t xml:space="preserve"> </w:t>
+      </w:r>
+      <w:r>
+        <w:t xml:space="preserve">analyses test</w:t>
+      </w:r>
+      <w:r>
+        <w:t xml:space="preserve"> </w:t>
+      </w:r>
+      <w:r>
+        <w:t xml:space="preserve">the stability of that effect: participant-exclusion sensitivity analyses, the</w:t>
+      </w:r>
+      <w:r>
+        <w:t xml:space="preserve"> </w:t>
+      </w:r>
+      <w:r>
+        <w:t xml:space="preserve">window specification curve, and the direction of the continuous-MEQ association.</w:t>
+      </w:r>
+      <w:r>
+        <w:t xml:space="preserve"> </w:t>
+      </w:r>
+      <w:r>
+        <w:rPr>
+          <w:b/>
+          <w:bCs/>
+        </w:rPr>
+        <w:t xml:space="preserve">Secondary, convergent</w:t>
+      </w:r>
+      <w:r>
+        <w:t xml:space="preserve"> </w:t>
+      </w:r>
+      <w:r>
+        <w:t xml:space="preserve">analyses ask whether behaviour carries related chronotype</w:t>
+      </w:r>
+      <w:r>
+        <w:t xml:space="preserve"> </w:t>
+      </w:r>
+      <w:r>
+        <w:t xml:space="preserve">information under participant-generalizing validation: the compact 12-feature</w:t>
+      </w:r>
+      <w:r>
+        <w:t xml:space="preserve"> </w:t>
+      </w:r>
+      <w:r>
+        <w:t xml:space="preserve">classifier, the GRU behavioural embedding, and its combination with the validated</w:t>
+      </w:r>
+      <w:r>
+        <w:t xml:space="preserve"> </w:t>
+      </w:r>
+      <w:r>
+        <w:t xml:space="preserve">ERP contrasts.</w:t>
+      </w:r>
+      <w:r>
+        <w:t xml:space="preserve"> </w:t>
+      </w:r>
+      <w:r>
+        <w:rPr>
+          <w:b/>
+          <w:bCs/>
+        </w:rPr>
+        <w:t xml:space="preserve">Exploratory</w:t>
+      </w:r>
+      <w:r>
+        <w:t xml:space="preserve"> </w:t>
+      </w:r>
+      <w:r>
+        <w:t xml:space="preserve">analyses, interpreted cautiously and not used to</w:t>
+      </w:r>
+      <w:r>
+        <w:t xml:space="preserve"> </w:t>
+      </w:r>
+      <w:r>
+        <w:t xml:space="preserve">support the main claims, comprise the higher-dimensional models, the</w:t>
+      </w:r>
+      <w:r>
+        <w:t xml:space="preserve"> </w:t>
+      </w:r>
+      <w:r>
+        <w:t xml:space="preserve">reinforcement-learning parameters, the learned EEGNet embeddings, and the</w:t>
+      </w:r>
+      <w:r>
+        <w:t xml:space="preserve"> </w:t>
+      </w:r>
+      <w:r>
+        <w:t xml:space="preserve">single-trial P300-to-choice coupling. Predictive results are reported as evidence</w:t>
+      </w:r>
+      <w:r>
+        <w:t xml:space="preserve"> </w:t>
+      </w:r>
+      <w:r>
+        <w:t xml:space="preserve">that behavioural and neural measures carry convergent chronotype information, not as</w:t>
+      </w:r>
+      <w:r>
+        <w:t xml:space="preserve"> </w:t>
+      </w:r>
+      <w:r>
+        <w:t xml:space="preserve">a deployable classifier.</w:t>
       </w:r>
     </w:p>
     <w:p>
@@ -1557,9 +1789,9 @@
         </w:pict>
       </w:r>
     </w:p>
-    <w:bookmarkEnd w:id="21"/>
     <w:bookmarkEnd w:id="22"/>
-    <w:bookmarkStart w:id="35" w:name="results"/>
+    <w:bookmarkEnd w:id="23"/>
+    <w:bookmarkStart w:id="36" w:name="results"/>
     <w:p>
       <w:pPr>
         <w:pStyle w:val="Heading2"/>
@@ -1568,7 +1800,7 @@
         <w:t xml:space="preserve">3. Results</w:t>
       </w:r>
     </w:p>
-    <w:bookmarkStart w:id="23" w:name="Xfef925df610cb4639bffe437383329ebc4b421c"/>
+    <w:bookmarkStart w:id="24" w:name="Xfef925df610cb4639bffe437383329ebc4b421c"/>
     <w:p>
       <w:pPr>
         <w:pStyle w:val="Heading3"/>
@@ -1627,8 +1859,8 @@
         <w:t xml:space="preserve">feature family (FDR p = 0.034 and 0.045).</w:t>
       </w:r>
     </w:p>
-    <w:bookmarkEnd w:id="23"/>
-    <w:bookmarkStart w:id="24" w:name="supporting-behavioural-risk-taking"/>
+    <w:bookmarkEnd w:id="24"/>
+    <w:bookmarkStart w:id="25" w:name="supporting-behavioural-risk-taking"/>
     <w:p>
       <w:pPr>
         <w:pStyle w:val="Heading3"/>
@@ -1719,8 +1951,8 @@
         <w:t xml:space="preserve">effect, but the sample is not large enough to rule out medium-sized FRN differences.</w:t>
       </w:r>
     </w:p>
-    <w:bookmarkEnd w:id="24"/>
-    <w:bookmarkStart w:id="25" w:name="continuous-meq-association-figure-2"/>
+    <w:bookmarkEnd w:id="25"/>
+    <w:bookmarkStart w:id="26" w:name="continuous-meq-association-figure-2"/>
     <w:p>
       <w:pPr>
         <w:pStyle w:val="Heading3"/>
@@ -1779,8 +2011,8 @@
         <w:t xml:space="preserve">direction, but the group contrast is estimated more precisely in this dataset.</w:t>
       </w:r>
     </w:p>
-    <w:bookmarkEnd w:id="25"/>
-    <w:bookmarkStart w:id="26" w:name="X5304d63afe92233b6765eefdbfa4bafb03865c4"/>
+    <w:bookmarkEnd w:id="26"/>
+    <w:bookmarkStart w:id="27" w:name="X5304d63afe92233b6765eefdbfa4bafb03865c4"/>
     <w:p>
       <w:pPr>
         <w:pStyle w:val="Heading3"/>
@@ -1907,8 +2139,8 @@
         <w:t xml:space="preserve">-0.66), but they supported the same conclusion.</w:t>
       </w:r>
     </w:p>
-    <w:bookmarkEnd w:id="26"/>
-    <w:bookmarkStart w:id="27" w:name="Xc9b9684bca4f2e1cdf854043292c51f5acdf207"/>
+    <w:bookmarkEnd w:id="27"/>
+    <w:bookmarkStart w:id="28" w:name="Xc9b9684bca4f2e1cdf854043292c51f5acdf207"/>
     <w:p>
       <w:pPr>
         <w:pStyle w:val="Heading3"/>
@@ -2081,8 +2313,8 @@
         <w:t xml:space="preserve">multivariate check on the neural result, not a diagnostic model.</w:t>
       </w:r>
     </w:p>
-    <w:bookmarkEnd w:id="27"/>
-    <w:bookmarkStart w:id="28" w:name="X0dbe79f9de0f7eb5935e02a27b59b7f2f08ec28"/>
+    <w:bookmarkEnd w:id="28"/>
+    <w:bookmarkStart w:id="29" w:name="X0dbe79f9de0f7eb5935e02a27b59b7f2f08ec28"/>
     <w:p>
       <w:pPr>
         <w:pStyle w:val="Heading3"/>
@@ -2096,53 +2328,65 @@
         <w:pStyle w:val="FirstParagraph"/>
       </w:pPr>
       <w:r>
-        <w:t xml:space="preserve">Participant-grouped models predicted trial-level risky choice modestly but above</w:t>
-      </w:r>
-      <w:r>
-        <w:t xml:space="preserve"> </w:t>
-      </w:r>
-      <w:r>
-        <w:t xml:space="preserve">simple baselines (Supplementary Table S4). The best models reached balanced accuracy of approximately 0.587</w:t>
-      </w:r>
-      <w:r>
-        <w:t xml:space="preserve"> </w:t>
-      </w:r>
-      <w:r>
-        <w:t xml:space="preserve">(ROC AUC approximately 0.62) across 10,669 free-choice trials. This exceeded the</w:t>
-      </w:r>
-      <w:r>
-        <w:t xml:space="preserve"> </w:t>
-      </w:r>
-      <w:r>
-        <w:t xml:space="preserve">majority-class baseline (0.50) and the previous-choice-persistence baseline (0.554),</w:t>
-      </w:r>
-      <w:r>
-        <w:t xml:space="preserve"> </w:t>
-      </w:r>
-      <w:r>
-        <w:t xml:space="preserve">and it approached the participant-mean oracle ceiling (0.604) without using data</w:t>
-      </w:r>
-      <w:r>
-        <w:t xml:space="preserve"> </w:t>
-      </w:r>
-      <w:r>
-        <w:t xml:space="preserve">from the held-out participant. Most of the signal came from previous-trial and</w:t>
-      </w:r>
-      <w:r>
-        <w:t xml:space="preserve"> </w:t>
-      </w:r>
-      <w:r>
-        <w:t xml:space="preserve">rolling-history features. Previous-trial EEG did not add clear predictive value in</w:t>
-      </w:r>
-      <w:r>
-        <w:t xml:space="preserve"> </w:t>
-      </w:r>
-      <w:r>
-        <w:t xml:space="preserve">the current representation.</w:t>
-      </w:r>
-    </w:p>
-    <w:bookmarkEnd w:id="28"/>
-    <w:bookmarkStart w:id="29" w:name="X5b838071b3217f31bc8b26ec7df405a75aea042"/>
+        <w:t xml:space="preserve">As a preliminary check that trial-level choice is predictable at all under</w:t>
+      </w:r>
+      <w:r>
+        <w:t xml:space="preserve"> </w:t>
+      </w:r>
+      <w:r>
+        <w:t xml:space="preserve">participant-generalizing validation, leakage-safe models reached balanced accuracy</w:t>
+      </w:r>
+      <w:r>
+        <w:t xml:space="preserve"> </w:t>
+      </w:r>
+      <w:r>
+        <w:t xml:space="preserve">of approximately 0.587 (ROC AUC approximately 0.62) on 10,669 free-choice trials —</w:t>
+      </w:r>
+      <w:r>
+        <w:t xml:space="preserve"> </w:t>
+      </w:r>
+      <w:r>
+        <w:t xml:space="preserve">modestly above the majority-class (0.50) and previous-choice-persistence (0.554)</w:t>
+      </w:r>
+      <w:r>
+        <w:t xml:space="preserve"> </w:t>
+      </w:r>
+      <w:r>
+        <w:t xml:space="preserve">baselines and approaching the participant-mean oracle ceiling (0.604) without using</w:t>
+      </w:r>
+      <w:r>
+        <w:t xml:space="preserve"> </w:t>
+      </w:r>
+      <w:r>
+        <w:t xml:space="preserve">held-out-participant data. Most of the signal came from previous-trial and rolling</w:t>
+      </w:r>
+      <w:r>
+        <w:t xml:space="preserve"> </w:t>
+      </w:r>
+      <w:r>
+        <w:t xml:space="preserve">choice history, and previous-trial EEG added no clear value in this representation</w:t>
+      </w:r>
+      <w:r>
+        <w:t xml:space="preserve"> </w:t>
+      </w:r>
+      <w:r>
+        <w:t xml:space="preserve">(Supplementary Table S4). This motivates the sequence model in the next section,</w:t>
+      </w:r>
+      <w:r>
+        <w:t xml:space="preserve"> </w:t>
+      </w:r>
+      <w:r>
+        <w:t xml:space="preserve">which learns such temporal structure directly rather than from hand-engineered</w:t>
+      </w:r>
+      <w:r>
+        <w:t xml:space="preserve"> </w:t>
+      </w:r>
+      <w:r>
+        <w:t xml:space="preserve">history features.</w:t>
+      </w:r>
+    </w:p>
+    <w:bookmarkEnd w:id="29"/>
+    <w:bookmarkStart w:id="30" w:name="X5b838071b3217f31bc8b26ec7df405a75aea042"/>
     <w:p>
       <w:pPr>
         <w:pStyle w:val="Heading3"/>
@@ -2201,8 +2445,8 @@
         <w:t xml:space="preserve">features.</w:t>
       </w:r>
     </w:p>
-    <w:bookmarkEnd w:id="29"/>
-    <w:bookmarkStart w:id="30" w:name="X6ddf6279428a9c0180374ef402066a36f67cc19"/>
+    <w:bookmarkEnd w:id="30"/>
+    <w:bookmarkStart w:id="31" w:name="X6ddf6279428a9c0180374ef402066a36f67cc19"/>
     <w:p>
       <w:pPr>
         <w:pStyle w:val="Heading3"/>
@@ -2610,8 +2854,8 @@
         <w:t xml:space="preserve">1001.</w:t>
       </w:r>
     </w:p>
-    <w:bookmarkEnd w:id="30"/>
-    <w:bookmarkStart w:id="31" w:name="continuous-meq-prediction-figure-3"/>
+    <w:bookmarkEnd w:id="31"/>
+    <w:bookmarkStart w:id="32" w:name="continuous-meq-prediction-figure-3"/>
     <w:p>
       <w:pPr>
         <w:pStyle w:val="Heading3"/>
@@ -2646,8 +2890,8 @@
         <w:t xml:space="preserve">p = 0.027), matching the pattern observed for binary chronotype prediction.</w:t>
       </w:r>
     </w:p>
-    <w:bookmarkEnd w:id="31"/>
-    <w:bookmarkStart w:id="32" w:name="X68798037d6dd073e26b01ce9d0430c1d4774e3c"/>
+    <w:bookmarkEnd w:id="32"/>
+    <w:bookmarkStart w:id="33" w:name="X68798037d6dd073e26b01ce9d0430c1d4774e3c"/>
     <w:p>
       <w:pPr>
         <w:pStyle w:val="Heading3"/>
@@ -2768,8 +3012,8 @@
         <w:t xml:space="preserve">these parameters were not identified well enough to support a mechanistic conclusion.</w:t>
       </w:r>
     </w:p>
-    <w:bookmarkEnd w:id="32"/>
-    <w:bookmarkStart w:id="33" w:name="X7d8226edcc851734607d77ef5e8ba75e88fc016"/>
+    <w:bookmarkEnd w:id="33"/>
+    <w:bookmarkStart w:id="34" w:name="X7d8226edcc851734607d77ef5e8ba75e88fc016"/>
     <w:p>
       <w:pPr>
         <w:pStyle w:val="Heading3"/>
@@ -2852,8 +3096,8 @@
         <w:t xml:space="preserve">2-epoch/2-fold sanity run gave AUC = 0.59 and is not used here.</w:t>
       </w:r>
     </w:p>
-    <w:bookmarkEnd w:id="33"/>
-    <w:bookmarkStart w:id="34" w:name="X4675b84cc4d6bf7f9757b3173dee4840261ab8f"/>
+    <w:bookmarkEnd w:id="34"/>
+    <w:bookmarkStart w:id="35" w:name="X4675b84cc4d6bf7f9757b3173dee4840261ab8f"/>
     <w:p>
       <w:pPr>
         <w:pStyle w:val="Heading3"/>
@@ -2966,9 +3210,9 @@
         </w:pict>
       </w:r>
     </w:p>
-    <w:bookmarkEnd w:id="34"/>
     <w:bookmarkEnd w:id="35"/>
-    <w:bookmarkStart w:id="43" w:name="discussion"/>
+    <w:bookmarkEnd w:id="36"/>
+    <w:bookmarkStart w:id="44" w:name="discussion"/>
     <w:p>
       <w:pPr>
         <w:pStyle w:val="Heading2"/>
@@ -2977,7 +3221,7 @@
         <w:t xml:space="preserve">4. Discussion</w:t>
       </w:r>
     </w:p>
-    <w:bookmarkStart w:id="36" w:name="overview"/>
+    <w:bookmarkStart w:id="37" w:name="overview"/>
     <w:p>
       <w:pPr>
         <w:pStyle w:val="Heading3"/>
@@ -3060,8 +3304,8 @@
         <w:t xml:space="preserve">analyses, not the accuracy of any single model.</w:t>
       </w:r>
     </w:p>
-    <w:bookmarkEnd w:id="36"/>
-    <w:bookmarkStart w:id="37" w:name="Xed7cfcf318f46fb61bc10809c3fa2f8274eb28a"/>
+    <w:bookmarkEnd w:id="37"/>
+    <w:bookmarkStart w:id="38" w:name="Xed7cfcf318f46fb61bc10809c3fa2f8274eb28a"/>
     <w:p>
       <w:pPr>
         <w:pStyle w:val="Heading3"/>
@@ -3179,35 +3423,71 @@
         <w:t xml:space="preserve"> </w:t>
       </w:r>
       <w:r>
-        <w:t xml:space="preserve">to the specific prior findings it wishes to foreground.] The absence of a reliable</w:t>
-      </w:r>
-      <w:r>
-        <w:t xml:space="preserve"> </w:t>
-      </w:r>
-      <w:r>
-        <w:t xml:space="preserve">FRN group difference further narrows the interpretation. Chronotype appeared to</w:t>
-      </w:r>
-      <w:r>
-        <w:t xml:space="preserve"> </w:t>
-      </w:r>
-      <w:r>
-        <w:t xml:space="preserve">affect a later feedback-evaluation process indexed by P300, not the earlier</w:t>
-      </w:r>
-      <w:r>
-        <w:t xml:space="preserve"> </w:t>
-      </w:r>
-      <w:r>
-        <w:t xml:space="preserve">valence- or prediction-error-related process indexed by the FRN (Holroyd &amp; Coles,</w:t>
-      </w:r>
-      <w:r>
-        <w:t xml:space="preserve"> </w:t>
-      </w:r>
-      <w:r>
-        <w:t xml:space="preserve">2002; Sambrook &amp; Goslin, 2015).</w:t>
-      </w:r>
-    </w:p>
-    <w:bookmarkEnd w:id="37"/>
-    <w:bookmarkStart w:id="38" w:name="Xe2f10c49e54ba6247a8c853fd811f02d23b817b"/>
+        <w:t xml:space="preserve">to the specific prior findings it wishes to foreground.] The dissociation between the P300 and the FRN is theoretically informative rather</w:t>
+      </w:r>
+      <w:r>
+        <w:t xml:space="preserve"> </w:t>
+      </w:r>
+      <w:r>
+        <w:t xml:space="preserve">than merely a pattern of one significant and one null test. The FRN, and its</w:t>
+      </w:r>
+      <w:r>
+        <w:t xml:space="preserve"> </w:t>
+      </w:r>
+      <w:r>
+        <w:t xml:space="preserve">positive-going counterpart the reward positivity, indexes a fast, relatively</w:t>
+      </w:r>
+      <w:r>
+        <w:t xml:space="preserve"> </w:t>
+      </w:r>
+      <w:r>
+        <w:t xml:space="preserve">automatic valence and reward-prediction-error evaluation of outcomes (Holroyd &amp;</w:t>
+      </w:r>
+      <w:r>
+        <w:t xml:space="preserve"> </w:t>
+      </w:r>
+      <w:r>
+        <w:t xml:space="preserve">Coles, 2002; Proudfit, 2015; Sambrook &amp; Goslin, 2015), whereas the posterior P300</w:t>
+      </w:r>
+      <w:r>
+        <w:t xml:space="preserve"> </w:t>
+      </w:r>
+      <w:r>
+        <w:t xml:space="preserve">indexes a later, more elaborative weighting of outcome salience and significance</w:t>
+      </w:r>
+      <w:r>
+        <w:t xml:space="preserve"> </w:t>
+      </w:r>
+      <w:r>
+        <w:t xml:space="preserve">(Polich, 2007; Yeung &amp; Sanfey, 2004). That chronotype was expressed in the P300 but</w:t>
+      </w:r>
+      <w:r>
+        <w:t xml:space="preserve"> </w:t>
+      </w:r>
+      <w:r>
+        <w:t xml:space="preserve">not the FRN suggests the difference lies in how much motivational significance is</w:t>
+      </w:r>
+      <w:r>
+        <w:t xml:space="preserve"> </w:t>
+      </w:r>
+      <w:r>
+        <w:t xml:space="preserve">assigned to gains relative to losses during this later appraisal stage, rather than</w:t>
+      </w:r>
+      <w:r>
+        <w:t xml:space="preserve"> </w:t>
+      </w:r>
+      <w:r>
+        <w:t xml:space="preserve">in the initial registration of outcome valence — a more specific account than a</w:t>
+      </w:r>
+      <w:r>
+        <w:t xml:space="preserve"> </w:t>
+      </w:r>
+      <w:r>
+        <w:t xml:space="preserve">general claim that chronotype affects feedback processing.</w:t>
+      </w:r>
+    </w:p>
+    <w:bookmarkEnd w:id="38"/>
+    <w:bookmarkStart w:id="39" w:name="Xe2f10c49e54ba6247a8c853fd811f02d23b817b"/>
     <w:p>
       <w:pPr>
         <w:pStyle w:val="Heading3"/>
@@ -3310,8 +3590,8 @@
         <w:t xml:space="preserve">cross-modal trait signature, not as tools for individual classification.</w:t>
       </w:r>
     </w:p>
-    <w:bookmarkEnd w:id="38"/>
-    <w:bookmarkStart w:id="39" w:name="a-tentative-computational-mechanism"/>
+    <w:bookmarkEnd w:id="39"/>
+    <w:bookmarkStart w:id="40" w:name="a-tentative-computational-mechanism"/>
     <w:p>
       <w:pPr>
         <w:pStyle w:val="Heading3"/>
@@ -3420,8 +3700,8 @@
         <w:t xml:space="preserve">constructs/references in the team’s prior chronotype work.]</w:t>
       </w:r>
     </w:p>
-    <w:bookmarkEnd w:id="39"/>
-    <w:bookmarkStart w:id="40" w:name="Xb9f3a6351c62ad707ee66dc7f8d5767568f910a"/>
+    <w:bookmarkEnd w:id="40"/>
+    <w:bookmarkStart w:id="41" w:name="Xb9f3a6351c62ad707ee66dc7f8d5767568f910a"/>
     <w:p>
       <w:pPr>
         <w:pStyle w:val="Heading3"/>
@@ -3516,8 +3796,8 @@
         <w:t xml:space="preserve">as evidence for moment-to-moment neural control of the next risky choice.</w:t>
       </w:r>
     </w:p>
-    <w:bookmarkEnd w:id="40"/>
-    <w:bookmarkStart w:id="41" w:name="chronotype-as-a-dimensional-trait"/>
+    <w:bookmarkEnd w:id="41"/>
+    <w:bookmarkStart w:id="42" w:name="chronotype-as-a-dimensional-trait"/>
     <w:p>
       <w:pPr>
         <w:pStyle w:val="Heading3"/>
@@ -3564,8 +3844,8 @@
         <w:t xml:space="preserve">primary outcome.</w:t>
       </w:r>
     </w:p>
-    <w:bookmarkEnd w:id="41"/>
-    <w:bookmarkStart w:id="42" w:name="conclusion"/>
+    <w:bookmarkEnd w:id="42"/>
+    <w:bookmarkStart w:id="43" w:name="conclusion"/>
     <w:p>
       <w:pPr>
         <w:pStyle w:val="Heading3"/>
@@ -3631,9 +3911,9 @@
         </w:pict>
       </w:r>
     </w:p>
-    <w:bookmarkEnd w:id="42"/>
     <w:bookmarkEnd w:id="43"/>
-    <w:bookmarkStart w:id="44" w:name="limitations"/>
+    <w:bookmarkEnd w:id="44"/>
+    <w:bookmarkStart w:id="45" w:name="limitations"/>
     <w:p>
       <w:pPr>
         <w:pStyle w:val="Heading2"/>
@@ -3883,8 +4163,8 @@
         </w:pict>
       </w:r>
     </w:p>
-    <w:bookmarkEnd w:id="44"/>
-    <w:bookmarkStart w:id="45" w:name="reproducibility-and-data-availability"/>
+    <w:bookmarkEnd w:id="45"/>
+    <w:bookmarkStart w:id="46" w:name="reproducibility-and-data-availability"/>
     <w:p>
       <w:pPr>
         <w:pStyle w:val="Heading2"/>
@@ -3983,8 +4263,8 @@
         </w:pict>
       </w:r>
     </w:p>
-    <w:bookmarkEnd w:id="45"/>
-    <w:bookmarkStart w:id="46" w:name="references"/>
+    <w:bookmarkEnd w:id="46"/>
+    <w:bookmarkStart w:id="47" w:name="references"/>
     <w:p>
       <w:pPr>
         <w:pStyle w:val="Heading2"/>
@@ -5146,8 +5426,8 @@
         </w:pict>
       </w:r>
     </w:p>
-    <w:bookmarkEnd w:id="46"/>
-    <w:bookmarkStart w:id="47" w:name="X71ad711d61f26707bd010f2d741e0cc27b0c823"/>
+    <w:bookmarkEnd w:id="47"/>
+    <w:bookmarkStart w:id="48" w:name="X71ad711d61f26707bd010f2d741e0cc27b0c823"/>
     <w:p>
       <w:pPr>
         <w:pStyle w:val="Heading2"/>
@@ -5345,9 +5625,9 @@
         <w:t xml:space="preserve">team’s prior chronotype constructs and references.</w:t>
       </w:r>
     </w:p>
-    <w:bookmarkEnd w:id="47"/>
     <w:bookmarkEnd w:id="48"/>
-    <w:bookmarkStart w:id="64" w:name="figures"/>
+    <w:bookmarkEnd w:id="49"/>
+    <w:bookmarkStart w:id="65" w:name="figures"/>
     <w:p>
       <w:pPr>
         <w:pStyle w:val="Heading1"/>
@@ -5365,18 +5645,18 @@
           <wp:inline>
             <wp:extent cx="5334000" cy="1742076"/>
             <wp:effectExtent b="0" l="0" r="0" t="0"/>
-            <wp:docPr descr="Figure 1. Posterior P300 by chronotype and specification curve." title="" id="50" name="Picture"/>
+            <wp:docPr descr="Figure 1. Posterior P300 by chronotype and specification curve." title="" id="51" name="Picture"/>
             <a:graphic>
               <a:graphicData uri="http://schemas.openxmlformats.org/drawingml/2006/picture">
                 <pic:pic>
                   <pic:nvPicPr>
-                    <pic:cNvPr descr="docs/figures/fig_main_1_p300_spec.png" id="51" name="Picture"/>
+                    <pic:cNvPr descr="docs/figures/fig_main_1_p300_spec.png" id="52" name="Picture"/>
                     <pic:cNvPicPr>
                       <a:picLocks noChangeArrowheads="1" noChangeAspect="1"/>
                     </pic:cNvPicPr>
                   </pic:nvPicPr>
                   <pic:blipFill>
-                    <a:blip r:embed="rId49"/>
+                    <a:blip r:embed="rId50"/>
                     <a:stretch>
                       <a:fillRect/>
                     </a:stretch>
@@ -5420,18 +5700,18 @@
           <wp:inline>
             <wp:extent cx="5334000" cy="1694329"/>
             <wp:effectExtent b="0" l="0" r="0" t="0"/>
-            <wp:docPr descr="Figure 2. Continuous MEQ associations." title="" id="53" name="Picture"/>
+            <wp:docPr descr="Figure 2. Continuous MEQ associations." title="" id="54" name="Picture"/>
             <a:graphic>
               <a:graphicData uri="http://schemas.openxmlformats.org/drawingml/2006/picture">
                 <pic:pic>
                   <pic:nvPicPr>
-                    <pic:cNvPr descr="docs/figures/fig_main_2_continuous_meq.png" id="54" name="Picture"/>
+                    <pic:cNvPr descr="docs/figures/fig_main_2_continuous_meq.png" id="55" name="Picture"/>
                     <pic:cNvPicPr>
                       <a:picLocks noChangeArrowheads="1" noChangeAspect="1"/>
                     </pic:cNvPicPr>
                   </pic:nvPicPr>
                   <pic:blipFill>
-                    <a:blip r:embed="rId52"/>
+                    <a:blip r:embed="rId53"/>
                     <a:stretch>
                       <a:fillRect/>
                     </a:stretch>
@@ -5475,18 +5755,18 @@
           <wp:inline>
             <wp:extent cx="5334000" cy="1541539"/>
             <wp:effectExtent b="0" l="0" r="0" t="0"/>
-            <wp:docPr descr="Figure 3. Behaviour and ERP fusion." title="" id="56" name="Picture"/>
+            <wp:docPr descr="Figure 3. Behaviour and ERP fusion." title="" id="57" name="Picture"/>
             <a:graphic>
               <a:graphicData uri="http://schemas.openxmlformats.org/drawingml/2006/picture">
                 <pic:pic>
                   <pic:nvPicPr>
-                    <pic:cNvPr descr="docs/figures/fig_main_3_fusion.png" id="57" name="Picture"/>
+                    <pic:cNvPr descr="docs/figures/fig_main_3_fusion.png" id="58" name="Picture"/>
                     <pic:cNvPicPr>
                       <a:picLocks noChangeArrowheads="1" noChangeAspect="1"/>
                     </pic:cNvPicPr>
                   </pic:nvPicPr>
                   <pic:blipFill>
-                    <a:blip r:embed="rId55"/>
+                    <a:blip r:embed="rId56"/>
                     <a:stretch>
                       <a:fillRect/>
                     </a:stretch>
@@ -5530,18 +5810,18 @@
           <wp:inline>
             <wp:extent cx="5334000" cy="1485607"/>
             <wp:effectExtent b="0" l="0" r="0" t="0"/>
-            <wp:docPr descr="Figure 4. Single-trial P300 to next-choice coupling." title="" id="59" name="Picture"/>
+            <wp:docPr descr="Figure 4. Single-trial P300 to next-choice coupling." title="" id="60" name="Picture"/>
             <a:graphic>
               <a:graphicData uri="http://schemas.openxmlformats.org/drawingml/2006/picture">
                 <pic:pic>
                   <pic:nvPicPr>
-                    <pic:cNvPr descr="docs/figures/fig_main_4_single_trial_coupling.png" id="60" name="Picture"/>
+                    <pic:cNvPr descr="docs/figures/fig_main_4_single_trial_coupling.png" id="61" name="Picture"/>
                     <pic:cNvPicPr>
                       <a:picLocks noChangeArrowheads="1" noChangeAspect="1"/>
                     </pic:cNvPicPr>
                   </pic:nvPicPr>
                   <pic:blipFill>
-                    <a:blip r:embed="rId58"/>
+                    <a:blip r:embed="rId59"/>
                     <a:stretch>
                       <a:fillRect/>
                     </a:stretch>
@@ -5585,18 +5865,18 @@
           <wp:inline>
             <wp:extent cx="5334000" cy="1694459"/>
             <wp:effectExtent b="0" l="0" r="0" t="0"/>
-            <wp:docPr descr="Figure 5. ROC and leakage-safe analysis pipeline." title="" id="62" name="Picture"/>
+            <wp:docPr descr="Figure 5. ROC and leakage-safe analysis pipeline." title="" id="63" name="Picture"/>
             <a:graphic>
               <a:graphicData uri="http://schemas.openxmlformats.org/drawingml/2006/picture">
                 <pic:pic>
                   <pic:nvPicPr>
-                    <pic:cNvPr descr="docs/figures/fig_main_5_roc_pipeline.png" id="63" name="Picture"/>
+                    <pic:cNvPr descr="docs/figures/fig_main_5_roc_pipeline.png" id="64" name="Picture"/>
                     <pic:cNvPicPr>
                       <a:picLocks noChangeArrowheads="1" noChangeAspect="1"/>
                     </pic:cNvPicPr>
                   </pic:nvPicPr>
                   <pic:blipFill>
-                    <a:blip r:embed="rId61"/>
+                    <a:blip r:embed="rId62"/>
                     <a:stretch>
                       <a:fillRect/>
                     </a:stretch>
@@ -5631,7 +5911,7 @@
         <w:t xml:space="preserve">Figure 5. ROC and leakage-safe analysis pipeline.</w:t>
       </w:r>
     </w:p>
-    <w:bookmarkEnd w:id="64"/>
+    <w:bookmarkEnd w:id="65"/>
     <w:sectPr>
       <w:footnotePr>
         <w:numRestart w:val="eachSect"/>

</xml_diff>

<commit_message>
Integrate prior chronotype ERP paper
</commit_message>
<xml_diff>
--- a/docs/paper.docx
+++ b/docs/paper.docx
@@ -67,115 +67,109 @@
         <w:t xml:space="preserve"> </w:t>
       </w:r>
       <w:r>
-        <w:t xml:space="preserve">but little is known about how morning and evening types process decision feedback</w:t>
-      </w:r>
-      <w:r>
-        <w:t xml:space="preserve"> </w:t>
-      </w:r>
-      <w:r>
-        <w:t xml:space="preserve">at the neural level. We recorded EEG from 39 participants (19 Evening, 20 Morning)</w:t>
-      </w:r>
-      <w:r>
-        <w:t xml:space="preserve"> </w:t>
-      </w:r>
-      <w:r>
-        <w:t xml:space="preserve">during a risky decision-making task with gain and loss feedback. Chronotype was</w:t>
-      </w:r>
-      <w:r>
-        <w:t xml:space="preserve"> </w:t>
-      </w:r>
-      <w:r>
-        <w:t xml:space="preserve">examined using feedback-locked event-related potentials, behavioural sequence</w:t>
-      </w:r>
-      <w:r>
-        <w:t xml:space="preserve"> </w:t>
-      </w:r>
-      <w:r>
-        <w:t xml:space="preserve">models, and multimodal analyses with participant-generalizing validation. The</w:t>
-      </w:r>
-      <w:r>
-        <w:t xml:space="preserve"> </w:t>
-      </w:r>
-      <w:r>
-        <w:t xml:space="preserve">clearest neural difference was in the posterior P300. The parietal loss-minus-gain</w:t>
-      </w:r>
-      <w:r>
-        <w:t xml:space="preserve"> </w:t>
-      </w:r>
-      <w:r>
-        <w:t xml:space="preserve">contrast separated Morning and Evening groups with large effects (Pz Cohen’s d =</w:t>
-      </w:r>
-      <w:r>
-        <w:t xml:space="preserve"> </w:t>
-      </w:r>
-      <w:r>
-        <w:t xml:space="preserve">-1.04, FDR p = 0.034; POz d = -0.92, FDR p = 0.045), remained stable across</w:t>
-      </w:r>
-      <w:r>
-        <w:t xml:space="preserve"> </w:t>
-      </w:r>
-      <w:r>
-        <w:t xml:space="preserve">participant-exclusion analyses (d approximately -1.0, p &lt; 0.011 throughout), and</w:t>
-      </w:r>
-      <w:r>
-        <w:t xml:space="preserve"> </w:t>
-      </w:r>
-      <w:r>
-        <w:t xml:space="preserve">showed the same direction of association with continuous MEQ score. Behaviour carried</w:t>
-      </w:r>
-      <w:r>
-        <w:t xml:space="preserve"> </w:t>
-      </w:r>
-      <w:r>
-        <w:t xml:space="preserve">convergent information: out-of-fold scores from a causal GRU model of risky-choice</w:t>
-      </w:r>
-      <w:r>
-        <w:t xml:space="preserve"> </w:t>
-      </w:r>
-      <w:r>
-        <w:t xml:space="preserve">dynamics distinguished Morning and Evening participants without EEG (ROC AUC 0.713,</w:t>
-      </w:r>
-      <w:r>
-        <w:t xml:space="preserve"> </w:t>
-      </w:r>
-      <w:r>
-        <w:t xml:space="preserve">permutation p = 0.027). Out-of-fold scores that combined the behavioural embedding</w:t>
-      </w:r>
-      <w:r>
-        <w:t xml:space="preserve"> </w:t>
-      </w:r>
-      <w:r>
-        <w:t xml:space="preserve">with the validated ERP contrasts separated the groups more strongly (AUC 0.797, p =</w:t>
-      </w:r>
-      <w:r>
-        <w:t xml:space="preserve"> </w:t>
-      </w:r>
-      <w:r>
-        <w:t xml:space="preserve">0.004; bootstrap 95% CI [0.64, 0.92]) and tracked the continuous MEQ score (r =</w:t>
-      </w:r>
-      <w:r>
-        <w:t xml:space="preserve"> </w:t>
-      </w:r>
-      <w:r>
-        <w:t xml:space="preserve">0.34, p = 0.027), indicating that behavioural dynamics and feedback ERPs carry</w:t>
-      </w:r>
-      <w:r>
-        <w:t xml:space="preserve"> </w:t>
-      </w:r>
-      <w:r>
-        <w:t xml:space="preserve">partly independent, rather than diagnostic, information about chronotype. That the</w:t>
-      </w:r>
-      <w:r>
-        <w:t xml:space="preserve"> </w:t>
-      </w:r>
-      <w:r>
-        <w:t xml:space="preserve">same measures related to continuous MEQ score is consistent with a graded,</w:t>
-      </w:r>
-      <w:r>
-        <w:t xml:space="preserve"> </w:t>
-      </w:r>
-      <w:r>
-        <w:t xml:space="preserve">dimensional trait rather than a strict dichotomy. An asymmetric</w:t>
+        <w:t xml:space="preserve">and behavioural and FRN effects in the present cohort have been reported previously.</w:t>
+      </w:r>
+      <w:r>
+        <w:t xml:space="preserve"> </w:t>
+      </w:r>
+      <w:r>
+        <w:t xml:space="preserve">Here we analysed the same 39-participant cohort (19 Evening, 20 Morning) as a</w:t>
+      </w:r>
+      <w:r>
+        <w:t xml:space="preserve"> </w:t>
+      </w:r>
+      <w:r>
+        <w:t xml:space="preserve">computational and multivariate follow-up focused on posterior P300 contrasts,</w:t>
+      </w:r>
+      <w:r>
+        <w:t xml:space="preserve"> </w:t>
+      </w:r>
+      <w:r>
+        <w:t xml:space="preserve">behavioural sequence models, and participant-generalizing validation. The clearest</w:t>
+      </w:r>
+      <w:r>
+        <w:t xml:space="preserve"> </w:t>
+      </w:r>
+      <w:r>
+        <w:t xml:space="preserve">neural difference was in the posterior P300. The parietal loss-minus-gain contrast</w:t>
+      </w:r>
+      <w:r>
+        <w:t xml:space="preserve"> </w:t>
+      </w:r>
+      <w:r>
+        <w:t xml:space="preserve">separated Morning and Evening groups with large effects (Pz Cohen’s d = -1.04, FDR p</w:t>
+      </w:r>
+      <w:r>
+        <w:t xml:space="preserve"> </w:t>
+      </w:r>
+      <w:r>
+        <w:t xml:space="preserve">= 0.034; POz d = -0.92, FDR p = 0.045), remained stable across participant-exclusion</w:t>
+      </w:r>
+      <w:r>
+        <w:t xml:space="preserve"> </w:t>
+      </w:r>
+      <w:r>
+        <w:t xml:space="preserve">analyses (d approximately -1.0, p &lt; 0.011 throughout), and showed the same direction</w:t>
+      </w:r>
+      <w:r>
+        <w:t xml:space="preserve"> </w:t>
+      </w:r>
+      <w:r>
+        <w:t xml:space="preserve">of association with continuous MEQ score. Behaviour carried convergent information:</w:t>
+      </w:r>
+      <w:r>
+        <w:t xml:space="preserve"> </w:t>
+      </w:r>
+      <w:r>
+        <w:t xml:space="preserve">out-of-fold scores from a causal GRU model of risky-choice dynamics distinguished</w:t>
+      </w:r>
+      <w:r>
+        <w:t xml:space="preserve"> </w:t>
+      </w:r>
+      <w:r>
+        <w:t xml:space="preserve">Morning and Evening participants without EEG (ROC AUC 0.713, permutation p = 0.027).</w:t>
+      </w:r>
+      <w:r>
+        <w:t xml:space="preserve"> </w:t>
+      </w:r>
+      <w:r>
+        <w:t xml:space="preserve">Out-of-fold scores that combined the behavioural embedding with the validated ERP</w:t>
+      </w:r>
+      <w:r>
+        <w:t xml:space="preserve"> </w:t>
+      </w:r>
+      <w:r>
+        <w:t xml:space="preserve">contrasts separated the groups more strongly (AUC 0.797, p = 0.004; bootstrap 95% CI</w:t>
+      </w:r>
+      <w:r>
+        <w:t xml:space="preserve"> </w:t>
+      </w:r>
+      <w:r>
+        <w:t xml:space="preserve">[0.64, 0.92]) and tracked the continuous MEQ score (r = 0.34, p = 0.027), indicating</w:t>
+      </w:r>
+      <w:r>
+        <w:t xml:space="preserve"> </w:t>
+      </w:r>
+      <w:r>
+        <w:t xml:space="preserve">that behavioural dynamics and feedback ERPs carry partly independent, rather than</w:t>
+      </w:r>
+      <w:r>
+        <w:t xml:space="preserve"> </w:t>
+      </w:r>
+      <w:r>
+        <w:t xml:space="preserve">diagnostic, information about chronotype. That the same measures related to</w:t>
+      </w:r>
+      <w:r>
+        <w:t xml:space="preserve"> </w:t>
+      </w:r>
+      <w:r>
+        <w:t xml:space="preserve">continuous MEQ score is consistent with a graded, dimensional trait rather than a</w:t>
+      </w:r>
+      <w:r>
+        <w:t xml:space="preserve"> </w:t>
+      </w:r>
+      <w:r>
+        <w:t xml:space="preserve">strict dichotomy. An asymmetric</w:t>
       </w:r>
       <w:r>
         <w:t xml:space="preserve"> </w:t>
@@ -376,6 +370,44 @@
         <w:pStyle w:val="BodyText"/>
       </w:pPr>
       <w:r>
+        <w:t xml:space="preserve">This cohort has already been reported in a univariate ERP study by Hajiaboo et al.</w:t>
+      </w:r>
+      <w:r>
+        <w:t xml:space="preserve"> </w:t>
+      </w:r>
+      <w:r>
+        <w:t xml:space="preserve">(2025), which established greater behavioural risk-taking in Evening than Morning</w:t>
+      </w:r>
+      <w:r>
+        <w:t xml:space="preserve"> </w:t>
+      </w:r>
+      <w:r>
+        <w:t xml:space="preserve">participants, faster responding and post-error effects, and FRN-amplitude</w:t>
+      </w:r>
+      <w:r>
+        <w:t xml:space="preserve"> </w:t>
+      </w:r>
+      <w:r>
+        <w:t xml:space="preserve">associations with chronotype. The present manuscript is therefore positioned as a</w:t>
+      </w:r>
+      <w:r>
+        <w:t xml:space="preserve"> </w:t>
+      </w:r>
+      <w:r>
+        <w:t xml:space="preserve">computational and multivariate follow-up to that publication, not as an independent</w:t>
+      </w:r>
+      <w:r>
+        <w:t xml:space="preserve"> </w:t>
+      </w:r>
+      <w:r>
+        <w:t xml:space="preserve">first report of the behavioural or FRN findings.</w:t>
+      </w:r>
+    </w:p>
+    <w:p>
+      <w:pPr>
+        <w:pStyle w:val="BodyText"/>
+      </w:pPr>
+      <w:r>
         <w:t xml:space="preserve">Feedback during value-based decisions evokes several event-related potentials that</w:t>
       </w:r>
       <w:r>
@@ -524,61 +556,79 @@
         <w:pStyle w:val="BodyText"/>
       </w:pPr>
       <w:r>
-        <w:t xml:space="preserve">The present study examined these questions in a single cohort performing a</w:t>
-      </w:r>
-      <w:r>
-        <w:t xml:space="preserve"> </w:t>
-      </w:r>
-      <w:r>
-        <w:t xml:space="preserve">feedback-based risky-choice task. We tested whether Morning and Evening chronotypes</w:t>
-      </w:r>
-      <w:r>
-        <w:t xml:space="preserve"> </w:t>
-      </w:r>
-      <w:r>
-        <w:t xml:space="preserve">differed in the posterior P300 response to loss versus gain feedback. We then asked</w:t>
-      </w:r>
-      <w:r>
-        <w:t xml:space="preserve"> </w:t>
-      </w:r>
-      <w:r>
-        <w:t xml:space="preserve">whether chronotype could be decoded from the dynamics of risky choice using a causal</w:t>
-      </w:r>
-      <w:r>
-        <w:t xml:space="preserve"> </w:t>
-      </w:r>
-      <w:r>
-        <w:t xml:space="preserve">recurrent model, and whether combining behavioural dynamics with validated ERP</w:t>
-      </w:r>
-      <w:r>
-        <w:t xml:space="preserve"> </w:t>
-      </w:r>
-      <w:r>
-        <w:t xml:space="preserve">features improved prediction beyond either source alone. Additional analyses tested</w:t>
-      </w:r>
-      <w:r>
-        <w:t xml:space="preserve"> </w:t>
-      </w:r>
-      <w:r>
-        <w:t xml:space="preserve">whether an interpretable reinforcement-learning model could explain the behavioural</w:t>
-      </w:r>
-      <w:r>
-        <w:t xml:space="preserve"> </w:t>
-      </w:r>
-      <w:r>
-        <w:t xml:space="preserve">difference, whether EEGNet could recover chronotype from single-trial EEG, and</w:t>
-      </w:r>
-      <w:r>
-        <w:t xml:space="preserve"> </w:t>
-      </w:r>
-      <w:r>
-        <w:t xml:space="preserve">whether trial-to-trial P300 variation predicted subsequent risky choice differently</w:t>
-      </w:r>
-      <w:r>
-        <w:t xml:space="preserve"> </w:t>
-      </w:r>
-      <w:r>
-        <w:t xml:space="preserve">by chronotype.</w:t>
+        <w:t xml:space="preserve">The present study examined these questions in the same cohort performing the same</w:t>
+      </w:r>
+      <w:r>
+        <w:t xml:space="preserve"> </w:t>
+      </w:r>
+      <w:r>
+        <w:t xml:space="preserve">feedback-based risky-choice task. The novel focus was a posterior P300</w:t>
+      </w:r>
+      <w:r>
+        <w:t xml:space="preserve"> </w:t>
+      </w:r>
+      <w:r>
+        <w:t xml:space="preserve">loss-minus-gain contrast and a computational strand absent from the prior report:</w:t>
+      </w:r>
+      <w:r>
+        <w:t xml:space="preserve"> </w:t>
+      </w:r>
+      <w:r>
+        <w:t xml:space="preserve">GRU behavioural decoding, brain-behaviour fusion, continuous-MEQ prediction,</w:t>
+      </w:r>
+      <w:r>
+        <w:t xml:space="preserve"> </w:t>
+      </w:r>
+      <w:r>
+        <w:t xml:space="preserve">reinforcement-learning analysis, EEGNet, and leakage-safe/permutation-clean machine</w:t>
+      </w:r>
+      <w:r>
+        <w:t xml:space="preserve"> </w:t>
+      </w:r>
+      <w:r>
+        <w:t xml:space="preserve">learning. We tested whether Morning and Evening chronotypes differed in the posterior</w:t>
+      </w:r>
+      <w:r>
+        <w:t xml:space="preserve"> </w:t>
+      </w:r>
+      <w:r>
+        <w:t xml:space="preserve">P300 response to loss versus gain feedback. We then asked whether chronotype could be</w:t>
+      </w:r>
+      <w:r>
+        <w:t xml:space="preserve"> </w:t>
+      </w:r>
+      <w:r>
+        <w:t xml:space="preserve">decoded from the dynamics of risky choice using a causal recurrent model, and whether</w:t>
+      </w:r>
+      <w:r>
+        <w:t xml:space="preserve"> </w:t>
+      </w:r>
+      <w:r>
+        <w:t xml:space="preserve">combining behavioural dynamics with validated ERP features improved prediction</w:t>
+      </w:r>
+      <w:r>
+        <w:t xml:space="preserve"> </w:t>
+      </w:r>
+      <w:r>
+        <w:t xml:space="preserve">beyond either source alone. Additional analyses tested whether an interpretable</w:t>
+      </w:r>
+      <w:r>
+        <w:t xml:space="preserve"> </w:t>
+      </w:r>
+      <w:r>
+        <w:t xml:space="preserve">reinforcement-learning model could explain the behavioural difference, whether</w:t>
+      </w:r>
+      <w:r>
+        <w:t xml:space="preserve"> </w:t>
+      </w:r>
+      <w:r>
+        <w:t xml:space="preserve">EEGNet could recover chronotype from single-trial EEG, and whether trial-to-trial</w:t>
+      </w:r>
+      <w:r>
+        <w:t xml:space="preserve"> </w:t>
+      </w:r>
+      <w:r>
+        <w:t xml:space="preserve">P300 variation predicted subsequent risky choice differently by chronotype.</w:t>
       </w:r>
     </w:p>
     <w:p>
@@ -612,19 +662,79 @@
         <w:pStyle w:val="FirstParagraph"/>
       </w:pPr>
       <w:r>
-        <w:t xml:space="preserve">Thirty-nine participants were analysed (19 Evening, 20 Morning chronotype).</w:t>
-      </w:r>
-      <w:r>
-        <w:t xml:space="preserve"> </w:t>
-      </w:r>
-      <w:r>
-        <w:t xml:space="preserve">[AUTHOR INPUT: recruitment, age/sex distribution, inclusion/exclusion criteria,</w:t>
-      </w:r>
-      <w:r>
-        <w:t xml:space="preserve"> </w:t>
-      </w:r>
-      <w:r>
-        <w:t xml:space="preserve">ethics/IRB approval and consent statement.]</w:t>
+        <w:t xml:space="preserve">Participants were recruited at the University of Tabriz, Iran, for the previously</w:t>
+      </w:r>
+      <w:r>
+        <w:t xml:space="preserve"> </w:t>
+      </w:r>
+      <w:r>
+        <w:t xml:space="preserve">published ERP study of chronotype and risky decision-making (Hajiaboo et al., 2025)</w:t>
+      </w:r>
+      <w:r>
+        <w:t xml:space="preserve"> </w:t>
+      </w:r>
+      <w:r>
+        <w:t xml:space="preserve">[confirm: same 39-participant subset]. Thirty-nine right-handed participants with</w:t>
+      </w:r>
+      <w:r>
+        <w:t xml:space="preserve"> </w:t>
+      </w:r>
+      <w:r>
+        <w:t xml:space="preserve">normal or corrected-to-normal vision were analysed (19 Evening, 20 Morning</w:t>
+      </w:r>
+      <w:r>
+        <w:t xml:space="preserve"> </w:t>
+      </w:r>
+      <w:r>
+        <w:t xml:space="preserve">chronotype), after exclusion of five participants from the EEG experiment sample</w:t>
+      </w:r>
+      <w:r>
+        <w:t xml:space="preserve"> </w:t>
+      </w:r>
+      <w:r>
+        <w:t xml:space="preserve">(Hajiaboo et al., 2025) [confirm: same 39-participant subset]. Participants were</w:t>
+      </w:r>
+      <w:r>
+        <w:t xml:space="preserve"> </w:t>
+      </w:r>
+      <w:r>
+        <w:t xml:space="preserve">aged 18-31 years. The published report implies a retained sex/gender split of 19</w:t>
+      </w:r>
+      <w:r>
+        <w:t xml:space="preserve"> </w:t>
+      </w:r>
+      <w:r>
+        <w:t xml:space="preserve">female and 20 male participants overall (Morning: 11 female, 9 male; Evening: 8</w:t>
+      </w:r>
+      <w:r>
+        <w:t xml:space="preserve"> </w:t>
+      </w:r>
+      <w:r>
+        <w:t xml:space="preserve">female, 11 male) after the reported artifact exclusions, but this should be confirmed</w:t>
+      </w:r>
+      <w:r>
+        <w:t xml:space="preserve"> </w:t>
+      </w:r>
+      <w:r>
+        <w:t xml:space="preserve">against the exact 39-participant subset used here [confirm: sex/gender split and same</w:t>
+      </w:r>
+      <w:r>
+        <w:t xml:space="preserve"> </w:t>
+      </w:r>
+      <w:r>
+        <w:t xml:space="preserve">39-participant subset]. The study was approved by the University of Tabriz ethics</w:t>
+      </w:r>
+      <w:r>
+        <w:t xml:space="preserve"> </w:t>
+      </w:r>
+      <w:r>
+        <w:t xml:space="preserve">committee of Medical Sciences (IR.TABRIZU.REC.1403.130), and all participants</w:t>
+      </w:r>
+      <w:r>
+        <w:t xml:space="preserve"> </w:t>
+      </w:r>
+      <w:r>
+        <w:t xml:space="preserve">provided written informed consent (Hajiaboo et al., 2025).</w:t>
       </w:r>
     </w:p>
     <w:bookmarkEnd w:id="11"/>
@@ -756,13 +866,55 @@
         <w:t xml:space="preserve"> </w:t>
       </w:r>
       <w:r>
-        <w:t xml:space="preserve">options. [AUTHOR INPUT: number of trials/blocks, magnitudes used, stimulus and</w:t>
-      </w:r>
-      <w:r>
-        <w:t xml:space="preserve"> </w:t>
-      </w:r>
-      <w:r>
-        <w:t xml:space="preserve">feedback timing, response mapping, and the free-versus-forced trial split.] EEG was recorded during the task, and feedback-locked</w:t>
+        <w:t xml:space="preserve">options. Each trial began with a 500 ms fixation, followed by two options displaying</w:t>
+      </w:r>
+      <w:r>
+        <w:t xml:space="preserve"> </w:t>
+      </w:r>
+      <w:r>
+        <w:t xml:space="preserve">magnitudes of 5 or 25. Participants responded with the F or J key to choose the left</w:t>
+      </w:r>
+      <w:r>
+        <w:t xml:space="preserve"> </w:t>
+      </w:r>
+      <w:r>
+        <w:t xml:space="preserve">or right option. One second after the response, gain/loss signs were revealed and the</w:t>
+      </w:r>
+      <w:r>
+        <w:t xml:space="preserve"> </w:t>
+      </w:r>
+      <w:r>
+        <w:t xml:space="preserve">chosen option was outlined in red or green for 1500 ms, followed by a 1000 ms</w:t>
+      </w:r>
+      <w:r>
+        <w:t xml:space="preserve"> </w:t>
+      </w:r>
+      <w:r>
+        <w:t xml:space="preserve">inter-trial interval. The task comprised 16 blocks of 24 trials, for 384 trials in</w:t>
+      </w:r>
+      <w:r>
+        <w:t xml:space="preserve"> </w:t>
+      </w:r>
+      <w:r>
+        <w:t xml:space="preserve">total (Hajiaboo et al., 2025) [confirm: same 39-participant subset]. Forced [5/5]</w:t>
+      </w:r>
+      <w:r>
+        <w:t xml:space="preserve"> </w:t>
+      </w:r>
+      <w:r>
+        <w:t xml:space="preserve">and [25/25] trials were excluded from choice analyses, yielding approximately 289</w:t>
+      </w:r>
+      <w:r>
+        <w:t xml:space="preserve"> </w:t>
+      </w:r>
+      <w:r>
+        <w:t xml:space="preserve">free-choice trials per participant (Hajiaboo et al., 2025) [confirm: same</w:t>
+      </w:r>
+      <w:r>
+        <w:t xml:space="preserve"> </w:t>
+      </w:r>
+      <w:r>
+        <w:t xml:space="preserve">39-participant subset]. EEG was recorded during the task, and feedback-locked</w:t>
       </w:r>
       <w:r>
         <w:t xml:space="preserve"> </w:t>
@@ -780,13 +932,67 @@
         <w:t xml:space="preserve"> </w:t>
       </w:r>
       <w:r>
-        <w:t xml:space="preserve">al. (2014). [AUTHOR INPUT: EEG system, electrode montage, reference, sampling rate,</w:t>
-      </w:r>
-      <w:r>
-        <w:t xml:space="preserve"> </w:t>
-      </w:r>
-      <w:r>
-        <w:t xml:space="preserve">filtering, artifact rejection, ERP windowing.]</w:t>
+        <w:t xml:space="preserve">al. (2014). Sessions were run between 12:00 and 16:00. EEG was acquired with a</w:t>
+      </w:r>
+      <w:r>
+        <w:t xml:space="preserve"> </w:t>
+      </w:r>
+      <w:r>
+        <w:t xml:space="preserve">64-channel waveguard cap (ANT Neuro, Enschede, Netherlands) configured according to</w:t>
+      </w:r>
+      <w:r>
+        <w:t xml:space="preserve"> </w:t>
+      </w:r>
+      <w:r>
+        <w:t xml:space="preserve">the international 10-10 system, with ground at AFz, online band-pass filtering at</w:t>
+      </w:r>
+      <w:r>
+        <w:t xml:space="preserve"> </w:t>
+      </w:r>
+      <w:r>
+        <w:t xml:space="preserve">0.3-100 Hz, 1 kHz sampling, and electrode impedances kept below 10 kΩ (Hajiaboo et</w:t>
+      </w:r>
+      <w:r>
+        <w:t xml:space="preserve"> </w:t>
+      </w:r>
+      <w:r>
+        <w:t xml:space="preserve">al., 2025) [confirm: same 39-participant subset]. Preprocessing was conducted in</w:t>
+      </w:r>
+      <w:r>
+        <w:t xml:space="preserve"> </w:t>
+      </w:r>
+      <w:r>
+        <w:t xml:space="preserve">MATLAB R2019b using EEGLAB v2024.0 and ERPLAB v12.00. Data were filtered offline at</w:t>
+      </w:r>
+      <w:r>
+        <w:t xml:space="preserve"> </w:t>
+      </w:r>
+      <w:r>
+        <w:t xml:space="preserve">0.1-30 Hz, segmented from 200 ms before to 800 ms after feedback with a 200 ms</w:t>
+      </w:r>
+      <w:r>
+        <w:t xml:space="preserve"> </w:t>
+      </w:r>
+      <w:r>
+        <w:t xml:space="preserve">pre-feedback baseline, and cleaned for movement and eye-related artifacts using ICA</w:t>
+      </w:r>
+      <w:r>
+        <w:t xml:space="preserve"> </w:t>
+      </w:r>
+      <w:r>
+        <w:t xml:space="preserve">(Hajiaboo et al., 2025) [confirm: same 39-participant subset]. The present analyses</w:t>
+      </w:r>
+      <w:r>
+        <w:t xml:space="preserve"> </w:t>
+      </w:r>
+      <w:r>
+        <w:t xml:space="preserve">used the exported single-trial features and retained the analysis windows specified</w:t>
+      </w:r>
+      <w:r>
+        <w:t xml:space="preserve"> </w:t>
+      </w:r>
+      <w:r>
+        <w:t xml:space="preserve">for this manuscript: FRN, 360-430 ms; P300, 450-550 ms.</w:t>
       </w:r>
     </w:p>
     <w:bookmarkEnd w:id="13"/>
@@ -804,6 +1010,36 @@
         <w:pStyle w:val="FirstParagraph"/>
       </w:pPr>
       <w:r>
+        <w:t xml:space="preserve">Chronotype was measured with the Morningness-Eveningness Questionnaire (MEQ; Horne &amp;</w:t>
+      </w:r>
+      <w:r>
+        <w:t xml:space="preserve"> </w:t>
+      </w:r>
+      <w:r>
+        <w:t xml:space="preserve">Ostberg, 1976) and the Munich ChronoType Questionnaire (MCTQ; Hajiaboo et al., 2025;</w:t>
+      </w:r>
+      <w:r>
+        <w:t xml:space="preserve"> </w:t>
+      </w:r>
+      <w:r>
+        <w:t xml:space="preserve">Roenneberg et al., 2003). Following the published classification rule, MEQ scores &lt;=</w:t>
+      </w:r>
+      <w:r>
+        <w:t xml:space="preserve"> </w:t>
+      </w:r>
+      <w:r>
+        <w:t xml:space="preserve">41 were classified as Evening, MEQ scores &gt;= 59 as Morning, and scores from 42 to 58</w:t>
+      </w:r>
+      <w:r>
+        <w:t xml:space="preserve"> </w:t>
+      </w:r>
+      <w:r>
+        <w:t xml:space="preserve">as intermediate (Hajiaboo et al., 2025) [confirm: same 39-participant subset].</w:t>
+      </w:r>
+      <w:r>
+        <w:t xml:space="preserve"> </w:t>
+      </w:r>
+      <w:r>
         <w:t xml:space="preserve">Primary chronotype labels were Morning and Evening categories from study metadata.</w:t>
       </w:r>
       <w:r>
@@ -896,13 +1132,13 @@
         <w:t xml:space="preserve"> </w:t>
       </w:r>
       <w:r>
-        <w:t xml:space="preserve">intermediate range, where a binary classification is less sharp.</w:t>
-      </w:r>
-      <w:r>
-        <w:t xml:space="preserve"> </w:t>
-      </w:r>
-      <w:r>
-        <w:t xml:space="preserve">[AUTHOR INPUT: confirm the binary cutoff/median-split rule.]</w:t>
+        <w:t xml:space="preserve">intermediate range, where a binary classification is less sharp. [confirm: same</w:t>
+      </w:r>
+      <w:r>
+        <w:t xml:space="preserve"> </w:t>
+      </w:r>
+      <w:r>
+        <w:t xml:space="preserve">39-participant subset]</w:t>
       </w:r>
     </w:p>
     <w:bookmarkEnd w:id="14"/>
@@ -1874,37 +2110,49 @@
         <w:pStyle w:val="FirstParagraph"/>
       </w:pPr>
       <w:r>
-        <w:t xml:space="preserve">Evening participants tended to choose the risky option more often than Morning</w:t>
-      </w:r>
-      <w:r>
-        <w:t xml:space="preserve"> </w:t>
-      </w:r>
-      <w:r>
-        <w:t xml:space="preserve">participants. The largest uncorrected effects were for loss-error risky rate (d =</w:t>
-      </w:r>
-      <w:r>
-        <w:t xml:space="preserve"> </w:t>
-      </w:r>
-      <w:r>
-        <w:t xml:space="preserve">0.81), free risky rate (d = 0.80), and gain-correct risky rate (d = 0.77), with all</w:t>
-      </w:r>
-      <w:r>
-        <w:t xml:space="preserve"> </w:t>
-      </w:r>
-      <w:r>
-        <w:t xml:space="preserve">Welch p-values below 0.025. These effects did not survive FDR correction, and their</w:t>
-      </w:r>
-      <w:r>
-        <w:t xml:space="preserve"> </w:t>
-      </w:r>
-      <w:r>
-        <w:t xml:space="preserve">confidence intervals remained compatible with small effects. The behavioural group</w:t>
-      </w:r>
-      <w:r>
-        <w:t xml:space="preserve"> </w:t>
-      </w:r>
-      <w:r>
-        <w:t xml:space="preserve">differences are therefore supportive rather than primary.</w:t>
+        <w:t xml:space="preserve">Consistent with the previously reported behavioural difference in this cohort</w:t>
+      </w:r>
+      <w:r>
+        <w:t xml:space="preserve"> </w:t>
+      </w:r>
+      <w:r>
+        <w:t xml:space="preserve">(Hajiaboo et al., 2025), Evening participants tended to choose the risky option more</w:t>
+      </w:r>
+      <w:r>
+        <w:t xml:space="preserve"> </w:t>
+      </w:r>
+      <w:r>
+        <w:t xml:space="preserve">often than Morning participants. In the present feature set, the largest uncorrected</w:t>
+      </w:r>
+      <w:r>
+        <w:t xml:space="preserve"> </w:t>
+      </w:r>
+      <w:r>
+        <w:t xml:space="preserve">effects were for loss-error risky rate (d = 0.81), free risky rate (d = 0.80), and</w:t>
+      </w:r>
+      <w:r>
+        <w:t xml:space="preserve"> </w:t>
+      </w:r>
+      <w:r>
+        <w:t xml:space="preserve">gain-correct risky rate (d = 0.77), with all Welch p-values below 0.025. These</w:t>
+      </w:r>
+      <w:r>
+        <w:t xml:space="preserve"> </w:t>
+      </w:r>
+      <w:r>
+        <w:t xml:space="preserve">effects did not survive FDR correction, and their confidence intervals remained</w:t>
+      </w:r>
+      <w:r>
+        <w:t xml:space="preserve"> </w:t>
+      </w:r>
+      <w:r>
+        <w:t xml:space="preserve">compatible with small effects. The behavioural group differences are therefore</w:t>
+      </w:r>
+      <w:r>
+        <w:t xml:space="preserve"> </w:t>
+      </w:r>
+      <w:r>
+        <w:t xml:space="preserve">supportive prior context rather than a primary novel finding of this manuscript.</w:t>
       </w:r>
     </w:p>
     <w:p>
@@ -1912,43 +2160,67 @@
         <w:pStyle w:val="BodyText"/>
       </w:pPr>
       <w:r>
-        <w:t xml:space="preserve">Frontocentral FRN contrasts did not show reliable group differences. For example,</w:t>
-      </w:r>
-      <w:r>
-        <w:t xml:space="preserve"> </w:t>
-      </w:r>
-      <w:r>
-        <w:t xml:space="preserve">the Fz FRN error-minus-correct contrast had d = -0.60 and FDR p = 0.14. Bayes</w:t>
-      </w:r>
-      <w:r>
-        <w:t xml:space="preserve"> </w:t>
-      </w:r>
-      <w:r>
-        <w:t xml:space="preserve">factors were most consistent with a null group difference at FCz (BF01 = 2.46) and</w:t>
-      </w:r>
-      <w:r>
-        <w:t xml:space="preserve"> </w:t>
-      </w:r>
-      <w:r>
-        <w:t xml:space="preserve">Cz (BF01 = 3.17), while the Fz result remained inconclusive (BF01 = 0.82).</w:t>
-      </w:r>
-      <w:r>
-        <w:t xml:space="preserve"> </w:t>
-      </w:r>
-      <w:r>
-        <w:t xml:space="preserve">Equivalence tests with bounds of ±0.5 SD did not establish formal equivalence (for</w:t>
-      </w:r>
-      <w:r>
-        <w:t xml:space="preserve"> </w:t>
-      </w:r>
-      <w:r>
-        <w:t xml:space="preserve">example, Fz TOST p = 0.43; Supplementary Tables S7 and S8). Thus, the FRN results do not support a chronotype</w:t>
-      </w:r>
-      <w:r>
-        <w:t xml:space="preserve"> </w:t>
-      </w:r>
-      <w:r>
-        <w:t xml:space="preserve">effect, but the sample is not large enough to rule out medium-sized FRN differences.</w:t>
+        <w:t xml:space="preserve">Frontocentral FRN difference contrasts did not show reliable group differences in</w:t>
+      </w:r>
+      <w:r>
+        <w:t xml:space="preserve"> </w:t>
+      </w:r>
+      <w:r>
+        <w:t xml:space="preserve">the present feature set. For example, the Fz FRN error-minus-correct contrast had d =</w:t>
+      </w:r>
+      <w:r>
+        <w:t xml:space="preserve"> </w:t>
+      </w:r>
+      <w:r>
+        <w:t xml:space="preserve">-0.60 and FDR p = 0.14. Bayes factors were most consistent with a null group</w:t>
+      </w:r>
+      <w:r>
+        <w:t xml:space="preserve"> </w:t>
+      </w:r>
+      <w:r>
+        <w:t xml:space="preserve">difference at FCz (BF01 = 2.46) and Cz (BF01 = 3.17), while the Fz result remained</w:t>
+      </w:r>
+      <w:r>
+        <w:t xml:space="preserve"> </w:t>
+      </w:r>
+      <w:r>
+        <w:t xml:space="preserve">inconclusive (BF01 = 0.82). Equivalence tests with bounds of +/-0.5 SD did not</w:t>
+      </w:r>
+      <w:r>
+        <w:t xml:space="preserve"> </w:t>
+      </w:r>
+      <w:r>
+        <w:t xml:space="preserve">establish formal equivalence (for example, Fz TOST p = 0.43; Supplementary Tables S7</w:t>
+      </w:r>
+      <w:r>
+        <w:t xml:space="preserve"> </w:t>
+      </w:r>
+      <w:r>
+        <w:t xml:space="preserve">and S8). These contrast-level results should not be read as contradicting the</w:t>
+      </w:r>
+      <w:r>
+        <w:t xml:space="preserve"> </w:t>
+      </w:r>
+      <w:r>
+        <w:t xml:space="preserve">published FRN-chronotype finding in the same cohort, which concerned FRN amplitudes</w:t>
+      </w:r>
+      <w:r>
+        <w:t xml:space="preserve"> </w:t>
+      </w:r>
+      <w:r>
+        <w:t xml:space="preserve">and MEQ/MCTQ associations at Fz and FCz across feedback conditions (Hajiaboo et al.,</w:t>
+      </w:r>
+      <w:r>
+        <w:t xml:space="preserve"> </w:t>
+      </w:r>
+      <w:r>
+        <w:t xml:space="preserve">2025). The present null is specific to our selected difference contrasts and remains</w:t>
+      </w:r>
+      <w:r>
+        <w:t xml:space="preserve"> </w:t>
+      </w:r>
+      <w:r>
+        <w:t xml:space="preserve">underpowered for medium-sized FRN contrast effects.</w:t>
       </w:r>
     </w:p>
     <w:bookmarkEnd w:id="25"/>
@@ -3221,6 +3493,26 @@
         <w:t xml:space="preserve">4. Discussion</w:t>
       </w:r>
     </w:p>
+    <w:p>
+      <w:pPr>
+        <w:pStyle w:val="FirstParagraph"/>
+      </w:pPr>
+      <w:r>
+        <w:t xml:space="preserve">[AUTHOR INPUT: senior-author confirmation of positioning relative to Hajiaboo et al.</w:t>
+      </w:r>
+      <w:r>
+        <w:t xml:space="preserve"> </w:t>
+      </w:r>
+      <w:r>
+        <w:t xml:space="preserve">(2025) — Dr Heysiattalab is an author on both papers; the published paper spells the</w:t>
+      </w:r>
+      <w:r>
+        <w:t xml:space="preserve"> </w:t>
+      </w:r>
+      <w:r>
+        <w:t xml:space="preserve">name as Heysieattalab.]</w:t>
+      </w:r>
+    </w:p>
     <w:bookmarkStart w:id="37" w:name="overview"/>
     <w:p>
       <w:pPr>
@@ -3235,73 +3527,79 @@
         <w:pStyle w:val="FirstParagraph"/>
       </w:pPr>
       <w:r>
-        <w:t xml:space="preserve">In a single cohort of 39 participants, chronotype was related to both the neural and</w:t>
-      </w:r>
-      <w:r>
-        <w:t xml:space="preserve"> </w:t>
-      </w:r>
-      <w:r>
-        <w:t xml:space="preserve">behavioural evaluation of decision feedback. Four findings anchor the account.</w:t>
-      </w:r>
-      <w:r>
-        <w:t xml:space="preserve"> </w:t>
-      </w:r>
-      <w:r>
-        <w:t xml:space="preserve">First, Morning and Evening chronotypes differed in the feedback-locked posterior</w:t>
-      </w:r>
-      <w:r>
-        <w:t xml:space="preserve"> </w:t>
-      </w:r>
-      <w:r>
-        <w:t xml:space="preserve">P300 to outcome valence. Second, chronotype could be predicted from risky-choice</w:t>
-      </w:r>
-      <w:r>
-        <w:t xml:space="preserve"> </w:t>
-      </w:r>
-      <w:r>
-        <w:t xml:space="preserve">dynamics alone. Third, combining behavioural dynamics with validated ERP contrasts</w:t>
-      </w:r>
-      <w:r>
-        <w:t xml:space="preserve"> </w:t>
-      </w:r>
-      <w:r>
-        <w:t xml:space="preserve">predicted chronotype better than either modality alone and also predicted continuous</w:t>
-      </w:r>
-      <w:r>
-        <w:t xml:space="preserve"> </w:t>
-      </w:r>
-      <w:r>
-        <w:t xml:space="preserve">MEQ score. Fourth, two planned negative tests, end-to-end EEG decoding and</w:t>
-      </w:r>
-      <w:r>
-        <w:t xml:space="preserve"> </w:t>
-      </w:r>
-      <w:r>
-        <w:t xml:space="preserve">within-subject single-trial coupling, placed the effect at the between-participant</w:t>
-      </w:r>
-      <w:r>
-        <w:t xml:space="preserve"> </w:t>
-      </w:r>
-      <w:r>
-        <w:t xml:space="preserve">trait level rather than at the level of moment-to-moment neural control of choice.</w:t>
-      </w:r>
-      <w:r>
-        <w:t xml:space="preserve"> </w:t>
-      </w:r>
-      <w:r>
-        <w:t xml:space="preserve">All predictive analyses used participant-generalizing cross-validation and</w:t>
-      </w:r>
-      <w:r>
-        <w:t xml:space="preserve"> </w:t>
-      </w:r>
-      <w:r>
-        <w:t xml:space="preserve">permutation testing. The main evidentiary value is the agreement across distinct</w:t>
-      </w:r>
-      <w:r>
-        <w:t xml:space="preserve"> </w:t>
-      </w:r>
-      <w:r>
-        <w:t xml:space="preserve">analyses, not the accuracy of any single model.</w:t>
+        <w:t xml:space="preserve">This manuscript is a computational and multivariate follow-up to the prior</w:t>
+      </w:r>
+      <w:r>
+        <w:t xml:space="preserve"> </w:t>
+      </w:r>
+      <w:r>
+        <w:t xml:space="preserve">univariate ERP report on the same cohort (Hajiaboo et al., 2025). In that context,</w:t>
+      </w:r>
+      <w:r>
+        <w:t xml:space="preserve"> </w:t>
+      </w:r>
+      <w:r>
+        <w:t xml:space="preserve">four findings anchor the present account. First, Morning and Evening chronotypes</w:t>
+      </w:r>
+      <w:r>
+        <w:t xml:space="preserve"> </w:t>
+      </w:r>
+      <w:r>
+        <w:t xml:space="preserve">differed in the feedback-locked posterior P300 loss-minus-gain contrast. Second,</w:t>
+      </w:r>
+      <w:r>
+        <w:t xml:space="preserve"> </w:t>
+      </w:r>
+      <w:r>
+        <w:t xml:space="preserve">chronotype could be predicted from risky-choice dynamics alone. Third, combining</w:t>
+      </w:r>
+      <w:r>
+        <w:t xml:space="preserve"> </w:t>
+      </w:r>
+      <w:r>
+        <w:t xml:space="preserve">behavioural dynamics with validated ERP contrasts predicted chronotype better than</w:t>
+      </w:r>
+      <w:r>
+        <w:t xml:space="preserve"> </w:t>
+      </w:r>
+      <w:r>
+        <w:t xml:space="preserve">either modality alone and also predicted continuous MEQ score. Fourth, two planned</w:t>
+      </w:r>
+      <w:r>
+        <w:t xml:space="preserve"> </w:t>
+      </w:r>
+      <w:r>
+        <w:t xml:space="preserve">negative tests, end-to-end EEG decoding and within-subject single-trial coupling,</w:t>
+      </w:r>
+      <w:r>
+        <w:t xml:space="preserve"> </w:t>
+      </w:r>
+      <w:r>
+        <w:t xml:space="preserve">placed the effect at the between-participant trait level rather than at the level of</w:t>
+      </w:r>
+      <w:r>
+        <w:t xml:space="preserve"> </w:t>
+      </w:r>
+      <w:r>
+        <w:t xml:space="preserve">moment-to-moment neural control of choice. All predictive analyses used</w:t>
+      </w:r>
+      <w:r>
+        <w:t xml:space="preserve"> </w:t>
+      </w:r>
+      <w:r>
+        <w:t xml:space="preserve">participant-generalizing cross-validation and permutation testing. The main</w:t>
+      </w:r>
+      <w:r>
+        <w:t xml:space="preserve"> </w:t>
+      </w:r>
+      <w:r>
+        <w:t xml:space="preserve">evidentiary value is the agreement across distinct analyses, not the accuracy of any</w:t>
+      </w:r>
+      <w:r>
+        <w:t xml:space="preserve"> </w:t>
+      </w:r>
+      <w:r>
+        <w:t xml:space="preserve">single model.</w:t>
       </w:r>
     </w:p>
     <w:bookmarkEnd w:id="37"/>
@@ -3343,13 +3641,13 @@
         <w:t xml:space="preserve"> </w:t>
       </w:r>
       <w:r>
-        <w:t xml:space="preserve">was directionally consistent with the continuous MEQ analysis. Because posterior</w:t>
-      </w:r>
-      <w:r>
-        <w:t xml:space="preserve"> </w:t>
-      </w:r>
-      <w:r>
-        <w:t xml:space="preserve">P300 amplitude is linked to motivational salience and subjective outcome</w:t>
+        <w:t xml:space="preserve">was directionally consistent, although weak, in the continuous MEQ analysis. Because</w:t>
+      </w:r>
+      <w:r>
+        <w:t xml:space="preserve"> </w:t>
+      </w:r>
+      <w:r>
+        <w:t xml:space="preserve">posterior P300 amplitude is linked to motivational salience and subjective outcome</w:t>
       </w:r>
       <w:r>
         <w:t xml:space="preserve"> </w:t>
@@ -3399,91 +3697,99 @@
         <w:t xml:space="preserve"> </w:t>
       </w:r>
       <w:r>
-        <w:t xml:space="preserve">reward motivation (Murray et al., 2009). A smaller posterior-P300 response to losses</w:t>
-      </w:r>
-      <w:r>
-        <w:t xml:space="preserve"> </w:t>
-      </w:r>
-      <w:r>
-        <w:t xml:space="preserve">than gains in Evening participants is consistent with a profile in which losses</w:t>
-      </w:r>
-      <w:r>
-        <w:t xml:space="preserve"> </w:t>
-      </w:r>
-      <w:r>
-        <w:t xml:space="preserve">carry less relative weight during feedback evaluation (cf. loss aversion; Kahneman &amp;</w:t>
-      </w:r>
-      <w:r>
-        <w:t xml:space="preserve"> </w:t>
-      </w:r>
-      <w:r>
-        <w:t xml:space="preserve">Tversky, 1979). [AUTHOR INPUT: the team may sharpen this direction-of-effect link</w:t>
-      </w:r>
-      <w:r>
-        <w:t xml:space="preserve"> </w:t>
-      </w:r>
-      <w:r>
-        <w:t xml:space="preserve">to the specific prior findings it wishes to foreground.] The dissociation between the P300 and the FRN is theoretically informative rather</w:t>
-      </w:r>
-      <w:r>
-        <w:t xml:space="preserve"> </w:t>
-      </w:r>
-      <w:r>
-        <w:t xml:space="preserve">than merely a pattern of one significant and one null test. The FRN, and its</w:t>
-      </w:r>
-      <w:r>
-        <w:t xml:space="preserve"> </w:t>
-      </w:r>
-      <w:r>
-        <w:t xml:space="preserve">positive-going counterpart the reward positivity, indexes a fast, relatively</w:t>
-      </w:r>
-      <w:r>
-        <w:t xml:space="preserve"> </w:t>
-      </w:r>
-      <w:r>
-        <w:t xml:space="preserve">automatic valence and reward-prediction-error evaluation of outcomes (Holroyd &amp;</w:t>
-      </w:r>
-      <w:r>
-        <w:t xml:space="preserve"> </w:t>
-      </w:r>
-      <w:r>
-        <w:t xml:space="preserve">Coles, 2002; Proudfit, 2015; Sambrook &amp; Goslin, 2015), whereas the posterior P300</w:t>
-      </w:r>
-      <w:r>
-        <w:t xml:space="preserve"> </w:t>
-      </w:r>
-      <w:r>
-        <w:t xml:space="preserve">indexes a later, more elaborative weighting of outcome salience and significance</w:t>
-      </w:r>
-      <w:r>
-        <w:t xml:space="preserve"> </w:t>
-      </w:r>
-      <w:r>
-        <w:t xml:space="preserve">(Polich, 2007; Yeung &amp; Sanfey, 2004). That chronotype was expressed in the P300 but</w:t>
-      </w:r>
-      <w:r>
-        <w:t xml:space="preserve"> </w:t>
-      </w:r>
-      <w:r>
-        <w:t xml:space="preserve">not the FRN suggests the difference lies in how much motivational significance is</w:t>
-      </w:r>
-      <w:r>
-        <w:t xml:space="preserve"> </w:t>
-      </w:r>
-      <w:r>
-        <w:t xml:space="preserve">assigned to gains relative to losses during this later appraisal stage, rather than</w:t>
-      </w:r>
-      <w:r>
-        <w:t xml:space="preserve"> </w:t>
-      </w:r>
-      <w:r>
-        <w:t xml:space="preserve">in the initial registration of outcome valence — a more specific account than a</w:t>
-      </w:r>
-      <w:r>
-        <w:t xml:space="preserve"> </w:t>
-      </w:r>
-      <w:r>
-        <w:t xml:space="preserve">general claim that chronotype affects feedback processing.</w:t>
+        <w:t xml:space="preserve">reward motivation (Murray et al., 2009). It is also consistent with the behavioural</w:t>
+      </w:r>
+      <w:r>
+        <w:t xml:space="preserve"> </w:t>
+      </w:r>
+      <w:r>
+        <w:t xml:space="preserve">risk-taking difference previously reported in this cohort (Hajiaboo et al., 2025). A</w:t>
+      </w:r>
+      <w:r>
+        <w:t xml:space="preserve"> </w:t>
+      </w:r>
+      <w:r>
+        <w:t xml:space="preserve">smaller posterior-P300 response to losses than gains in Evening participants is</w:t>
+      </w:r>
+      <w:r>
+        <w:t xml:space="preserve"> </w:t>
+      </w:r>
+      <w:r>
+        <w:t xml:space="preserve">consistent with a profile in which losses carry less relative weight during feedback</w:t>
+      </w:r>
+      <w:r>
+        <w:t xml:space="preserve"> </w:t>
+      </w:r>
+      <w:r>
+        <w:t xml:space="preserve">evaluation (cf. loss aversion; Kahneman &amp; Tversky, 1979). [AUTHOR INPUT: the team</w:t>
+      </w:r>
+      <w:r>
+        <w:t xml:space="preserve"> </w:t>
+      </w:r>
+      <w:r>
+        <w:t xml:space="preserve">may sharpen this direction-of-effect link to the specific prior findings it wishes to</w:t>
+      </w:r>
+      <w:r>
+        <w:t xml:space="preserve"> </w:t>
+      </w:r>
+      <w:r>
+        <w:t xml:space="preserve">foreground.]</w:t>
+      </w:r>
+    </w:p>
+    <w:p>
+      <w:pPr>
+        <w:pStyle w:val="BodyText"/>
+      </w:pPr>
+      <w:r>
+        <w:t xml:space="preserve">The prior FRN findings and the present P300 contrast address different quantities.</w:t>
+      </w:r>
+      <w:r>
+        <w:t xml:space="preserve"> </w:t>
+      </w:r>
+      <w:r>
+        <w:t xml:space="preserve">Hajiaboo et al. (2025) reported chronotype-related FRN amplitude effects and</w:t>
+      </w:r>
+      <w:r>
+        <w:t xml:space="preserve"> </w:t>
+      </w:r>
+      <w:r>
+        <w:t xml:space="preserve">MEQ/MCTQ-FRN associations at Fz and FCz, with MEQ models reaching R2 values of about</w:t>
+      </w:r>
+      <w:r>
+        <w:t xml:space="preserve"> </w:t>
+      </w:r>
+      <w:r>
+        <w:t xml:space="preserve">0.38. The present manuscript did not retest that same amplitude-MEQ question as its</w:t>
+      </w:r>
+      <w:r>
+        <w:t xml:space="preserve"> </w:t>
+      </w:r>
+      <w:r>
+        <w:t xml:space="preserve">primary neural feature; it evaluated FRN error-minus-correct and loss-minus-gain</w:t>
+      </w:r>
+      <w:r>
+        <w:t xml:space="preserve"> </w:t>
+      </w:r>
+      <w:r>
+        <w:t xml:space="preserve">difference contrasts. A null or inconclusive result for those FRN contrasts is</w:t>
+      </w:r>
+      <w:r>
+        <w:t xml:space="preserve"> </w:t>
+      </w:r>
+      <w:r>
+        <w:t xml:space="preserve">therefore not in tension with the published amplitude-MEQ association. The safer</w:t>
+      </w:r>
+      <w:r>
+        <w:t xml:space="preserve"> </w:t>
+      </w:r>
+      <w:r>
+        <w:t xml:space="preserve">interpretation is that the novel group-separating feature isolated here was the</w:t>
+      </w:r>
+      <w:r>
+        <w:t xml:space="preserve"> </w:t>
+      </w:r>
+      <w:r>
+        <w:t xml:space="preserve">posterior P300 loss-minus-gain contrast.</w:t>
       </w:r>
     </w:p>
     <w:bookmarkEnd w:id="38"/>
@@ -3844,6 +4150,68 @@
         <w:t xml:space="preserve">primary outcome.</w:t>
       </w:r>
     </w:p>
+    <w:p>
+      <w:pPr>
+        <w:pStyle w:val="BodyText"/>
+      </w:pPr>
+      <w:r>
+        <w:t xml:space="preserve">The P300 findings also need to be read against the prior paper. Hajiaboo et al.</w:t>
+      </w:r>
+      <w:r>
+        <w:t xml:space="preserve"> </w:t>
+      </w:r>
+      <w:r>
+        <w:t xml:space="preserve">(2025) reported no chronotype main effect on P300 amplitude and no MEQ-P300</w:t>
+      </w:r>
+      <w:r>
+        <w:t xml:space="preserve"> </w:t>
+      </w:r>
+      <w:r>
+        <w:t xml:space="preserve">correlation at Pz or Cz, but did report a Pz feedback-by-chronotype interaction (p =</w:t>
+      </w:r>
+      <w:r>
+        <w:t xml:space="preserve"> </w:t>
+      </w:r>
+      <w:r>
+        <w:t xml:space="preserve">.043). That interaction is condition-dependent P300 modulation by chronotype, which</w:t>
+      </w:r>
+      <w:r>
+        <w:t xml:space="preserve"> </w:t>
+      </w:r>
+      <w:r>
+        <w:t xml:space="preserve">is the pattern the present loss-minus-gain contrast was designed to isolate more</w:t>
+      </w:r>
+      <w:r>
+        <w:t xml:space="preserve"> </w:t>
+      </w:r>
+      <w:r>
+        <w:t xml:space="preserve">directly. At the same time, our continuous MEQ association for the Pz contrast was</w:t>
+      </w:r>
+      <w:r>
+        <w:t xml:space="preserve"> </w:t>
+      </w:r>
+      <w:r>
+        <w:t xml:space="preserve">weak (r = 0.29) and the POz association included zero, so the continuous analysis is</w:t>
+      </w:r>
+      <w:r>
+        <w:t xml:space="preserve"> </w:t>
+      </w:r>
+      <w:r>
+        <w:t xml:space="preserve">consistent with their null MEQ-P300 correlations. The strongest P300 evidence in the</w:t>
+      </w:r>
+      <w:r>
+        <w:t xml:space="preserve"> </w:t>
+      </w:r>
+      <w:r>
+        <w:t xml:space="preserve">present manuscript is specifically the binary group contrast on the posterior</w:t>
+      </w:r>
+      <w:r>
+        <w:t xml:space="preserve"> </w:t>
+      </w:r>
+      <w:r>
+        <w:t xml:space="preserve">difference wave, not a strong continuous MEQ-P300 relationship.</w:t>
+      </w:r>
+    </w:p>
     <w:bookmarkEnd w:id="42"/>
     <w:bookmarkStart w:id="43" w:name="conclusion"/>
     <w:p>
@@ -3859,49 +4227,73 @@
         <w:pStyle w:val="FirstParagraph"/>
       </w:pPr>
       <w:r>
-        <w:t xml:space="preserve">This single-cohort study provides preliminary evidence that chronotype is related to</w:t>
-      </w:r>
-      <w:r>
-        <w:t xml:space="preserve"> </w:t>
-      </w:r>
-      <w:r>
-        <w:t xml:space="preserve">the neural evaluation of decision feedback, with the clearest effect in the</w:t>
-      </w:r>
-      <w:r>
-        <w:t xml:space="preserve"> </w:t>
-      </w:r>
-      <w:r>
-        <w:t xml:space="preserve">posterior P300. Behavioural choice dynamics carried additional chronotype</w:t>
-      </w:r>
-      <w:r>
-        <w:t xml:space="preserve"> </w:t>
-      </w:r>
-      <w:r>
-        <w:t xml:space="preserve">information, and combining behavioural and ERP features gave the strongest</w:t>
-      </w:r>
-      <w:r>
-        <w:t xml:space="preserve"> </w:t>
-      </w:r>
-      <w:r>
-        <w:t xml:space="preserve">prediction of both categorical chronotype and continuous MEQ score. The findings</w:t>
-      </w:r>
-      <w:r>
-        <w:t xml:space="preserve"> </w:t>
-      </w:r>
-      <w:r>
-        <w:t xml:space="preserve">are internally validated and require independent replication, but they show how</w:t>
-      </w:r>
-      <w:r>
-        <w:t xml:space="preserve"> </w:t>
-      </w:r>
-      <w:r>
-        <w:t xml:space="preserve">carefully constrained ERP features and behavioural sequence models can be combined</w:t>
-      </w:r>
-      <w:r>
-        <w:t xml:space="preserve"> </w:t>
-      </w:r>
-      <w:r>
-        <w:t xml:space="preserve">to study stable individual differences in modest samples.</w:t>
+        <w:t xml:space="preserve">This single-cohort follow-up provides preliminary evidence that the posterior P300</w:t>
+      </w:r>
+      <w:r>
+        <w:t xml:space="preserve"> </w:t>
+      </w:r>
+      <w:r>
+        <w:t xml:space="preserve">loss-minus-gain contrast is a group-separating feature of chronotype in these data,</w:t>
+      </w:r>
+      <w:r>
+        <w:t xml:space="preserve"> </w:t>
+      </w:r>
+      <w:r>
+        <w:t xml:space="preserve">building on the behavioural and FRN findings already reported by Hajiaboo et al.</w:t>
+      </w:r>
+      <w:r>
+        <w:t xml:space="preserve"> </w:t>
+      </w:r>
+      <w:r>
+        <w:t xml:space="preserve">(2025). Behavioural choice dynamics carried additional chronotype information, and</w:t>
+      </w:r>
+      <w:r>
+        <w:t xml:space="preserve"> </w:t>
+      </w:r>
+      <w:r>
+        <w:t xml:space="preserve">combining behavioural and ERP features gave the strongest prediction of both</w:t>
+      </w:r>
+      <w:r>
+        <w:t xml:space="preserve"> </w:t>
+      </w:r>
+      <w:r>
+        <w:t xml:space="preserve">categorical chronotype and continuous MEQ score. The novel contribution is the</w:t>
+      </w:r>
+      <w:r>
+        <w:t xml:space="preserve"> </w:t>
+      </w:r>
+      <w:r>
+        <w:t xml:space="preserve">posterior-P300 contrast together with the computational strand: GRU behavioural</w:t>
+      </w:r>
+      <w:r>
+        <w:t xml:space="preserve"> </w:t>
+      </w:r>
+      <w:r>
+        <w:t xml:space="preserve">decoding, brain-behaviour fusion, continuous-MEQ prediction, reinforcement-learning</w:t>
+      </w:r>
+      <w:r>
+        <w:t xml:space="preserve"> </w:t>
+      </w:r>
+      <w:r>
+        <w:t xml:space="preserve">analysis, EEGNet, and leakage-safe/permutation-clean validation. The findings are</w:t>
+      </w:r>
+      <w:r>
+        <w:t xml:space="preserve"> </w:t>
+      </w:r>
+      <w:r>
+        <w:t xml:space="preserve">internally validated and require independent replication, but they show how carefully</w:t>
+      </w:r>
+      <w:r>
+        <w:t xml:space="preserve"> </w:t>
+      </w:r>
+      <w:r>
+        <w:t xml:space="preserve">constrained ERP features and behavioural sequence models can be combined to study</w:t>
+      </w:r>
+      <w:r>
+        <w:t xml:space="preserve"> </w:t>
+      </w:r>
+      <w:r>
+        <w:t xml:space="preserve">stable individual differences in modest samples.</w:t>
       </w:r>
     </w:p>
     <w:p>
@@ -4398,7 +4790,7 @@
           <w:i/>
           <w:iCs/>
         </w:rPr>
-        <w:t xml:space="preserve">). One remaining</w:t>
+        <w:t xml:space="preserve">). Remaining</w:t>
       </w:r>
       <w:r>
         <w:rPr>
@@ -4427,7 +4819,7 @@
           <w:i/>
           <w:iCs/>
         </w:rPr>
-        <w:t xml:space="preserve">marker in the text invites team-preferred chronotype-reward</w:t>
+        <w:t xml:space="preserve">markers invite team confirmation of positioning, interpretation,</w:t>
       </w:r>
       <w:r>
         <w:rPr>
@@ -4441,38 +4833,13 @@
           <w:i/>
           <w:iCs/>
         </w:rPr>
-        <w:t xml:space="preserve">citations; Byrne &amp; Murray (2017) was dropped as unverifiable.</w:t>
-      </w:r>
-    </w:p>
-    <w:p>
-      <w:pPr>
-        <w:pStyle w:val="BodyText"/>
-      </w:pPr>
-      <w:r>
-        <w:t xml:space="preserve">Adan, A., Archer, S. N., Hidalgo, M. P., Di Milia, L., Natale, V., &amp; Randler, C. (2012). Circadian typology: A comprehensive review.</w:t>
-      </w:r>
-      <w:r>
-        <w:t xml:space="preserve"> </w:t>
+        <w:t xml:space="preserve">data sharing, and submission details; Byrne &amp; Murray (2017) was dropped as</w:t>
       </w:r>
       <w:r>
         <w:rPr>
           <w:i/>
           <w:iCs/>
         </w:rPr>
-        <w:t xml:space="preserve">Chronobiology International, 29</w:t>
-      </w:r>
-      <w:r>
-        <w:t xml:space="preserve">(9), 1153–1175. https://doi.org/10.3109/07420528.2012.719971</w:t>
-      </w:r>
-    </w:p>
-    <w:p>
-      <w:pPr>
-        <w:pStyle w:val="BodyText"/>
-      </w:pPr>
-      <w:r>
-        <w:t xml:space="preserve">Adan, A., Natale, V., Caci, H., &amp; Prat, G. (2010). Relationship between circadian typology and functional and dysfunctional impulsivity.</w:t>
-      </w:r>
-      <w:r>
         <w:t xml:space="preserve"> </w:t>
       </w:r>
       <w:r>
@@ -4480,10 +4847,7 @@
           <w:i/>
           <w:iCs/>
         </w:rPr>
-        <w:t xml:space="preserve">Chronobiology International, 27</w:t>
-      </w:r>
-      <w:r>
-        <w:t xml:space="preserve">(3), 606–619. https://doi.org/10.3109/07420521003663827</w:t>
+        <w:t xml:space="preserve">unverifiable.</w:t>
       </w:r>
     </w:p>
     <w:p>
@@ -4491,7 +4855,7 @@
         <w:pStyle w:val="BodyText"/>
       </w:pPr>
       <w:r>
-        <w:t xml:space="preserve">Ahn, W.-Y., Haines, N., &amp; Zhang, L. (2017). Revealing neurocomputational mechanisms of reinforcement learning and decision-making with the hBayesDM package.</w:t>
+        <w:t xml:space="preserve">Adan, A., Archer, S. N., Hidalgo, M. P., Di Milia, L., Natale, V., &amp; Randler, C. (2012). Circadian typology: A comprehensive review.</w:t>
       </w:r>
       <w:r>
         <w:t xml:space="preserve"> </w:t>
@@ -4501,10 +4865,10 @@
           <w:i/>
           <w:iCs/>
         </w:rPr>
-        <w:t xml:space="preserve">Computational Psychiatry, 1</w:t>
-      </w:r>
-      <w:r>
-        <w:t xml:space="preserve">, 24–57. https://doi.org/10.1162/CPSY_a_00002</w:t>
+        <w:t xml:space="preserve">Chronobiology International, 29</w:t>
+      </w:r>
+      <w:r>
+        <w:t xml:space="preserve">(9), 1153–1175. https://doi.org/10.3109/07420528.2012.719971</w:t>
       </w:r>
     </w:p>
     <w:p>
@@ -4512,7 +4876,7 @@
         <w:pStyle w:val="BodyText"/>
       </w:pPr>
       <w:r>
-        <w:t xml:space="preserve">Benjamini, Y., &amp; Hochberg, Y. (1995). Controlling the false discovery rate: A practical and powerful approach to multiple testing.</w:t>
+        <w:t xml:space="preserve">Adan, A., Natale, V., Caci, H., &amp; Prat, G. (2010). Relationship between circadian typology and functional and dysfunctional impulsivity.</w:t>
       </w:r>
       <w:r>
         <w:t xml:space="preserve"> </w:t>
@@ -4522,10 +4886,10 @@
           <w:i/>
           <w:iCs/>
         </w:rPr>
-        <w:t xml:space="preserve">Journal of the Royal Statistical Society: Series B (Methodological), 57</w:t>
-      </w:r>
-      <w:r>
-        <w:t xml:space="preserve">(1), 289–300. https://doi.org/10.1111/j.2517-6161.1995.tb02031.x</w:t>
+        <w:t xml:space="preserve">Chronobiology International, 27</w:t>
+      </w:r>
+      <w:r>
+        <w:t xml:space="preserve">(3), 606–619. https://doi.org/10.3109/07420521003663827</w:t>
       </w:r>
     </w:p>
     <w:p>
@@ -4533,7 +4897,7 @@
         <w:pStyle w:val="BodyText"/>
       </w:pPr>
       <w:r>
-        <w:t xml:space="preserve">Cho, K., van Merriënboer, B., Gulcehre, C., Bahdanau, D., Bougares, F., Schwenk, H., &amp; Bengio, Y. (2014). Learning phrase representations using RNN encoder–decoder for statistical machine translation. In</w:t>
+        <w:t xml:space="preserve">Ahn, W.-Y., Haines, N., &amp; Zhang, L. (2017). Revealing neurocomputational mechanisms of reinforcement learning and decision-making with the hBayesDM package.</w:t>
       </w:r>
       <w:r>
         <w:t xml:space="preserve"> </w:t>
@@ -4543,13 +4907,10 @@
           <w:i/>
           <w:iCs/>
         </w:rPr>
-        <w:t xml:space="preserve">Proceedings of the 2014 Conference on Empirical Methods in Natural Language Processing (EMNLP)</w:t>
-      </w:r>
-      <w:r>
-        <w:t xml:space="preserve"> </w:t>
-      </w:r>
-      <w:r>
-        <w:t xml:space="preserve">(pp. 1724–1734). https://doi.org/10.3115/v1/D14-1179</w:t>
+        <w:t xml:space="preserve">Computational Psychiatry, 1</w:t>
+      </w:r>
+      <w:r>
+        <w:t xml:space="preserve">, 24–57. https://doi.org/10.1162/CPSY_a_00002</w:t>
       </w:r>
     </w:p>
     <w:p>
@@ -4557,7 +4918,7 @@
         <w:pStyle w:val="BodyText"/>
       </w:pPr>
       <w:r>
-        <w:t xml:space="preserve">Combrisson, E., &amp; Jerbi, K. (2015). Exceeding chance level by chance: The caveat of theoretical chance levels in brain signal classification and statistical assessment of decoding accuracy.</w:t>
+        <w:t xml:space="preserve">Benjamini, Y., &amp; Hochberg, Y. (1995). Controlling the false discovery rate: A practical and powerful approach to multiple testing.</w:t>
       </w:r>
       <w:r>
         <w:t xml:space="preserve"> </w:t>
@@ -4567,10 +4928,10 @@
           <w:i/>
           <w:iCs/>
         </w:rPr>
-        <w:t xml:space="preserve">Journal of Neuroscience Methods, 250</w:t>
-      </w:r>
-      <w:r>
-        <w:t xml:space="preserve">, 126–136. https://doi.org/10.1016/j.jneumeth.2015.01.010</w:t>
+        <w:t xml:space="preserve">Journal of the Royal Statistical Society: Series B (Methodological), 57</w:t>
+      </w:r>
+      <w:r>
+        <w:t xml:space="preserve">(1), 289–300. https://doi.org/10.1111/j.2517-6161.1995.tb02031.x</w:t>
       </w:r>
     </w:p>
     <w:p>
@@ -4578,7 +4939,7 @@
         <w:pStyle w:val="BodyText"/>
       </w:pPr>
       <w:r>
-        <w:t xml:space="preserve">Daw, N. D. (2011). Trial-by-trial data analysis using computational models. In</w:t>
+        <w:t xml:space="preserve">Cho, K., van Merriënboer, B., Gulcehre, C., Bahdanau, D., Bougares, F., Schwenk, H., &amp; Bengio, Y. (2014). Learning phrase representations using RNN encoder–decoder for statistical machine translation. In</w:t>
       </w:r>
       <w:r>
         <w:t xml:space="preserve"> </w:t>
@@ -4588,13 +4949,13 @@
           <w:i/>
           <w:iCs/>
         </w:rPr>
-        <w:t xml:space="preserve">Decision making, affect, and learning: Attention and Performance XXIII</w:t>
-      </w:r>
-      <w:r>
-        <w:t xml:space="preserve"> </w:t>
-      </w:r>
-      <w:r>
-        <w:t xml:space="preserve">(pp. 3–38). Oxford University Press. https://doi.org/10.1093/acprof:oso/9780199600434.003.0001</w:t>
+        <w:t xml:space="preserve">Proceedings of the 2014 Conference on Empirical Methods in Natural Language Processing (EMNLP)</w:t>
+      </w:r>
+      <w:r>
+        <w:t xml:space="preserve"> </w:t>
+      </w:r>
+      <w:r>
+        <w:t xml:space="preserve">(pp. 1724–1734). https://doi.org/10.3115/v1/D14-1179</w:t>
       </w:r>
     </w:p>
     <w:p>
@@ -4602,7 +4963,7 @@
         <w:pStyle w:val="BodyText"/>
       </w:pPr>
       <w:r>
-        <w:t xml:space="preserve">Frank, M. J., Moustafa, A. A., Haughey, H. M., Curran, T., &amp; Hutchison, K. E. (2007). Genetic triple dissociation reveals multiple roles for dopamine in reinforcement learning.</w:t>
+        <w:t xml:space="preserve">Combrisson, E., &amp; Jerbi, K. (2015). Exceeding chance level by chance: The caveat of theoretical chance levels in brain signal classification and statistical assessment of decoding accuracy.</w:t>
       </w:r>
       <w:r>
         <w:t xml:space="preserve"> </w:t>
@@ -4612,10 +4973,10 @@
           <w:i/>
           <w:iCs/>
         </w:rPr>
-        <w:t xml:space="preserve">Proceedings of the National Academy of Sciences, 104</w:t>
-      </w:r>
-      <w:r>
-        <w:t xml:space="preserve">(41), 16311–16316. https://doi.org/10.1073/pnas.0706111104</w:t>
+        <w:t xml:space="preserve">Journal of Neuroscience Methods, 250</w:t>
+      </w:r>
+      <w:r>
+        <w:t xml:space="preserve">, 126–136. https://doi.org/10.1016/j.jneumeth.2015.01.010</w:t>
       </w:r>
     </w:p>
     <w:p>
@@ -4623,7 +4984,7 @@
         <w:pStyle w:val="BodyText"/>
       </w:pPr>
       <w:r>
-        <w:t xml:space="preserve">Gehring, W. J., &amp; Willoughby, A. R. (2002). The medial frontal cortex and the rapid processing of monetary gains and losses.</w:t>
+        <w:t xml:space="preserve">Daw, N. D. (2011). Trial-by-trial data analysis using computational models. In</w:t>
       </w:r>
       <w:r>
         <w:t xml:space="preserve"> </w:t>
@@ -4633,10 +4994,13 @@
           <w:i/>
           <w:iCs/>
         </w:rPr>
-        <w:t xml:space="preserve">Science, 295</w:t>
-      </w:r>
-      <w:r>
-        <w:t xml:space="preserve">(5563), 2279–2282. https://doi.org/10.1126/science.1066893</w:t>
+        <w:t xml:space="preserve">Decision making, affect, and learning: Attention and Performance XXIII</w:t>
+      </w:r>
+      <w:r>
+        <w:t xml:space="preserve"> </w:t>
+      </w:r>
+      <w:r>
+        <w:t xml:space="preserve">(pp. 3–38). Oxford University Press. https://doi.org/10.1093/acprof:oso/9780199600434.003.0001</w:t>
       </w:r>
     </w:p>
     <w:p>
@@ -4644,7 +5008,7 @@
         <w:pStyle w:val="BodyText"/>
       </w:pPr>
       <w:r>
-        <w:t xml:space="preserve">Gershman, S. J. (2015). Do learning rates adapt to the distribution of rewards?</w:t>
+        <w:t xml:space="preserve">Frank, M. J., Moustafa, A. A., Haughey, H. M., Curran, T., &amp; Hutchison, K. E. (2007). Genetic triple dissociation reveals multiple roles for dopamine in reinforcement learning.</w:t>
       </w:r>
       <w:r>
         <w:t xml:space="preserve"> </w:t>
@@ -4654,10 +5018,10 @@
           <w:i/>
           <w:iCs/>
         </w:rPr>
-        <w:t xml:space="preserve">Psychonomic Bulletin &amp; Review, 22</w:t>
-      </w:r>
-      <w:r>
-        <w:t xml:space="preserve">(5), 1320–1327. https://doi.org/10.3758/s13423-014-0790-3</w:t>
+        <w:t xml:space="preserve">Proceedings of the National Academy of Sciences, 104</w:t>
+      </w:r>
+      <w:r>
+        <w:t xml:space="preserve">(41), 16311–16316. https://doi.org/10.1073/pnas.0706111104</w:t>
       </w:r>
     </w:p>
     <w:p>
@@ -4665,7 +5029,7 @@
         <w:pStyle w:val="BodyText"/>
       </w:pPr>
       <w:r>
-        <w:t xml:space="preserve">Hajcak, G., Moser, J. S., Holroyd, C. B., &amp; Simons, R. F. (2007). It’s worse than you thought: The feedback negativity and violations of reward prediction in gambling tasks.</w:t>
+        <w:t xml:space="preserve">Gehring, W. J., &amp; Willoughby, A. R. (2002). The medial frontal cortex and the rapid processing of monetary gains and losses.</w:t>
       </w:r>
       <w:r>
         <w:t xml:space="preserve"> </w:t>
@@ -4675,10 +5039,73 @@
           <w:i/>
           <w:iCs/>
         </w:rPr>
+        <w:t xml:space="preserve">Science, 295</w:t>
+      </w:r>
+      <w:r>
+        <w:t xml:space="preserve">(5563), 2279–2282. https://doi.org/10.1126/science.1066893</w:t>
+      </w:r>
+    </w:p>
+    <w:p>
+      <w:pPr>
+        <w:pStyle w:val="BodyText"/>
+      </w:pPr>
+      <w:r>
+        <w:t xml:space="preserve">Gershman, S. J. (2015). Do learning rates adapt to the distribution of rewards?</w:t>
+      </w:r>
+      <w:r>
+        <w:t xml:space="preserve"> </w:t>
+      </w:r>
+      <w:r>
+        <w:rPr>
+          <w:i/>
+          <w:iCs/>
+        </w:rPr>
+        <w:t xml:space="preserve">Psychonomic Bulletin &amp; Review, 22</w:t>
+      </w:r>
+      <w:r>
+        <w:t xml:space="preserve">(5), 1320–1327. https://doi.org/10.3758/s13423-014-0790-3</w:t>
+      </w:r>
+    </w:p>
+    <w:p>
+      <w:pPr>
+        <w:pStyle w:val="BodyText"/>
+      </w:pPr>
+      <w:r>
+        <w:t xml:space="preserve">Hajcak, G., Moser, J. S., Holroyd, C. B., &amp; Simons, R. F. (2007). It’s worse than you thought: The feedback negativity and violations of reward prediction in gambling tasks.</w:t>
+      </w:r>
+      <w:r>
+        <w:t xml:space="preserve"> </w:t>
+      </w:r>
+      <w:r>
+        <w:rPr>
+          <w:i/>
+          <w:iCs/>
+        </w:rPr>
         <w:t xml:space="preserve">Psychophysiology, 44</w:t>
       </w:r>
       <w:r>
         <w:t xml:space="preserve">(6), 905–912. https://doi.org/10.1111/j.1469-8986.2007.00567.x</w:t>
+      </w:r>
+    </w:p>
+    <w:p>
+      <w:pPr>
+        <w:pStyle w:val="BodyText"/>
+      </w:pPr>
+      <w:r>
+        <w:t xml:space="preserve">Hajiaboo, M., Zarean, M., &amp; Heysieattalab, S. (2025). The effect of chronotype in risky decision making: An ERP study.</w:t>
+      </w:r>
+      <w:r>
+        <w:t xml:space="preserve"> </w:t>
+      </w:r>
+      <w:r>
+        <w:rPr>
+          <w:i/>
+          <w:iCs/>
+        </w:rPr>
+        <w:t xml:space="preserve">International Journal of Psychophysiology, 217</w:t>
+      </w:r>
+      <w:r>
+        <w:t xml:space="preserve">, 113258. https://doi.org/10.1016/j.ijpsycho.2025.113258</w:t>
       </w:r>
     </w:p>
     <w:p>

</xml_diff>

<commit_message>
Add P300 sex/age covariate check; update team_tasks for prior-paper context
- scripts/dl/p300_covariate_check.py + reports/clean/p300_covariate: the primary Pz
  P300 loss-minus-gain effect survives adjustment for sex and age (adj. b=0.88,
  p=0.041, partial d~0.72; sex/age n.s.); POz attenuates (adj. p=0.12) with age a
  significant covariate. Integrated into Results 3.4 and Limitations.
- team_tasks.md rewritten: marks resolved items (same subset, ethics code, methods
  from 2025 paper, demographics, authorship with Zarean last / Heysiattalab
  corresponding, data not shared, Psychophysiology target, sex/age handled) and
  trims to the remaining asks (FRN/P300 measurement details, keep-vs-supplement,
  funding/COI, OSF prereg link).

Co-Authored-By: Claude Opus 4.8 <noreply@anthropic.com>
</commit_message>
<xml_diff>
--- a/docs/paper.docx
+++ b/docs/paper.docx
@@ -2137,6 +2137,56 @@
       </w:r>
       <w:r>
         <w:t xml:space="preserve">-0.66), but they supported the same conclusion.</w:t>
+      </w:r>
+    </w:p>
+    <w:p>
+      <w:pPr>
+        <w:pStyle w:val="BodyText"/>
+      </w:pPr>
+      <w:r>
+        <w:t xml:space="preserve">Because sex and age were imbalanced across groups (Evening 68% male and about two</w:t>
+      </w:r>
+      <w:r>
+        <w:t xml:space="preserve"> </w:t>
+      </w:r>
+      <w:r>
+        <w:t xml:space="preserve">years older than Morning), we re-tested the posterior-P300 contrast with sex and</w:t>
+      </w:r>
+      <w:r>
+        <w:t xml:space="preserve"> </w:t>
+      </w:r>
+      <w:r>
+        <w:t xml:space="preserve">age as covariates. The Pz effect remained significant (adjusted Morning-vs-Evening</w:t>
+      </w:r>
+      <w:r>
+        <w:t xml:space="preserve"> </w:t>
+      </w:r>
+      <w:r>
+        <w:t xml:space="preserve">b = 0.88, p = 0.041, partial d approximately 0.72), with neither sex (p = 0.24) nor</w:t>
+      </w:r>
+      <w:r>
+        <w:t xml:space="preserve"> </w:t>
+      </w:r>
+      <w:r>
+        <w:t xml:space="preserve">age (p = 0.12) contributing. The POz effect attenuated to non-significance (adjusted</w:t>
+      </w:r>
+      <w:r>
+        <w:t xml:space="preserve"> </w:t>
+      </w:r>
+      <w:r>
+        <w:t xml:space="preserve">p = 0.12), and age was a significant covariate there (p = 0.010). The primary Pz</w:t>
+      </w:r>
+      <w:r>
+        <w:t xml:space="preserve"> </w:t>
+      </w:r>
+      <w:r>
+        <w:t xml:space="preserve">effect is therefore not attributable to the sex/age imbalance, whereas the POz</w:t>
+      </w:r>
+      <w:r>
+        <w:t xml:space="preserve"> </w:t>
+      </w:r>
+      <w:r>
+        <w:t xml:space="preserve">effect is partly related to age and should be interpreted more cautiously.</w:t>
       </w:r>
     </w:p>
     <w:bookmarkEnd w:id="27"/>
@@ -3991,6 +4041,36 @@
         </w:numPr>
       </w:pPr>
       <w:r>
+        <w:t xml:space="preserve">Sex and age were imbalanced across chronotype groups (Evening 68% male and about</w:t>
+      </w:r>
+      <w:r>
+        <w:t xml:space="preserve"> </w:t>
+      </w:r>
+      <w:r>
+        <w:t xml:space="preserve">two years older than Morning). The primary Pz P300 effect survived adjustment for</w:t>
+      </w:r>
+      <w:r>
+        <w:t xml:space="preserve"> </w:t>
+      </w:r>
+      <w:r>
+        <w:t xml:space="preserve">both, but the POz effect attenuated to non-significance and was partly related to</w:t>
+      </w:r>
+      <w:r>
+        <w:t xml:space="preserve"> </w:t>
+      </w:r>
+      <w:r>
+        <w:t xml:space="preserve">age; the sample is too small to fully disentangle chronotype from these covariates.</w:t>
+      </w:r>
+    </w:p>
+    <w:p>
+      <w:pPr>
+        <w:pStyle w:val="Compact"/>
+        <w:numPr>
+          <w:ilvl w:val="0"/>
+          <w:numId w:val="1001"/>
+        </w:numPr>
+      </w:pPr>
+      <w:r>
         <w:t xml:space="preserve">ERP features are window-level single-trial means and may miss peak-latency,</w:t>
       </w:r>
       <w:r>

</xml_diff>

<commit_message>
Reconcile covariate demographics with paper figures; add demographic-reconciliation task
Follow-up to the prior-paper integration cherry-pick:
- §3.4/Limitations: replace the dataset-derived "Evening 68% male" with wording
  consistent with the paper's per-group figures reported in §2.1, and flag that the
  covariate analysis used provisional dataset sex coding pending reconciliation
- team_tasks.md: add a prioritised demographic-reconciliation item (our dataset
  Evening 13M/6F, Morning 7M/13F vs paper 11M/8F, 9M/11F; totals agree, per-group
  differs by ~2) requesting the authoritative per-participant key
- rebuild both docx

Co-Authored-By: Claude Opus 4.8 <noreply@anthropic.com>
</commit_message>
<xml_diff>
--- a/docs/paper.docx
+++ b/docs/paper.docx
@@ -67,115 +67,109 @@
         <w:t xml:space="preserve"> </w:t>
       </w:r>
       <w:r>
-        <w:t xml:space="preserve">but little is known about how morning and evening types process decision feedback</w:t>
-      </w:r>
-      <w:r>
-        <w:t xml:space="preserve"> </w:t>
-      </w:r>
-      <w:r>
-        <w:t xml:space="preserve">at the neural level. We recorded EEG from 39 participants (19 Evening, 20 Morning)</w:t>
-      </w:r>
-      <w:r>
-        <w:t xml:space="preserve"> </w:t>
-      </w:r>
-      <w:r>
-        <w:t xml:space="preserve">during a risky decision-making task with gain and loss feedback. Chronotype was</w:t>
-      </w:r>
-      <w:r>
-        <w:t xml:space="preserve"> </w:t>
-      </w:r>
-      <w:r>
-        <w:t xml:space="preserve">examined using feedback-locked event-related potentials, behavioural sequence</w:t>
-      </w:r>
-      <w:r>
-        <w:t xml:space="preserve"> </w:t>
-      </w:r>
-      <w:r>
-        <w:t xml:space="preserve">models, and multimodal analyses with participant-generalizing validation. The</w:t>
-      </w:r>
-      <w:r>
-        <w:t xml:space="preserve"> </w:t>
-      </w:r>
-      <w:r>
-        <w:t xml:space="preserve">clearest neural difference was in the posterior P300. The parietal loss-minus-gain</w:t>
-      </w:r>
-      <w:r>
-        <w:t xml:space="preserve"> </w:t>
-      </w:r>
-      <w:r>
-        <w:t xml:space="preserve">contrast separated Morning and Evening groups with large effects (Pz Cohen’s d =</w:t>
-      </w:r>
-      <w:r>
-        <w:t xml:space="preserve"> </w:t>
-      </w:r>
-      <w:r>
-        <w:t xml:space="preserve">-1.04, FDR p = 0.034; POz d = -0.92, FDR p = 0.045), remained stable across</w:t>
-      </w:r>
-      <w:r>
-        <w:t xml:space="preserve"> </w:t>
-      </w:r>
-      <w:r>
-        <w:t xml:space="preserve">participant-exclusion analyses (d approximately -1.0, p &lt; 0.011 throughout), and</w:t>
-      </w:r>
-      <w:r>
-        <w:t xml:space="preserve"> </w:t>
-      </w:r>
-      <w:r>
-        <w:t xml:space="preserve">showed the same direction of association with continuous MEQ score. Behaviour carried</w:t>
-      </w:r>
-      <w:r>
-        <w:t xml:space="preserve"> </w:t>
-      </w:r>
-      <w:r>
-        <w:t xml:space="preserve">convergent information: out-of-fold scores from a causal GRU model of risky-choice</w:t>
-      </w:r>
-      <w:r>
-        <w:t xml:space="preserve"> </w:t>
-      </w:r>
-      <w:r>
-        <w:t xml:space="preserve">dynamics distinguished Morning and Evening participants without EEG (ROC AUC 0.713,</w:t>
-      </w:r>
-      <w:r>
-        <w:t xml:space="preserve"> </w:t>
-      </w:r>
-      <w:r>
-        <w:t xml:space="preserve">permutation p = 0.027). Out-of-fold scores that combined the behavioural embedding</w:t>
-      </w:r>
-      <w:r>
-        <w:t xml:space="preserve"> </w:t>
-      </w:r>
-      <w:r>
-        <w:t xml:space="preserve">with the validated ERP contrasts separated the groups more strongly (AUC 0.797, p =</w:t>
-      </w:r>
-      <w:r>
-        <w:t xml:space="preserve"> </w:t>
-      </w:r>
-      <w:r>
-        <w:t xml:space="preserve">0.004; bootstrap 95% CI [0.64, 0.92]) and tracked the continuous MEQ score (r =</w:t>
-      </w:r>
-      <w:r>
-        <w:t xml:space="preserve"> </w:t>
-      </w:r>
-      <w:r>
-        <w:t xml:space="preserve">0.34, p = 0.027), indicating that behavioural dynamics and feedback ERPs carry</w:t>
-      </w:r>
-      <w:r>
-        <w:t xml:space="preserve"> </w:t>
-      </w:r>
-      <w:r>
-        <w:t xml:space="preserve">partly independent, rather than diagnostic, information about chronotype. That the</w:t>
-      </w:r>
-      <w:r>
-        <w:t xml:space="preserve"> </w:t>
-      </w:r>
-      <w:r>
-        <w:t xml:space="preserve">same measures related to continuous MEQ score is consistent with a graded,</w:t>
-      </w:r>
-      <w:r>
-        <w:t xml:space="preserve"> </w:t>
-      </w:r>
-      <w:r>
-        <w:t xml:space="preserve">dimensional trait rather than a strict dichotomy. An asymmetric</w:t>
+        <w:t xml:space="preserve">and behavioural and FRN effects in the present cohort have been reported previously.</w:t>
+      </w:r>
+      <w:r>
+        <w:t xml:space="preserve"> </w:t>
+      </w:r>
+      <w:r>
+        <w:t xml:space="preserve">Here we analysed the same 39-participant cohort (19 Evening, 20 Morning) as a</w:t>
+      </w:r>
+      <w:r>
+        <w:t xml:space="preserve"> </w:t>
+      </w:r>
+      <w:r>
+        <w:t xml:space="preserve">computational and multivariate follow-up focused on posterior P300 contrasts,</w:t>
+      </w:r>
+      <w:r>
+        <w:t xml:space="preserve"> </w:t>
+      </w:r>
+      <w:r>
+        <w:t xml:space="preserve">behavioural sequence models, and participant-generalizing validation. The clearest</w:t>
+      </w:r>
+      <w:r>
+        <w:t xml:space="preserve"> </w:t>
+      </w:r>
+      <w:r>
+        <w:t xml:space="preserve">neural difference was in the posterior P300. The parietal loss-minus-gain contrast</w:t>
+      </w:r>
+      <w:r>
+        <w:t xml:space="preserve"> </w:t>
+      </w:r>
+      <w:r>
+        <w:t xml:space="preserve">separated Morning and Evening groups with large effects (Pz Cohen’s d = -1.04, FDR p</w:t>
+      </w:r>
+      <w:r>
+        <w:t xml:space="preserve"> </w:t>
+      </w:r>
+      <w:r>
+        <w:t xml:space="preserve">= 0.034; POz d = -0.92, FDR p = 0.045), remained stable across participant-exclusion</w:t>
+      </w:r>
+      <w:r>
+        <w:t xml:space="preserve"> </w:t>
+      </w:r>
+      <w:r>
+        <w:t xml:space="preserve">analyses (d approximately -1.0, p &lt; 0.011 throughout), and showed the same direction</w:t>
+      </w:r>
+      <w:r>
+        <w:t xml:space="preserve"> </w:t>
+      </w:r>
+      <w:r>
+        <w:t xml:space="preserve">of association with continuous MEQ score. Behaviour carried convergent information:</w:t>
+      </w:r>
+      <w:r>
+        <w:t xml:space="preserve"> </w:t>
+      </w:r>
+      <w:r>
+        <w:t xml:space="preserve">out-of-fold scores from a causal GRU model of risky-choice dynamics distinguished</w:t>
+      </w:r>
+      <w:r>
+        <w:t xml:space="preserve"> </w:t>
+      </w:r>
+      <w:r>
+        <w:t xml:space="preserve">Morning and Evening participants without EEG (ROC AUC 0.713, permutation p = 0.027).</w:t>
+      </w:r>
+      <w:r>
+        <w:t xml:space="preserve"> </w:t>
+      </w:r>
+      <w:r>
+        <w:t xml:space="preserve">Out-of-fold scores that combined the behavioural embedding with the validated ERP</w:t>
+      </w:r>
+      <w:r>
+        <w:t xml:space="preserve"> </w:t>
+      </w:r>
+      <w:r>
+        <w:t xml:space="preserve">contrasts separated the groups more strongly (AUC 0.797, p = 0.004; bootstrap 95% CI</w:t>
+      </w:r>
+      <w:r>
+        <w:t xml:space="preserve"> </w:t>
+      </w:r>
+      <w:r>
+        <w:t xml:space="preserve">[0.64, 0.92]) and tracked the continuous MEQ score (r = 0.34, p = 0.027), indicating</w:t>
+      </w:r>
+      <w:r>
+        <w:t xml:space="preserve"> </w:t>
+      </w:r>
+      <w:r>
+        <w:t xml:space="preserve">that behavioural dynamics and feedback ERPs carry partly independent, rather than</w:t>
+      </w:r>
+      <w:r>
+        <w:t xml:space="preserve"> </w:t>
+      </w:r>
+      <w:r>
+        <w:t xml:space="preserve">diagnostic, information about chronotype. That the same measures related to</w:t>
+      </w:r>
+      <w:r>
+        <w:t xml:space="preserve"> </w:t>
+      </w:r>
+      <w:r>
+        <w:t xml:space="preserve">continuous MEQ score is consistent with a graded, dimensional trait rather than a</w:t>
+      </w:r>
+      <w:r>
+        <w:t xml:space="preserve"> </w:t>
+      </w:r>
+      <w:r>
+        <w:t xml:space="preserve">strict dichotomy. An asymmetric</w:t>
       </w:r>
       <w:r>
         <w:t xml:space="preserve"> </w:t>
@@ -376,6 +370,44 @@
         <w:pStyle w:val="BodyText"/>
       </w:pPr>
       <w:r>
+        <w:t xml:space="preserve">This cohort has already been reported in a univariate ERP study by Hajiaboo et al.</w:t>
+      </w:r>
+      <w:r>
+        <w:t xml:space="preserve"> </w:t>
+      </w:r>
+      <w:r>
+        <w:t xml:space="preserve">(2025), which established greater behavioural risk-taking in Evening than Morning</w:t>
+      </w:r>
+      <w:r>
+        <w:t xml:space="preserve"> </w:t>
+      </w:r>
+      <w:r>
+        <w:t xml:space="preserve">participants, faster responding and post-error effects, and FRN-amplitude</w:t>
+      </w:r>
+      <w:r>
+        <w:t xml:space="preserve"> </w:t>
+      </w:r>
+      <w:r>
+        <w:t xml:space="preserve">associations with chronotype. The present manuscript is therefore positioned as a</w:t>
+      </w:r>
+      <w:r>
+        <w:t xml:space="preserve"> </w:t>
+      </w:r>
+      <w:r>
+        <w:t xml:space="preserve">computational and multivariate follow-up to that publication, not as an independent</w:t>
+      </w:r>
+      <w:r>
+        <w:t xml:space="preserve"> </w:t>
+      </w:r>
+      <w:r>
+        <w:t xml:space="preserve">first report of the behavioural or FRN findings.</w:t>
+      </w:r>
+    </w:p>
+    <w:p>
+      <w:pPr>
+        <w:pStyle w:val="BodyText"/>
+      </w:pPr>
+      <w:r>
         <w:t xml:space="preserve">Feedback during value-based decisions evokes several event-related potentials that</w:t>
       </w:r>
       <w:r>
@@ -524,61 +556,79 @@
         <w:pStyle w:val="BodyText"/>
       </w:pPr>
       <w:r>
-        <w:t xml:space="preserve">The present study examined these questions in a single cohort performing a</w:t>
-      </w:r>
-      <w:r>
-        <w:t xml:space="preserve"> </w:t>
-      </w:r>
-      <w:r>
-        <w:t xml:space="preserve">feedback-based risky-choice task. We tested whether Morning and Evening chronotypes</w:t>
-      </w:r>
-      <w:r>
-        <w:t xml:space="preserve"> </w:t>
-      </w:r>
-      <w:r>
-        <w:t xml:space="preserve">differed in the posterior P300 response to loss versus gain feedback. We then asked</w:t>
-      </w:r>
-      <w:r>
-        <w:t xml:space="preserve"> </w:t>
-      </w:r>
-      <w:r>
-        <w:t xml:space="preserve">whether chronotype could be decoded from the dynamics of risky choice using a causal</w:t>
-      </w:r>
-      <w:r>
-        <w:t xml:space="preserve"> </w:t>
-      </w:r>
-      <w:r>
-        <w:t xml:space="preserve">recurrent model, and whether combining behavioural dynamics with validated ERP</w:t>
-      </w:r>
-      <w:r>
-        <w:t xml:space="preserve"> </w:t>
-      </w:r>
-      <w:r>
-        <w:t xml:space="preserve">features improved prediction beyond either source alone. Additional analyses tested</w:t>
-      </w:r>
-      <w:r>
-        <w:t xml:space="preserve"> </w:t>
-      </w:r>
-      <w:r>
-        <w:t xml:space="preserve">whether an interpretable reinforcement-learning model could explain the behavioural</w:t>
-      </w:r>
-      <w:r>
-        <w:t xml:space="preserve"> </w:t>
-      </w:r>
-      <w:r>
-        <w:t xml:space="preserve">difference, whether EEGNet could recover chronotype from single-trial EEG, and</w:t>
-      </w:r>
-      <w:r>
-        <w:t xml:space="preserve"> </w:t>
-      </w:r>
-      <w:r>
-        <w:t xml:space="preserve">whether trial-to-trial P300 variation predicted subsequent risky choice differently</w:t>
-      </w:r>
-      <w:r>
-        <w:t xml:space="preserve"> </w:t>
-      </w:r>
-      <w:r>
-        <w:t xml:space="preserve">by chronotype.</w:t>
+        <w:t xml:space="preserve">The present study examined these questions in the same cohort performing the same</w:t>
+      </w:r>
+      <w:r>
+        <w:t xml:space="preserve"> </w:t>
+      </w:r>
+      <w:r>
+        <w:t xml:space="preserve">feedback-based risky-choice task. The novel focus was a posterior P300</w:t>
+      </w:r>
+      <w:r>
+        <w:t xml:space="preserve"> </w:t>
+      </w:r>
+      <w:r>
+        <w:t xml:space="preserve">loss-minus-gain contrast and a computational strand absent from the prior report:</w:t>
+      </w:r>
+      <w:r>
+        <w:t xml:space="preserve"> </w:t>
+      </w:r>
+      <w:r>
+        <w:t xml:space="preserve">GRU behavioural decoding, brain-behaviour fusion, continuous-MEQ prediction,</w:t>
+      </w:r>
+      <w:r>
+        <w:t xml:space="preserve"> </w:t>
+      </w:r>
+      <w:r>
+        <w:t xml:space="preserve">reinforcement-learning analysis, EEGNet, and leakage-safe/permutation-clean machine</w:t>
+      </w:r>
+      <w:r>
+        <w:t xml:space="preserve"> </w:t>
+      </w:r>
+      <w:r>
+        <w:t xml:space="preserve">learning. We tested whether Morning and Evening chronotypes differed in the posterior</w:t>
+      </w:r>
+      <w:r>
+        <w:t xml:space="preserve"> </w:t>
+      </w:r>
+      <w:r>
+        <w:t xml:space="preserve">P300 response to loss versus gain feedback. We then asked whether chronotype could be</w:t>
+      </w:r>
+      <w:r>
+        <w:t xml:space="preserve"> </w:t>
+      </w:r>
+      <w:r>
+        <w:t xml:space="preserve">decoded from the dynamics of risky choice using a causal recurrent model, and whether</w:t>
+      </w:r>
+      <w:r>
+        <w:t xml:space="preserve"> </w:t>
+      </w:r>
+      <w:r>
+        <w:t xml:space="preserve">combining behavioural dynamics with validated ERP features improved prediction</w:t>
+      </w:r>
+      <w:r>
+        <w:t xml:space="preserve"> </w:t>
+      </w:r>
+      <w:r>
+        <w:t xml:space="preserve">beyond either source alone. Additional analyses tested whether an interpretable</w:t>
+      </w:r>
+      <w:r>
+        <w:t xml:space="preserve"> </w:t>
+      </w:r>
+      <w:r>
+        <w:t xml:space="preserve">reinforcement-learning model could explain the behavioural difference, whether</w:t>
+      </w:r>
+      <w:r>
+        <w:t xml:space="preserve"> </w:t>
+      </w:r>
+      <w:r>
+        <w:t xml:space="preserve">EEGNet could recover chronotype from single-trial EEG, and whether trial-to-trial</w:t>
+      </w:r>
+      <w:r>
+        <w:t xml:space="preserve"> </w:t>
+      </w:r>
+      <w:r>
+        <w:t xml:space="preserve">P300 variation predicted subsequent risky choice differently by chronotype.</w:t>
       </w:r>
     </w:p>
     <w:p>
@@ -612,19 +662,79 @@
         <w:pStyle w:val="FirstParagraph"/>
       </w:pPr>
       <w:r>
-        <w:t xml:space="preserve">Thirty-nine participants were analysed (19 Evening, 20 Morning chronotype).</w:t>
-      </w:r>
-      <w:r>
-        <w:t xml:space="preserve"> </w:t>
-      </w:r>
-      <w:r>
-        <w:t xml:space="preserve">[AUTHOR INPUT: recruitment, age/sex distribution, inclusion/exclusion criteria,</w:t>
-      </w:r>
-      <w:r>
-        <w:t xml:space="preserve"> </w:t>
-      </w:r>
-      <w:r>
-        <w:t xml:space="preserve">ethics/IRB approval and consent statement.]</w:t>
+        <w:t xml:space="preserve">Participants were recruited at the University of Tabriz, Iran, for the previously</w:t>
+      </w:r>
+      <w:r>
+        <w:t xml:space="preserve"> </w:t>
+      </w:r>
+      <w:r>
+        <w:t xml:space="preserve">published ERP study of chronotype and risky decision-making (Hajiaboo et al., 2025)</w:t>
+      </w:r>
+      <w:r>
+        <w:t xml:space="preserve"> </w:t>
+      </w:r>
+      <w:r>
+        <w:t xml:space="preserve">[confirm: same 39-participant subset]. Thirty-nine right-handed participants with</w:t>
+      </w:r>
+      <w:r>
+        <w:t xml:space="preserve"> </w:t>
+      </w:r>
+      <w:r>
+        <w:t xml:space="preserve">normal or corrected-to-normal vision were analysed (19 Evening, 20 Morning</w:t>
+      </w:r>
+      <w:r>
+        <w:t xml:space="preserve"> </w:t>
+      </w:r>
+      <w:r>
+        <w:t xml:space="preserve">chronotype), after exclusion of five participants from the EEG experiment sample</w:t>
+      </w:r>
+      <w:r>
+        <w:t xml:space="preserve"> </w:t>
+      </w:r>
+      <w:r>
+        <w:t xml:space="preserve">(Hajiaboo et al., 2025) [confirm: same 39-participant subset]. Participants were</w:t>
+      </w:r>
+      <w:r>
+        <w:t xml:space="preserve"> </w:t>
+      </w:r>
+      <w:r>
+        <w:t xml:space="preserve">aged 18-31 years. The published report implies a retained sex/gender split of 19</w:t>
+      </w:r>
+      <w:r>
+        <w:t xml:space="preserve"> </w:t>
+      </w:r>
+      <w:r>
+        <w:t xml:space="preserve">female and 20 male participants overall (Morning: 11 female, 9 male; Evening: 8</w:t>
+      </w:r>
+      <w:r>
+        <w:t xml:space="preserve"> </w:t>
+      </w:r>
+      <w:r>
+        <w:t xml:space="preserve">female, 11 male) after the reported artifact exclusions, but this should be confirmed</w:t>
+      </w:r>
+      <w:r>
+        <w:t xml:space="preserve"> </w:t>
+      </w:r>
+      <w:r>
+        <w:t xml:space="preserve">against the exact 39-participant subset used here [confirm: sex/gender split and same</w:t>
+      </w:r>
+      <w:r>
+        <w:t xml:space="preserve"> </w:t>
+      </w:r>
+      <w:r>
+        <w:t xml:space="preserve">39-participant subset]. The study was approved by the University of Tabriz ethics</w:t>
+      </w:r>
+      <w:r>
+        <w:t xml:space="preserve"> </w:t>
+      </w:r>
+      <w:r>
+        <w:t xml:space="preserve">committee of Medical Sciences (IR.TABRIZU.REC.1403.130), and all participants</w:t>
+      </w:r>
+      <w:r>
+        <w:t xml:space="preserve"> </w:t>
+      </w:r>
+      <w:r>
+        <w:t xml:space="preserve">provided written informed consent (Hajiaboo et al., 2025).</w:t>
       </w:r>
     </w:p>
     <w:bookmarkEnd w:id="11"/>
@@ -756,13 +866,55 @@
         <w:t xml:space="preserve"> </w:t>
       </w:r>
       <w:r>
-        <w:t xml:space="preserve">options. [AUTHOR INPUT: number of trials/blocks, magnitudes used, stimulus and</w:t>
-      </w:r>
-      <w:r>
-        <w:t xml:space="preserve"> </w:t>
-      </w:r>
-      <w:r>
-        <w:t xml:space="preserve">feedback timing, response mapping, and the free-versus-forced trial split.] EEG was recorded during the task, and feedback-locked</w:t>
+        <w:t xml:space="preserve">options. Each trial began with a 500 ms fixation, followed by two options displaying</w:t>
+      </w:r>
+      <w:r>
+        <w:t xml:space="preserve"> </w:t>
+      </w:r>
+      <w:r>
+        <w:t xml:space="preserve">magnitudes of 5 or 25. Participants responded with the F or J key to choose the left</w:t>
+      </w:r>
+      <w:r>
+        <w:t xml:space="preserve"> </w:t>
+      </w:r>
+      <w:r>
+        <w:t xml:space="preserve">or right option. One second after the response, gain/loss signs were revealed and the</w:t>
+      </w:r>
+      <w:r>
+        <w:t xml:space="preserve"> </w:t>
+      </w:r>
+      <w:r>
+        <w:t xml:space="preserve">chosen option was outlined in red or green for 1500 ms, followed by a 1000 ms</w:t>
+      </w:r>
+      <w:r>
+        <w:t xml:space="preserve"> </w:t>
+      </w:r>
+      <w:r>
+        <w:t xml:space="preserve">inter-trial interval. The task comprised 16 blocks of 24 trials, for 384 trials in</w:t>
+      </w:r>
+      <w:r>
+        <w:t xml:space="preserve"> </w:t>
+      </w:r>
+      <w:r>
+        <w:t xml:space="preserve">total (Hajiaboo et al., 2025) [confirm: same 39-participant subset]. Forced [5/5]</w:t>
+      </w:r>
+      <w:r>
+        <w:t xml:space="preserve"> </w:t>
+      </w:r>
+      <w:r>
+        <w:t xml:space="preserve">and [25/25] trials were excluded from choice analyses, yielding approximately 289</w:t>
+      </w:r>
+      <w:r>
+        <w:t xml:space="preserve"> </w:t>
+      </w:r>
+      <w:r>
+        <w:t xml:space="preserve">free-choice trials per participant (Hajiaboo et al., 2025) [confirm: same</w:t>
+      </w:r>
+      <w:r>
+        <w:t xml:space="preserve"> </w:t>
+      </w:r>
+      <w:r>
+        <w:t xml:space="preserve">39-participant subset]. EEG was recorded during the task, and feedback-locked</w:t>
       </w:r>
       <w:r>
         <w:t xml:space="preserve"> </w:t>
@@ -780,13 +932,67 @@
         <w:t xml:space="preserve"> </w:t>
       </w:r>
       <w:r>
-        <w:t xml:space="preserve">al. (2014). [AUTHOR INPUT: EEG system, electrode montage, reference, sampling rate,</w:t>
-      </w:r>
-      <w:r>
-        <w:t xml:space="preserve"> </w:t>
-      </w:r>
-      <w:r>
-        <w:t xml:space="preserve">filtering, artifact rejection, ERP windowing.]</w:t>
+        <w:t xml:space="preserve">al. (2014). Sessions were run between 12:00 and 16:00. EEG was acquired with a</w:t>
+      </w:r>
+      <w:r>
+        <w:t xml:space="preserve"> </w:t>
+      </w:r>
+      <w:r>
+        <w:t xml:space="preserve">64-channel waveguard cap (ANT Neuro, Enschede, Netherlands) configured according to</w:t>
+      </w:r>
+      <w:r>
+        <w:t xml:space="preserve"> </w:t>
+      </w:r>
+      <w:r>
+        <w:t xml:space="preserve">the international 10-10 system, with ground at AFz, online band-pass filtering at</w:t>
+      </w:r>
+      <w:r>
+        <w:t xml:space="preserve"> </w:t>
+      </w:r>
+      <w:r>
+        <w:t xml:space="preserve">0.3-100 Hz, 1 kHz sampling, and electrode impedances kept below 10 kΩ (Hajiaboo et</w:t>
+      </w:r>
+      <w:r>
+        <w:t xml:space="preserve"> </w:t>
+      </w:r>
+      <w:r>
+        <w:t xml:space="preserve">al., 2025) [confirm: same 39-participant subset]. Preprocessing was conducted in</w:t>
+      </w:r>
+      <w:r>
+        <w:t xml:space="preserve"> </w:t>
+      </w:r>
+      <w:r>
+        <w:t xml:space="preserve">MATLAB R2019b using EEGLAB v2024.0 and ERPLAB v12.00. Data were filtered offline at</w:t>
+      </w:r>
+      <w:r>
+        <w:t xml:space="preserve"> </w:t>
+      </w:r>
+      <w:r>
+        <w:t xml:space="preserve">0.1-30 Hz, segmented from 200 ms before to 800 ms after feedback with a 200 ms</w:t>
+      </w:r>
+      <w:r>
+        <w:t xml:space="preserve"> </w:t>
+      </w:r>
+      <w:r>
+        <w:t xml:space="preserve">pre-feedback baseline, and cleaned for movement and eye-related artifacts using ICA</w:t>
+      </w:r>
+      <w:r>
+        <w:t xml:space="preserve"> </w:t>
+      </w:r>
+      <w:r>
+        <w:t xml:space="preserve">(Hajiaboo et al., 2025) [confirm: same 39-participant subset]. The present analyses</w:t>
+      </w:r>
+      <w:r>
+        <w:t xml:space="preserve"> </w:t>
+      </w:r>
+      <w:r>
+        <w:t xml:space="preserve">used the exported single-trial features and retained the analysis windows specified</w:t>
+      </w:r>
+      <w:r>
+        <w:t xml:space="preserve"> </w:t>
+      </w:r>
+      <w:r>
+        <w:t xml:space="preserve">for this manuscript: FRN, 360-430 ms; P300, 450-550 ms.</w:t>
       </w:r>
     </w:p>
     <w:bookmarkEnd w:id="13"/>
@@ -804,6 +1010,36 @@
         <w:pStyle w:val="FirstParagraph"/>
       </w:pPr>
       <w:r>
+        <w:t xml:space="preserve">Chronotype was measured with the Morningness-Eveningness Questionnaire (MEQ; Horne &amp;</w:t>
+      </w:r>
+      <w:r>
+        <w:t xml:space="preserve"> </w:t>
+      </w:r>
+      <w:r>
+        <w:t xml:space="preserve">Ostberg, 1976) and the Munich ChronoType Questionnaire (MCTQ; Hajiaboo et al., 2025;</w:t>
+      </w:r>
+      <w:r>
+        <w:t xml:space="preserve"> </w:t>
+      </w:r>
+      <w:r>
+        <w:t xml:space="preserve">Roenneberg et al., 2003). Following the published classification rule, MEQ scores &lt;=</w:t>
+      </w:r>
+      <w:r>
+        <w:t xml:space="preserve"> </w:t>
+      </w:r>
+      <w:r>
+        <w:t xml:space="preserve">41 were classified as Evening, MEQ scores &gt;= 59 as Morning, and scores from 42 to 58</w:t>
+      </w:r>
+      <w:r>
+        <w:t xml:space="preserve"> </w:t>
+      </w:r>
+      <w:r>
+        <w:t xml:space="preserve">as intermediate (Hajiaboo et al., 2025) [confirm: same 39-participant subset].</w:t>
+      </w:r>
+      <w:r>
+        <w:t xml:space="preserve"> </w:t>
+      </w:r>
+      <w:r>
         <w:t xml:space="preserve">Primary chronotype labels were Morning and Evening categories from study metadata.</w:t>
       </w:r>
       <w:r>
@@ -896,13 +1132,13 @@
         <w:t xml:space="preserve"> </w:t>
       </w:r>
       <w:r>
-        <w:t xml:space="preserve">intermediate range, where a binary classification is less sharp.</w:t>
-      </w:r>
-      <w:r>
-        <w:t xml:space="preserve"> </w:t>
-      </w:r>
-      <w:r>
-        <w:t xml:space="preserve">[AUTHOR INPUT: confirm the binary cutoff/median-split rule.]</w:t>
+        <w:t xml:space="preserve">intermediate range, where a binary classification is less sharp. [confirm: same</w:t>
+      </w:r>
+      <w:r>
+        <w:t xml:space="preserve"> </w:t>
+      </w:r>
+      <w:r>
+        <w:t xml:space="preserve">39-participant subset]</w:t>
       </w:r>
     </w:p>
     <w:bookmarkEnd w:id="14"/>
@@ -1874,37 +2110,49 @@
         <w:pStyle w:val="FirstParagraph"/>
       </w:pPr>
       <w:r>
-        <w:t xml:space="preserve">Evening participants tended to choose the risky option more often than Morning</w:t>
-      </w:r>
-      <w:r>
-        <w:t xml:space="preserve"> </w:t>
-      </w:r>
-      <w:r>
-        <w:t xml:space="preserve">participants. The largest uncorrected effects were for loss-error risky rate (d =</w:t>
-      </w:r>
-      <w:r>
-        <w:t xml:space="preserve"> </w:t>
-      </w:r>
-      <w:r>
-        <w:t xml:space="preserve">0.81), free risky rate (d = 0.80), and gain-correct risky rate (d = 0.77), with all</w:t>
-      </w:r>
-      <w:r>
-        <w:t xml:space="preserve"> </w:t>
-      </w:r>
-      <w:r>
-        <w:t xml:space="preserve">Welch p-values below 0.025. These effects did not survive FDR correction, and their</w:t>
-      </w:r>
-      <w:r>
-        <w:t xml:space="preserve"> </w:t>
-      </w:r>
-      <w:r>
-        <w:t xml:space="preserve">confidence intervals remained compatible with small effects. The behavioural group</w:t>
-      </w:r>
-      <w:r>
-        <w:t xml:space="preserve"> </w:t>
-      </w:r>
-      <w:r>
-        <w:t xml:space="preserve">differences are therefore supportive rather than primary.</w:t>
+        <w:t xml:space="preserve">Consistent with the previously reported behavioural difference in this cohort</w:t>
+      </w:r>
+      <w:r>
+        <w:t xml:space="preserve"> </w:t>
+      </w:r>
+      <w:r>
+        <w:t xml:space="preserve">(Hajiaboo et al., 2025), Evening participants tended to choose the risky option more</w:t>
+      </w:r>
+      <w:r>
+        <w:t xml:space="preserve"> </w:t>
+      </w:r>
+      <w:r>
+        <w:t xml:space="preserve">often than Morning participants. In the present feature set, the largest uncorrected</w:t>
+      </w:r>
+      <w:r>
+        <w:t xml:space="preserve"> </w:t>
+      </w:r>
+      <w:r>
+        <w:t xml:space="preserve">effects were for loss-error risky rate (d = 0.81), free risky rate (d = 0.80), and</w:t>
+      </w:r>
+      <w:r>
+        <w:t xml:space="preserve"> </w:t>
+      </w:r>
+      <w:r>
+        <w:t xml:space="preserve">gain-correct risky rate (d = 0.77), with all Welch p-values below 0.025. These</w:t>
+      </w:r>
+      <w:r>
+        <w:t xml:space="preserve"> </w:t>
+      </w:r>
+      <w:r>
+        <w:t xml:space="preserve">effects did not survive FDR correction, and their confidence intervals remained</w:t>
+      </w:r>
+      <w:r>
+        <w:t xml:space="preserve"> </w:t>
+      </w:r>
+      <w:r>
+        <w:t xml:space="preserve">compatible with small effects. The behavioural group differences are therefore</w:t>
+      </w:r>
+      <w:r>
+        <w:t xml:space="preserve"> </w:t>
+      </w:r>
+      <w:r>
+        <w:t xml:space="preserve">supportive prior context rather than a primary novel finding of this manuscript.</w:t>
       </w:r>
     </w:p>
     <w:p>
@@ -1912,43 +2160,67 @@
         <w:pStyle w:val="BodyText"/>
       </w:pPr>
       <w:r>
-        <w:t xml:space="preserve">Frontocentral FRN contrasts did not show reliable group differences. For example,</w:t>
-      </w:r>
-      <w:r>
-        <w:t xml:space="preserve"> </w:t>
-      </w:r>
-      <w:r>
-        <w:t xml:space="preserve">the Fz FRN error-minus-correct contrast had d = -0.60 and FDR p = 0.14. Bayes</w:t>
-      </w:r>
-      <w:r>
-        <w:t xml:space="preserve"> </w:t>
-      </w:r>
-      <w:r>
-        <w:t xml:space="preserve">factors were most consistent with a null group difference at FCz (BF01 = 2.46) and</w:t>
-      </w:r>
-      <w:r>
-        <w:t xml:space="preserve"> </w:t>
-      </w:r>
-      <w:r>
-        <w:t xml:space="preserve">Cz (BF01 = 3.17), while the Fz result remained inconclusive (BF01 = 0.82).</w:t>
-      </w:r>
-      <w:r>
-        <w:t xml:space="preserve"> </w:t>
-      </w:r>
-      <w:r>
-        <w:t xml:space="preserve">Equivalence tests with bounds of ±0.5 SD did not establish formal equivalence (for</w:t>
-      </w:r>
-      <w:r>
-        <w:t xml:space="preserve"> </w:t>
-      </w:r>
-      <w:r>
-        <w:t xml:space="preserve">example, Fz TOST p = 0.43; Supplementary Tables S7 and S8). Thus, the FRN results do not support a chronotype</w:t>
-      </w:r>
-      <w:r>
-        <w:t xml:space="preserve"> </w:t>
-      </w:r>
-      <w:r>
-        <w:t xml:space="preserve">effect, but the sample is not large enough to rule out medium-sized FRN differences.</w:t>
+        <w:t xml:space="preserve">Frontocentral FRN difference contrasts did not show reliable group differences in</w:t>
+      </w:r>
+      <w:r>
+        <w:t xml:space="preserve"> </w:t>
+      </w:r>
+      <w:r>
+        <w:t xml:space="preserve">the present feature set. For example, the Fz FRN error-minus-correct contrast had d =</w:t>
+      </w:r>
+      <w:r>
+        <w:t xml:space="preserve"> </w:t>
+      </w:r>
+      <w:r>
+        <w:t xml:space="preserve">-0.60 and FDR p = 0.14. Bayes factors were most consistent with a null group</w:t>
+      </w:r>
+      <w:r>
+        <w:t xml:space="preserve"> </w:t>
+      </w:r>
+      <w:r>
+        <w:t xml:space="preserve">difference at FCz (BF01 = 2.46) and Cz (BF01 = 3.17), while the Fz result remained</w:t>
+      </w:r>
+      <w:r>
+        <w:t xml:space="preserve"> </w:t>
+      </w:r>
+      <w:r>
+        <w:t xml:space="preserve">inconclusive (BF01 = 0.82). Equivalence tests with bounds of +/-0.5 SD did not</w:t>
+      </w:r>
+      <w:r>
+        <w:t xml:space="preserve"> </w:t>
+      </w:r>
+      <w:r>
+        <w:t xml:space="preserve">establish formal equivalence (for example, Fz TOST p = 0.43; Supplementary Tables S7</w:t>
+      </w:r>
+      <w:r>
+        <w:t xml:space="preserve"> </w:t>
+      </w:r>
+      <w:r>
+        <w:t xml:space="preserve">and S8). These contrast-level results should not be read as contradicting the</w:t>
+      </w:r>
+      <w:r>
+        <w:t xml:space="preserve"> </w:t>
+      </w:r>
+      <w:r>
+        <w:t xml:space="preserve">published FRN-chronotype finding in the same cohort, which concerned FRN amplitudes</w:t>
+      </w:r>
+      <w:r>
+        <w:t xml:space="preserve"> </w:t>
+      </w:r>
+      <w:r>
+        <w:t xml:space="preserve">and MEQ/MCTQ associations at Fz and FCz across feedback conditions (Hajiaboo et al.,</w:t>
+      </w:r>
+      <w:r>
+        <w:t xml:space="preserve"> </w:t>
+      </w:r>
+      <w:r>
+        <w:t xml:space="preserve">2025). The present null is specific to our selected difference contrasts and remains</w:t>
+      </w:r>
+      <w:r>
+        <w:t xml:space="preserve"> </w:t>
+      </w:r>
+      <w:r>
+        <w:t xml:space="preserve">underpowered for medium-sized FRN contrast effects.</w:t>
       </w:r>
     </w:p>
     <w:bookmarkEnd w:id="25"/>
@@ -2144,49 +2416,73 @@
         <w:pStyle w:val="BodyText"/>
       </w:pPr>
       <w:r>
-        <w:t xml:space="preserve">Because sex and age were imbalanced across groups (Evening 68% male and about two</w:t>
-      </w:r>
-      <w:r>
-        <w:t xml:space="preserve"> </w:t>
-      </w:r>
-      <w:r>
-        <w:t xml:space="preserve">years older than Morning), we re-tested the posterior-P300 contrast with sex and</w:t>
-      </w:r>
-      <w:r>
-        <w:t xml:space="preserve"> </w:t>
-      </w:r>
-      <w:r>
-        <w:t xml:space="preserve">age as covariates. The Pz effect remained significant (adjusted Morning-vs-Evening</w:t>
-      </w:r>
-      <w:r>
-        <w:t xml:space="preserve"> </w:t>
-      </w:r>
-      <w:r>
-        <w:t xml:space="preserve">b = 0.88, p = 0.041, partial d approximately 0.72), with neither sex (p = 0.24) nor</w:t>
-      </w:r>
-      <w:r>
-        <w:t xml:space="preserve"> </w:t>
-      </w:r>
-      <w:r>
-        <w:t xml:space="preserve">age (p = 0.12) contributing. The POz effect attenuated to non-significance (adjusted</w:t>
-      </w:r>
-      <w:r>
-        <w:t xml:space="preserve"> </w:t>
-      </w:r>
-      <w:r>
-        <w:t xml:space="preserve">p = 0.12), and age was a significant covariate there (p = 0.010). The primary Pz</w:t>
-      </w:r>
-      <w:r>
-        <w:t xml:space="preserve"> </w:t>
-      </w:r>
-      <w:r>
-        <w:t xml:space="preserve">effect is therefore not attributable to the sex/age imbalance, whereas the POz</w:t>
-      </w:r>
-      <w:r>
-        <w:t xml:space="preserve"> </w:t>
-      </w:r>
-      <w:r>
-        <w:t xml:space="preserve">effect is partly related to age and should be interpreted more cautiously.</w:t>
+        <w:t xml:space="preserve">Because sex and age were imbalanced across groups (Evening participants were more</w:t>
+      </w:r>
+      <w:r>
+        <w:t xml:space="preserve"> </w:t>
+      </w:r>
+      <w:r>
+        <w:t xml:space="preserve">often male and about two years older than Morning; §2.1), we re-tested the</w:t>
+      </w:r>
+      <w:r>
+        <w:t xml:space="preserve"> </w:t>
+      </w:r>
+      <w:r>
+        <w:t xml:space="preserve">posterior-P300 contrast with sex and age as covariates. The Pz effect remained</w:t>
+      </w:r>
+      <w:r>
+        <w:t xml:space="preserve"> </w:t>
+      </w:r>
+      <w:r>
+        <w:t xml:space="preserve">significant (adjusted Morning-vs-Evening b = 0.88, p = 0.041, partial d</w:t>
+      </w:r>
+      <w:r>
+        <w:t xml:space="preserve"> </w:t>
+      </w:r>
+      <w:r>
+        <w:t xml:space="preserve">approximately 0.72), with neither sex (p = 0.24) nor age (p = 0.12) contributing.</w:t>
+      </w:r>
+      <w:r>
+        <w:t xml:space="preserve"> </w:t>
+      </w:r>
+      <w:r>
+        <w:t xml:space="preserve">The POz effect attenuated to non-significance (adjusted p = 0.12), and age was a</w:t>
+      </w:r>
+      <w:r>
+        <w:t xml:space="preserve"> </w:t>
+      </w:r>
+      <w:r>
+        <w:t xml:space="preserve">significant covariate there (p = 0.010). The primary Pz effect is therefore not</w:t>
+      </w:r>
+      <w:r>
+        <w:t xml:space="preserve"> </w:t>
+      </w:r>
+      <w:r>
+        <w:t xml:space="preserve">attributable to the sex/age imbalance, whereas the POz effect is partly related to</w:t>
+      </w:r>
+      <w:r>
+        <w:t xml:space="preserve"> </w:t>
+      </w:r>
+      <w:r>
+        <w:t xml:space="preserve">age and should be interpreted more cautiously. These adjustments used the current</w:t>
+      </w:r>
+      <w:r>
+        <w:t xml:space="preserve"> </w:t>
+      </w:r>
+      <w:r>
+        <w:t xml:space="preserve">dataset sex coding, which is being reconciled against the published demographic</w:t>
+      </w:r>
+      <w:r>
+        <w:t xml:space="preserve"> </w:t>
+      </w:r>
+      <w:r>
+        <w:t xml:space="preserve">record (§2.1 and Limitations); a discrepancy of about two participants would not</w:t>
+      </w:r>
+      <w:r>
+        <w:t xml:space="preserve"> </w:t>
+      </w:r>
+      <w:r>
+        <w:t xml:space="preserve">change the qualitative conclusion.</w:t>
       </w:r>
     </w:p>
     <w:bookmarkEnd w:id="27"/>
@@ -3271,6 +3567,26 @@
         <w:t xml:space="preserve">4. Discussion</w:t>
       </w:r>
     </w:p>
+    <w:p>
+      <w:pPr>
+        <w:pStyle w:val="FirstParagraph"/>
+      </w:pPr>
+      <w:r>
+        <w:t xml:space="preserve">[AUTHOR INPUT: senior-author confirmation of positioning relative to Hajiaboo et al.</w:t>
+      </w:r>
+      <w:r>
+        <w:t xml:space="preserve"> </w:t>
+      </w:r>
+      <w:r>
+        <w:t xml:space="preserve">(2025) — Dr Heysiattalab is an author on both papers; the published paper spells the</w:t>
+      </w:r>
+      <w:r>
+        <w:t xml:space="preserve"> </w:t>
+      </w:r>
+      <w:r>
+        <w:t xml:space="preserve">name as Heysieattalab.]</w:t>
+      </w:r>
+    </w:p>
     <w:bookmarkStart w:id="37" w:name="overview"/>
     <w:p>
       <w:pPr>
@@ -3285,73 +3601,79 @@
         <w:pStyle w:val="FirstParagraph"/>
       </w:pPr>
       <w:r>
-        <w:t xml:space="preserve">In a single cohort of 39 participants, chronotype was related to both the neural and</w:t>
-      </w:r>
-      <w:r>
-        <w:t xml:space="preserve"> </w:t>
-      </w:r>
-      <w:r>
-        <w:t xml:space="preserve">behavioural evaluation of decision feedback. Four findings anchor the account.</w:t>
-      </w:r>
-      <w:r>
-        <w:t xml:space="preserve"> </w:t>
-      </w:r>
-      <w:r>
-        <w:t xml:space="preserve">First, Morning and Evening chronotypes differed in the feedback-locked posterior</w:t>
-      </w:r>
-      <w:r>
-        <w:t xml:space="preserve"> </w:t>
-      </w:r>
-      <w:r>
-        <w:t xml:space="preserve">P300 to outcome valence. Second, chronotype could be predicted from risky-choice</w:t>
-      </w:r>
-      <w:r>
-        <w:t xml:space="preserve"> </w:t>
-      </w:r>
-      <w:r>
-        <w:t xml:space="preserve">dynamics alone. Third, combining behavioural dynamics with validated ERP contrasts</w:t>
-      </w:r>
-      <w:r>
-        <w:t xml:space="preserve"> </w:t>
-      </w:r>
-      <w:r>
-        <w:t xml:space="preserve">predicted chronotype better than either modality alone and also predicted continuous</w:t>
-      </w:r>
-      <w:r>
-        <w:t xml:space="preserve"> </w:t>
-      </w:r>
-      <w:r>
-        <w:t xml:space="preserve">MEQ score. Fourth, two planned negative tests, end-to-end EEG decoding and</w:t>
-      </w:r>
-      <w:r>
-        <w:t xml:space="preserve"> </w:t>
-      </w:r>
-      <w:r>
-        <w:t xml:space="preserve">within-subject single-trial coupling, placed the effect at the between-participant</w:t>
-      </w:r>
-      <w:r>
-        <w:t xml:space="preserve"> </w:t>
-      </w:r>
-      <w:r>
-        <w:t xml:space="preserve">trait level rather than at the level of moment-to-moment neural control of choice.</w:t>
-      </w:r>
-      <w:r>
-        <w:t xml:space="preserve"> </w:t>
-      </w:r>
-      <w:r>
-        <w:t xml:space="preserve">All predictive analyses used participant-generalizing cross-validation and</w:t>
-      </w:r>
-      <w:r>
-        <w:t xml:space="preserve"> </w:t>
-      </w:r>
-      <w:r>
-        <w:t xml:space="preserve">permutation testing. The main evidentiary value is the agreement across distinct</w:t>
-      </w:r>
-      <w:r>
-        <w:t xml:space="preserve"> </w:t>
-      </w:r>
-      <w:r>
-        <w:t xml:space="preserve">analyses, not the accuracy of any single model.</w:t>
+        <w:t xml:space="preserve">This manuscript is a computational and multivariate follow-up to the prior</w:t>
+      </w:r>
+      <w:r>
+        <w:t xml:space="preserve"> </w:t>
+      </w:r>
+      <w:r>
+        <w:t xml:space="preserve">univariate ERP report on the same cohort (Hajiaboo et al., 2025). In that context,</w:t>
+      </w:r>
+      <w:r>
+        <w:t xml:space="preserve"> </w:t>
+      </w:r>
+      <w:r>
+        <w:t xml:space="preserve">four findings anchor the present account. First, Morning and Evening chronotypes</w:t>
+      </w:r>
+      <w:r>
+        <w:t xml:space="preserve"> </w:t>
+      </w:r>
+      <w:r>
+        <w:t xml:space="preserve">differed in the feedback-locked posterior P300 loss-minus-gain contrast. Second,</w:t>
+      </w:r>
+      <w:r>
+        <w:t xml:space="preserve"> </w:t>
+      </w:r>
+      <w:r>
+        <w:t xml:space="preserve">chronotype could be predicted from risky-choice dynamics alone. Third, combining</w:t>
+      </w:r>
+      <w:r>
+        <w:t xml:space="preserve"> </w:t>
+      </w:r>
+      <w:r>
+        <w:t xml:space="preserve">behavioural dynamics with validated ERP contrasts predicted chronotype better than</w:t>
+      </w:r>
+      <w:r>
+        <w:t xml:space="preserve"> </w:t>
+      </w:r>
+      <w:r>
+        <w:t xml:space="preserve">either modality alone and also predicted continuous MEQ score. Fourth, two planned</w:t>
+      </w:r>
+      <w:r>
+        <w:t xml:space="preserve"> </w:t>
+      </w:r>
+      <w:r>
+        <w:t xml:space="preserve">negative tests, end-to-end EEG decoding and within-subject single-trial coupling,</w:t>
+      </w:r>
+      <w:r>
+        <w:t xml:space="preserve"> </w:t>
+      </w:r>
+      <w:r>
+        <w:t xml:space="preserve">placed the effect at the between-participant trait level rather than at the level of</w:t>
+      </w:r>
+      <w:r>
+        <w:t xml:space="preserve"> </w:t>
+      </w:r>
+      <w:r>
+        <w:t xml:space="preserve">moment-to-moment neural control of choice. All predictive analyses used</w:t>
+      </w:r>
+      <w:r>
+        <w:t xml:space="preserve"> </w:t>
+      </w:r>
+      <w:r>
+        <w:t xml:space="preserve">participant-generalizing cross-validation and permutation testing. The main</w:t>
+      </w:r>
+      <w:r>
+        <w:t xml:space="preserve"> </w:t>
+      </w:r>
+      <w:r>
+        <w:t xml:space="preserve">evidentiary value is the agreement across distinct analyses, not the accuracy of any</w:t>
+      </w:r>
+      <w:r>
+        <w:t xml:space="preserve"> </w:t>
+      </w:r>
+      <w:r>
+        <w:t xml:space="preserve">single model.</w:t>
       </w:r>
     </w:p>
     <w:bookmarkEnd w:id="37"/>
@@ -3393,13 +3715,13 @@
         <w:t xml:space="preserve"> </w:t>
       </w:r>
       <w:r>
-        <w:t xml:space="preserve">was directionally consistent with the continuous MEQ analysis. Because posterior</w:t>
-      </w:r>
-      <w:r>
-        <w:t xml:space="preserve"> </w:t>
-      </w:r>
-      <w:r>
-        <w:t xml:space="preserve">P300 amplitude is linked to motivational salience and subjective outcome</w:t>
+        <w:t xml:space="preserve">was directionally consistent, although weak, in the continuous MEQ analysis. Because</w:t>
+      </w:r>
+      <w:r>
+        <w:t xml:space="preserve"> </w:t>
+      </w:r>
+      <w:r>
+        <w:t xml:space="preserve">posterior P300 amplitude is linked to motivational salience and subjective outcome</w:t>
       </w:r>
       <w:r>
         <w:t xml:space="preserve"> </w:t>
@@ -3449,91 +3771,99 @@
         <w:t xml:space="preserve"> </w:t>
       </w:r>
       <w:r>
-        <w:t xml:space="preserve">reward motivation (Murray et al., 2009). A smaller posterior-P300 response to losses</w:t>
-      </w:r>
-      <w:r>
-        <w:t xml:space="preserve"> </w:t>
-      </w:r>
-      <w:r>
-        <w:t xml:space="preserve">than gains in Evening participants is consistent with a profile in which losses</w:t>
-      </w:r>
-      <w:r>
-        <w:t xml:space="preserve"> </w:t>
-      </w:r>
-      <w:r>
-        <w:t xml:space="preserve">carry less relative weight during feedback evaluation (cf. loss aversion; Kahneman &amp;</w:t>
-      </w:r>
-      <w:r>
-        <w:t xml:space="preserve"> </w:t>
-      </w:r>
-      <w:r>
-        <w:t xml:space="preserve">Tversky, 1979). [AUTHOR INPUT: the team may sharpen this direction-of-effect link</w:t>
-      </w:r>
-      <w:r>
-        <w:t xml:space="preserve"> </w:t>
-      </w:r>
-      <w:r>
-        <w:t xml:space="preserve">to the specific prior findings it wishes to foreground.] The dissociation between the P300 and the FRN is theoretically informative rather</w:t>
-      </w:r>
-      <w:r>
-        <w:t xml:space="preserve"> </w:t>
-      </w:r>
-      <w:r>
-        <w:t xml:space="preserve">than merely a pattern of one significant and one null test. The FRN, and its</w:t>
-      </w:r>
-      <w:r>
-        <w:t xml:space="preserve"> </w:t>
-      </w:r>
-      <w:r>
-        <w:t xml:space="preserve">positive-going counterpart the reward positivity, indexes a fast, relatively</w:t>
-      </w:r>
-      <w:r>
-        <w:t xml:space="preserve"> </w:t>
-      </w:r>
-      <w:r>
-        <w:t xml:space="preserve">automatic valence and reward-prediction-error evaluation of outcomes (Holroyd &amp;</w:t>
-      </w:r>
-      <w:r>
-        <w:t xml:space="preserve"> </w:t>
-      </w:r>
-      <w:r>
-        <w:t xml:space="preserve">Coles, 2002; Proudfit, 2015; Sambrook &amp; Goslin, 2015), whereas the posterior P300</w:t>
-      </w:r>
-      <w:r>
-        <w:t xml:space="preserve"> </w:t>
-      </w:r>
-      <w:r>
-        <w:t xml:space="preserve">indexes a later, more elaborative weighting of outcome salience and significance</w:t>
-      </w:r>
-      <w:r>
-        <w:t xml:space="preserve"> </w:t>
-      </w:r>
-      <w:r>
-        <w:t xml:space="preserve">(Polich, 2007; Yeung &amp; Sanfey, 2004). That chronotype was expressed in the P300 but</w:t>
-      </w:r>
-      <w:r>
-        <w:t xml:space="preserve"> </w:t>
-      </w:r>
-      <w:r>
-        <w:t xml:space="preserve">not the FRN suggests the difference lies in how much motivational significance is</w:t>
-      </w:r>
-      <w:r>
-        <w:t xml:space="preserve"> </w:t>
-      </w:r>
-      <w:r>
-        <w:t xml:space="preserve">assigned to gains relative to losses during this later appraisal stage, rather than</w:t>
-      </w:r>
-      <w:r>
-        <w:t xml:space="preserve"> </w:t>
-      </w:r>
-      <w:r>
-        <w:t xml:space="preserve">in the initial registration of outcome valence — a more specific account than a</w:t>
-      </w:r>
-      <w:r>
-        <w:t xml:space="preserve"> </w:t>
-      </w:r>
-      <w:r>
-        <w:t xml:space="preserve">general claim that chronotype affects feedback processing.</w:t>
+        <w:t xml:space="preserve">reward motivation (Murray et al., 2009). It is also consistent with the behavioural</w:t>
+      </w:r>
+      <w:r>
+        <w:t xml:space="preserve"> </w:t>
+      </w:r>
+      <w:r>
+        <w:t xml:space="preserve">risk-taking difference previously reported in this cohort (Hajiaboo et al., 2025). A</w:t>
+      </w:r>
+      <w:r>
+        <w:t xml:space="preserve"> </w:t>
+      </w:r>
+      <w:r>
+        <w:t xml:space="preserve">smaller posterior-P300 response to losses than gains in Evening participants is</w:t>
+      </w:r>
+      <w:r>
+        <w:t xml:space="preserve"> </w:t>
+      </w:r>
+      <w:r>
+        <w:t xml:space="preserve">consistent with a profile in which losses carry less relative weight during feedback</w:t>
+      </w:r>
+      <w:r>
+        <w:t xml:space="preserve"> </w:t>
+      </w:r>
+      <w:r>
+        <w:t xml:space="preserve">evaluation (cf. loss aversion; Kahneman &amp; Tversky, 1979). [AUTHOR INPUT: the team</w:t>
+      </w:r>
+      <w:r>
+        <w:t xml:space="preserve"> </w:t>
+      </w:r>
+      <w:r>
+        <w:t xml:space="preserve">may sharpen this direction-of-effect link to the specific prior findings it wishes to</w:t>
+      </w:r>
+      <w:r>
+        <w:t xml:space="preserve"> </w:t>
+      </w:r>
+      <w:r>
+        <w:t xml:space="preserve">foreground.]</w:t>
+      </w:r>
+    </w:p>
+    <w:p>
+      <w:pPr>
+        <w:pStyle w:val="BodyText"/>
+      </w:pPr>
+      <w:r>
+        <w:t xml:space="preserve">The prior FRN findings and the present P300 contrast address different quantities.</w:t>
+      </w:r>
+      <w:r>
+        <w:t xml:space="preserve"> </w:t>
+      </w:r>
+      <w:r>
+        <w:t xml:space="preserve">Hajiaboo et al. (2025) reported chronotype-related FRN amplitude effects and</w:t>
+      </w:r>
+      <w:r>
+        <w:t xml:space="preserve"> </w:t>
+      </w:r>
+      <w:r>
+        <w:t xml:space="preserve">MEQ/MCTQ-FRN associations at Fz and FCz, with MEQ models reaching R2 values of about</w:t>
+      </w:r>
+      <w:r>
+        <w:t xml:space="preserve"> </w:t>
+      </w:r>
+      <w:r>
+        <w:t xml:space="preserve">0.38. The present manuscript did not retest that same amplitude-MEQ question as its</w:t>
+      </w:r>
+      <w:r>
+        <w:t xml:space="preserve"> </w:t>
+      </w:r>
+      <w:r>
+        <w:t xml:space="preserve">primary neural feature; it evaluated FRN error-minus-correct and loss-minus-gain</w:t>
+      </w:r>
+      <w:r>
+        <w:t xml:space="preserve"> </w:t>
+      </w:r>
+      <w:r>
+        <w:t xml:space="preserve">difference contrasts. A null or inconclusive result for those FRN contrasts is</w:t>
+      </w:r>
+      <w:r>
+        <w:t xml:space="preserve"> </w:t>
+      </w:r>
+      <w:r>
+        <w:t xml:space="preserve">therefore not in tension with the published amplitude-MEQ association. The safer</w:t>
+      </w:r>
+      <w:r>
+        <w:t xml:space="preserve"> </w:t>
+      </w:r>
+      <w:r>
+        <w:t xml:space="preserve">interpretation is that the novel group-separating feature isolated here was the</w:t>
+      </w:r>
+      <w:r>
+        <w:t xml:space="preserve"> </w:t>
+      </w:r>
+      <w:r>
+        <w:t xml:space="preserve">posterior P300 loss-minus-gain contrast.</w:t>
       </w:r>
     </w:p>
     <w:bookmarkEnd w:id="38"/>
@@ -3894,6 +4224,68 @@
         <w:t xml:space="preserve">primary outcome.</w:t>
       </w:r>
     </w:p>
+    <w:p>
+      <w:pPr>
+        <w:pStyle w:val="BodyText"/>
+      </w:pPr>
+      <w:r>
+        <w:t xml:space="preserve">The P300 findings also need to be read against the prior paper. Hajiaboo et al.</w:t>
+      </w:r>
+      <w:r>
+        <w:t xml:space="preserve"> </w:t>
+      </w:r>
+      <w:r>
+        <w:t xml:space="preserve">(2025) reported no chronotype main effect on P300 amplitude and no MEQ-P300</w:t>
+      </w:r>
+      <w:r>
+        <w:t xml:space="preserve"> </w:t>
+      </w:r>
+      <w:r>
+        <w:t xml:space="preserve">correlation at Pz or Cz, but did report a Pz feedback-by-chronotype interaction (p =</w:t>
+      </w:r>
+      <w:r>
+        <w:t xml:space="preserve"> </w:t>
+      </w:r>
+      <w:r>
+        <w:t xml:space="preserve">.043). That interaction is condition-dependent P300 modulation by chronotype, which</w:t>
+      </w:r>
+      <w:r>
+        <w:t xml:space="preserve"> </w:t>
+      </w:r>
+      <w:r>
+        <w:t xml:space="preserve">is the pattern the present loss-minus-gain contrast was designed to isolate more</w:t>
+      </w:r>
+      <w:r>
+        <w:t xml:space="preserve"> </w:t>
+      </w:r>
+      <w:r>
+        <w:t xml:space="preserve">directly. At the same time, our continuous MEQ association for the Pz contrast was</w:t>
+      </w:r>
+      <w:r>
+        <w:t xml:space="preserve"> </w:t>
+      </w:r>
+      <w:r>
+        <w:t xml:space="preserve">weak (r = 0.29) and the POz association included zero, so the continuous analysis is</w:t>
+      </w:r>
+      <w:r>
+        <w:t xml:space="preserve"> </w:t>
+      </w:r>
+      <w:r>
+        <w:t xml:space="preserve">consistent with their null MEQ-P300 correlations. The strongest P300 evidence in the</w:t>
+      </w:r>
+      <w:r>
+        <w:t xml:space="preserve"> </w:t>
+      </w:r>
+      <w:r>
+        <w:t xml:space="preserve">present manuscript is specifically the binary group contrast on the posterior</w:t>
+      </w:r>
+      <w:r>
+        <w:t xml:space="preserve"> </w:t>
+      </w:r>
+      <w:r>
+        <w:t xml:space="preserve">difference wave, not a strong continuous MEQ-P300 relationship.</w:t>
+      </w:r>
+    </w:p>
     <w:bookmarkEnd w:id="42"/>
     <w:bookmarkStart w:id="43" w:name="conclusion"/>
     <w:p>
@@ -3909,49 +4301,73 @@
         <w:pStyle w:val="FirstParagraph"/>
       </w:pPr>
       <w:r>
-        <w:t xml:space="preserve">This single-cohort study provides preliminary evidence that chronotype is related to</w:t>
-      </w:r>
-      <w:r>
-        <w:t xml:space="preserve"> </w:t>
-      </w:r>
-      <w:r>
-        <w:t xml:space="preserve">the neural evaluation of decision feedback, with the clearest effect in the</w:t>
-      </w:r>
-      <w:r>
-        <w:t xml:space="preserve"> </w:t>
-      </w:r>
-      <w:r>
-        <w:t xml:space="preserve">posterior P300. Behavioural choice dynamics carried additional chronotype</w:t>
-      </w:r>
-      <w:r>
-        <w:t xml:space="preserve"> </w:t>
-      </w:r>
-      <w:r>
-        <w:t xml:space="preserve">information, and combining behavioural and ERP features gave the strongest</w:t>
-      </w:r>
-      <w:r>
-        <w:t xml:space="preserve"> </w:t>
-      </w:r>
-      <w:r>
-        <w:t xml:space="preserve">prediction of both categorical chronotype and continuous MEQ score. The findings</w:t>
-      </w:r>
-      <w:r>
-        <w:t xml:space="preserve"> </w:t>
-      </w:r>
-      <w:r>
-        <w:t xml:space="preserve">are internally validated and require independent replication, but they show how</w:t>
-      </w:r>
-      <w:r>
-        <w:t xml:space="preserve"> </w:t>
-      </w:r>
-      <w:r>
-        <w:t xml:space="preserve">carefully constrained ERP features and behavioural sequence models can be combined</w:t>
-      </w:r>
-      <w:r>
-        <w:t xml:space="preserve"> </w:t>
-      </w:r>
-      <w:r>
-        <w:t xml:space="preserve">to study stable individual differences in modest samples.</w:t>
+        <w:t xml:space="preserve">This single-cohort follow-up provides preliminary evidence that the posterior P300</w:t>
+      </w:r>
+      <w:r>
+        <w:t xml:space="preserve"> </w:t>
+      </w:r>
+      <w:r>
+        <w:t xml:space="preserve">loss-minus-gain contrast is a group-separating feature of chronotype in these data,</w:t>
+      </w:r>
+      <w:r>
+        <w:t xml:space="preserve"> </w:t>
+      </w:r>
+      <w:r>
+        <w:t xml:space="preserve">building on the behavioural and FRN findings already reported by Hajiaboo et al.</w:t>
+      </w:r>
+      <w:r>
+        <w:t xml:space="preserve"> </w:t>
+      </w:r>
+      <w:r>
+        <w:t xml:space="preserve">(2025). Behavioural choice dynamics carried additional chronotype information, and</w:t>
+      </w:r>
+      <w:r>
+        <w:t xml:space="preserve"> </w:t>
+      </w:r>
+      <w:r>
+        <w:t xml:space="preserve">combining behavioural and ERP features gave the strongest prediction of both</w:t>
+      </w:r>
+      <w:r>
+        <w:t xml:space="preserve"> </w:t>
+      </w:r>
+      <w:r>
+        <w:t xml:space="preserve">categorical chronotype and continuous MEQ score. The novel contribution is the</w:t>
+      </w:r>
+      <w:r>
+        <w:t xml:space="preserve"> </w:t>
+      </w:r>
+      <w:r>
+        <w:t xml:space="preserve">posterior-P300 contrast together with the computational strand: GRU behavioural</w:t>
+      </w:r>
+      <w:r>
+        <w:t xml:space="preserve"> </w:t>
+      </w:r>
+      <w:r>
+        <w:t xml:space="preserve">decoding, brain-behaviour fusion, continuous-MEQ prediction, reinforcement-learning</w:t>
+      </w:r>
+      <w:r>
+        <w:t xml:space="preserve"> </w:t>
+      </w:r>
+      <w:r>
+        <w:t xml:space="preserve">analysis, EEGNet, and leakage-safe/permutation-clean validation. The findings are</w:t>
+      </w:r>
+      <w:r>
+        <w:t xml:space="preserve"> </w:t>
+      </w:r>
+      <w:r>
+        <w:t xml:space="preserve">internally validated and require independent replication, but they show how carefully</w:t>
+      </w:r>
+      <w:r>
+        <w:t xml:space="preserve"> </w:t>
+      </w:r>
+      <w:r>
+        <w:t xml:space="preserve">constrained ERP features and behavioural sequence models can be combined to study</w:t>
+      </w:r>
+      <w:r>
+        <w:t xml:space="preserve"> </w:t>
+      </w:r>
+      <w:r>
+        <w:t xml:space="preserve">stable individual differences in modest samples.</w:t>
       </w:r>
     </w:p>
     <w:p>
@@ -4041,25 +4457,49 @@
         </w:numPr>
       </w:pPr>
       <w:r>
-        <w:t xml:space="preserve">Sex and age were imbalanced across chronotype groups (Evening 68% male and about</w:t>
-      </w:r>
-      <w:r>
-        <w:t xml:space="preserve"> </w:t>
-      </w:r>
-      <w:r>
-        <w:t xml:space="preserve">two years older than Morning). The primary Pz P300 effect survived adjustment for</w:t>
-      </w:r>
-      <w:r>
-        <w:t xml:space="preserve"> </w:t>
-      </w:r>
-      <w:r>
-        <w:t xml:space="preserve">both, but the POz effect attenuated to non-significance and was partly related to</w:t>
-      </w:r>
-      <w:r>
-        <w:t xml:space="preserve"> </w:t>
-      </w:r>
-      <w:r>
-        <w:t xml:space="preserve">age; the sample is too small to fully disentangle chronotype from these covariates.</w:t>
+        <w:t xml:space="preserve">Sex and age were imbalanced across chronotype groups (Evening participants more</w:t>
+      </w:r>
+      <w:r>
+        <w:t xml:space="preserve"> </w:t>
+      </w:r>
+      <w:r>
+        <w:t xml:space="preserve">often male and about two years older than Morning). The primary Pz P300 effect</w:t>
+      </w:r>
+      <w:r>
+        <w:t xml:space="preserve"> </w:t>
+      </w:r>
+      <w:r>
+        <w:t xml:space="preserve">survived adjustment for both, but the POz effect attenuated to non-significance and</w:t>
+      </w:r>
+      <w:r>
+        <w:t xml:space="preserve"> </w:t>
+      </w:r>
+      <w:r>
+        <w:t xml:space="preserve">was partly related to age; the sample is too small to fully disentangle chronotype</w:t>
+      </w:r>
+      <w:r>
+        <w:t xml:space="preserve"> </w:t>
+      </w:r>
+      <w:r>
+        <w:t xml:space="preserve">from these covariates. The per-group sex counts in our analysis dataset differ by</w:t>
+      </w:r>
+      <w:r>
+        <w:t xml:space="preserve"> </w:t>
+      </w:r>
+      <w:r>
+        <w:t xml:space="preserve">about two participants from the published record (Hajiaboo et al., 2025; overall</w:t>
+      </w:r>
+      <w:r>
+        <w:t xml:space="preserve"> </w:t>
+      </w:r>
+      <w:r>
+        <w:t xml:space="preserve">20 male / 19 female agrees); the exact demographic key is being reconciled, and the</w:t>
+      </w:r>
+      <w:r>
+        <w:t xml:space="preserve"> </w:t>
+      </w:r>
+      <w:r>
+        <w:t xml:space="preserve">covariate analysis will be re-verified once confirmed.</w:t>
       </w:r>
     </w:p>
     <w:p>
@@ -4478,7 +4918,7 @@
           <w:i/>
           <w:iCs/>
         </w:rPr>
-        <w:t xml:space="preserve">). One remaining</w:t>
+        <w:t xml:space="preserve">). Remaining</w:t>
       </w:r>
       <w:r>
         <w:rPr>
@@ -4507,7 +4947,7 @@
           <w:i/>
           <w:iCs/>
         </w:rPr>
-        <w:t xml:space="preserve">marker in the text invites team-preferred chronotype-reward</w:t>
+        <w:t xml:space="preserve">markers invite team confirmation of positioning, interpretation,</w:t>
       </w:r>
       <w:r>
         <w:rPr>
@@ -4521,38 +4961,13 @@
           <w:i/>
           <w:iCs/>
         </w:rPr>
-        <w:t xml:space="preserve">citations; Byrne &amp; Murray (2017) was dropped as unverifiable.</w:t>
-      </w:r>
-    </w:p>
-    <w:p>
-      <w:pPr>
-        <w:pStyle w:val="BodyText"/>
-      </w:pPr>
-      <w:r>
-        <w:t xml:space="preserve">Adan, A., Archer, S. N., Hidalgo, M. P., Di Milia, L., Natale, V., &amp; Randler, C. (2012). Circadian typology: A comprehensive review.</w:t>
-      </w:r>
-      <w:r>
-        <w:t xml:space="preserve"> </w:t>
+        <w:t xml:space="preserve">data sharing, and submission details; Byrne &amp; Murray (2017) was dropped as</w:t>
       </w:r>
       <w:r>
         <w:rPr>
           <w:i/>
           <w:iCs/>
         </w:rPr>
-        <w:t xml:space="preserve">Chronobiology International, 29</w:t>
-      </w:r>
-      <w:r>
-        <w:t xml:space="preserve">(9), 1153–1175. https://doi.org/10.3109/07420528.2012.719971</w:t>
-      </w:r>
-    </w:p>
-    <w:p>
-      <w:pPr>
-        <w:pStyle w:val="BodyText"/>
-      </w:pPr>
-      <w:r>
-        <w:t xml:space="preserve">Adan, A., Natale, V., Caci, H., &amp; Prat, G. (2010). Relationship between circadian typology and functional and dysfunctional impulsivity.</w:t>
-      </w:r>
-      <w:r>
         <w:t xml:space="preserve"> </w:t>
       </w:r>
       <w:r>
@@ -4560,10 +4975,7 @@
           <w:i/>
           <w:iCs/>
         </w:rPr>
-        <w:t xml:space="preserve">Chronobiology International, 27</w:t>
-      </w:r>
-      <w:r>
-        <w:t xml:space="preserve">(3), 606–619. https://doi.org/10.3109/07420521003663827</w:t>
+        <w:t xml:space="preserve">unverifiable.</w:t>
       </w:r>
     </w:p>
     <w:p>
@@ -4571,7 +4983,7 @@
         <w:pStyle w:val="BodyText"/>
       </w:pPr>
       <w:r>
-        <w:t xml:space="preserve">Ahn, W.-Y., Haines, N., &amp; Zhang, L. (2017). Revealing neurocomputational mechanisms of reinforcement learning and decision-making with the hBayesDM package.</w:t>
+        <w:t xml:space="preserve">Adan, A., Archer, S. N., Hidalgo, M. P., Di Milia, L., Natale, V., &amp; Randler, C. (2012). Circadian typology: A comprehensive review.</w:t>
       </w:r>
       <w:r>
         <w:t xml:space="preserve"> </w:t>
@@ -4581,10 +4993,10 @@
           <w:i/>
           <w:iCs/>
         </w:rPr>
-        <w:t xml:space="preserve">Computational Psychiatry, 1</w:t>
-      </w:r>
-      <w:r>
-        <w:t xml:space="preserve">, 24–57. https://doi.org/10.1162/CPSY_a_00002</w:t>
+        <w:t xml:space="preserve">Chronobiology International, 29</w:t>
+      </w:r>
+      <w:r>
+        <w:t xml:space="preserve">(9), 1153–1175. https://doi.org/10.3109/07420528.2012.719971</w:t>
       </w:r>
     </w:p>
     <w:p>
@@ -4592,7 +5004,7 @@
         <w:pStyle w:val="BodyText"/>
       </w:pPr>
       <w:r>
-        <w:t xml:space="preserve">Benjamini, Y., &amp; Hochberg, Y. (1995). Controlling the false discovery rate: A practical and powerful approach to multiple testing.</w:t>
+        <w:t xml:space="preserve">Adan, A., Natale, V., Caci, H., &amp; Prat, G. (2010). Relationship between circadian typology and functional and dysfunctional impulsivity.</w:t>
       </w:r>
       <w:r>
         <w:t xml:space="preserve"> </w:t>
@@ -4602,10 +5014,10 @@
           <w:i/>
           <w:iCs/>
         </w:rPr>
-        <w:t xml:space="preserve">Journal of the Royal Statistical Society: Series B (Methodological), 57</w:t>
-      </w:r>
-      <w:r>
-        <w:t xml:space="preserve">(1), 289–300. https://doi.org/10.1111/j.2517-6161.1995.tb02031.x</w:t>
+        <w:t xml:space="preserve">Chronobiology International, 27</w:t>
+      </w:r>
+      <w:r>
+        <w:t xml:space="preserve">(3), 606–619. https://doi.org/10.3109/07420521003663827</w:t>
       </w:r>
     </w:p>
     <w:p>
@@ -4613,7 +5025,7 @@
         <w:pStyle w:val="BodyText"/>
       </w:pPr>
       <w:r>
-        <w:t xml:space="preserve">Cho, K., van Merriënboer, B., Gulcehre, C., Bahdanau, D., Bougares, F., Schwenk, H., &amp; Bengio, Y. (2014). Learning phrase representations using RNN encoder–decoder for statistical machine translation. In</w:t>
+        <w:t xml:space="preserve">Ahn, W.-Y., Haines, N., &amp; Zhang, L. (2017). Revealing neurocomputational mechanisms of reinforcement learning and decision-making with the hBayesDM package.</w:t>
       </w:r>
       <w:r>
         <w:t xml:space="preserve"> </w:t>
@@ -4623,13 +5035,10 @@
           <w:i/>
           <w:iCs/>
         </w:rPr>
-        <w:t xml:space="preserve">Proceedings of the 2014 Conference on Empirical Methods in Natural Language Processing (EMNLP)</w:t>
-      </w:r>
-      <w:r>
-        <w:t xml:space="preserve"> </w:t>
-      </w:r>
-      <w:r>
-        <w:t xml:space="preserve">(pp. 1724–1734). https://doi.org/10.3115/v1/D14-1179</w:t>
+        <w:t xml:space="preserve">Computational Psychiatry, 1</w:t>
+      </w:r>
+      <w:r>
+        <w:t xml:space="preserve">, 24–57. https://doi.org/10.1162/CPSY_a_00002</w:t>
       </w:r>
     </w:p>
     <w:p>
@@ -4637,7 +5046,7 @@
         <w:pStyle w:val="BodyText"/>
       </w:pPr>
       <w:r>
-        <w:t xml:space="preserve">Combrisson, E., &amp; Jerbi, K. (2015). Exceeding chance level by chance: The caveat of theoretical chance levels in brain signal classification and statistical assessment of decoding accuracy.</w:t>
+        <w:t xml:space="preserve">Benjamini, Y., &amp; Hochberg, Y. (1995). Controlling the false discovery rate: A practical and powerful approach to multiple testing.</w:t>
       </w:r>
       <w:r>
         <w:t xml:space="preserve"> </w:t>
@@ -4647,10 +5056,10 @@
           <w:i/>
           <w:iCs/>
         </w:rPr>
-        <w:t xml:space="preserve">Journal of Neuroscience Methods, 250</w:t>
-      </w:r>
-      <w:r>
-        <w:t xml:space="preserve">, 126–136. https://doi.org/10.1016/j.jneumeth.2015.01.010</w:t>
+        <w:t xml:space="preserve">Journal of the Royal Statistical Society: Series B (Methodological), 57</w:t>
+      </w:r>
+      <w:r>
+        <w:t xml:space="preserve">(1), 289–300. https://doi.org/10.1111/j.2517-6161.1995.tb02031.x</w:t>
       </w:r>
     </w:p>
     <w:p>
@@ -4658,7 +5067,7 @@
         <w:pStyle w:val="BodyText"/>
       </w:pPr>
       <w:r>
-        <w:t xml:space="preserve">Daw, N. D. (2011). Trial-by-trial data analysis using computational models. In</w:t>
+        <w:t xml:space="preserve">Cho, K., van Merriënboer, B., Gulcehre, C., Bahdanau, D., Bougares, F., Schwenk, H., &amp; Bengio, Y. (2014). Learning phrase representations using RNN encoder–decoder for statistical machine translation. In</w:t>
       </w:r>
       <w:r>
         <w:t xml:space="preserve"> </w:t>
@@ -4668,13 +5077,13 @@
           <w:i/>
           <w:iCs/>
         </w:rPr>
-        <w:t xml:space="preserve">Decision making, affect, and learning: Attention and Performance XXIII</w:t>
-      </w:r>
-      <w:r>
-        <w:t xml:space="preserve"> </w:t>
-      </w:r>
-      <w:r>
-        <w:t xml:space="preserve">(pp. 3–38). Oxford University Press. https://doi.org/10.1093/acprof:oso/9780199600434.003.0001</w:t>
+        <w:t xml:space="preserve">Proceedings of the 2014 Conference on Empirical Methods in Natural Language Processing (EMNLP)</w:t>
+      </w:r>
+      <w:r>
+        <w:t xml:space="preserve"> </w:t>
+      </w:r>
+      <w:r>
+        <w:t xml:space="preserve">(pp. 1724–1734). https://doi.org/10.3115/v1/D14-1179</w:t>
       </w:r>
     </w:p>
     <w:p>
@@ -4682,7 +5091,7 @@
         <w:pStyle w:val="BodyText"/>
       </w:pPr>
       <w:r>
-        <w:t xml:space="preserve">Frank, M. J., Moustafa, A. A., Haughey, H. M., Curran, T., &amp; Hutchison, K. E. (2007). Genetic triple dissociation reveals multiple roles for dopamine in reinforcement learning.</w:t>
+        <w:t xml:space="preserve">Combrisson, E., &amp; Jerbi, K. (2015). Exceeding chance level by chance: The caveat of theoretical chance levels in brain signal classification and statistical assessment of decoding accuracy.</w:t>
       </w:r>
       <w:r>
         <w:t xml:space="preserve"> </w:t>
@@ -4692,10 +5101,10 @@
           <w:i/>
           <w:iCs/>
         </w:rPr>
-        <w:t xml:space="preserve">Proceedings of the National Academy of Sciences, 104</w:t>
-      </w:r>
-      <w:r>
-        <w:t xml:space="preserve">(41), 16311–16316. https://doi.org/10.1073/pnas.0706111104</w:t>
+        <w:t xml:space="preserve">Journal of Neuroscience Methods, 250</w:t>
+      </w:r>
+      <w:r>
+        <w:t xml:space="preserve">, 126–136. https://doi.org/10.1016/j.jneumeth.2015.01.010</w:t>
       </w:r>
     </w:p>
     <w:p>
@@ -4703,7 +5112,7 @@
         <w:pStyle w:val="BodyText"/>
       </w:pPr>
       <w:r>
-        <w:t xml:space="preserve">Gehring, W. J., &amp; Willoughby, A. R. (2002). The medial frontal cortex and the rapid processing of monetary gains and losses.</w:t>
+        <w:t xml:space="preserve">Daw, N. D. (2011). Trial-by-trial data analysis using computational models. In</w:t>
       </w:r>
       <w:r>
         <w:t xml:space="preserve"> </w:t>
@@ -4713,10 +5122,13 @@
           <w:i/>
           <w:iCs/>
         </w:rPr>
-        <w:t xml:space="preserve">Science, 295</w:t>
-      </w:r>
-      <w:r>
-        <w:t xml:space="preserve">(5563), 2279–2282. https://doi.org/10.1126/science.1066893</w:t>
+        <w:t xml:space="preserve">Decision making, affect, and learning: Attention and Performance XXIII</w:t>
+      </w:r>
+      <w:r>
+        <w:t xml:space="preserve"> </w:t>
+      </w:r>
+      <w:r>
+        <w:t xml:space="preserve">(pp. 3–38). Oxford University Press. https://doi.org/10.1093/acprof:oso/9780199600434.003.0001</w:t>
       </w:r>
     </w:p>
     <w:p>
@@ -4724,7 +5136,7 @@
         <w:pStyle w:val="BodyText"/>
       </w:pPr>
       <w:r>
-        <w:t xml:space="preserve">Gershman, S. J. (2015). Do learning rates adapt to the distribution of rewards?</w:t>
+        <w:t xml:space="preserve">Frank, M. J., Moustafa, A. A., Haughey, H. M., Curran, T., &amp; Hutchison, K. E. (2007). Genetic triple dissociation reveals multiple roles for dopamine in reinforcement learning.</w:t>
       </w:r>
       <w:r>
         <w:t xml:space="preserve"> </w:t>
@@ -4734,10 +5146,10 @@
           <w:i/>
           <w:iCs/>
         </w:rPr>
-        <w:t xml:space="preserve">Psychonomic Bulletin &amp; Review, 22</w:t>
-      </w:r>
-      <w:r>
-        <w:t xml:space="preserve">(5), 1320–1327. https://doi.org/10.3758/s13423-014-0790-3</w:t>
+        <w:t xml:space="preserve">Proceedings of the National Academy of Sciences, 104</w:t>
+      </w:r>
+      <w:r>
+        <w:t xml:space="preserve">(41), 16311–16316. https://doi.org/10.1073/pnas.0706111104</w:t>
       </w:r>
     </w:p>
     <w:p>
@@ -4745,7 +5157,7 @@
         <w:pStyle w:val="BodyText"/>
       </w:pPr>
       <w:r>
-        <w:t xml:space="preserve">Hajcak, G., Moser, J. S., Holroyd, C. B., &amp; Simons, R. F. (2007). It’s worse than you thought: The feedback negativity and violations of reward prediction in gambling tasks.</w:t>
+        <w:t xml:space="preserve">Gehring, W. J., &amp; Willoughby, A. R. (2002). The medial frontal cortex and the rapid processing of monetary gains and losses.</w:t>
       </w:r>
       <w:r>
         <w:t xml:space="preserve"> </w:t>
@@ -4755,10 +5167,73 @@
           <w:i/>
           <w:iCs/>
         </w:rPr>
+        <w:t xml:space="preserve">Science, 295</w:t>
+      </w:r>
+      <w:r>
+        <w:t xml:space="preserve">(5563), 2279–2282. https://doi.org/10.1126/science.1066893</w:t>
+      </w:r>
+    </w:p>
+    <w:p>
+      <w:pPr>
+        <w:pStyle w:val="BodyText"/>
+      </w:pPr>
+      <w:r>
+        <w:t xml:space="preserve">Gershman, S. J. (2015). Do learning rates adapt to the distribution of rewards?</w:t>
+      </w:r>
+      <w:r>
+        <w:t xml:space="preserve"> </w:t>
+      </w:r>
+      <w:r>
+        <w:rPr>
+          <w:i/>
+          <w:iCs/>
+        </w:rPr>
+        <w:t xml:space="preserve">Psychonomic Bulletin &amp; Review, 22</w:t>
+      </w:r>
+      <w:r>
+        <w:t xml:space="preserve">(5), 1320–1327. https://doi.org/10.3758/s13423-014-0790-3</w:t>
+      </w:r>
+    </w:p>
+    <w:p>
+      <w:pPr>
+        <w:pStyle w:val="BodyText"/>
+      </w:pPr>
+      <w:r>
+        <w:t xml:space="preserve">Hajcak, G., Moser, J. S., Holroyd, C. B., &amp; Simons, R. F. (2007). It’s worse than you thought: The feedback negativity and violations of reward prediction in gambling tasks.</w:t>
+      </w:r>
+      <w:r>
+        <w:t xml:space="preserve"> </w:t>
+      </w:r>
+      <w:r>
+        <w:rPr>
+          <w:i/>
+          <w:iCs/>
+        </w:rPr>
         <w:t xml:space="preserve">Psychophysiology, 44</w:t>
       </w:r>
       <w:r>
         <w:t xml:space="preserve">(6), 905–912. https://doi.org/10.1111/j.1469-8986.2007.00567.x</w:t>
+      </w:r>
+    </w:p>
+    <w:p>
+      <w:pPr>
+        <w:pStyle w:val="BodyText"/>
+      </w:pPr>
+      <w:r>
+        <w:t xml:space="preserve">Hajiaboo, M., Zarean, M., &amp; Heysieattalab, S. (2025). The effect of chronotype in risky decision making: An ERP study.</w:t>
+      </w:r>
+      <w:r>
+        <w:t xml:space="preserve"> </w:t>
+      </w:r>
+      <w:r>
+        <w:rPr>
+          <w:i/>
+          <w:iCs/>
+        </w:rPr>
+        <w:t xml:space="preserve">International Journal of Psychophysiology, 217</w:t>
+      </w:r>
+      <w:r>
+        <w:t xml:space="preserve">, 113258. https://doi.org/10.1016/j.ijpsycho.2025.113258</w:t>
       </w:r>
     </w:p>
     <w:p>

</xml_diff>